<commit_message>
v0.149 — Growth's Content: ficha de conteúdo de cada produto (aba Produtos) e ideias ligadas a um produto (aplicado em produção)
Co-Authored-By: Claude Opus 5.5 <noreply@anthropic.com>
Claude-Session: https://claude.ai/code/session_01KZYD1VyufGDrBDPUSE7fwE
</commit_message>
<xml_diff>
--- a/docs/Growths-o-sistema.docx
+++ b/docs/Growths-o-sistema.docx
@@ -42,7 +42,7 @@
         <w:t xml:space="preserve"> </w:t>
       </w:r>
       <w:r>
-        <w:t xml:space="preserve">25/10/2026, versão 0.148.</w:t>
+        <w:t xml:space="preserve">25/10/2026, versão 0.149.</w:t>
       </w:r>
     </w:p>
     <w:p>
@@ -2343,6 +2343,124 @@
           <w:bCs/>
           <w:b/>
         </w:rPr>
+        <w:t xml:space="preserve">Produtos.</w:t>
+      </w:r>
+      <w:r>
+        <w:t xml:space="preserve"> </w:t>
+      </w:r>
+      <w:r>
+        <w:t xml:space="preserve">Cada produto do cliente ganha uma ficha de conteúdo, em 7 partes:</w:t>
+      </w:r>
+    </w:p>
+    <w:p>
+      <w:pPr>
+        <w:numPr>
+          <w:ilvl w:val="1"/>
+          <w:numId w:val="1020"/>
+        </w:numPr>
+        <w:pStyle w:val="Compact"/>
+      </w:pPr>
+      <w:r>
+        <w:t xml:space="preserve">o que é: o produto em uma frase, para quem é e para quem não é;</w:t>
+      </w:r>
+    </w:p>
+    <w:p>
+      <w:pPr>
+        <w:numPr>
+          <w:ilvl w:val="1"/>
+          <w:numId w:val="1020"/>
+        </w:numPr>
+        <w:pStyle w:val="Compact"/>
+      </w:pPr>
+      <w:r>
+        <w:t xml:space="preserve">problema e transformação: a dor principal, o que a pessoa já tentou, o resultado e em quanto tempo;</w:t>
+      </w:r>
+    </w:p>
+    <w:p>
+      <w:pPr>
+        <w:numPr>
+          <w:ilvl w:val="1"/>
+          <w:numId w:val="1020"/>
+        </w:numPr>
+        <w:pStyle w:val="Compact"/>
+      </w:pPr>
+      <w:r>
+        <w:t xml:space="preserve">método e entrega: o método ou mecanismo, as etapas, o que a pessoa recebe, bônus e formato;</w:t>
+      </w:r>
+    </w:p>
+    <w:p>
+      <w:pPr>
+        <w:numPr>
+          <w:ilvl w:val="1"/>
+          <w:numId w:val="1020"/>
+        </w:numPr>
+        <w:pStyle w:val="Compact"/>
+      </w:pPr>
+      <w:r>
+        <w:t xml:space="preserve">diferenciais e provas: por que este e não outro, provas reais (dizendo onde estão) e garantia;</w:t>
+      </w:r>
+    </w:p>
+    <w:p>
+      <w:pPr>
+        <w:numPr>
+          <w:ilvl w:val="1"/>
+          <w:numId w:val="1020"/>
+        </w:numPr>
+        <w:pStyle w:val="Compact"/>
+      </w:pPr>
+      <w:r>
+        <w:t xml:space="preserve">objeções, cada uma com a resposta;</w:t>
+      </w:r>
+    </w:p>
+    <w:p>
+      <w:pPr>
+        <w:numPr>
+          <w:ilvl w:val="1"/>
+          <w:numId w:val="1020"/>
+        </w:numPr>
+        <w:pStyle w:val="Compact"/>
+      </w:pPr>
+      <w:r>
+        <w:t xml:space="preserve">oferta e momento de venda: perpétuo, lançamento, carrinho aberto ou fechado, próxima abertura, condições, página e checkout, a chamada que o conteúdo deve fazer, o papel na escada de produtos e o nível de consciência de quem compra;</w:t>
+      </w:r>
+    </w:p>
+    <w:p>
+      <w:pPr>
+        <w:numPr>
+          <w:ilvl w:val="1"/>
+          <w:numId w:val="1020"/>
+        </w:numPr>
+        <w:pStyle w:val="Compact"/>
+      </w:pPr>
+      <w:r>
+        <w:t xml:space="preserve">para o conteúdo: os temas que levam ao produto, as palavras que o público usa, o que evitar dizer e onde estão os materiais.</w:t>
+      </w:r>
+    </w:p>
+    <w:p>
+      <w:pPr>
+        <w:numPr>
+          <w:ilvl w:val="0"/>
+          <w:numId w:val="1000"/>
+        </w:numPr>
+        <w:pStyle w:val="Compact"/>
+      </w:pPr>
+      <w:r>
+        <w:t xml:space="preserve">O cartão de cada produto mostra quanto da ficha está preenchido e quantos conteúdos já falam dele. Cada ideia pode ser ligada a um produto, e a IA vai usar a ficha para criar conteúdo que leva ao produto certo.</w:t>
+      </w:r>
+    </w:p>
+    <w:p>
+      <w:pPr>
+        <w:numPr>
+          <w:ilvl w:val="0"/>
+          <w:numId w:val="1017"/>
+        </w:numPr>
+        <w:pStyle w:val="Compact"/>
+      </w:pPr>
+      <w:r>
+        <w:rPr>
+          <w:bCs/>
+          <w:b/>
+        </w:rPr>
         <w:t xml:space="preserve">Estruturas.</w:t>
       </w:r>
       <w:r>
@@ -2410,7 +2528,7 @@
       <w:pPr>
         <w:numPr>
           <w:ilvl w:val="0"/>
-          <w:numId w:val="1020"/>
+          <w:numId w:val="1021"/>
         </w:numPr>
         <w:pStyle w:val="Compact"/>
       </w:pPr>
@@ -2432,7 +2550,7 @@
       <w:pPr>
         <w:numPr>
           <w:ilvl w:val="0"/>
-          <w:numId w:val="1020"/>
+          <w:numId w:val="1021"/>
         </w:numPr>
         <w:pStyle w:val="Compact"/>
       </w:pPr>
@@ -2448,237 +2566,237 @@
       <w:pPr>
         <w:numPr>
           <w:ilvl w:val="1"/>
+          <w:numId w:val="1022"/>
+        </w:numPr>
+        <w:pStyle w:val="Compact"/>
+      </w:pPr>
+      <w:r>
+        <w:t xml:space="preserve">posts, alcance, interações, engajamento, salvamentos, compartilhamentos e seguidores contra o período anterior;</w:t>
+      </w:r>
+    </w:p>
+    <w:p>
+      <w:pPr>
+        <w:numPr>
+          <w:ilvl w:val="1"/>
+          <w:numId w:val="1022"/>
+        </w:numPr>
+        <w:pStyle w:val="Compact"/>
+      </w:pPr>
+      <w:r>
+        <w:t xml:space="preserve">top 1 e gráficos por dia;</w:t>
+      </w:r>
+    </w:p>
+    <w:p>
+      <w:pPr>
+        <w:numPr>
+          <w:ilvl w:val="1"/>
+          <w:numId w:val="1022"/>
+        </w:numPr>
+        <w:pStyle w:val="Compact"/>
+      </w:pPr>
+      <w:r>
+        <w:t xml:space="preserve">os posts em imagens (4 primeiro,</w:t>
+      </w:r>
+      <w:r>
+        <w:t xml:space="preserve"> </w:t>
+      </w:r>
+      <w:r>
+        <w:t xml:space="preserve">“</w:t>
+      </w:r>
+      <w:r>
+        <w:t xml:space="preserve">Mostrar mais</w:t>
+      </w:r>
+      <w:r>
+        <w:t xml:space="preserve">”</w:t>
+      </w:r>
+      <w:r>
+        <w:t xml:space="preserve">), ordenáveis por engajamento, curtidas, alcance, recentes, salvos, compartilhados, comentários ou visualizações;</w:t>
+      </w:r>
+    </w:p>
+    <w:p>
+      <w:pPr>
+        <w:numPr>
+          <w:ilvl w:val="1"/>
+          <w:numId w:val="1022"/>
+        </w:numPr>
+        <w:pStyle w:val="Compact"/>
+      </w:pPr>
+      <w:r>
+        <w:t xml:space="preserve">gráficos por tema, formato e tipo de mídia. A cor diz se está acima da média (verde), na média (azul) ou abaixo (vermelho), com</w:t>
+      </w:r>
+      <w:r>
+        <w:t xml:space="preserve"> </w:t>
+      </w:r>
+      <w:r>
+        <w:t xml:space="preserve">“</w:t>
+      </w:r>
+      <w:r>
+        <w:t xml:space="preserve">+X% vs. média</w:t>
+      </w:r>
+      <w:r>
+        <w:t xml:space="preserve">”</w:t>
+      </w:r>
+      <w:r>
+        <w:t xml:space="preserve">. Clicar na barra mostra os posts que formam o número;</w:t>
+      </w:r>
+    </w:p>
+    <w:p>
+      <w:pPr>
+        <w:numPr>
+          <w:ilvl w:val="1"/>
+          <w:numId w:val="1022"/>
+        </w:numPr>
+        <w:pStyle w:val="Compact"/>
+      </w:pPr>
+      <w:r>
+        <w:t xml:space="preserve">melhores dias da semana e horários de publicação, em linha.</w:t>
+      </w:r>
+    </w:p>
+    <w:p>
+      <w:pPr>
+        <w:numPr>
+          <w:ilvl w:val="0"/>
           <w:numId w:val="1021"/>
         </w:numPr>
         <w:pStyle w:val="Compact"/>
       </w:pPr>
       <w:r>
-        <w:t xml:space="preserve">posts, alcance, interações, engajamento, salvamentos, compartilhamentos e seguidores contra o período anterior;</w:t>
-      </w:r>
-    </w:p>
-    <w:p>
-      <w:pPr>
-        <w:numPr>
-          <w:ilvl w:val="1"/>
+        <w:rPr>
+          <w:bCs/>
+          <w:b/>
+        </w:rPr>
+        <w:t xml:space="preserve">Insights automáticos.</w:t>
+      </w:r>
+      <w:r>
+        <w:t xml:space="preserve"> </w:t>
+      </w:r>
+      <w:r>
+        <w:t xml:space="preserve">O Growths lê o período e diz o que se destaca, cada item como fato, hipótese ou recomendação e com um botão para ver os posts:</w:t>
+      </w:r>
+    </w:p>
+    <w:p>
+      <w:pPr>
+        <w:numPr>
+          <w:ilvl w:val="1"/>
+          <w:numId w:val="1023"/>
+        </w:numPr>
+        <w:pStyle w:val="Compact"/>
+      </w:pPr>
+      <w:r>
+        <w:t xml:space="preserve">o assunto que mais engaja e o que rende menos, pelas palavras das legendas;</w:t>
+      </w:r>
+    </w:p>
+    <w:p>
+      <w:pPr>
+        <w:numPr>
+          <w:ilvl w:val="1"/>
+          <w:numId w:val="1023"/>
+        </w:numPr>
+        <w:pStyle w:val="Compact"/>
+      </w:pPr>
+      <w:r>
+        <w:t xml:space="preserve">o tema mais forte;</w:t>
+      </w:r>
+    </w:p>
+    <w:p>
+      <w:pPr>
+        <w:numPr>
+          <w:ilvl w:val="1"/>
+          <w:numId w:val="1023"/>
+        </w:numPr>
+        <w:pStyle w:val="Compact"/>
+      </w:pPr>
+      <w:r>
+        <w:t xml:space="preserve">o tipo de mídia que mais alcança;</w:t>
+      </w:r>
+    </w:p>
+    <w:p>
+      <w:pPr>
+        <w:numPr>
+          <w:ilvl w:val="1"/>
+          <w:numId w:val="1023"/>
+        </w:numPr>
+        <w:pStyle w:val="Compact"/>
+      </w:pPr>
+      <w:r>
+        <w:t xml:space="preserve">o post que puxou conversa;</w:t>
+      </w:r>
+    </w:p>
+    <w:p>
+      <w:pPr>
+        <w:numPr>
+          <w:ilvl w:val="1"/>
+          <w:numId w:val="1023"/>
+        </w:numPr>
+        <w:pStyle w:val="Compact"/>
+      </w:pPr>
+      <w:r>
+        <w:t xml:space="preserve">o que pode ter levado gente para a DM;</w:t>
+      </w:r>
+    </w:p>
+    <w:p>
+      <w:pPr>
+        <w:numPr>
+          <w:ilvl w:val="1"/>
+          <w:numId w:val="1023"/>
+        </w:numPr>
+        <w:pStyle w:val="Compact"/>
+      </w:pPr>
+      <w:r>
+        <w:t xml:space="preserve">o mais salvo e o mais compartilhado;</w:t>
+      </w:r>
+    </w:p>
+    <w:p>
+      <w:pPr>
+        <w:numPr>
+          <w:ilvl w:val="1"/>
+          <w:numId w:val="1023"/>
+        </w:numPr>
+        <w:pStyle w:val="Compact"/>
+      </w:pPr>
+      <w:r>
+        <w:t xml:space="preserve">o melhor dia;</w:t>
+      </w:r>
+    </w:p>
+    <w:p>
+      <w:pPr>
+        <w:numPr>
+          <w:ilvl w:val="1"/>
+          <w:numId w:val="1023"/>
+        </w:numPr>
+        <w:pStyle w:val="Compact"/>
+      </w:pPr>
+      <w:r>
+        <w:t xml:space="preserve">a comparação com o período anterior.</w:t>
+      </w:r>
+    </w:p>
+    <w:p>
+      <w:pPr>
+        <w:numPr>
+          <w:ilvl w:val="0"/>
           <w:numId w:val="1021"/>
         </w:numPr>
         <w:pStyle w:val="Compact"/>
       </w:pPr>
       <w:r>
-        <w:t xml:space="preserve">top 1 e gráficos por dia;</w:t>
-      </w:r>
-    </w:p>
-    <w:p>
-      <w:pPr>
-        <w:numPr>
-          <w:ilvl w:val="1"/>
+        <w:rPr>
+          <w:bCs/>
+          <w:b/>
+        </w:rPr>
+        <w:t xml:space="preserve">Classificar o post</w:t>
+      </w:r>
+      <w:r>
+        <w:t xml:space="preserve"> </w:t>
+      </w:r>
+      <w:r>
+        <w:t xml:space="preserve">que não veio da Máquina (frente e formato) no próprio post.</w:t>
+      </w:r>
+    </w:p>
+    <w:p>
+      <w:pPr>
+        <w:numPr>
+          <w:ilvl w:val="0"/>
           <w:numId w:val="1021"/>
-        </w:numPr>
-        <w:pStyle w:val="Compact"/>
-      </w:pPr>
-      <w:r>
-        <w:t xml:space="preserve">os posts em imagens (4 primeiro,</w:t>
-      </w:r>
-      <w:r>
-        <w:t xml:space="preserve"> </w:t>
-      </w:r>
-      <w:r>
-        <w:t xml:space="preserve">“</w:t>
-      </w:r>
-      <w:r>
-        <w:t xml:space="preserve">Mostrar mais</w:t>
-      </w:r>
-      <w:r>
-        <w:t xml:space="preserve">”</w:t>
-      </w:r>
-      <w:r>
-        <w:t xml:space="preserve">), ordenáveis por engajamento, curtidas, alcance, recentes, salvos, compartilhados, comentários ou visualizações;</w:t>
-      </w:r>
-    </w:p>
-    <w:p>
-      <w:pPr>
-        <w:numPr>
-          <w:ilvl w:val="1"/>
-          <w:numId w:val="1021"/>
-        </w:numPr>
-        <w:pStyle w:val="Compact"/>
-      </w:pPr>
-      <w:r>
-        <w:t xml:space="preserve">gráficos por tema, formato e tipo de mídia. A cor diz se está acima da média (verde), na média (azul) ou abaixo (vermelho), com</w:t>
-      </w:r>
-      <w:r>
-        <w:t xml:space="preserve"> </w:t>
-      </w:r>
-      <w:r>
-        <w:t xml:space="preserve">“</w:t>
-      </w:r>
-      <w:r>
-        <w:t xml:space="preserve">+X% vs. média</w:t>
-      </w:r>
-      <w:r>
-        <w:t xml:space="preserve">”</w:t>
-      </w:r>
-      <w:r>
-        <w:t xml:space="preserve">. Clicar na barra mostra os posts que formam o número;</w:t>
-      </w:r>
-    </w:p>
-    <w:p>
-      <w:pPr>
-        <w:numPr>
-          <w:ilvl w:val="1"/>
-          <w:numId w:val="1021"/>
-        </w:numPr>
-        <w:pStyle w:val="Compact"/>
-      </w:pPr>
-      <w:r>
-        <w:t xml:space="preserve">melhores dias da semana e horários de publicação, em linha.</w:t>
-      </w:r>
-    </w:p>
-    <w:p>
-      <w:pPr>
-        <w:numPr>
-          <w:ilvl w:val="0"/>
-          <w:numId w:val="1020"/>
-        </w:numPr>
-        <w:pStyle w:val="Compact"/>
-      </w:pPr>
-      <w:r>
-        <w:rPr>
-          <w:bCs/>
-          <w:b/>
-        </w:rPr>
-        <w:t xml:space="preserve">Insights automáticos.</w:t>
-      </w:r>
-      <w:r>
-        <w:t xml:space="preserve"> </w:t>
-      </w:r>
-      <w:r>
-        <w:t xml:space="preserve">O Growths lê o período e diz o que se destaca, cada item como fato, hipótese ou recomendação e com um botão para ver os posts:</w:t>
-      </w:r>
-    </w:p>
-    <w:p>
-      <w:pPr>
-        <w:numPr>
-          <w:ilvl w:val="1"/>
-          <w:numId w:val="1022"/>
-        </w:numPr>
-        <w:pStyle w:val="Compact"/>
-      </w:pPr>
-      <w:r>
-        <w:t xml:space="preserve">o assunto que mais engaja e o que rende menos, pelas palavras das legendas;</w:t>
-      </w:r>
-    </w:p>
-    <w:p>
-      <w:pPr>
-        <w:numPr>
-          <w:ilvl w:val="1"/>
-          <w:numId w:val="1022"/>
-        </w:numPr>
-        <w:pStyle w:val="Compact"/>
-      </w:pPr>
-      <w:r>
-        <w:t xml:space="preserve">o tema mais forte;</w:t>
-      </w:r>
-    </w:p>
-    <w:p>
-      <w:pPr>
-        <w:numPr>
-          <w:ilvl w:val="1"/>
-          <w:numId w:val="1022"/>
-        </w:numPr>
-        <w:pStyle w:val="Compact"/>
-      </w:pPr>
-      <w:r>
-        <w:t xml:space="preserve">o tipo de mídia que mais alcança;</w:t>
-      </w:r>
-    </w:p>
-    <w:p>
-      <w:pPr>
-        <w:numPr>
-          <w:ilvl w:val="1"/>
-          <w:numId w:val="1022"/>
-        </w:numPr>
-        <w:pStyle w:val="Compact"/>
-      </w:pPr>
-      <w:r>
-        <w:t xml:space="preserve">o post que puxou conversa;</w:t>
-      </w:r>
-    </w:p>
-    <w:p>
-      <w:pPr>
-        <w:numPr>
-          <w:ilvl w:val="1"/>
-          <w:numId w:val="1022"/>
-        </w:numPr>
-        <w:pStyle w:val="Compact"/>
-      </w:pPr>
-      <w:r>
-        <w:t xml:space="preserve">o que pode ter levado gente para a DM;</w:t>
-      </w:r>
-    </w:p>
-    <w:p>
-      <w:pPr>
-        <w:numPr>
-          <w:ilvl w:val="1"/>
-          <w:numId w:val="1022"/>
-        </w:numPr>
-        <w:pStyle w:val="Compact"/>
-      </w:pPr>
-      <w:r>
-        <w:t xml:space="preserve">o mais salvo e o mais compartilhado;</w:t>
-      </w:r>
-    </w:p>
-    <w:p>
-      <w:pPr>
-        <w:numPr>
-          <w:ilvl w:val="1"/>
-          <w:numId w:val="1022"/>
-        </w:numPr>
-        <w:pStyle w:val="Compact"/>
-      </w:pPr>
-      <w:r>
-        <w:t xml:space="preserve">o melhor dia;</w:t>
-      </w:r>
-    </w:p>
-    <w:p>
-      <w:pPr>
-        <w:numPr>
-          <w:ilvl w:val="1"/>
-          <w:numId w:val="1022"/>
-        </w:numPr>
-        <w:pStyle w:val="Compact"/>
-      </w:pPr>
-      <w:r>
-        <w:t xml:space="preserve">a comparação com o período anterior.</w:t>
-      </w:r>
-    </w:p>
-    <w:p>
-      <w:pPr>
-        <w:numPr>
-          <w:ilvl w:val="0"/>
-          <w:numId w:val="1020"/>
-        </w:numPr>
-        <w:pStyle w:val="Compact"/>
-      </w:pPr>
-      <w:r>
-        <w:rPr>
-          <w:bCs/>
-          <w:b/>
-        </w:rPr>
-        <w:t xml:space="preserve">Classificar o post</w:t>
-      </w:r>
-      <w:r>
-        <w:t xml:space="preserve"> </w:t>
-      </w:r>
-      <w:r>
-        <w:t xml:space="preserve">que não veio da Máquina (frente e formato) no próprio post.</w:t>
-      </w:r>
-    </w:p>
-    <w:p>
-      <w:pPr>
-        <w:numPr>
-          <w:ilvl w:val="0"/>
-          <w:numId w:val="1020"/>
         </w:numPr>
         <w:pStyle w:val="Compact"/>
       </w:pPr>
@@ -2710,7 +2828,7 @@
       <w:pPr>
         <w:numPr>
           <w:ilvl w:val="0"/>
-          <w:numId w:val="1023"/>
+          <w:numId w:val="1024"/>
         </w:numPr>
         <w:pStyle w:val="Compact"/>
       </w:pPr>
@@ -2732,179 +2850,179 @@
       <w:pPr>
         <w:numPr>
           <w:ilvl w:val="1"/>
+          <w:numId w:val="1025"/>
+        </w:numPr>
+        <w:pStyle w:val="Compact"/>
+      </w:pPr>
+      <w:r>
+        <w:t xml:space="preserve">AIDA;</w:t>
+      </w:r>
+    </w:p>
+    <w:p>
+      <w:pPr>
+        <w:numPr>
+          <w:ilvl w:val="1"/>
+          <w:numId w:val="1025"/>
+        </w:numPr>
+        <w:pStyle w:val="Compact"/>
+      </w:pPr>
+      <w:r>
+        <w:t xml:space="preserve">PAS;</w:t>
+      </w:r>
+    </w:p>
+    <w:p>
+      <w:pPr>
+        <w:numPr>
+          <w:ilvl w:val="1"/>
+          <w:numId w:val="1025"/>
+        </w:numPr>
+        <w:pStyle w:val="Compact"/>
+      </w:pPr>
+      <w:r>
+        <w:t xml:space="preserve">Antes, depois e a ponte;</w:t>
+      </w:r>
+    </w:p>
+    <w:p>
+      <w:pPr>
+        <w:numPr>
+          <w:ilvl w:val="1"/>
+          <w:numId w:val="1025"/>
+        </w:numPr>
+        <w:pStyle w:val="Compact"/>
+      </w:pPr>
+      <w:r>
+        <w:t xml:space="preserve">Gancho, conteúdo e chamada para Reels;</w:t>
+      </w:r>
+    </w:p>
+    <w:p>
+      <w:pPr>
+        <w:numPr>
+          <w:ilvl w:val="1"/>
+          <w:numId w:val="1025"/>
+        </w:numPr>
+        <w:pStyle w:val="Compact"/>
+      </w:pPr>
+      <w:r>
+        <w:t xml:space="preserve">Carrossel educativo;</w:t>
+      </w:r>
+    </w:p>
+    <w:p>
+      <w:pPr>
+        <w:numPr>
+          <w:ilvl w:val="1"/>
+          <w:numId w:val="1025"/>
+        </w:numPr>
+        <w:pStyle w:val="Compact"/>
+      </w:pPr>
+      <w:r>
+        <w:t xml:space="preserve">Storytelling em jornada curta;</w:t>
+      </w:r>
+    </w:p>
+    <w:p>
+      <w:pPr>
+        <w:numPr>
+          <w:ilvl w:val="1"/>
+          <w:numId w:val="1025"/>
+        </w:numPr>
+        <w:pStyle w:val="Compact"/>
+      </w:pPr>
+      <w:r>
+        <w:t xml:space="preserve">copy pelos 5 níveis de consciência.</w:t>
+      </w:r>
+    </w:p>
+    <w:p>
+      <w:pPr>
+        <w:numPr>
+          <w:ilvl w:val="0"/>
+          <w:numId w:val="1000"/>
+        </w:numPr>
+        <w:pStyle w:val="Compact"/>
+      </w:pPr>
+      <w:r>
+        <w:t xml:space="preserve">A equipe pode criar outras (como as do método MIRA), editar, reordenar e desativar.</w:t>
+      </w:r>
+    </w:p>
+    <w:p>
+      <w:pPr>
+        <w:numPr>
+          <w:ilvl w:val="0"/>
           <w:numId w:val="1024"/>
         </w:numPr>
         <w:pStyle w:val="Compact"/>
       </w:pPr>
       <w:r>
-        <w:t xml:space="preserve">AIDA;</w:t>
-      </w:r>
-    </w:p>
-    <w:p>
-      <w:pPr>
-        <w:numPr>
-          <w:ilvl w:val="1"/>
+        <w:rPr>
+          <w:bCs/>
+          <w:b/>
+        </w:rPr>
+        <w:t xml:space="preserve">Pastas da Mathisa.</w:t>
+      </w:r>
+      <w:r>
+        <w:t xml:space="preserve"> </w:t>
+      </w:r>
+      <w:r>
+        <w:t xml:space="preserve">Pastas do Drive da Mathisa que a IA lê junto com as do cliente, para todos os clientes ou para um. A regra: as pastas da Mathisa são os</w:t>
+      </w:r>
+      <w:r>
+        <w:t xml:space="preserve"> </w:t>
+      </w:r>
+      <w:r>
+        <w:rPr>
+          <w:bCs/>
+          <w:b/>
+        </w:rPr>
+        <w:t xml:space="preserve">padrões</w:t>
+      </w:r>
+      <w:r>
+        <w:t xml:space="preserve"> </w:t>
+      </w:r>
+      <w:r>
+        <w:t xml:space="preserve">(método, estruturas, exemplos, o que muda pouco). As pastas do cliente são as</w:t>
+      </w:r>
+      <w:r>
+        <w:t xml:space="preserve"> </w:t>
+      </w:r>
+      <w:r>
+        <w:rPr>
+          <w:bCs/>
+          <w:b/>
+        </w:rPr>
+        <w:t xml:space="preserve">novidades</w:t>
+      </w:r>
+      <w:r>
+        <w:t xml:space="preserve"> </w:t>
+      </w:r>
+      <w:r>
+        <w:t xml:space="preserve">(método novo, estudo novo, material novo). Quando os dois falam do mesmo assunto, a novidade do cliente vale para aquele cliente.</w:t>
+      </w:r>
+    </w:p>
+    <w:p>
+      <w:pPr>
+        <w:numPr>
+          <w:ilvl w:val="0"/>
           <w:numId w:val="1024"/>
         </w:numPr>
         <w:pStyle w:val="Compact"/>
       </w:pPr>
       <w:r>
-        <w:t xml:space="preserve">PAS;</w:t>
-      </w:r>
-    </w:p>
-    <w:p>
-      <w:pPr>
-        <w:numPr>
-          <w:ilvl w:val="1"/>
+        <w:rPr>
+          <w:bCs/>
+          <w:b/>
+        </w:rPr>
+        <w:t xml:space="preserve">Custos de IA.</w:t>
+      </w:r>
+      <w:r>
+        <w:t xml:space="preserve"> </w:t>
+      </w:r>
+      <w:r>
+        <w:t xml:space="preserve">Uma tela que só a Rebecka vê: tokens, buscas na web e custo por cliente e por mês, em dólar e em reais (com o câmbio informado por ela). Serve para medir o custo real antes de definir os planos.</w:t>
+      </w:r>
+    </w:p>
+    <w:p>
+      <w:pPr>
+        <w:numPr>
+          <w:ilvl w:val="0"/>
           <w:numId w:val="1024"/>
-        </w:numPr>
-        <w:pStyle w:val="Compact"/>
-      </w:pPr>
-      <w:r>
-        <w:t xml:space="preserve">Antes, depois e a ponte;</w:t>
-      </w:r>
-    </w:p>
-    <w:p>
-      <w:pPr>
-        <w:numPr>
-          <w:ilvl w:val="1"/>
-          <w:numId w:val="1024"/>
-        </w:numPr>
-        <w:pStyle w:val="Compact"/>
-      </w:pPr>
-      <w:r>
-        <w:t xml:space="preserve">Gancho, conteúdo e chamada para Reels;</w:t>
-      </w:r>
-    </w:p>
-    <w:p>
-      <w:pPr>
-        <w:numPr>
-          <w:ilvl w:val="1"/>
-          <w:numId w:val="1024"/>
-        </w:numPr>
-        <w:pStyle w:val="Compact"/>
-      </w:pPr>
-      <w:r>
-        <w:t xml:space="preserve">Carrossel educativo;</w:t>
-      </w:r>
-    </w:p>
-    <w:p>
-      <w:pPr>
-        <w:numPr>
-          <w:ilvl w:val="1"/>
-          <w:numId w:val="1024"/>
-        </w:numPr>
-        <w:pStyle w:val="Compact"/>
-      </w:pPr>
-      <w:r>
-        <w:t xml:space="preserve">Storytelling em jornada curta;</w:t>
-      </w:r>
-    </w:p>
-    <w:p>
-      <w:pPr>
-        <w:numPr>
-          <w:ilvl w:val="1"/>
-          <w:numId w:val="1024"/>
-        </w:numPr>
-        <w:pStyle w:val="Compact"/>
-      </w:pPr>
-      <w:r>
-        <w:t xml:space="preserve">copy pelos 5 níveis de consciência.</w:t>
-      </w:r>
-    </w:p>
-    <w:p>
-      <w:pPr>
-        <w:numPr>
-          <w:ilvl w:val="0"/>
-          <w:numId w:val="1000"/>
-        </w:numPr>
-        <w:pStyle w:val="Compact"/>
-      </w:pPr>
-      <w:r>
-        <w:t xml:space="preserve">A equipe pode criar outras (como as do método MIRA), editar, reordenar e desativar.</w:t>
-      </w:r>
-    </w:p>
-    <w:p>
-      <w:pPr>
-        <w:numPr>
-          <w:ilvl w:val="0"/>
-          <w:numId w:val="1023"/>
-        </w:numPr>
-        <w:pStyle w:val="Compact"/>
-      </w:pPr>
-      <w:r>
-        <w:rPr>
-          <w:bCs/>
-          <w:b/>
-        </w:rPr>
-        <w:t xml:space="preserve">Pastas da Mathisa.</w:t>
-      </w:r>
-      <w:r>
-        <w:t xml:space="preserve"> </w:t>
-      </w:r>
-      <w:r>
-        <w:t xml:space="preserve">Pastas do Drive da Mathisa que a IA lê junto com as do cliente, para todos os clientes ou para um. A regra: as pastas da Mathisa são os</w:t>
-      </w:r>
-      <w:r>
-        <w:t xml:space="preserve"> </w:t>
-      </w:r>
-      <w:r>
-        <w:rPr>
-          <w:bCs/>
-          <w:b/>
-        </w:rPr>
-        <w:t xml:space="preserve">padrões</w:t>
-      </w:r>
-      <w:r>
-        <w:t xml:space="preserve"> </w:t>
-      </w:r>
-      <w:r>
-        <w:t xml:space="preserve">(método, estruturas, exemplos, o que muda pouco). As pastas do cliente são as</w:t>
-      </w:r>
-      <w:r>
-        <w:t xml:space="preserve"> </w:t>
-      </w:r>
-      <w:r>
-        <w:rPr>
-          <w:bCs/>
-          <w:b/>
-        </w:rPr>
-        <w:t xml:space="preserve">novidades</w:t>
-      </w:r>
-      <w:r>
-        <w:t xml:space="preserve"> </w:t>
-      </w:r>
-      <w:r>
-        <w:t xml:space="preserve">(método novo, estudo novo, material novo). Quando os dois falam do mesmo assunto, a novidade do cliente vale para aquele cliente.</w:t>
-      </w:r>
-    </w:p>
-    <w:p>
-      <w:pPr>
-        <w:numPr>
-          <w:ilvl w:val="0"/>
-          <w:numId w:val="1023"/>
-        </w:numPr>
-        <w:pStyle w:val="Compact"/>
-      </w:pPr>
-      <w:r>
-        <w:rPr>
-          <w:bCs/>
-          <w:b/>
-        </w:rPr>
-        <w:t xml:space="preserve">Custos de IA.</w:t>
-      </w:r>
-      <w:r>
-        <w:t xml:space="preserve"> </w:t>
-      </w:r>
-      <w:r>
-        <w:t xml:space="preserve">Uma tela que só a Rebecka vê: tokens, buscas na web e custo por cliente e por mês, em dólar e em reais (com o câmbio informado por ela). Serve para medir o custo real antes de definir os planos.</w:t>
-      </w:r>
-    </w:p>
-    <w:p>
-      <w:pPr>
-        <w:numPr>
-          <w:ilvl w:val="0"/>
-          <w:numId w:val="1023"/>
         </w:numPr>
         <w:pStyle w:val="Compact"/>
       </w:pPr>
@@ -2936,7 +3054,7 @@
       <w:pPr>
         <w:numPr>
           <w:ilvl w:val="0"/>
-          <w:numId w:val="1025"/>
+          <w:numId w:val="1026"/>
         </w:numPr>
         <w:pStyle w:val="Compact"/>
       </w:pPr>
@@ -2955,100 +3073,122 @@
       <w:pPr>
         <w:numPr>
           <w:ilvl w:val="1"/>
+          <w:numId w:val="1027"/>
+        </w:numPr>
+        <w:pStyle w:val="Compact"/>
+      </w:pPr>
+      <w:r>
+        <w:t xml:space="preserve">ler o que entrou nas pastas (da Mathisa e do cliente);</w:t>
+      </w:r>
+    </w:p>
+    <w:p>
+      <w:pPr>
+        <w:numPr>
+          <w:ilvl w:val="1"/>
+          <w:numId w:val="1027"/>
+        </w:numPr>
+        <w:pStyle w:val="Compact"/>
+      </w:pPr>
+      <w:r>
+        <w:t xml:space="preserve">buscar na web sobre o nicho (notícias, tendências, concorrentes), com fonte;</w:t>
+      </w:r>
+    </w:p>
+    <w:p>
+      <w:pPr>
+        <w:numPr>
+          <w:ilvl w:val="1"/>
+          <w:numId w:val="1027"/>
+        </w:numPr>
+        <w:pStyle w:val="Compact"/>
+      </w:pPr>
+      <w:r>
+        <w:t xml:space="preserve">gerar ideias pela linha editorial, persona, voz e estruturas escolhidas, no formato e na quantidade da rotina;</w:t>
+      </w:r>
+    </w:p>
+    <w:p>
+      <w:pPr>
+        <w:numPr>
+          <w:ilvl w:val="1"/>
+          <w:numId w:val="1027"/>
+        </w:numPr>
+        <w:pStyle w:val="Compact"/>
+      </w:pPr>
+      <w:r>
+        <w:t xml:space="preserve">registrar o custo de cada rodada.</w:t>
+      </w:r>
+    </w:p>
+    <w:p>
+      <w:pPr>
+        <w:numPr>
+          <w:ilvl w:val="0"/>
           <w:numId w:val="1026"/>
         </w:numPr>
         <w:pStyle w:val="Compact"/>
       </w:pPr>
       <w:r>
-        <w:t xml:space="preserve">ler o que entrou nas pastas (da Mathisa e do cliente);</w:t>
-      </w:r>
-    </w:p>
-    <w:p>
-      <w:pPr>
-        <w:numPr>
-          <w:ilvl w:val="1"/>
+        <w:rPr>
+          <w:bCs/>
+          <w:b/>
+        </w:rPr>
+        <w:t xml:space="preserve">Leitura dos outros canais</w:t>
+      </w:r>
+      <w:r>
+        <w:t xml:space="preserve"> </w:t>
+      </w:r>
+      <w:r>
+        <w:t xml:space="preserve">(YouTube, TikTok, LinkedIn, Threads) pela conexão.</w:t>
+      </w:r>
+    </w:p>
+    <w:p>
+      <w:pPr>
+        <w:numPr>
+          <w:ilvl w:val="0"/>
           <w:numId w:val="1026"/>
         </w:numPr>
         <w:pStyle w:val="Compact"/>
       </w:pPr>
       <w:r>
-        <w:t xml:space="preserve">buscar na web sobre o nicho (notícias, tendências, concorrentes), com fonte;</w:t>
-      </w:r>
-    </w:p>
-    <w:p>
-      <w:pPr>
-        <w:numPr>
-          <w:ilvl w:val="1"/>
+        <w:rPr>
+          <w:bCs/>
+          <w:b/>
+        </w:rPr>
+        <w:t xml:space="preserve">Pesquisa, tese, dossiê e skill do cliente</w:t>
+      </w:r>
+      <w:r>
+        <w:t xml:space="preserve">, com aprovação.</w:t>
+      </w:r>
+    </w:p>
+    <w:p>
+      <w:pPr>
+        <w:numPr>
+          <w:ilvl w:val="0"/>
           <w:numId w:val="1026"/>
         </w:numPr>
         <w:pStyle w:val="Compact"/>
       </w:pPr>
       <w:r>
-        <w:t xml:space="preserve">gerar ideias pela linha editorial, persona, voz e estruturas escolhidas, no formato e na quantidade da rotina;</w:t>
-      </w:r>
-    </w:p>
-    <w:p>
-      <w:pPr>
-        <w:numPr>
-          <w:ilvl w:val="1"/>
+        <w:rPr>
+          <w:bCs/>
+          <w:b/>
+        </w:rPr>
+        <w:t xml:space="preserve">A rotina de ideias usando a ficha de cada produto</w:t>
+      </w:r>
+      <w:r>
+        <w:t xml:space="preserve"> </w:t>
+      </w:r>
+      <w:r>
+        <w:t xml:space="preserve">e o momento de venda (ex.: mais conteúdo do produto perto da abertura do carrinho).</w:t>
+      </w:r>
+    </w:p>
+    <w:p>
+      <w:pPr>
+        <w:numPr>
+          <w:ilvl w:val="0"/>
           <w:numId w:val="1026"/>
         </w:numPr>
         <w:pStyle w:val="Compact"/>
       </w:pPr>
       <w:r>
-        <w:t xml:space="preserve">registrar o custo de cada rodada.</w:t>
-      </w:r>
-    </w:p>
-    <w:p>
-      <w:pPr>
-        <w:numPr>
-          <w:ilvl w:val="0"/>
-          <w:numId w:val="1025"/>
-        </w:numPr>
-        <w:pStyle w:val="Compact"/>
-      </w:pPr>
-      <w:r>
-        <w:rPr>
-          <w:bCs/>
-          <w:b/>
-        </w:rPr>
-        <w:t xml:space="preserve">Leitura dos outros canais</w:t>
-      </w:r>
-      <w:r>
-        <w:t xml:space="preserve"> </w:t>
-      </w:r>
-      <w:r>
-        <w:t xml:space="preserve">(YouTube, TikTok, LinkedIn, Threads) pela conexão.</w:t>
-      </w:r>
-    </w:p>
-    <w:p>
-      <w:pPr>
-        <w:numPr>
-          <w:ilvl w:val="0"/>
-          <w:numId w:val="1025"/>
-        </w:numPr>
-        <w:pStyle w:val="Compact"/>
-      </w:pPr>
-      <w:r>
-        <w:rPr>
-          <w:bCs/>
-          <w:b/>
-        </w:rPr>
-        <w:t xml:space="preserve">Pesquisa, tese, dossiê e skill do cliente</w:t>
-      </w:r>
-      <w:r>
-        <w:t xml:space="preserve">, com aprovação.</w:t>
-      </w:r>
-    </w:p>
-    <w:p>
-      <w:pPr>
-        <w:numPr>
-          <w:ilvl w:val="0"/>
-          <w:numId w:val="1025"/>
-        </w:numPr>
-        <w:pStyle w:val="Compact"/>
-      </w:pPr>
-      <w:r>
         <w:rPr>
           <w:bCs/>
           <w:b/>
@@ -3063,7 +3203,7 @@
       <w:pPr>
         <w:numPr>
           <w:ilvl w:val="0"/>
-          <w:numId w:val="1025"/>
+          <w:numId w:val="1026"/>
         </w:numPr>
         <w:pStyle w:val="Compact"/>
       </w:pPr>
@@ -3093,7 +3233,7 @@
       <w:pPr>
         <w:numPr>
           <w:ilvl w:val="0"/>
-          <w:numId w:val="1027"/>
+          <w:numId w:val="1028"/>
         </w:numPr>
         <w:pStyle w:val="Compact"/>
       </w:pPr>
@@ -3163,7 +3303,7 @@
       <w:pPr>
         <w:numPr>
           <w:ilvl w:val="0"/>
-          <w:numId w:val="1027"/>
+          <w:numId w:val="1028"/>
         </w:numPr>
         <w:pStyle w:val="Compact"/>
       </w:pPr>
@@ -3179,249 +3319,249 @@
       <w:pPr>
         <w:numPr>
           <w:ilvl w:val="1"/>
+          <w:numId w:val="1029"/>
+        </w:numPr>
+        <w:pStyle w:val="Compact"/>
+      </w:pPr>
+      <w:r>
+        <w:t xml:space="preserve">primeira origem e último clique;</w:t>
+      </w:r>
+    </w:p>
+    <w:p>
+      <w:pPr>
+        <w:numPr>
+          <w:ilvl w:val="1"/>
+          <w:numId w:val="1029"/>
+        </w:numPr>
+        <w:pStyle w:val="Compact"/>
+      </w:pPr>
+      <w:r>
+        <w:t xml:space="preserve">quantos contatos até a compra e a linha do tempo da jornada;</w:t>
+      </w:r>
+    </w:p>
+    <w:p>
+      <w:pPr>
+        <w:numPr>
+          <w:ilvl w:val="1"/>
+          <w:numId w:val="1029"/>
+        </w:numPr>
+        <w:pStyle w:val="Compact"/>
+      </w:pPr>
+      <w:r>
+        <w:t xml:space="preserve">responsáveis e o histórico de quem mudou;</w:t>
+      </w:r>
+    </w:p>
+    <w:p>
+      <w:pPr>
+        <w:numPr>
+          <w:ilvl w:val="1"/>
+          <w:numId w:val="1029"/>
+        </w:numPr>
+        <w:pStyle w:val="Compact"/>
+      </w:pPr>
+      <w:r>
+        <w:t xml:space="preserve">compras, contratos e oportunidades;</w:t>
+      </w:r>
+    </w:p>
+    <w:p>
+      <w:pPr>
+        <w:numPr>
+          <w:ilvl w:val="1"/>
+          <w:numId w:val="1029"/>
+        </w:numPr>
+        <w:pStyle w:val="Compact"/>
+      </w:pPr>
+      <w:r>
+        <w:t xml:space="preserve">pagamentos anteriores ao sistema.</w:t>
+      </w:r>
+    </w:p>
+    <w:p>
+      <w:pPr>
+        <w:numPr>
+          <w:ilvl w:val="0"/>
           <w:numId w:val="1028"/>
         </w:numPr>
         <w:pStyle w:val="Compact"/>
       </w:pPr>
       <w:r>
-        <w:t xml:space="preserve">primeira origem e último clique;</w:t>
-      </w:r>
-    </w:p>
-    <w:p>
-      <w:pPr>
-        <w:numPr>
-          <w:ilvl w:val="1"/>
+        <w:rPr>
+          <w:bCs/>
+          <w:b/>
+        </w:rPr>
+        <w:t xml:space="preserve">Identidade sem duplicar.</w:t>
+      </w:r>
+      <w:r>
+        <w:t xml:space="preserve"> </w:t>
+      </w:r>
+      <w:r>
+        <w:t xml:space="preserve">A mesma pessoa é reconhecida por telefone e e-mail. Cadastro repetido junta sozinho ou por botão, com histórico.</w:t>
+      </w:r>
+    </w:p>
+    <w:p>
+      <w:pPr>
+        <w:numPr>
+          <w:ilvl w:val="0"/>
           <w:numId w:val="1028"/>
         </w:numPr>
         <w:pStyle w:val="Compact"/>
       </w:pPr>
       <w:r>
-        <w:t xml:space="preserve">quantos contatos até a compra e a linha do tempo da jornada;</w:t>
-      </w:r>
-    </w:p>
-    <w:p>
-      <w:pPr>
-        <w:numPr>
-          <w:ilvl w:val="1"/>
+        <w:rPr>
+          <w:bCs/>
+          <w:b/>
+        </w:rPr>
+        <w:t xml:space="preserve">Vendas.</w:t>
+      </w:r>
+      <w:r>
+        <w:t xml:space="preserve"> </w:t>
+      </w:r>
+      <w:r>
+        <w:t xml:space="preserve">Vendas aprovadas, bruto e líquido, ticket médio e reembolsos. A receita aparece por papel da oferta (order bump, upsell, downsell). Cada venda guarda o primeiro e o último toque, com o painel</w:t>
+      </w:r>
+      <w:r>
+        <w:t xml:space="preserve"> </w:t>
+      </w:r>
+      <w:r>
+        <w:t xml:space="preserve">“</w:t>
+      </w:r>
+      <w:r>
+        <w:t xml:space="preserve">Vendas por canal</w:t>
+      </w:r>
+      <w:r>
+        <w:t xml:space="preserve">”</w:t>
+      </w:r>
+      <w:r>
+        <w:t xml:space="preserve"> </w:t>
+      </w:r>
+      <w:r>
+        <w:t xml:space="preserve">(CAC e ROAS bruto).</w:t>
+      </w:r>
+    </w:p>
+    <w:p>
+      <w:pPr>
+        <w:numPr>
+          <w:ilvl w:val="0"/>
           <w:numId w:val="1028"/>
         </w:numPr>
         <w:pStyle w:val="Compact"/>
       </w:pPr>
       <w:r>
-        <w:t xml:space="preserve">responsáveis e o histórico de quem mudou;</w:t>
-      </w:r>
-    </w:p>
-    <w:p>
-      <w:pPr>
-        <w:numPr>
-          <w:ilvl w:val="1"/>
+        <w:rPr>
+          <w:bCs/>
+          <w:b/>
+        </w:rPr>
+        <w:t xml:space="preserve">Contratos:</w:t>
+      </w:r>
+    </w:p>
+    <w:p>
+      <w:pPr>
+        <w:numPr>
+          <w:ilvl w:val="1"/>
+          <w:numId w:val="1030"/>
+        </w:numPr>
+        <w:pStyle w:val="Compact"/>
+      </w:pPr>
+      <w:r>
+        <w:t xml:space="preserve">status claros: pendente, assinado e ativo, cancelado, encerrado;</w:t>
+      </w:r>
+    </w:p>
+    <w:p>
+      <w:pPr>
+        <w:numPr>
+          <w:ilvl w:val="1"/>
+          <w:numId w:val="1030"/>
+        </w:numPr>
+        <w:pStyle w:val="Compact"/>
+      </w:pPr>
+      <w:r>
+        <w:t xml:space="preserve">parcelas personalizadas;</w:t>
+      </w:r>
+    </w:p>
+    <w:p>
+      <w:pPr>
+        <w:numPr>
+          <w:ilvl w:val="1"/>
+          <w:numId w:val="1030"/>
+        </w:numPr>
+        <w:pStyle w:val="Compact"/>
+      </w:pPr>
+      <w:r>
+        <w:t xml:space="preserve">alerta de vencimento a 40 e a 30 dias;</w:t>
+      </w:r>
+    </w:p>
+    <w:p>
+      <w:pPr>
+        <w:numPr>
+          <w:ilvl w:val="1"/>
+          <w:numId w:val="1030"/>
+        </w:numPr>
+        <w:pStyle w:val="Compact"/>
+      </w:pPr>
+      <w:r>
+        <w:t xml:space="preserve">renovar e negociar;</w:t>
+      </w:r>
+    </w:p>
+    <w:p>
+      <w:pPr>
+        <w:numPr>
+          <w:ilvl w:val="1"/>
+          <w:numId w:val="1030"/>
+        </w:numPr>
+        <w:pStyle w:val="Compact"/>
+      </w:pPr>
+      <w:r>
+        <w:t xml:space="preserve">números do mês e MRR/ARR.</w:t>
+      </w:r>
+    </w:p>
+    <w:p>
+      <w:pPr>
+        <w:numPr>
+          <w:ilvl w:val="0"/>
           <w:numId w:val="1028"/>
         </w:numPr>
         <w:pStyle w:val="Compact"/>
       </w:pPr>
       <w:r>
-        <w:t xml:space="preserve">compras, contratos e oportunidades;</w:t>
-      </w:r>
-    </w:p>
-    <w:p>
-      <w:pPr>
-        <w:numPr>
-          <w:ilvl w:val="1"/>
+        <w:rPr>
+          <w:bCs/>
+          <w:b/>
+        </w:rPr>
+        <w:t xml:space="preserve">Oportunidades.</w:t>
+      </w:r>
+      <w:r>
+        <w:t xml:space="preserve"> </w:t>
+      </w:r>
+      <w:r>
+        <w:t xml:space="preserve">Kanban de novos negócios com quem já é cliente: outro produto, renovação ou aditivo.</w:t>
+      </w:r>
+      <w:r>
+        <w:t xml:space="preserve"> </w:t>
+      </w:r>
+      <w:r>
+        <w:t xml:space="preserve">“</w:t>
+      </w:r>
+      <w:r>
+        <w:t xml:space="preserve">Ganhou</w:t>
+      </w:r>
+      <w:r>
+        <w:t xml:space="preserve">”</w:t>
+      </w:r>
+      <w:r>
+        <w:t xml:space="preserve"> </w:t>
+      </w:r>
+      <w:r>
+        <w:t xml:space="preserve">abre o contrato já preenchido.</w:t>
+      </w:r>
+    </w:p>
+    <w:p>
+      <w:pPr>
+        <w:numPr>
+          <w:ilvl w:val="0"/>
           <w:numId w:val="1028"/>
         </w:numPr>
         <w:pStyle w:val="Compact"/>
       </w:pPr>
       <w:r>
-        <w:t xml:space="preserve">pagamentos anteriores ao sistema.</w:t>
-      </w:r>
-    </w:p>
-    <w:p>
-      <w:pPr>
-        <w:numPr>
-          <w:ilvl w:val="0"/>
-          <w:numId w:val="1027"/>
-        </w:numPr>
-        <w:pStyle w:val="Compact"/>
-      </w:pPr>
-      <w:r>
-        <w:rPr>
-          <w:bCs/>
-          <w:b/>
-        </w:rPr>
-        <w:t xml:space="preserve">Identidade sem duplicar.</w:t>
-      </w:r>
-      <w:r>
-        <w:t xml:space="preserve"> </w:t>
-      </w:r>
-      <w:r>
-        <w:t xml:space="preserve">A mesma pessoa é reconhecida por telefone e e-mail. Cadastro repetido junta sozinho ou por botão, com histórico.</w:t>
-      </w:r>
-    </w:p>
-    <w:p>
-      <w:pPr>
-        <w:numPr>
-          <w:ilvl w:val="0"/>
-          <w:numId w:val="1027"/>
-        </w:numPr>
-        <w:pStyle w:val="Compact"/>
-      </w:pPr>
-      <w:r>
-        <w:rPr>
-          <w:bCs/>
-          <w:b/>
-        </w:rPr>
-        <w:t xml:space="preserve">Vendas.</w:t>
-      </w:r>
-      <w:r>
-        <w:t xml:space="preserve"> </w:t>
-      </w:r>
-      <w:r>
-        <w:t xml:space="preserve">Vendas aprovadas, bruto e líquido, ticket médio e reembolsos. A receita aparece por papel da oferta (order bump, upsell, downsell). Cada venda guarda o primeiro e o último toque, com o painel</w:t>
-      </w:r>
-      <w:r>
-        <w:t xml:space="preserve"> </w:t>
-      </w:r>
-      <w:r>
-        <w:t xml:space="preserve">“</w:t>
-      </w:r>
-      <w:r>
-        <w:t xml:space="preserve">Vendas por canal</w:t>
-      </w:r>
-      <w:r>
-        <w:t xml:space="preserve">”</w:t>
-      </w:r>
-      <w:r>
-        <w:t xml:space="preserve"> </w:t>
-      </w:r>
-      <w:r>
-        <w:t xml:space="preserve">(CAC e ROAS bruto).</w:t>
-      </w:r>
-    </w:p>
-    <w:p>
-      <w:pPr>
-        <w:numPr>
-          <w:ilvl w:val="0"/>
-          <w:numId w:val="1027"/>
-        </w:numPr>
-        <w:pStyle w:val="Compact"/>
-      </w:pPr>
-      <w:r>
-        <w:rPr>
-          <w:bCs/>
-          <w:b/>
-        </w:rPr>
-        <w:t xml:space="preserve">Contratos:</w:t>
-      </w:r>
-    </w:p>
-    <w:p>
-      <w:pPr>
-        <w:numPr>
-          <w:ilvl w:val="1"/>
-          <w:numId w:val="1029"/>
-        </w:numPr>
-        <w:pStyle w:val="Compact"/>
-      </w:pPr>
-      <w:r>
-        <w:t xml:space="preserve">status claros: pendente, assinado e ativo, cancelado, encerrado;</w:t>
-      </w:r>
-    </w:p>
-    <w:p>
-      <w:pPr>
-        <w:numPr>
-          <w:ilvl w:val="1"/>
-          <w:numId w:val="1029"/>
-        </w:numPr>
-        <w:pStyle w:val="Compact"/>
-      </w:pPr>
-      <w:r>
-        <w:t xml:space="preserve">parcelas personalizadas;</w:t>
-      </w:r>
-    </w:p>
-    <w:p>
-      <w:pPr>
-        <w:numPr>
-          <w:ilvl w:val="1"/>
-          <w:numId w:val="1029"/>
-        </w:numPr>
-        <w:pStyle w:val="Compact"/>
-      </w:pPr>
-      <w:r>
-        <w:t xml:space="preserve">alerta de vencimento a 40 e a 30 dias;</w:t>
-      </w:r>
-    </w:p>
-    <w:p>
-      <w:pPr>
-        <w:numPr>
-          <w:ilvl w:val="1"/>
-          <w:numId w:val="1029"/>
-        </w:numPr>
-        <w:pStyle w:val="Compact"/>
-      </w:pPr>
-      <w:r>
-        <w:t xml:space="preserve">renovar e negociar;</w:t>
-      </w:r>
-    </w:p>
-    <w:p>
-      <w:pPr>
-        <w:numPr>
-          <w:ilvl w:val="1"/>
-          <w:numId w:val="1029"/>
-        </w:numPr>
-        <w:pStyle w:val="Compact"/>
-      </w:pPr>
-      <w:r>
-        <w:t xml:space="preserve">números do mês e MRR/ARR.</w:t>
-      </w:r>
-    </w:p>
-    <w:p>
-      <w:pPr>
-        <w:numPr>
-          <w:ilvl w:val="0"/>
-          <w:numId w:val="1027"/>
-        </w:numPr>
-        <w:pStyle w:val="Compact"/>
-      </w:pPr>
-      <w:r>
-        <w:rPr>
-          <w:bCs/>
-          <w:b/>
-        </w:rPr>
-        <w:t xml:space="preserve">Oportunidades.</w:t>
-      </w:r>
-      <w:r>
-        <w:t xml:space="preserve"> </w:t>
-      </w:r>
-      <w:r>
-        <w:t xml:space="preserve">Kanban de novos negócios com quem já é cliente: outro produto, renovação ou aditivo.</w:t>
-      </w:r>
-      <w:r>
-        <w:t xml:space="preserve"> </w:t>
-      </w:r>
-      <w:r>
-        <w:t xml:space="preserve">“</w:t>
-      </w:r>
-      <w:r>
-        <w:t xml:space="preserve">Ganhou</w:t>
-      </w:r>
-      <w:r>
-        <w:t xml:space="preserve">”</w:t>
-      </w:r>
-      <w:r>
-        <w:t xml:space="preserve"> </w:t>
-      </w:r>
-      <w:r>
-        <w:t xml:space="preserve">abre o contrato já preenchido.</w:t>
-      </w:r>
-    </w:p>
-    <w:p>
-      <w:pPr>
-        <w:numPr>
-          <w:ilvl w:val="0"/>
-          <w:numId w:val="1027"/>
-        </w:numPr>
-        <w:pStyle w:val="Compact"/>
-      </w:pPr>
-      <w:r>
         <w:rPr>
           <w:bCs/>
           <w:b/>
@@ -3439,7 +3579,7 @@
       <w:pPr>
         <w:numPr>
           <w:ilvl w:val="0"/>
-          <w:numId w:val="1027"/>
+          <w:numId w:val="1028"/>
         </w:numPr>
         <w:pStyle w:val="Compact"/>
       </w:pPr>
@@ -3461,7 +3601,7 @@
       <w:pPr>
         <w:numPr>
           <w:ilvl w:val="0"/>
-          <w:numId w:val="1027"/>
+          <w:numId w:val="1028"/>
         </w:numPr>
         <w:pStyle w:val="Compact"/>
       </w:pPr>
@@ -3483,7 +3623,7 @@
       <w:pPr>
         <w:numPr>
           <w:ilvl w:val="0"/>
-          <w:numId w:val="1027"/>
+          <w:numId w:val="1028"/>
         </w:numPr>
         <w:pStyle w:val="Compact"/>
       </w:pPr>
@@ -3522,7 +3662,7 @@
       <w:pPr>
         <w:numPr>
           <w:ilvl w:val="0"/>
-          <w:numId w:val="1030"/>
+          <w:numId w:val="1031"/>
         </w:numPr>
         <w:pStyle w:val="Compact"/>
       </w:pPr>
@@ -3541,6 +3681,109 @@
       <w:pPr>
         <w:numPr>
           <w:ilvl w:val="1"/>
+          <w:numId w:val="1032"/>
+        </w:numPr>
+        <w:pStyle w:val="Compact"/>
+      </w:pPr>
+      <w:r>
+        <w:rPr>
+          <w:bCs/>
+          <w:b/>
+        </w:rPr>
+        <w:t xml:space="preserve">Coortes:</w:t>
+      </w:r>
+      <w:r>
+        <w:t xml:space="preserve"> </w:t>
+      </w:r>
+      <w:r>
+        <w:t xml:space="preserve">segunda compra em 30, 60, 90, 180 e 365 dias, receita acumulada por cliente, curva D0 a D365 e matriz de coortes. Coorte que não completou o prazo aparece como</w:t>
+      </w:r>
+      <w:r>
+        <w:t xml:space="preserve"> </w:t>
+      </w:r>
+      <w:r>
+        <w:t xml:space="preserve">“</w:t>
+      </w:r>
+      <w:r>
+        <w:t xml:space="preserve">indisponível</w:t>
+      </w:r>
+      <w:r>
+        <w:t xml:space="preserve">”</w:t>
+      </w:r>
+      <w:r>
+        <w:t xml:space="preserve">, com o parcial à mostra.</w:t>
+      </w:r>
+    </w:p>
+    <w:p>
+      <w:pPr>
+        <w:numPr>
+          <w:ilvl w:val="1"/>
+          <w:numId w:val="1032"/>
+        </w:numPr>
+        <w:pStyle w:val="Compact"/>
+      </w:pPr>
+      <w:r>
+        <w:rPr>
+          <w:bCs/>
+          <w:b/>
+        </w:rPr>
+        <w:t xml:space="preserve">Recompra:</w:t>
+      </w:r>
+      <w:r>
+        <w:t xml:space="preserve"> </w:t>
+      </w:r>
+      <w:r>
+        <w:t xml:space="preserve">taxa, intervalo entre compras, frequência, ticket de recompra, receita de novos contra existentes e o papel de cada produto de entrada (expande, recompra moderada, não expande).</w:t>
+      </w:r>
+    </w:p>
+    <w:p>
+      <w:pPr>
+        <w:numPr>
+          <w:ilvl w:val="1"/>
+          <w:numId w:val="1032"/>
+        </w:numPr>
+        <w:pStyle w:val="Compact"/>
+      </w:pPr>
+      <w:r>
+        <w:rPr>
+          <w:bCs/>
+          <w:b/>
+        </w:rPr>
+        <w:t xml:space="preserve">RFM:</w:t>
+      </w:r>
+      <w:r>
+        <w:t xml:space="preserve"> </w:t>
+      </w:r>
+      <w:r>
+        <w:t xml:space="preserve">sete segmentos com regras editáveis, a grade R×F e o cruzamento com produto, campanha, canal e origem.</w:t>
+      </w:r>
+    </w:p>
+    <w:p>
+      <w:pPr>
+        <w:numPr>
+          <w:ilvl w:val="1"/>
+          <w:numId w:val="1032"/>
+        </w:numPr>
+        <w:pStyle w:val="Compact"/>
+      </w:pPr>
+      <w:r>
+        <w:rPr>
+          <w:bCs/>
+          <w:b/>
+        </w:rPr>
+        <w:t xml:space="preserve">Investigar:</w:t>
+      </w:r>
+      <w:r>
+        <w:t xml:space="preserve"> </w:t>
+      </w:r>
+      <w:r>
+        <w:t xml:space="preserve">qualquer número abre a lista de clientes com o histórico, exportável.</w:t>
+      </w:r>
+    </w:p>
+    <w:p>
+      <w:pPr>
+        <w:numPr>
+          <w:ilvl w:val="0"/>
           <w:numId w:val="1031"/>
         </w:numPr>
         <w:pStyle w:val="Compact"/>
@@ -3550,123 +3793,20 @@
           <w:bCs/>
           <w:b/>
         </w:rPr>
-        <w:t xml:space="preserve">Coortes:</w:t>
-      </w:r>
-      <w:r>
-        <w:t xml:space="preserve"> </w:t>
-      </w:r>
-      <w:r>
-        <w:t xml:space="preserve">segunda compra em 30, 60, 90, 180 e 365 dias, receita acumulada por cliente, curva D0 a D365 e matriz de coortes. Coorte que não completou o prazo aparece como</w:t>
-      </w:r>
-      <w:r>
-        <w:t xml:space="preserve"> </w:t>
-      </w:r>
-      <w:r>
-        <w:t xml:space="preserve">“</w:t>
-      </w:r>
-      <w:r>
-        <w:t xml:space="preserve">indisponível</w:t>
-      </w:r>
-      <w:r>
-        <w:t xml:space="preserve">”</w:t>
-      </w:r>
-      <w:r>
-        <w:t xml:space="preserve">, com o parcial à mostra.</w:t>
-      </w:r>
-    </w:p>
-    <w:p>
-      <w:pPr>
-        <w:numPr>
-          <w:ilvl w:val="1"/>
+        <w:t xml:space="preserve">Alunos.</w:t>
+      </w:r>
+      <w:r>
+        <w:t xml:space="preserve"> </w:t>
+      </w:r>
+      <w:r>
+        <w:t xml:space="preserve">Kanban do onboarding e da jornada do aluno, com CS responsável. O aluno nasce sozinho na venda ou no contrato.</w:t>
+      </w:r>
+    </w:p>
+    <w:p>
+      <w:pPr>
+        <w:numPr>
+          <w:ilvl w:val="0"/>
           <w:numId w:val="1031"/>
-        </w:numPr>
-        <w:pStyle w:val="Compact"/>
-      </w:pPr>
-      <w:r>
-        <w:rPr>
-          <w:bCs/>
-          <w:b/>
-        </w:rPr>
-        <w:t xml:space="preserve">Recompra:</w:t>
-      </w:r>
-      <w:r>
-        <w:t xml:space="preserve"> </w:t>
-      </w:r>
-      <w:r>
-        <w:t xml:space="preserve">taxa, intervalo entre compras, frequência, ticket de recompra, receita de novos contra existentes e o papel de cada produto de entrada (expande, recompra moderada, não expande).</w:t>
-      </w:r>
-    </w:p>
-    <w:p>
-      <w:pPr>
-        <w:numPr>
-          <w:ilvl w:val="1"/>
-          <w:numId w:val="1031"/>
-        </w:numPr>
-        <w:pStyle w:val="Compact"/>
-      </w:pPr>
-      <w:r>
-        <w:rPr>
-          <w:bCs/>
-          <w:b/>
-        </w:rPr>
-        <w:t xml:space="preserve">RFM:</w:t>
-      </w:r>
-      <w:r>
-        <w:t xml:space="preserve"> </w:t>
-      </w:r>
-      <w:r>
-        <w:t xml:space="preserve">sete segmentos com regras editáveis, a grade R×F e o cruzamento com produto, campanha, canal e origem.</w:t>
-      </w:r>
-    </w:p>
-    <w:p>
-      <w:pPr>
-        <w:numPr>
-          <w:ilvl w:val="1"/>
-          <w:numId w:val="1031"/>
-        </w:numPr>
-        <w:pStyle w:val="Compact"/>
-      </w:pPr>
-      <w:r>
-        <w:rPr>
-          <w:bCs/>
-          <w:b/>
-        </w:rPr>
-        <w:t xml:space="preserve">Investigar:</w:t>
-      </w:r>
-      <w:r>
-        <w:t xml:space="preserve"> </w:t>
-      </w:r>
-      <w:r>
-        <w:t xml:space="preserve">qualquer número abre a lista de clientes com o histórico, exportável.</w:t>
-      </w:r>
-    </w:p>
-    <w:p>
-      <w:pPr>
-        <w:numPr>
-          <w:ilvl w:val="0"/>
-          <w:numId w:val="1030"/>
-        </w:numPr>
-        <w:pStyle w:val="Compact"/>
-      </w:pPr>
-      <w:r>
-        <w:rPr>
-          <w:bCs/>
-          <w:b/>
-        </w:rPr>
-        <w:t xml:space="preserve">Alunos.</w:t>
-      </w:r>
-      <w:r>
-        <w:t xml:space="preserve"> </w:t>
-      </w:r>
-      <w:r>
-        <w:t xml:space="preserve">Kanban do onboarding e da jornada do aluno, com CS responsável. O aluno nasce sozinho na venda ou no contrato.</w:t>
-      </w:r>
-    </w:p>
-    <w:p>
-      <w:pPr>
-        <w:numPr>
-          <w:ilvl w:val="0"/>
-          <w:numId w:val="1030"/>
         </w:numPr>
         <w:pStyle w:val="Compact"/>
       </w:pPr>
@@ -3705,7 +3845,7 @@
       <w:pPr>
         <w:numPr>
           <w:ilvl w:val="0"/>
-          <w:numId w:val="1032"/>
+          <w:numId w:val="1033"/>
         </w:numPr>
         <w:pStyle w:val="Compact"/>
       </w:pPr>
@@ -3727,7 +3867,7 @@
       <w:pPr>
         <w:numPr>
           <w:ilvl w:val="0"/>
-          <w:numId w:val="1032"/>
+          <w:numId w:val="1033"/>
         </w:numPr>
         <w:pStyle w:val="Compact"/>
       </w:pPr>
@@ -3749,7 +3889,7 @@
       <w:pPr>
         <w:numPr>
           <w:ilvl w:val="0"/>
-          <w:numId w:val="1032"/>
+          <w:numId w:val="1033"/>
         </w:numPr>
         <w:pStyle w:val="Compact"/>
       </w:pPr>
@@ -3771,7 +3911,7 @@
       <w:pPr>
         <w:numPr>
           <w:ilvl w:val="0"/>
-          <w:numId w:val="1032"/>
+          <w:numId w:val="1033"/>
         </w:numPr>
         <w:pStyle w:val="Compact"/>
       </w:pPr>
@@ -3793,7 +3933,7 @@
       <w:pPr>
         <w:numPr>
           <w:ilvl w:val="0"/>
-          <w:numId w:val="1032"/>
+          <w:numId w:val="1033"/>
         </w:numPr>
         <w:pStyle w:val="Compact"/>
       </w:pPr>
@@ -3812,7 +3952,7 @@
       <w:pPr>
         <w:numPr>
           <w:ilvl w:val="0"/>
-          <w:numId w:val="1032"/>
+          <w:numId w:val="1033"/>
         </w:numPr>
         <w:pStyle w:val="Compact"/>
       </w:pPr>
@@ -3834,7 +3974,7 @@
       <w:pPr>
         <w:numPr>
           <w:ilvl w:val="0"/>
-          <w:numId w:val="1032"/>
+          <w:numId w:val="1033"/>
         </w:numPr>
         <w:pStyle w:val="Compact"/>
       </w:pPr>
@@ -3850,132 +3990,132 @@
       <w:pPr>
         <w:numPr>
           <w:ilvl w:val="1"/>
+          <w:numId w:val="1034"/>
+        </w:numPr>
+        <w:pStyle w:val="Compact"/>
+      </w:pPr>
+      <w:r>
+        <w:t xml:space="preserve">custo do mês (fixo, variável, parcelado, pontual) e pró-labores;</w:t>
+      </w:r>
+    </w:p>
+    <w:p>
+      <w:pPr>
+        <w:numPr>
+          <w:ilvl w:val="1"/>
+          <w:numId w:val="1034"/>
+        </w:numPr>
+        <w:pStyle w:val="Compact"/>
+      </w:pPr>
+      <w:r>
+        <w:t xml:space="preserve">margem de contribuição por produto e lucro líquido;</w:t>
+      </w:r>
+    </w:p>
+    <w:p>
+      <w:pPr>
+        <w:numPr>
+          <w:ilvl w:val="1"/>
+          <w:numId w:val="1034"/>
+        </w:numPr>
+        <w:pStyle w:val="Compact"/>
+      </w:pPr>
+      <w:r>
+        <w:t xml:space="preserve">ponto de equilíbrio e</w:t>
+      </w:r>
+      <w:r>
+        <w:t xml:space="preserve"> </w:t>
+      </w:r>
+      <w:r>
+        <w:t xml:space="preserve">“</w:t>
+      </w:r>
+      <w:r>
+        <w:t xml:space="preserve">quanto preciso vender</w:t>
+      </w:r>
+      <w:r>
+        <w:t xml:space="preserve">”</w:t>
+      </w:r>
+      <w:r>
+        <w:t xml:space="preserve">;</w:t>
+      </w:r>
+    </w:p>
+    <w:p>
+      <w:pPr>
+        <w:numPr>
+          <w:ilvl w:val="1"/>
+          <w:numId w:val="1034"/>
+        </w:numPr>
+        <w:pStyle w:val="Compact"/>
+      </w:pPr>
+      <w:r>
+        <w:t xml:space="preserve">comparação entre regimes tributários;</w:t>
+      </w:r>
+    </w:p>
+    <w:p>
+      <w:pPr>
+        <w:numPr>
+          <w:ilvl w:val="1"/>
+          <w:numId w:val="1034"/>
+        </w:numPr>
+        <w:pStyle w:val="Compact"/>
+      </w:pPr>
+      <w:r>
+        <w:t xml:space="preserve">cenários ruim, bom e ótimo de margem;</w:t>
+      </w:r>
+    </w:p>
+    <w:p>
+      <w:pPr>
+        <w:numPr>
+          <w:ilvl w:val="1"/>
+          <w:numId w:val="1034"/>
+        </w:numPr>
+        <w:pStyle w:val="Compact"/>
+      </w:pPr>
+      <w:r>
+        <w:t xml:space="preserve">custo por área contra o mês anterior.</w:t>
+      </w:r>
+    </w:p>
+    <w:p>
+      <w:pPr>
+        <w:numPr>
+          <w:ilvl w:val="0"/>
           <w:numId w:val="1033"/>
         </w:numPr>
         <w:pStyle w:val="Compact"/>
       </w:pPr>
       <w:r>
-        <w:t xml:space="preserve">custo do mês (fixo, variável, parcelado, pontual) e pró-labores;</w:t>
-      </w:r>
-    </w:p>
-    <w:p>
-      <w:pPr>
-        <w:numPr>
-          <w:ilvl w:val="1"/>
+        <w:rPr>
+          <w:bCs/>
+          <w:b/>
+        </w:rPr>
+        <w:t xml:space="preserve">Saldo mínimo de caixa</w:t>
+      </w:r>
+      <w:r>
+        <w:t xml:space="preserve">, com aviso no Dashboard.</w:t>
+      </w:r>
+    </w:p>
+    <w:p>
+      <w:pPr>
+        <w:numPr>
+          <w:ilvl w:val="0"/>
           <w:numId w:val="1033"/>
         </w:numPr>
         <w:pStyle w:val="Compact"/>
       </w:pPr>
       <w:r>
-        <w:t xml:space="preserve">margem de contribuição por produto e lucro líquido;</w:t>
-      </w:r>
-    </w:p>
-    <w:p>
-      <w:pPr>
-        <w:numPr>
-          <w:ilvl w:val="1"/>
+        <w:rPr>
+          <w:bCs/>
+          <w:b/>
+        </w:rPr>
+        <w:t xml:space="preserve">Plano de contas por cliente</w:t>
+      </w:r>
+      <w:r>
+        <w:t xml:space="preserve">: importar, baixar e ligar as contas do sistema.</w:t>
+      </w:r>
+    </w:p>
+    <w:p>
+      <w:pPr>
+        <w:numPr>
+          <w:ilvl w:val="0"/>
           <w:numId w:val="1033"/>
-        </w:numPr>
-        <w:pStyle w:val="Compact"/>
-      </w:pPr>
-      <w:r>
-        <w:t xml:space="preserve">ponto de equilíbrio e</w:t>
-      </w:r>
-      <w:r>
-        <w:t xml:space="preserve"> </w:t>
-      </w:r>
-      <w:r>
-        <w:t xml:space="preserve">“</w:t>
-      </w:r>
-      <w:r>
-        <w:t xml:space="preserve">quanto preciso vender</w:t>
-      </w:r>
-      <w:r>
-        <w:t xml:space="preserve">”</w:t>
-      </w:r>
-      <w:r>
-        <w:t xml:space="preserve">;</w:t>
-      </w:r>
-    </w:p>
-    <w:p>
-      <w:pPr>
-        <w:numPr>
-          <w:ilvl w:val="1"/>
-          <w:numId w:val="1033"/>
-        </w:numPr>
-        <w:pStyle w:val="Compact"/>
-      </w:pPr>
-      <w:r>
-        <w:t xml:space="preserve">comparação entre regimes tributários;</w:t>
-      </w:r>
-    </w:p>
-    <w:p>
-      <w:pPr>
-        <w:numPr>
-          <w:ilvl w:val="1"/>
-          <w:numId w:val="1033"/>
-        </w:numPr>
-        <w:pStyle w:val="Compact"/>
-      </w:pPr>
-      <w:r>
-        <w:t xml:space="preserve">cenários ruim, bom e ótimo de margem;</w:t>
-      </w:r>
-    </w:p>
-    <w:p>
-      <w:pPr>
-        <w:numPr>
-          <w:ilvl w:val="1"/>
-          <w:numId w:val="1033"/>
-        </w:numPr>
-        <w:pStyle w:val="Compact"/>
-      </w:pPr>
-      <w:r>
-        <w:t xml:space="preserve">custo por área contra o mês anterior.</w:t>
-      </w:r>
-    </w:p>
-    <w:p>
-      <w:pPr>
-        <w:numPr>
-          <w:ilvl w:val="0"/>
-          <w:numId w:val="1032"/>
-        </w:numPr>
-        <w:pStyle w:val="Compact"/>
-      </w:pPr>
-      <w:r>
-        <w:rPr>
-          <w:bCs/>
-          <w:b/>
-        </w:rPr>
-        <w:t xml:space="preserve">Saldo mínimo de caixa</w:t>
-      </w:r>
-      <w:r>
-        <w:t xml:space="preserve">, com aviso no Dashboard.</w:t>
-      </w:r>
-    </w:p>
-    <w:p>
-      <w:pPr>
-        <w:numPr>
-          <w:ilvl w:val="0"/>
-          <w:numId w:val="1032"/>
-        </w:numPr>
-        <w:pStyle w:val="Compact"/>
-      </w:pPr>
-      <w:r>
-        <w:rPr>
-          <w:bCs/>
-          <w:b/>
-        </w:rPr>
-        <w:t xml:space="preserve">Plano de contas por cliente</w:t>
-      </w:r>
-      <w:r>
-        <w:t xml:space="preserve">: importar, baixar e ligar as contas do sistema.</w:t>
-      </w:r>
-    </w:p>
-    <w:p>
-      <w:pPr>
-        <w:numPr>
-          <w:ilvl w:val="0"/>
-          <w:numId w:val="1032"/>
         </w:numPr>
         <w:pStyle w:val="Compact"/>
       </w:pPr>
@@ -4029,7 +4169,7 @@
       <w:pPr>
         <w:numPr>
           <w:ilvl w:val="0"/>
-          <w:numId w:val="1034"/>
+          <w:numId w:val="1035"/>
         </w:numPr>
         <w:pStyle w:val="Compact"/>
       </w:pPr>
@@ -4051,7 +4191,7 @@
       <w:pPr>
         <w:numPr>
           <w:ilvl w:val="0"/>
-          <w:numId w:val="1034"/>
+          <w:numId w:val="1035"/>
         </w:numPr>
         <w:pStyle w:val="Compact"/>
       </w:pPr>
@@ -4067,210 +4207,210 @@
       <w:pPr>
         <w:numPr>
           <w:ilvl w:val="1"/>
+          <w:numId w:val="1036"/>
+        </w:numPr>
+        <w:pStyle w:val="Compact"/>
+      </w:pPr>
+      <w:r>
+        <w:t xml:space="preserve">colunas Real + projeção (travado), Cenário (onde se mexe) e Efeito;</w:t>
+      </w:r>
+    </w:p>
+    <w:p>
+      <w:pPr>
+        <w:numPr>
+          <w:ilvl w:val="1"/>
+          <w:numId w:val="1036"/>
+        </w:numPr>
+        <w:pStyle w:val="Compact"/>
+      </w:pPr>
+      <w:r>
+        <w:t xml:space="preserve">mexeu numa célula, o resto recalcula: o preço sobe, a receita sobe, o imposto acompanha, a margem e o lucro mudam;</w:t>
+      </w:r>
+    </w:p>
+    <w:p>
+      <w:pPr>
+        <w:numPr>
+          <w:ilvl w:val="1"/>
+          <w:numId w:val="1036"/>
+        </w:numPr>
+        <w:pStyle w:val="Compact"/>
+      </w:pPr>
+      <w:r>
+        <w:t xml:space="preserve">amarelo é o que se mexeu, azul é o que mudou por consequência;</w:t>
+      </w:r>
+    </w:p>
+    <w:p>
+      <w:pPr>
+        <w:numPr>
+          <w:ilvl w:val="1"/>
+          <w:numId w:val="1036"/>
+        </w:numPr>
+        <w:pStyle w:val="Compact"/>
+      </w:pPr>
+      <w:r>
+        <w:t xml:space="preserve">resultado do período, um bloco por produto e uma seção por loop ou campanha;</w:t>
+      </w:r>
+    </w:p>
+    <w:p>
+      <w:pPr>
+        <w:numPr>
+          <w:ilvl w:val="1"/>
+          <w:numId w:val="1036"/>
+        </w:numPr>
+        <w:pStyle w:val="Compact"/>
+      </w:pPr>
+      <w:r>
+        <w:t xml:space="preserve">comparar até 3 cenários lado a lado.</w:t>
+      </w:r>
+    </w:p>
+    <w:p>
+      <w:pPr>
+        <w:numPr>
+          <w:ilvl w:val="0"/>
           <w:numId w:val="1035"/>
         </w:numPr>
         <w:pStyle w:val="Compact"/>
       </w:pPr>
       <w:r>
-        <w:t xml:space="preserve">colunas Real + projeção (travado), Cenário (onde se mexe) e Efeito;</w:t>
-      </w:r>
-    </w:p>
-    <w:p>
-      <w:pPr>
-        <w:numPr>
-          <w:ilvl w:val="1"/>
+        <w:rPr>
+          <w:bCs/>
+          <w:b/>
+        </w:rPr>
+        <w:t xml:space="preserve">Cenários com ciclo de vida.</w:t>
+      </w:r>
+      <w:r>
+        <w:t xml:space="preserve"> </w:t>
+      </w:r>
+      <w:r>
+        <w:t xml:space="preserve">Em estudo, descartado (com motivo, e dá para reabrir), aprovado, ativo, encerrado, cancelado.</w:t>
+      </w:r>
+    </w:p>
+    <w:p>
+      <w:pPr>
+        <w:numPr>
+          <w:ilvl w:val="0"/>
           <w:numId w:val="1035"/>
         </w:numPr>
         <w:pStyle w:val="Compact"/>
       </w:pPr>
       <w:r>
-        <w:t xml:space="preserve">mexeu numa célula, o resto recalcula: o preço sobe, a receita sobe, o imposto acompanha, a margem e o lucro mudam;</w:t>
-      </w:r>
-    </w:p>
-    <w:p>
-      <w:pPr>
-        <w:numPr>
-          <w:ilvl w:val="1"/>
+        <w:rPr>
+          <w:bCs/>
+          <w:b/>
+        </w:rPr>
+        <w:t xml:space="preserve">Decisão.</w:t>
+      </w:r>
+      <w:r>
+        <w:t xml:space="preserve"> </w:t>
+      </w:r>
+      <w:r>
+        <w:t xml:space="preserve">ICE (impacto, confiança, facilidade) com justificativa. A aprovação congela o cenário e gera o documento de decisão imutável (contexto, hipótese, baseline contra projeção, riscos, responsável) e a ideia no Kanban.</w:t>
+      </w:r>
+    </w:p>
+    <w:p>
+      <w:pPr>
+        <w:numPr>
+          <w:ilvl w:val="0"/>
           <w:numId w:val="1035"/>
         </w:numPr>
         <w:pStyle w:val="Compact"/>
       </w:pPr>
       <w:r>
-        <w:t xml:space="preserve">amarelo é o que se mexeu, azul é o que mudou por consequência;</w:t>
-      </w:r>
-    </w:p>
-    <w:p>
-      <w:pPr>
-        <w:numPr>
-          <w:ilvl w:val="1"/>
+        <w:rPr>
+          <w:bCs/>
+          <w:b/>
+        </w:rPr>
+        <w:t xml:space="preserve">Ciclo de Growth (Kanban de experimentos).</w:t>
+      </w:r>
+      <w:r>
+        <w:t xml:space="preserve"> </w:t>
+      </w:r>
+      <w:r>
+        <w:t xml:space="preserve">Ideias → em avaliação → priorizadas → preparação → em teste → análise → concluídas. Cada experimento tem o desenho do teste: métrica-alvo, público, intervenção, critério de sucesso.</w:t>
+      </w:r>
+    </w:p>
+    <w:p>
+      <w:pPr>
+        <w:numPr>
+          <w:ilvl w:val="0"/>
           <w:numId w:val="1035"/>
         </w:numPr>
         <w:pStyle w:val="Compact"/>
       </w:pPr>
       <w:r>
-        <w:t xml:space="preserve">resultado do período, um bloco por produto e uma seção por loop ou campanha;</w:t>
-      </w:r>
-    </w:p>
-    <w:p>
-      <w:pPr>
-        <w:numPr>
-          <w:ilvl w:val="1"/>
+        <w:rPr>
+          <w:bCs/>
+          <w:b/>
+        </w:rPr>
+        <w:t xml:space="preserve">Guardrails.</w:t>
+      </w:r>
+      <w:r>
+        <w:t xml:space="preserve"> </w:t>
+      </w:r>
+      <w:r>
+        <w:t xml:space="preserve">Limites de margem, lucro, ROAS, CAC, CPL e outros:</w:t>
+      </w:r>
+    </w:p>
+    <w:p>
+      <w:pPr>
+        <w:numPr>
+          <w:ilvl w:val="1"/>
+          <w:numId w:val="1037"/>
+        </w:numPr>
+        <w:pStyle w:val="Compact"/>
+      </w:pPr>
+      <w:r>
+        <w:t xml:space="preserve">projetados no cenário:</w:t>
+      </w:r>
+      <w:r>
+        <w:t xml:space="preserve"> </w:t>
+      </w:r>
+      <w:r>
+        <w:t xml:space="preserve">“</w:t>
+      </w:r>
+      <w:r>
+        <w:t xml:space="preserve">este plano rompe o limite?</w:t>
+      </w:r>
+      <w:r>
+        <w:t xml:space="preserve">”</w:t>
+      </w:r>
+      <w:r>
+        <w:t xml:space="preserve">;</w:t>
+      </w:r>
+    </w:p>
+    <w:p>
+      <w:pPr>
+        <w:numPr>
+          <w:ilvl w:val="1"/>
+          <w:numId w:val="1037"/>
+        </w:numPr>
+        <w:pStyle w:val="Compact"/>
+      </w:pPr>
+      <w:r>
+        <w:t xml:space="preserve">monitorados de verdade quando o teste vai ao ar: antes, durante e depois;</w:t>
+      </w:r>
+    </w:p>
+    <w:p>
+      <w:pPr>
+        <w:numPr>
+          <w:ilvl w:val="1"/>
+          <w:numId w:val="1037"/>
+        </w:numPr>
+        <w:pStyle w:val="Compact"/>
+      </w:pPr>
+      <w:r>
+        <w:t xml:space="preserve">quando rompem, geram alerta com a ação sugerida. Nada é pausado sozinho.</w:t>
+      </w:r>
+    </w:p>
+    <w:p>
+      <w:pPr>
+        <w:numPr>
+          <w:ilvl w:val="0"/>
           <w:numId w:val="1035"/>
         </w:numPr>
         <w:pStyle w:val="Compact"/>
       </w:pPr>
       <w:r>
-        <w:t xml:space="preserve">comparar até 3 cenários lado a lado.</w:t>
-      </w:r>
-    </w:p>
-    <w:p>
-      <w:pPr>
-        <w:numPr>
-          <w:ilvl w:val="0"/>
-          <w:numId w:val="1034"/>
-        </w:numPr>
-        <w:pStyle w:val="Compact"/>
-      </w:pPr>
-      <w:r>
-        <w:rPr>
-          <w:bCs/>
-          <w:b/>
-        </w:rPr>
-        <w:t xml:space="preserve">Cenários com ciclo de vida.</w:t>
-      </w:r>
-      <w:r>
-        <w:t xml:space="preserve"> </w:t>
-      </w:r>
-      <w:r>
-        <w:t xml:space="preserve">Em estudo, descartado (com motivo, e dá para reabrir), aprovado, ativo, encerrado, cancelado.</w:t>
-      </w:r>
-    </w:p>
-    <w:p>
-      <w:pPr>
-        <w:numPr>
-          <w:ilvl w:val="0"/>
-          <w:numId w:val="1034"/>
-        </w:numPr>
-        <w:pStyle w:val="Compact"/>
-      </w:pPr>
-      <w:r>
-        <w:rPr>
-          <w:bCs/>
-          <w:b/>
-        </w:rPr>
-        <w:t xml:space="preserve">Decisão.</w:t>
-      </w:r>
-      <w:r>
-        <w:t xml:space="preserve"> </w:t>
-      </w:r>
-      <w:r>
-        <w:t xml:space="preserve">ICE (impacto, confiança, facilidade) com justificativa. A aprovação congela o cenário e gera o documento de decisão imutável (contexto, hipótese, baseline contra projeção, riscos, responsável) e a ideia no Kanban.</w:t>
-      </w:r>
-    </w:p>
-    <w:p>
-      <w:pPr>
-        <w:numPr>
-          <w:ilvl w:val="0"/>
-          <w:numId w:val="1034"/>
-        </w:numPr>
-        <w:pStyle w:val="Compact"/>
-      </w:pPr>
-      <w:r>
-        <w:rPr>
-          <w:bCs/>
-          <w:b/>
-        </w:rPr>
-        <w:t xml:space="preserve">Ciclo de Growth (Kanban de experimentos).</w:t>
-      </w:r>
-      <w:r>
-        <w:t xml:space="preserve"> </w:t>
-      </w:r>
-      <w:r>
-        <w:t xml:space="preserve">Ideias → em avaliação → priorizadas → preparação → em teste → análise → concluídas. Cada experimento tem o desenho do teste: métrica-alvo, público, intervenção, critério de sucesso.</w:t>
-      </w:r>
-    </w:p>
-    <w:p>
-      <w:pPr>
-        <w:numPr>
-          <w:ilvl w:val="0"/>
-          <w:numId w:val="1034"/>
-        </w:numPr>
-        <w:pStyle w:val="Compact"/>
-      </w:pPr>
-      <w:r>
-        <w:rPr>
-          <w:bCs/>
-          <w:b/>
-        </w:rPr>
-        <w:t xml:space="preserve">Guardrails.</w:t>
-      </w:r>
-      <w:r>
-        <w:t xml:space="preserve"> </w:t>
-      </w:r>
-      <w:r>
-        <w:t xml:space="preserve">Limites de margem, lucro, ROAS, CAC, CPL e outros:</w:t>
-      </w:r>
-    </w:p>
-    <w:p>
-      <w:pPr>
-        <w:numPr>
-          <w:ilvl w:val="1"/>
-          <w:numId w:val="1036"/>
-        </w:numPr>
-        <w:pStyle w:val="Compact"/>
-      </w:pPr>
-      <w:r>
-        <w:t xml:space="preserve">projetados no cenário:</w:t>
-      </w:r>
-      <w:r>
-        <w:t xml:space="preserve"> </w:t>
-      </w:r>
-      <w:r>
-        <w:t xml:space="preserve">“</w:t>
-      </w:r>
-      <w:r>
-        <w:t xml:space="preserve">este plano rompe o limite?</w:t>
-      </w:r>
-      <w:r>
-        <w:t xml:space="preserve">”</w:t>
-      </w:r>
-      <w:r>
-        <w:t xml:space="preserve">;</w:t>
-      </w:r>
-    </w:p>
-    <w:p>
-      <w:pPr>
-        <w:numPr>
-          <w:ilvl w:val="1"/>
-          <w:numId w:val="1036"/>
-        </w:numPr>
-        <w:pStyle w:val="Compact"/>
-      </w:pPr>
-      <w:r>
-        <w:t xml:space="preserve">monitorados de verdade quando o teste vai ao ar: antes, durante e depois;</w:t>
-      </w:r>
-    </w:p>
-    <w:p>
-      <w:pPr>
-        <w:numPr>
-          <w:ilvl w:val="1"/>
-          <w:numId w:val="1036"/>
-        </w:numPr>
-        <w:pStyle w:val="Compact"/>
-      </w:pPr>
-      <w:r>
-        <w:t xml:space="preserve">quando rompem, geram alerta com a ação sugerida. Nada é pausado sozinho.</w:t>
-      </w:r>
-    </w:p>
-    <w:p>
-      <w:pPr>
-        <w:numPr>
-          <w:ilvl w:val="0"/>
-          <w:numId w:val="1034"/>
-        </w:numPr>
-        <w:pStyle w:val="Compact"/>
-      </w:pPr>
-      <w:r>
         <w:rPr>
           <w:bCs/>
           <w:b/>
@@ -4288,7 +4428,7 @@
       <w:pPr>
         <w:numPr>
           <w:ilvl w:val="0"/>
-          <w:numId w:val="1034"/>
+          <w:numId w:val="1035"/>
         </w:numPr>
         <w:pStyle w:val="Compact"/>
       </w:pPr>
@@ -4304,7 +4444,7 @@
       <w:pPr>
         <w:numPr>
           <w:ilvl w:val="1"/>
-          <w:numId w:val="1037"/>
+          <w:numId w:val="1038"/>
         </w:numPr>
         <w:pStyle w:val="Compact"/>
       </w:pPr>
@@ -4316,7 +4456,7 @@
       <w:pPr>
         <w:numPr>
           <w:ilvl w:val="1"/>
-          <w:numId w:val="1037"/>
+          <w:numId w:val="1038"/>
         </w:numPr>
         <w:pStyle w:val="Compact"/>
       </w:pPr>
@@ -4328,7 +4468,7 @@
       <w:pPr>
         <w:numPr>
           <w:ilvl w:val="1"/>
-          <w:numId w:val="1037"/>
+          <w:numId w:val="1038"/>
         </w:numPr>
         <w:pStyle w:val="Compact"/>
       </w:pPr>
@@ -4340,7 +4480,7 @@
       <w:pPr>
         <w:numPr>
           <w:ilvl w:val="1"/>
-          <w:numId w:val="1037"/>
+          <w:numId w:val="1038"/>
         </w:numPr>
         <w:pStyle w:val="Compact"/>
       </w:pPr>
@@ -4362,7 +4502,7 @@
       <w:pPr>
         <w:numPr>
           <w:ilvl w:val="1"/>
-          <w:numId w:val="1037"/>
+          <w:numId w:val="1038"/>
         </w:numPr>
         <w:pStyle w:val="Compact"/>
       </w:pPr>
@@ -4384,7 +4524,7 @@
       <w:pPr>
         <w:numPr>
           <w:ilvl w:val="1"/>
-          <w:numId w:val="1037"/>
+          <w:numId w:val="1038"/>
         </w:numPr>
         <w:pStyle w:val="Compact"/>
       </w:pPr>
@@ -4428,7 +4568,7 @@
       <w:pPr>
         <w:numPr>
           <w:ilvl w:val="0"/>
-          <w:numId w:val="1038"/>
+          <w:numId w:val="1039"/>
         </w:numPr>
         <w:pStyle w:val="Compact"/>
       </w:pPr>
@@ -4450,7 +4590,7 @@
       <w:pPr>
         <w:numPr>
           <w:ilvl w:val="0"/>
-          <w:numId w:val="1038"/>
+          <w:numId w:val="1039"/>
         </w:numPr>
         <w:pStyle w:val="Compact"/>
       </w:pPr>
@@ -4472,7 +4612,7 @@
       <w:pPr>
         <w:numPr>
           <w:ilvl w:val="0"/>
-          <w:numId w:val="1038"/>
+          <w:numId w:val="1039"/>
         </w:numPr>
         <w:pStyle w:val="Compact"/>
       </w:pPr>
@@ -4488,7 +4628,7 @@
       <w:pPr>
         <w:numPr>
           <w:ilvl w:val="0"/>
-          <w:numId w:val="1038"/>
+          <w:numId w:val="1039"/>
         </w:numPr>
         <w:pStyle w:val="Compact"/>
       </w:pPr>
@@ -4510,7 +4650,7 @@
       <w:pPr>
         <w:numPr>
           <w:ilvl w:val="0"/>
-          <w:numId w:val="1038"/>
+          <w:numId w:val="1039"/>
         </w:numPr>
         <w:pStyle w:val="Compact"/>
       </w:pPr>
@@ -4549,7 +4689,7 @@
       <w:pPr>
         <w:numPr>
           <w:ilvl w:val="0"/>
-          <w:numId w:val="1039"/>
+          <w:numId w:val="1040"/>
         </w:numPr>
         <w:pStyle w:val="Compact"/>
       </w:pPr>
@@ -4571,103 +4711,103 @@
       <w:pPr>
         <w:numPr>
           <w:ilvl w:val="1"/>
+          <w:numId w:val="1041"/>
+        </w:numPr>
+        <w:pStyle w:val="Compact"/>
+      </w:pPr>
+      <w:r>
+        <w:t xml:space="preserve">verde: pronto;</w:t>
+      </w:r>
+    </w:p>
+    <w:p>
+      <w:pPr>
+        <w:numPr>
+          <w:ilvl w:val="1"/>
+          <w:numId w:val="1041"/>
+        </w:numPr>
+        <w:pStyle w:val="Compact"/>
+      </w:pPr>
+      <w:r>
+        <w:t xml:space="preserve">vermelho: tem problema, com o motivo;</w:t>
+      </w:r>
+    </w:p>
+    <w:p>
+      <w:pPr>
+        <w:numPr>
+          <w:ilvl w:val="1"/>
+          <w:numId w:val="1041"/>
+        </w:numPr>
+        <w:pStyle w:val="Compact"/>
+      </w:pPr>
+      <w:r>
+        <w:t xml:space="preserve">amarelo: em dúvida.</w:t>
+      </w:r>
+    </w:p>
+    <w:p>
+      <w:pPr>
+        <w:numPr>
+          <w:ilvl w:val="0"/>
+          <w:numId w:val="1000"/>
+        </w:numPr>
+        <w:pStyle w:val="Compact"/>
+      </w:pPr>
+      <w:r>
+        <w:t xml:space="preserve">Depois vem o de-para campo a campo. Colunas sem campo viram campos personalizados.</w:t>
+      </w:r>
+    </w:p>
+    <w:p>
+      <w:pPr>
+        <w:numPr>
+          <w:ilvl w:val="0"/>
           <w:numId w:val="1040"/>
         </w:numPr>
         <w:pStyle w:val="Compact"/>
       </w:pPr>
       <w:r>
-        <w:t xml:space="preserve">verde: pronto;</w:t>
-      </w:r>
-    </w:p>
-    <w:p>
-      <w:pPr>
-        <w:numPr>
-          <w:ilvl w:val="1"/>
+        <w:rPr>
+          <w:bCs/>
+          <w:b/>
+        </w:rPr>
+        <w:t xml:space="preserve">Qualidade dos dados.</w:t>
+      </w:r>
+      <w:r>
+        <w:t xml:space="preserve"> </w:t>
+      </w:r>
+      <w:r>
+        <w:t xml:space="preserve">10 verificações automáticas, como venda sem origem, mais cliques que impressões, dias sem dado de mídia e mídia dos anúncios diferente do financeiro. Os dashboards marcam com ⚠ os números afetados.</w:t>
+      </w:r>
+    </w:p>
+    <w:p>
+      <w:pPr>
+        <w:numPr>
+          <w:ilvl w:val="0"/>
           <w:numId w:val="1040"/>
         </w:numPr>
         <w:pStyle w:val="Compact"/>
       </w:pPr>
       <w:r>
-        <w:t xml:space="preserve">vermelho: tem problema, com o motivo;</w:t>
-      </w:r>
-    </w:p>
-    <w:p>
-      <w:pPr>
-        <w:numPr>
-          <w:ilvl w:val="1"/>
+        <w:rPr>
+          <w:bCs/>
+          <w:b/>
+        </w:rPr>
+        <w:t xml:space="preserve">Dicionário de métricas.</w:t>
+      </w:r>
+      <w:r>
+        <w:t xml:space="preserve"> </w:t>
+      </w:r>
+      <w:r>
+        <w:t xml:space="preserve">A definição oficial de cada indicador, com o ⓘ nos cartões.</w:t>
+      </w:r>
+    </w:p>
+    <w:p>
+      <w:pPr>
+        <w:numPr>
+          <w:ilvl w:val="0"/>
           <w:numId w:val="1040"/>
         </w:numPr>
         <w:pStyle w:val="Compact"/>
       </w:pPr>
       <w:r>
-        <w:t xml:space="preserve">amarelo: em dúvida.</w:t>
-      </w:r>
-    </w:p>
-    <w:p>
-      <w:pPr>
-        <w:numPr>
-          <w:ilvl w:val="0"/>
-          <w:numId w:val="1000"/>
-        </w:numPr>
-        <w:pStyle w:val="Compact"/>
-      </w:pPr>
-      <w:r>
-        <w:t xml:space="preserve">Depois vem o de-para campo a campo. Colunas sem campo viram campos personalizados.</w:t>
-      </w:r>
-    </w:p>
-    <w:p>
-      <w:pPr>
-        <w:numPr>
-          <w:ilvl w:val="0"/>
-          <w:numId w:val="1039"/>
-        </w:numPr>
-        <w:pStyle w:val="Compact"/>
-      </w:pPr>
-      <w:r>
-        <w:rPr>
-          <w:bCs/>
-          <w:b/>
-        </w:rPr>
-        <w:t xml:space="preserve">Qualidade dos dados.</w:t>
-      </w:r>
-      <w:r>
-        <w:t xml:space="preserve"> </w:t>
-      </w:r>
-      <w:r>
-        <w:t xml:space="preserve">10 verificações automáticas, como venda sem origem, mais cliques que impressões, dias sem dado de mídia e mídia dos anúncios diferente do financeiro. Os dashboards marcam com ⚠ os números afetados.</w:t>
-      </w:r>
-    </w:p>
-    <w:p>
-      <w:pPr>
-        <w:numPr>
-          <w:ilvl w:val="0"/>
-          <w:numId w:val="1039"/>
-        </w:numPr>
-        <w:pStyle w:val="Compact"/>
-      </w:pPr>
-      <w:r>
-        <w:rPr>
-          <w:bCs/>
-          <w:b/>
-        </w:rPr>
-        <w:t xml:space="preserve">Dicionário de métricas.</w:t>
-      </w:r>
-      <w:r>
-        <w:t xml:space="preserve"> </w:t>
-      </w:r>
-      <w:r>
-        <w:t xml:space="preserve">A definição oficial de cada indicador, com o ⓘ nos cartões.</w:t>
-      </w:r>
-    </w:p>
-    <w:p>
-      <w:pPr>
-        <w:numPr>
-          <w:ilvl w:val="0"/>
-          <w:numId w:val="1039"/>
-        </w:numPr>
-        <w:pStyle w:val="Compact"/>
-      </w:pPr>
-      <w:r>
         <w:rPr>
           <w:bCs/>
           <w:b/>
@@ -4685,7 +4825,7 @@
       <w:pPr>
         <w:numPr>
           <w:ilvl w:val="0"/>
-          <w:numId w:val="1039"/>
+          <w:numId w:val="1040"/>
         </w:numPr>
         <w:pStyle w:val="Compact"/>
       </w:pPr>
@@ -4707,7 +4847,7 @@
       <w:pPr>
         <w:numPr>
           <w:ilvl w:val="0"/>
-          <w:numId w:val="1039"/>
+          <w:numId w:val="1040"/>
         </w:numPr>
         <w:pStyle w:val="Compact"/>
       </w:pPr>
@@ -4729,7 +4869,7 @@
       <w:pPr>
         <w:numPr>
           <w:ilvl w:val="0"/>
-          <w:numId w:val="1039"/>
+          <w:numId w:val="1040"/>
         </w:numPr>
         <w:pStyle w:val="Compact"/>
       </w:pPr>
@@ -4766,7 +4906,7 @@
       <w:pPr>
         <w:numPr>
           <w:ilvl w:val="0"/>
-          <w:numId w:val="1039"/>
+          <w:numId w:val="1040"/>
         </w:numPr>
         <w:pStyle w:val="Compact"/>
       </w:pPr>
@@ -4805,7 +4945,7 @@
       <w:pPr>
         <w:numPr>
           <w:ilvl w:val="0"/>
-          <w:numId w:val="1041"/>
+          <w:numId w:val="1042"/>
         </w:numPr>
         <w:pStyle w:val="Compact"/>
       </w:pPr>
@@ -4827,7 +4967,7 @@
       <w:pPr>
         <w:numPr>
           <w:ilvl w:val="0"/>
-          <w:numId w:val="1041"/>
+          <w:numId w:val="1042"/>
         </w:numPr>
         <w:pStyle w:val="Compact"/>
       </w:pPr>
@@ -4846,7 +4986,7 @@
       <w:pPr>
         <w:numPr>
           <w:ilvl w:val="0"/>
-          <w:numId w:val="1041"/>
+          <w:numId w:val="1042"/>
         </w:numPr>
         <w:pStyle w:val="Compact"/>
       </w:pPr>
@@ -4868,7 +5008,7 @@
       <w:pPr>
         <w:numPr>
           <w:ilvl w:val="0"/>
-          <w:numId w:val="1041"/>
+          <w:numId w:val="1042"/>
         </w:numPr>
         <w:pStyle w:val="Compact"/>
       </w:pPr>
@@ -4890,7 +5030,7 @@
       <w:pPr>
         <w:numPr>
           <w:ilvl w:val="0"/>
-          <w:numId w:val="1041"/>
+          <w:numId w:val="1042"/>
         </w:numPr>
         <w:pStyle w:val="Compact"/>
       </w:pPr>
@@ -4906,7 +5046,7 @@
       <w:pPr>
         <w:numPr>
           <w:ilvl w:val="0"/>
-          <w:numId w:val="1041"/>
+          <w:numId w:val="1042"/>
         </w:numPr>
         <w:pStyle w:val="Compact"/>
       </w:pPr>
@@ -4953,7 +5093,7 @@
       <w:pPr>
         <w:numPr>
           <w:ilvl w:val="0"/>
-          <w:numId w:val="1041"/>
+          <w:numId w:val="1042"/>
         </w:numPr>
         <w:pStyle w:val="Compact"/>
       </w:pPr>
@@ -4992,7 +5132,7 @@
       <w:pPr>
         <w:numPr>
           <w:ilvl w:val="0"/>
-          <w:numId w:val="1042"/>
+          <w:numId w:val="1043"/>
         </w:numPr>
         <w:pStyle w:val="Compact"/>
       </w:pPr>
@@ -5014,7 +5154,7 @@
       <w:pPr>
         <w:numPr>
           <w:ilvl w:val="0"/>
-          <w:numId w:val="1042"/>
+          <w:numId w:val="1043"/>
         </w:numPr>
         <w:pStyle w:val="Compact"/>
       </w:pPr>
@@ -5036,7 +5176,7 @@
       <w:pPr>
         <w:numPr>
           <w:ilvl w:val="0"/>
-          <w:numId w:val="1042"/>
+          <w:numId w:val="1043"/>
         </w:numPr>
         <w:pStyle w:val="Compact"/>
       </w:pPr>
@@ -5058,7 +5198,7 @@
       <w:pPr>
         <w:numPr>
           <w:ilvl w:val="0"/>
-          <w:numId w:val="1042"/>
+          <w:numId w:val="1043"/>
         </w:numPr>
         <w:pStyle w:val="Compact"/>
       </w:pPr>
@@ -5080,70 +5220,70 @@
       <w:pPr>
         <w:numPr>
           <w:ilvl w:val="1"/>
+          <w:numId w:val="1044"/>
+        </w:numPr>
+        <w:pStyle w:val="Compact"/>
+      </w:pPr>
+      <w:r>
+        <w:t xml:space="preserve">“</w:t>
+      </w:r>
+      <w:r>
+        <w:t xml:space="preserve">ROAS oficial é o bruto</w:t>
+      </w:r>
+      <w:r>
+        <w:t xml:space="preserve">”</w:t>
+      </w:r>
+      <w:r>
+        <w:t xml:space="preserve">;</w:t>
+      </w:r>
+    </w:p>
+    <w:p>
+      <w:pPr>
+        <w:numPr>
+          <w:ilvl w:val="1"/>
+          <w:numId w:val="1044"/>
+        </w:numPr>
+        <w:pStyle w:val="Compact"/>
+      </w:pPr>
+      <w:r>
+        <w:t xml:space="preserve">“</w:t>
+      </w:r>
+      <w:r>
+        <w:t xml:space="preserve">mesmo telefone junta sozinho</w:t>
+      </w:r>
+      <w:r>
+        <w:t xml:space="preserve">”</w:t>
+      </w:r>
+      <w:r>
+        <w:t xml:space="preserve">;</w:t>
+      </w:r>
+    </w:p>
+    <w:p>
+      <w:pPr>
+        <w:numPr>
+          <w:ilvl w:val="1"/>
+          <w:numId w:val="1044"/>
+        </w:numPr>
+        <w:pStyle w:val="Compact"/>
+      </w:pPr>
+      <w:r>
+        <w:t xml:space="preserve">“</w:t>
+      </w:r>
+      <w:r>
+        <w:t xml:space="preserve">contrato recorrente: só contrato novo é recompra</w:t>
+      </w:r>
+      <w:r>
+        <w:t xml:space="preserve">”</w:t>
+      </w:r>
+      <w:r>
+        <w:t xml:space="preserve">.</w:t>
+      </w:r>
+    </w:p>
+    <w:p>
+      <w:pPr>
+        <w:numPr>
+          <w:ilvl w:val="0"/>
           <w:numId w:val="1043"/>
-        </w:numPr>
-        <w:pStyle w:val="Compact"/>
-      </w:pPr>
-      <w:r>
-        <w:t xml:space="preserve">“</w:t>
-      </w:r>
-      <w:r>
-        <w:t xml:space="preserve">ROAS oficial é o bruto</w:t>
-      </w:r>
-      <w:r>
-        <w:t xml:space="preserve">”</w:t>
-      </w:r>
-      <w:r>
-        <w:t xml:space="preserve">;</w:t>
-      </w:r>
-    </w:p>
-    <w:p>
-      <w:pPr>
-        <w:numPr>
-          <w:ilvl w:val="1"/>
-          <w:numId w:val="1043"/>
-        </w:numPr>
-        <w:pStyle w:val="Compact"/>
-      </w:pPr>
-      <w:r>
-        <w:t xml:space="preserve">“</w:t>
-      </w:r>
-      <w:r>
-        <w:t xml:space="preserve">mesmo telefone junta sozinho</w:t>
-      </w:r>
-      <w:r>
-        <w:t xml:space="preserve">”</w:t>
-      </w:r>
-      <w:r>
-        <w:t xml:space="preserve">;</w:t>
-      </w:r>
-    </w:p>
-    <w:p>
-      <w:pPr>
-        <w:numPr>
-          <w:ilvl w:val="1"/>
-          <w:numId w:val="1043"/>
-        </w:numPr>
-        <w:pStyle w:val="Compact"/>
-      </w:pPr>
-      <w:r>
-        <w:t xml:space="preserve">“</w:t>
-      </w:r>
-      <w:r>
-        <w:t xml:space="preserve">contrato recorrente: só contrato novo é recompra</w:t>
-      </w:r>
-      <w:r>
-        <w:t xml:space="preserve">”</w:t>
-      </w:r>
-      <w:r>
-        <w:t xml:space="preserve">.</w:t>
-      </w:r>
-    </w:p>
-    <w:p>
-      <w:pPr>
-        <w:numPr>
-          <w:ilvl w:val="0"/>
-          <w:numId w:val="1042"/>
         </w:numPr>
         <w:pStyle w:val="Compact"/>
       </w:pPr>
@@ -5190,7 +5330,7 @@
       <w:pPr>
         <w:numPr>
           <w:ilvl w:val="0"/>
-          <w:numId w:val="1044"/>
+          <w:numId w:val="1045"/>
         </w:numPr>
         <w:pStyle w:val="Compact"/>
       </w:pPr>
@@ -5214,7 +5354,7 @@
       <w:pPr>
         <w:numPr>
           <w:ilvl w:val="0"/>
-          <w:numId w:val="1044"/>
+          <w:numId w:val="1045"/>
         </w:numPr>
         <w:pStyle w:val="Compact"/>
       </w:pPr>
@@ -5244,7 +5384,7 @@
       <w:pPr>
         <w:numPr>
           <w:ilvl w:val="0"/>
-          <w:numId w:val="1044"/>
+          <w:numId w:val="1045"/>
         </w:numPr>
         <w:pStyle w:val="Compact"/>
       </w:pPr>
@@ -5256,7 +5396,7 @@
       <w:pPr>
         <w:numPr>
           <w:ilvl w:val="0"/>
-          <w:numId w:val="1044"/>
+          <w:numId w:val="1045"/>
         </w:numPr>
         <w:pStyle w:val="Compact"/>
       </w:pPr>
@@ -5268,7 +5408,7 @@
       <w:pPr>
         <w:numPr>
           <w:ilvl w:val="0"/>
-          <w:numId w:val="1044"/>
+          <w:numId w:val="1045"/>
         </w:numPr>
         <w:pStyle w:val="Compact"/>
       </w:pPr>
@@ -5280,7 +5420,7 @@
       <w:pPr>
         <w:numPr>
           <w:ilvl w:val="0"/>
-          <w:numId w:val="1044"/>
+          <w:numId w:val="1045"/>
         </w:numPr>
         <w:pStyle w:val="Compact"/>
       </w:pPr>
@@ -5292,7 +5432,7 @@
       <w:pPr>
         <w:numPr>
           <w:ilvl w:val="0"/>
-          <w:numId w:val="1044"/>
+          <w:numId w:val="1045"/>
         </w:numPr>
         <w:pStyle w:val="Compact"/>
       </w:pPr>
@@ -5304,7 +5444,7 @@
       <w:pPr>
         <w:numPr>
           <w:ilvl w:val="0"/>
-          <w:numId w:val="1044"/>
+          <w:numId w:val="1045"/>
         </w:numPr>
         <w:pStyle w:val="Compact"/>
       </w:pPr>
@@ -5316,7 +5456,7 @@
       <w:pPr>
         <w:numPr>
           <w:ilvl w:val="0"/>
-          <w:numId w:val="1044"/>
+          <w:numId w:val="1045"/>
         </w:numPr>
         <w:pStyle w:val="Compact"/>
       </w:pPr>
@@ -5328,7 +5468,7 @@
       <w:pPr>
         <w:numPr>
           <w:ilvl w:val="0"/>
-          <w:numId w:val="1044"/>
+          <w:numId w:val="1045"/>
         </w:numPr>
         <w:pStyle w:val="Compact"/>
       </w:pPr>
@@ -5340,7 +5480,7 @@
       <w:pPr>
         <w:numPr>
           <w:ilvl w:val="0"/>
-          <w:numId w:val="1044"/>
+          <w:numId w:val="1045"/>
         </w:numPr>
         <w:pStyle w:val="Compact"/>
       </w:pPr>
@@ -5352,7 +5492,7 @@
       <w:pPr>
         <w:numPr>
           <w:ilvl w:val="0"/>
-          <w:numId w:val="1044"/>
+          <w:numId w:val="1045"/>
         </w:numPr>
         <w:pStyle w:val="Compact"/>
       </w:pPr>
@@ -5364,7 +5504,7 @@
       <w:pPr>
         <w:numPr>
           <w:ilvl w:val="0"/>
-          <w:numId w:val="1044"/>
+          <w:numId w:val="1045"/>
         </w:numPr>
         <w:pStyle w:val="Compact"/>
       </w:pPr>
@@ -5376,7 +5516,7 @@
       <w:pPr>
         <w:numPr>
           <w:ilvl w:val="0"/>
-          <w:numId w:val="1044"/>
+          <w:numId w:val="1045"/>
         </w:numPr>
         <w:pStyle w:val="Compact"/>
       </w:pPr>
@@ -5388,7 +5528,49 @@
       <w:pPr>
         <w:numPr>
           <w:ilvl w:val="0"/>
-          <w:numId w:val="1044"/>
+          <w:numId w:val="1045"/>
+        </w:numPr>
+        <w:pStyle w:val="Compact"/>
+      </w:pPr>
+      <w:r>
+        <w:t xml:space="preserve">A ficha do produto: as 7 perguntas que todo conteúdo de venda precisa responder antes de ir ao ar.</w:t>
+      </w:r>
+    </w:p>
+    <w:p>
+      <w:pPr>
+        <w:numPr>
+          <w:ilvl w:val="0"/>
+          <w:numId w:val="1045"/>
+        </w:numPr>
+        <w:pStyle w:val="Compact"/>
+      </w:pPr>
+      <w:r>
+        <w:t xml:space="preserve">Objeção com resposta: transformar o</w:t>
+      </w:r>
+      <w:r>
+        <w:t xml:space="preserve"> </w:t>
+      </w:r>
+      <w:r>
+        <w:t xml:space="preserve">“</w:t>
+      </w:r>
+      <w:r>
+        <w:t xml:space="preserve">não tenho tempo</w:t>
+      </w:r>
+      <w:r>
+        <w:t xml:space="preserve">”</w:t>
+      </w:r>
+      <w:r>
+        <w:t xml:space="preserve"> </w:t>
+      </w:r>
+      <w:r>
+        <w:t xml:space="preserve">em pauta.</w:t>
+      </w:r>
+    </w:p>
+    <w:p>
+      <w:pPr>
+        <w:numPr>
+          <w:ilvl w:val="0"/>
+          <w:numId w:val="1045"/>
         </w:numPr>
         <w:pStyle w:val="Compact"/>
       </w:pPr>
@@ -5417,7 +5599,7 @@
       <w:pPr>
         <w:numPr>
           <w:ilvl w:val="0"/>
-          <w:numId w:val="1045"/>
+          <w:numId w:val="1046"/>
         </w:numPr>
         <w:pStyle w:val="Compact"/>
       </w:pPr>
@@ -5433,444 +5615,444 @@
       <w:pPr>
         <w:numPr>
           <w:ilvl w:val="1"/>
+          <w:numId w:val="1047"/>
+        </w:numPr>
+        <w:pStyle w:val="Compact"/>
+      </w:pPr>
+      <w:r>
+        <w:t xml:space="preserve">base do sistema: workspaces, pessoas, vendas com contabilidade automática, contas a receber, campanhas;</w:t>
+      </w:r>
+    </w:p>
+    <w:p>
+      <w:pPr>
+        <w:numPr>
+          <w:ilvl w:val="1"/>
+          <w:numId w:val="1047"/>
+        </w:numPr>
+        <w:pStyle w:val="Compact"/>
+      </w:pPr>
+      <w:r>
+        <w:t xml:space="preserve">financeiro completo;</w:t>
+      </w:r>
+    </w:p>
+    <w:p>
+      <w:pPr>
+        <w:numPr>
+          <w:ilvl w:val="1"/>
+          <w:numId w:val="1047"/>
+        </w:numPr>
+        <w:pStyle w:val="Compact"/>
+      </w:pPr>
+      <w:r>
+        <w:t xml:space="preserve">CRM, funis e jornada do lead;</w:t>
+      </w:r>
+    </w:p>
+    <w:p>
+      <w:pPr>
+        <w:numPr>
+          <w:ilvl w:val="1"/>
+          <w:numId w:val="1047"/>
+        </w:numPr>
+        <w:pStyle w:val="Compact"/>
+      </w:pPr>
+      <w:r>
+        <w:t xml:space="preserve">mídia paga, vídeos, RevOps, projetos;</w:t>
+      </w:r>
+    </w:p>
+    <w:p>
+      <w:pPr>
+        <w:numPr>
+          <w:ilvl w:val="1"/>
+          <w:numId w:val="1047"/>
+        </w:numPr>
+        <w:pStyle w:val="Compact"/>
+      </w:pPr>
+      <w:r>
+        <w:t xml:space="preserve">Growth Model e Ciclo de Growth;</w:t>
+      </w:r>
+    </w:p>
+    <w:p>
+      <w:pPr>
+        <w:numPr>
+          <w:ilvl w:val="1"/>
+          <w:numId w:val="1047"/>
+        </w:numPr>
+        <w:pStyle w:val="Compact"/>
+      </w:pPr>
+      <w:r>
+        <w:t xml:space="preserve">pesquisas e planejamento de conteúdo.</w:t>
+      </w:r>
+    </w:p>
+    <w:p>
+      <w:pPr>
+        <w:numPr>
+          <w:ilvl w:val="0"/>
           <w:numId w:val="1046"/>
         </w:numPr>
         <w:pStyle w:val="Compact"/>
       </w:pPr>
       <w:r>
-        <w:t xml:space="preserve">base do sistema: workspaces, pessoas, vendas com contabilidade automática, contas a receber, campanhas;</w:t>
-      </w:r>
-    </w:p>
-    <w:p>
-      <w:pPr>
-        <w:numPr>
-          <w:ilvl w:val="1"/>
+        <w:rPr>
+          <w:bCs/>
+          <w:b/>
+        </w:rPr>
+        <w:t xml:space="preserve">07 a 08/10:</w:t>
+      </w:r>
+    </w:p>
+    <w:p>
+      <w:pPr>
+        <w:numPr>
+          <w:ilvl w:val="1"/>
+          <w:numId w:val="1048"/>
+        </w:numPr>
+        <w:pStyle w:val="Compact"/>
+      </w:pPr>
+      <w:r>
+        <w:t xml:space="preserve">contratos com parcelas personalizadas, oportunidades, renovação;</w:t>
+      </w:r>
+    </w:p>
+    <w:p>
+      <w:pPr>
+        <w:numPr>
+          <w:ilvl w:val="1"/>
+          <w:numId w:val="1048"/>
+        </w:numPr>
+        <w:pStyle w:val="Compact"/>
+      </w:pPr>
+      <w:r>
+        <w:t xml:space="preserve">novo visual, Growth Starter, importação inteligente;</w:t>
+      </w:r>
+    </w:p>
+    <w:p>
+      <w:pPr>
+        <w:numPr>
+          <w:ilvl w:val="1"/>
+          <w:numId w:val="1048"/>
+        </w:numPr>
+        <w:pStyle w:val="Compact"/>
+      </w:pPr>
+      <w:r>
+        <w:t xml:space="preserve">“</w:t>
+      </w:r>
+      <w:r>
+        <w:t xml:space="preserve">Pergunte aos dados</w:t>
+      </w:r>
+      <w:r>
+        <w:t xml:space="preserve">”</w:t>
+      </w:r>
+      <w:r>
+        <w:t xml:space="preserve"> </w:t>
+      </w:r>
+      <w:r>
+        <w:t xml:space="preserve">com IA conferida;</w:t>
+      </w:r>
+    </w:p>
+    <w:p>
+      <w:pPr>
+        <w:numPr>
+          <w:ilvl w:val="1"/>
+          <w:numId w:val="1048"/>
+        </w:numPr>
+        <w:pStyle w:val="Compact"/>
+      </w:pPr>
+      <w:r>
+        <w:t xml:space="preserve">dashboards de mídia e vendas;</w:t>
+      </w:r>
+    </w:p>
+    <w:p>
+      <w:pPr>
+        <w:numPr>
+          <w:ilvl w:val="1"/>
+          <w:numId w:val="1048"/>
+        </w:numPr>
+        <w:pStyle w:val="Compact"/>
+      </w:pPr>
+      <w:r>
+        <w:t xml:space="preserve">Growth Model automático e calculadora de campanha.</w:t>
+      </w:r>
+    </w:p>
+    <w:p>
+      <w:pPr>
+        <w:numPr>
+          <w:ilvl w:val="0"/>
           <w:numId w:val="1046"/>
         </w:numPr>
         <w:pStyle w:val="Compact"/>
       </w:pPr>
       <w:r>
-        <w:t xml:space="preserve">financeiro completo;</w:t>
-      </w:r>
-    </w:p>
-    <w:p>
-      <w:pPr>
-        <w:numPr>
-          <w:ilvl w:val="1"/>
+        <w:rPr>
+          <w:bCs/>
+          <w:b/>
+        </w:rPr>
+        <w:t xml:space="preserve">10 a 11/10:</w:t>
+      </w:r>
+    </w:p>
+    <w:p>
+      <w:pPr>
+        <w:numPr>
+          <w:ilvl w:val="1"/>
+          <w:numId w:val="1049"/>
+        </w:numPr>
+        <w:pStyle w:val="Compact"/>
+      </w:pPr>
+      <w:r>
+        <w:t xml:space="preserve">estratégia em blocos e simulador de lucro;</w:t>
+      </w:r>
+    </w:p>
+    <w:p>
+      <w:pPr>
+        <w:numPr>
+          <w:ilvl w:val="1"/>
+          <w:numId w:val="1049"/>
+        </w:numPr>
+        <w:pStyle w:val="Compact"/>
+      </w:pPr>
+      <w:r>
+        <w:t xml:space="preserve">pacotes de acesso, cartões de crédito, Casa;</w:t>
+      </w:r>
+    </w:p>
+    <w:p>
+      <w:pPr>
+        <w:numPr>
+          <w:ilvl w:val="1"/>
+          <w:numId w:val="1049"/>
+        </w:numPr>
+        <w:pStyle w:val="Compact"/>
+      </w:pPr>
+      <w:r>
+        <w:t xml:space="preserve">segurança e confiança do dado: identidade, auditoria, qualidade, dicionário;</w:t>
+      </w:r>
+    </w:p>
+    <w:p>
+      <w:pPr>
+        <w:numPr>
+          <w:ilvl w:val="1"/>
+          <w:numId w:val="1049"/>
+        </w:numPr>
+        <w:pStyle w:val="Compact"/>
+      </w:pPr>
+      <w:r>
+        <w:t xml:space="preserve">captação e atribuição;</w:t>
+      </w:r>
+    </w:p>
+    <w:p>
+      <w:pPr>
+        <w:numPr>
+          <w:ilvl w:val="1"/>
+          <w:numId w:val="1049"/>
+        </w:numPr>
+        <w:pStyle w:val="Compact"/>
+      </w:pPr>
+      <w:r>
+        <w:t xml:space="preserve">projetos com modelos, custos e margens;</w:t>
+      </w:r>
+    </w:p>
+    <w:p>
+      <w:pPr>
+        <w:numPr>
+          <w:ilvl w:val="1"/>
+          <w:numId w:val="1049"/>
+        </w:numPr>
+        <w:pStyle w:val="Compact"/>
+      </w:pPr>
+      <w:r>
+        <w:t xml:space="preserve">“</w:t>
+      </w:r>
+      <w:r>
+        <w:t xml:space="preserve">Growth Now</w:t>
+      </w:r>
+      <w:r>
+        <w:t xml:space="preserve">”</w:t>
+      </w:r>
+      <w:r>
+        <w:t xml:space="preserve">: ofertas, cenários, decisão, guardrails.</w:t>
+      </w:r>
+    </w:p>
+    <w:p>
+      <w:pPr>
+        <w:numPr>
+          <w:ilvl w:val="0"/>
           <w:numId w:val="1046"/>
         </w:numPr>
         <w:pStyle w:val="Compact"/>
       </w:pPr>
       <w:r>
-        <w:t xml:space="preserve">CRM, funis e jornada do lead;</w:t>
-      </w:r>
-    </w:p>
-    <w:p>
-      <w:pPr>
-        <w:numPr>
-          <w:ilvl w:val="1"/>
+        <w:rPr>
+          <w:bCs/>
+          <w:b/>
+        </w:rPr>
+        <w:t xml:space="preserve">12 a 17/10:</w:t>
+      </w:r>
+    </w:p>
+    <w:p>
+      <w:pPr>
+        <w:numPr>
+          <w:ilvl w:val="1"/>
+          <w:numId w:val="1050"/>
+        </w:numPr>
+        <w:pStyle w:val="Compact"/>
+      </w:pPr>
+      <w:r>
+        <w:t xml:space="preserve">visual azul;</w:t>
+      </w:r>
+    </w:p>
+    <w:p>
+      <w:pPr>
+        <w:numPr>
+          <w:ilvl w:val="1"/>
+          <w:numId w:val="1050"/>
+        </w:numPr>
+        <w:pStyle w:val="Compact"/>
+      </w:pPr>
+      <w:r>
+        <w:t xml:space="preserve">Growth Model em planilha;</w:t>
+      </w:r>
+    </w:p>
+    <w:p>
+      <w:pPr>
+        <w:numPr>
+          <w:ilvl w:val="1"/>
+          <w:numId w:val="1050"/>
+        </w:numPr>
+        <w:pStyle w:val="Compact"/>
+      </w:pPr>
+      <w:r>
+        <w:t xml:space="preserve">Retenção &amp; Expansão (coortes, recompra, RFM);</w:t>
+      </w:r>
+    </w:p>
+    <w:p>
+      <w:pPr>
+        <w:numPr>
+          <w:ilvl w:val="1"/>
+          <w:numId w:val="1050"/>
+        </w:numPr>
+        <w:pStyle w:val="Compact"/>
+      </w:pPr>
+      <w:r>
+        <w:t xml:space="preserve">cenários com ciclo de vida, ideias pelo ChatGPT;</w:t>
+      </w:r>
+    </w:p>
+    <w:p>
+      <w:pPr>
+        <w:numPr>
+          <w:ilvl w:val="1"/>
+          <w:numId w:val="1050"/>
+        </w:numPr>
+        <w:pStyle w:val="Compact"/>
+      </w:pPr>
+      <w:r>
+        <w:t xml:space="preserve">auditoria de consistência e correção;</w:t>
+      </w:r>
+    </w:p>
+    <w:p>
+      <w:pPr>
+        <w:numPr>
+          <w:ilvl w:val="1"/>
+          <w:numId w:val="1050"/>
+        </w:numPr>
+        <w:pStyle w:val="Compact"/>
+      </w:pPr>
+      <w:r>
+        <w:t xml:space="preserve">Escola Aurora; leads por formulário.</w:t>
+      </w:r>
+    </w:p>
+    <w:p>
+      <w:pPr>
+        <w:numPr>
+          <w:ilvl w:val="0"/>
           <w:numId w:val="1046"/>
         </w:numPr>
         <w:pStyle w:val="Compact"/>
       </w:pPr>
       <w:r>
-        <w:t xml:space="preserve">mídia paga, vídeos, RevOps, projetos;</w:t>
-      </w:r>
-    </w:p>
-    <w:p>
-      <w:pPr>
-        <w:numPr>
-          <w:ilvl w:val="1"/>
+        <w:rPr>
+          <w:bCs/>
+          <w:b/>
+        </w:rPr>
+        <w:t xml:space="preserve">19 a 21/10:</w:t>
+      </w:r>
+    </w:p>
+    <w:p>
+      <w:pPr>
+        <w:numPr>
+          <w:ilvl w:val="1"/>
+          <w:numId w:val="1051"/>
+        </w:numPr>
+        <w:pStyle w:val="Compact"/>
+      </w:pPr>
+      <w:r>
+        <w:t xml:space="preserve">metas de leads; árvore dos números;</w:t>
+      </w:r>
+    </w:p>
+    <w:p>
+      <w:pPr>
+        <w:numPr>
+          <w:ilvl w:val="1"/>
+          <w:numId w:val="1051"/>
+        </w:numPr>
+        <w:pStyle w:val="Compact"/>
+      </w:pPr>
+      <w:r>
+        <w:t xml:space="preserve">comissões e conexões com Meta e Google;</w:t>
+      </w:r>
+    </w:p>
+    <w:p>
+      <w:pPr>
+        <w:numPr>
+          <w:ilvl w:val="1"/>
+          <w:numId w:val="1051"/>
+        </w:numPr>
+        <w:pStyle w:val="Compact"/>
+      </w:pPr>
+      <w:r>
+        <w:t xml:space="preserve">visual com destaque e dashboard em camadas;</w:t>
+      </w:r>
+    </w:p>
+    <w:p>
+      <w:pPr>
+        <w:numPr>
+          <w:ilvl w:val="1"/>
+          <w:numId w:val="1051"/>
+        </w:numPr>
+        <w:pStyle w:val="Compact"/>
+      </w:pPr>
+      <w:r>
+        <w:t xml:space="preserve">gráficos com função (ondas 1 a 3);</w:t>
+      </w:r>
+    </w:p>
+    <w:p>
+      <w:pPr>
+        <w:numPr>
+          <w:ilvl w:val="1"/>
+          <w:numId w:val="1051"/>
+        </w:numPr>
+        <w:pStyle w:val="Compact"/>
+      </w:pPr>
+      <w:r>
+        <w:t xml:space="preserve">painel da campanha dia a dia; qualificação por pontos;</w:t>
+      </w:r>
+    </w:p>
+    <w:p>
+      <w:pPr>
+        <w:numPr>
+          <w:ilvl w:val="1"/>
+          <w:numId w:val="1051"/>
+        </w:numPr>
+        <w:pStyle w:val="Compact"/>
+      </w:pPr>
+      <w:r>
+        <w:t xml:space="preserve">formulário de captação; selo de qualificado.</w:t>
+      </w:r>
+    </w:p>
+    <w:p>
+      <w:pPr>
+        <w:numPr>
+          <w:ilvl w:val="0"/>
           <w:numId w:val="1046"/>
         </w:numPr>
         <w:pStyle w:val="Compact"/>
       </w:pPr>
       <w:r>
-        <w:t xml:space="preserve">Growth Model e Ciclo de Growth;</w:t>
-      </w:r>
-    </w:p>
-    <w:p>
-      <w:pPr>
-        <w:numPr>
-          <w:ilvl w:val="1"/>
-          <w:numId w:val="1046"/>
-        </w:numPr>
-        <w:pStyle w:val="Compact"/>
-      </w:pPr>
-      <w:r>
-        <w:t xml:space="preserve">pesquisas e planejamento de conteúdo.</w:t>
-      </w:r>
-    </w:p>
-    <w:p>
-      <w:pPr>
-        <w:numPr>
-          <w:ilvl w:val="0"/>
-          <w:numId w:val="1045"/>
-        </w:numPr>
-        <w:pStyle w:val="Compact"/>
-      </w:pPr>
-      <w:r>
-        <w:rPr>
-          <w:bCs/>
-          <w:b/>
-        </w:rPr>
-        <w:t xml:space="preserve">07 a 08/10:</w:t>
-      </w:r>
-    </w:p>
-    <w:p>
-      <w:pPr>
-        <w:numPr>
-          <w:ilvl w:val="1"/>
-          <w:numId w:val="1047"/>
-        </w:numPr>
-        <w:pStyle w:val="Compact"/>
-      </w:pPr>
-      <w:r>
-        <w:t xml:space="preserve">contratos com parcelas personalizadas, oportunidades, renovação;</w:t>
-      </w:r>
-    </w:p>
-    <w:p>
-      <w:pPr>
-        <w:numPr>
-          <w:ilvl w:val="1"/>
-          <w:numId w:val="1047"/>
-        </w:numPr>
-        <w:pStyle w:val="Compact"/>
-      </w:pPr>
-      <w:r>
-        <w:t xml:space="preserve">novo visual, Growth Starter, importação inteligente;</w:t>
-      </w:r>
-    </w:p>
-    <w:p>
-      <w:pPr>
-        <w:numPr>
-          <w:ilvl w:val="1"/>
-          <w:numId w:val="1047"/>
-        </w:numPr>
-        <w:pStyle w:val="Compact"/>
-      </w:pPr>
-      <w:r>
-        <w:t xml:space="preserve">“</w:t>
-      </w:r>
-      <w:r>
-        <w:t xml:space="preserve">Pergunte aos dados</w:t>
-      </w:r>
-      <w:r>
-        <w:t xml:space="preserve">”</w:t>
-      </w:r>
-      <w:r>
-        <w:t xml:space="preserve"> </w:t>
-      </w:r>
-      <w:r>
-        <w:t xml:space="preserve">com IA conferida;</w:t>
-      </w:r>
-    </w:p>
-    <w:p>
-      <w:pPr>
-        <w:numPr>
-          <w:ilvl w:val="1"/>
-          <w:numId w:val="1047"/>
-        </w:numPr>
-        <w:pStyle w:val="Compact"/>
-      </w:pPr>
-      <w:r>
-        <w:t xml:space="preserve">dashboards de mídia e vendas;</w:t>
-      </w:r>
-    </w:p>
-    <w:p>
-      <w:pPr>
-        <w:numPr>
-          <w:ilvl w:val="1"/>
-          <w:numId w:val="1047"/>
-        </w:numPr>
-        <w:pStyle w:val="Compact"/>
-      </w:pPr>
-      <w:r>
-        <w:t xml:space="preserve">Growth Model automático e calculadora de campanha.</w:t>
-      </w:r>
-    </w:p>
-    <w:p>
-      <w:pPr>
-        <w:numPr>
-          <w:ilvl w:val="0"/>
-          <w:numId w:val="1045"/>
-        </w:numPr>
-        <w:pStyle w:val="Compact"/>
-      </w:pPr>
-      <w:r>
-        <w:rPr>
-          <w:bCs/>
-          <w:b/>
-        </w:rPr>
-        <w:t xml:space="preserve">10 a 11/10:</w:t>
-      </w:r>
-    </w:p>
-    <w:p>
-      <w:pPr>
-        <w:numPr>
-          <w:ilvl w:val="1"/>
-          <w:numId w:val="1048"/>
-        </w:numPr>
-        <w:pStyle w:val="Compact"/>
-      </w:pPr>
-      <w:r>
-        <w:t xml:space="preserve">estratégia em blocos e simulador de lucro;</w:t>
-      </w:r>
-    </w:p>
-    <w:p>
-      <w:pPr>
-        <w:numPr>
-          <w:ilvl w:val="1"/>
-          <w:numId w:val="1048"/>
-        </w:numPr>
-        <w:pStyle w:val="Compact"/>
-      </w:pPr>
-      <w:r>
-        <w:t xml:space="preserve">pacotes de acesso, cartões de crédito, Casa;</w:t>
-      </w:r>
-    </w:p>
-    <w:p>
-      <w:pPr>
-        <w:numPr>
-          <w:ilvl w:val="1"/>
-          <w:numId w:val="1048"/>
-        </w:numPr>
-        <w:pStyle w:val="Compact"/>
-      </w:pPr>
-      <w:r>
-        <w:t xml:space="preserve">segurança e confiança do dado: identidade, auditoria, qualidade, dicionário;</w:t>
-      </w:r>
-    </w:p>
-    <w:p>
-      <w:pPr>
-        <w:numPr>
-          <w:ilvl w:val="1"/>
-          <w:numId w:val="1048"/>
-        </w:numPr>
-        <w:pStyle w:val="Compact"/>
-      </w:pPr>
-      <w:r>
-        <w:t xml:space="preserve">captação e atribuição;</w:t>
-      </w:r>
-    </w:p>
-    <w:p>
-      <w:pPr>
-        <w:numPr>
-          <w:ilvl w:val="1"/>
-          <w:numId w:val="1048"/>
-        </w:numPr>
-        <w:pStyle w:val="Compact"/>
-      </w:pPr>
-      <w:r>
-        <w:t xml:space="preserve">projetos com modelos, custos e margens;</w:t>
-      </w:r>
-    </w:p>
-    <w:p>
-      <w:pPr>
-        <w:numPr>
-          <w:ilvl w:val="1"/>
-          <w:numId w:val="1048"/>
-        </w:numPr>
-        <w:pStyle w:val="Compact"/>
-      </w:pPr>
-      <w:r>
-        <w:t xml:space="preserve">“</w:t>
-      </w:r>
-      <w:r>
-        <w:t xml:space="preserve">Growth Now</w:t>
-      </w:r>
-      <w:r>
-        <w:t xml:space="preserve">”</w:t>
-      </w:r>
-      <w:r>
-        <w:t xml:space="preserve">: ofertas, cenários, decisão, guardrails.</w:t>
-      </w:r>
-    </w:p>
-    <w:p>
-      <w:pPr>
-        <w:numPr>
-          <w:ilvl w:val="0"/>
-          <w:numId w:val="1045"/>
-        </w:numPr>
-        <w:pStyle w:val="Compact"/>
-      </w:pPr>
-      <w:r>
-        <w:rPr>
-          <w:bCs/>
-          <w:b/>
-        </w:rPr>
-        <w:t xml:space="preserve">12 a 17/10:</w:t>
-      </w:r>
-    </w:p>
-    <w:p>
-      <w:pPr>
-        <w:numPr>
-          <w:ilvl w:val="1"/>
-          <w:numId w:val="1049"/>
-        </w:numPr>
-        <w:pStyle w:val="Compact"/>
-      </w:pPr>
-      <w:r>
-        <w:t xml:space="preserve">visual azul;</w:t>
-      </w:r>
-    </w:p>
-    <w:p>
-      <w:pPr>
-        <w:numPr>
-          <w:ilvl w:val="1"/>
-          <w:numId w:val="1049"/>
-        </w:numPr>
-        <w:pStyle w:val="Compact"/>
-      </w:pPr>
-      <w:r>
-        <w:t xml:space="preserve">Growth Model em planilha;</w:t>
-      </w:r>
-    </w:p>
-    <w:p>
-      <w:pPr>
-        <w:numPr>
-          <w:ilvl w:val="1"/>
-          <w:numId w:val="1049"/>
-        </w:numPr>
-        <w:pStyle w:val="Compact"/>
-      </w:pPr>
-      <w:r>
-        <w:t xml:space="preserve">Retenção &amp; Expansão (coortes, recompra, RFM);</w:t>
-      </w:r>
-    </w:p>
-    <w:p>
-      <w:pPr>
-        <w:numPr>
-          <w:ilvl w:val="1"/>
-          <w:numId w:val="1049"/>
-        </w:numPr>
-        <w:pStyle w:val="Compact"/>
-      </w:pPr>
-      <w:r>
-        <w:t xml:space="preserve">cenários com ciclo de vida, ideias pelo ChatGPT;</w:t>
-      </w:r>
-    </w:p>
-    <w:p>
-      <w:pPr>
-        <w:numPr>
-          <w:ilvl w:val="1"/>
-          <w:numId w:val="1049"/>
-        </w:numPr>
-        <w:pStyle w:val="Compact"/>
-      </w:pPr>
-      <w:r>
-        <w:t xml:space="preserve">auditoria de consistência e correção;</w:t>
-      </w:r>
-    </w:p>
-    <w:p>
-      <w:pPr>
-        <w:numPr>
-          <w:ilvl w:val="1"/>
-          <w:numId w:val="1049"/>
-        </w:numPr>
-        <w:pStyle w:val="Compact"/>
-      </w:pPr>
-      <w:r>
-        <w:t xml:space="preserve">Escola Aurora; leads por formulário.</w:t>
-      </w:r>
-    </w:p>
-    <w:p>
-      <w:pPr>
-        <w:numPr>
-          <w:ilvl w:val="0"/>
-          <w:numId w:val="1045"/>
-        </w:numPr>
-        <w:pStyle w:val="Compact"/>
-      </w:pPr>
-      <w:r>
-        <w:rPr>
-          <w:bCs/>
-          <w:b/>
-        </w:rPr>
-        <w:t xml:space="preserve">19 a 21/10:</w:t>
-      </w:r>
-    </w:p>
-    <w:p>
-      <w:pPr>
-        <w:numPr>
-          <w:ilvl w:val="1"/>
-          <w:numId w:val="1050"/>
-        </w:numPr>
-        <w:pStyle w:val="Compact"/>
-      </w:pPr>
-      <w:r>
-        <w:t xml:space="preserve">metas de leads; árvore dos números;</w:t>
-      </w:r>
-    </w:p>
-    <w:p>
-      <w:pPr>
-        <w:numPr>
-          <w:ilvl w:val="1"/>
-          <w:numId w:val="1050"/>
-        </w:numPr>
-        <w:pStyle w:val="Compact"/>
-      </w:pPr>
-      <w:r>
-        <w:t xml:space="preserve">comissões e conexões com Meta e Google;</w:t>
-      </w:r>
-    </w:p>
-    <w:p>
-      <w:pPr>
-        <w:numPr>
-          <w:ilvl w:val="1"/>
-          <w:numId w:val="1050"/>
-        </w:numPr>
-        <w:pStyle w:val="Compact"/>
-      </w:pPr>
-      <w:r>
-        <w:t xml:space="preserve">visual com destaque e dashboard em camadas;</w:t>
-      </w:r>
-    </w:p>
-    <w:p>
-      <w:pPr>
-        <w:numPr>
-          <w:ilvl w:val="1"/>
-          <w:numId w:val="1050"/>
-        </w:numPr>
-        <w:pStyle w:val="Compact"/>
-      </w:pPr>
-      <w:r>
-        <w:t xml:space="preserve">gráficos com função (ondas 1 a 3);</w:t>
-      </w:r>
-    </w:p>
-    <w:p>
-      <w:pPr>
-        <w:numPr>
-          <w:ilvl w:val="1"/>
-          <w:numId w:val="1050"/>
-        </w:numPr>
-        <w:pStyle w:val="Compact"/>
-      </w:pPr>
-      <w:r>
-        <w:t xml:space="preserve">painel da campanha dia a dia; qualificação por pontos;</w:t>
-      </w:r>
-    </w:p>
-    <w:p>
-      <w:pPr>
-        <w:numPr>
-          <w:ilvl w:val="1"/>
-          <w:numId w:val="1050"/>
-        </w:numPr>
-        <w:pStyle w:val="Compact"/>
-      </w:pPr>
-      <w:r>
-        <w:t xml:space="preserve">formulário de captação; selo de qualificado.</w:t>
-      </w:r>
-    </w:p>
-    <w:p>
-      <w:pPr>
-        <w:numPr>
-          <w:ilvl w:val="0"/>
-          <w:numId w:val="1045"/>
-        </w:numPr>
-        <w:pStyle w:val="Compact"/>
-      </w:pPr>
-      <w:r>
         <w:rPr>
           <w:bCs/>
           <w:b/>
@@ -5882,7 +6064,7 @@
       <w:pPr>
         <w:numPr>
           <w:ilvl w:val="1"/>
-          <w:numId w:val="1051"/>
+          <w:numId w:val="1052"/>
         </w:numPr>
         <w:pStyle w:val="Compact"/>
       </w:pPr>
@@ -5894,7 +6076,7 @@
       <w:pPr>
         <w:numPr>
           <w:ilvl w:val="1"/>
-          <w:numId w:val="1051"/>
+          <w:numId w:val="1052"/>
         </w:numPr>
         <w:pStyle w:val="Compact"/>
       </w:pPr>
@@ -5906,7 +6088,7 @@
       <w:pPr>
         <w:numPr>
           <w:ilvl w:val="1"/>
-          <w:numId w:val="1051"/>
+          <w:numId w:val="1052"/>
         </w:numPr>
         <w:pStyle w:val="Compact"/>
       </w:pPr>
@@ -5918,12 +6100,24 @@
       <w:pPr>
         <w:numPr>
           <w:ilvl w:val="1"/>
-          <w:numId w:val="1051"/>
-        </w:numPr>
-        <w:pStyle w:val="Compact"/>
-      </w:pPr>
-      <w:r>
-        <w:t xml:space="preserve">painel da produção no Kanban.</w:t>
+          <w:numId w:val="1052"/>
+        </w:numPr>
+        <w:pStyle w:val="Compact"/>
+      </w:pPr>
+      <w:r>
+        <w:t xml:space="preserve">painel da produção no Kanban;</w:t>
+      </w:r>
+    </w:p>
+    <w:p>
+      <w:pPr>
+        <w:numPr>
+          <w:ilvl w:val="1"/>
+          <w:numId w:val="1052"/>
+        </w:numPr>
+        <w:pStyle w:val="Compact"/>
+      </w:pPr>
+      <w:r>
+        <w:t xml:space="preserve">ficha de conteúdo de cada produto, com as ideias ligadas a ele.</w:t>
       </w:r>
     </w:p>
     <w:bookmarkEnd w:id="50"/>
@@ -6403,6 +6597,9 @@
     <w:abstractNumId w:val="991"/>
   </w:num>
   <w:num w:numId="1051">
+    <w:abstractNumId w:val="991"/>
+  </w:num>
+  <w:num w:numId="1052">
     <w:abstractNumId w:val="991"/>
   </w:num>
 </w:numbering>

</xml_diff>

<commit_message>
v0.150 — Growth's Content: ficha de produto simples (nome, valor, histórico) e bloco Produtos e esteira no questionário (aplicado em produção)
Co-Authored-By: Claude Opus 5.5 <noreply@anthropic.com>
Claude-Session: https://claude.ai/code/session_01KZYD1VyufGDrBDPUSE7fwE
</commit_message>
<xml_diff>
--- a/docs/Growths-o-sistema.docx
+++ b/docs/Growths-o-sistema.docx
@@ -42,7 +42,7 @@
         <w:t xml:space="preserve"> </w:t>
       </w:r>
       <w:r>
-        <w:t xml:space="preserve">25/10/2026, versão 0.149.</w:t>
+        <w:t xml:space="preserve">25/10/2026, versão 0.150.</w:t>
       </w:r>
     </w:p>
     <w:p>
@@ -1920,7 +1920,23 @@
         <w:t xml:space="preserve"> </w:t>
       </w:r>
       <w:r>
-        <w:t xml:space="preserve">O roteiro da call aparece na tela, um bloco de perguntas por vez, salvando sozinho enquanto a pessoa digita. Tem data da call e anotações livres.</w:t>
+        <w:t xml:space="preserve">O roteiro da call aparece na tela, um bloco de perguntas por vez, salvando sozinho enquanto a pessoa digita: nicho, objetivo,</w:t>
+      </w:r>
+      <w:r>
+        <w:t xml:space="preserve"> </w:t>
+      </w:r>
+      <w:r>
+        <w:rPr>
+          <w:bCs/>
+          <w:b/>
+        </w:rPr>
+        <w:t xml:space="preserve">produtos e esteira</w:t>
+      </w:r>
+      <w:r>
+        <w:t xml:space="preserve"> </w:t>
+      </w:r>
+      <w:r>
+        <w:t xml:space="preserve">(quais produtos e valores, como a esteira funciona, o carro-chefe, como a venda acontece e o histórico), tese, repertório e formatos. Tem data da call e anotações livres.</w:t>
       </w:r>
     </w:p>
     <w:p>
@@ -1942,7 +1958,22 @@
         <w:t xml:space="preserve"> </w:t>
       </w:r>
       <w:r>
-        <w:t xml:space="preserve">(em construção). A IA lê tudo, faz a pesquisa e monta a tese: diferencial, mecanismo do problema e da solução, construção do produto, narrativa e voz.</w:t>
+        <w:t xml:space="preserve">(em construção). Um botão</w:t>
+      </w:r>
+      <w:r>
+        <w:t xml:space="preserve"> </w:t>
+      </w:r>
+      <w:r>
+        <w:t xml:space="preserve">“</w:t>
+      </w:r>
+      <w:r>
+        <w:t xml:space="preserve">Fazer a pesquisa</w:t>
+      </w:r>
+      <w:r>
+        <w:t xml:space="preserve">”</w:t>
+      </w:r>
+      <w:r>
+        <w:t xml:space="preserve">: a IA lê as pastas (do cliente e da Mathisa), as respostas da call, os produtos e os canais, pesquisa na web e entrega um relatório para ler. Dele sai a tese: diferencial, mecanismo do problema e da solução, construção do produto, narrativa e voz.</w:t>
       </w:r>
     </w:p>
     <w:p>
@@ -2349,103 +2380,7 @@
         <w:t xml:space="preserve"> </w:t>
       </w:r>
       <w:r>
-        <w:t xml:space="preserve">Cada produto do cliente ganha uma ficha de conteúdo, em 7 partes:</w:t>
-      </w:r>
-    </w:p>
-    <w:p>
-      <w:pPr>
-        <w:numPr>
-          <w:ilvl w:val="1"/>
-          <w:numId w:val="1020"/>
-        </w:numPr>
-        <w:pStyle w:val="Compact"/>
-      </w:pPr>
-      <w:r>
-        <w:t xml:space="preserve">o que é: o produto em uma frase, para quem é e para quem não é;</w:t>
-      </w:r>
-    </w:p>
-    <w:p>
-      <w:pPr>
-        <w:numPr>
-          <w:ilvl w:val="1"/>
-          <w:numId w:val="1020"/>
-        </w:numPr>
-        <w:pStyle w:val="Compact"/>
-      </w:pPr>
-      <w:r>
-        <w:t xml:space="preserve">problema e transformação: a dor principal, o que a pessoa já tentou, o resultado e em quanto tempo;</w:t>
-      </w:r>
-    </w:p>
-    <w:p>
-      <w:pPr>
-        <w:numPr>
-          <w:ilvl w:val="1"/>
-          <w:numId w:val="1020"/>
-        </w:numPr>
-        <w:pStyle w:val="Compact"/>
-      </w:pPr>
-      <w:r>
-        <w:t xml:space="preserve">método e entrega: o método ou mecanismo, as etapas, o que a pessoa recebe, bônus e formato;</w:t>
-      </w:r>
-    </w:p>
-    <w:p>
-      <w:pPr>
-        <w:numPr>
-          <w:ilvl w:val="1"/>
-          <w:numId w:val="1020"/>
-        </w:numPr>
-        <w:pStyle w:val="Compact"/>
-      </w:pPr>
-      <w:r>
-        <w:t xml:space="preserve">diferenciais e provas: por que este e não outro, provas reais (dizendo onde estão) e garantia;</w:t>
-      </w:r>
-    </w:p>
-    <w:p>
-      <w:pPr>
-        <w:numPr>
-          <w:ilvl w:val="1"/>
-          <w:numId w:val="1020"/>
-        </w:numPr>
-        <w:pStyle w:val="Compact"/>
-      </w:pPr>
-      <w:r>
-        <w:t xml:space="preserve">objeções, cada uma com a resposta;</w:t>
-      </w:r>
-    </w:p>
-    <w:p>
-      <w:pPr>
-        <w:numPr>
-          <w:ilvl w:val="1"/>
-          <w:numId w:val="1020"/>
-        </w:numPr>
-        <w:pStyle w:val="Compact"/>
-      </w:pPr>
-      <w:r>
-        <w:t xml:space="preserve">oferta e momento de venda: perpétuo, lançamento, carrinho aberto ou fechado, próxima abertura, condições, página e checkout, a chamada que o conteúdo deve fazer, o papel na escada de produtos e o nível de consciência de quem compra;</w:t>
-      </w:r>
-    </w:p>
-    <w:p>
-      <w:pPr>
-        <w:numPr>
-          <w:ilvl w:val="1"/>
-          <w:numId w:val="1020"/>
-        </w:numPr>
-        <w:pStyle w:val="Compact"/>
-      </w:pPr>
-      <w:r>
-        <w:t xml:space="preserve">para o conteúdo: os temas que levam ao produto, as palavras que o público usa, o que evitar dizer e onde estão os materiais.</w:t>
-      </w:r>
-    </w:p>
-    <w:p>
-      <w:pPr>
-        <w:numPr>
-          <w:ilvl w:val="0"/>
-          <w:numId w:val="1000"/>
-        </w:numPr>
-        <w:pStyle w:val="Compact"/>
-      </w:pPr>
-      <w:r>
-        <w:t xml:space="preserve">O cartão de cada produto mostra quanto da ficha está preenchido e quantos conteúdos já falam dele. Cada ideia pode ser ligada a um produto, e a IA vai usar a ficha para criar conteúdo que leva ao produto certo.</w:t>
+        <w:t xml:space="preserve">A lista dos produtos do cliente, cada um com o nome, o valor e o histórico (como surgiu, turmas e lançamentos, resultados, o momento de agora). Cadastrados ali mesmo, ou trazidos do cadastro comercial. O cartão de cada produto mostra quantos conteúdos já falam dele, e cada ideia pode ser ligada a um produto.</w:t>
       </w:r>
     </w:p>
     <w:p>
@@ -2528,38 +2463,150 @@
       <w:pPr>
         <w:numPr>
           <w:ilvl w:val="0"/>
+          <w:numId w:val="1020"/>
+        </w:numPr>
+        <w:pStyle w:val="Compact"/>
+      </w:pPr>
+      <w:r>
+        <w:rPr>
+          <w:bCs/>
+          <w:b/>
+        </w:rPr>
+        <w:t xml:space="preserve">Conexão automática.</w:t>
+      </w:r>
+      <w:r>
+        <w:t xml:space="preserve"> </w:t>
+      </w:r>
+      <w:r>
+        <w:t xml:space="preserve">Os números chegam pela conexão oficial, sem planilha: a conta, cada post e as DMs.</w:t>
+      </w:r>
+    </w:p>
+    <w:p>
+      <w:pPr>
+        <w:numPr>
+          <w:ilvl w:val="0"/>
+          <w:numId w:val="1020"/>
+        </w:numPr>
+        <w:pStyle w:val="Compact"/>
+      </w:pPr>
+      <w:r>
+        <w:rPr>
+          <w:bCs/>
+          <w:b/>
+        </w:rPr>
+        <w:t xml:space="preserve">Dashboard:</w:t>
+      </w:r>
+    </w:p>
+    <w:p>
+      <w:pPr>
+        <w:numPr>
+          <w:ilvl w:val="1"/>
           <w:numId w:val="1021"/>
         </w:numPr>
         <w:pStyle w:val="Compact"/>
       </w:pPr>
       <w:r>
-        <w:rPr>
-          <w:bCs/>
-          <w:b/>
-        </w:rPr>
-        <w:t xml:space="preserve">Conexão automática.</w:t>
-      </w:r>
-      <w:r>
-        <w:t xml:space="preserve"> </w:t>
-      </w:r>
-      <w:r>
-        <w:t xml:space="preserve">Os números chegam pela conexão oficial, sem planilha: a conta, cada post e as DMs.</w:t>
-      </w:r>
-    </w:p>
-    <w:p>
-      <w:pPr>
-        <w:numPr>
-          <w:ilvl w:val="0"/>
+        <w:t xml:space="preserve">posts, alcance, interações, engajamento, salvamentos, compartilhamentos e seguidores contra o período anterior;</w:t>
+      </w:r>
+    </w:p>
+    <w:p>
+      <w:pPr>
+        <w:numPr>
+          <w:ilvl w:val="1"/>
           <w:numId w:val="1021"/>
         </w:numPr>
         <w:pStyle w:val="Compact"/>
       </w:pPr>
       <w:r>
-        <w:rPr>
-          <w:bCs/>
-          <w:b/>
-        </w:rPr>
-        <w:t xml:space="preserve">Dashboard:</w:t>
+        <w:t xml:space="preserve">top 1 e gráficos por dia;</w:t>
+      </w:r>
+    </w:p>
+    <w:p>
+      <w:pPr>
+        <w:numPr>
+          <w:ilvl w:val="1"/>
+          <w:numId w:val="1021"/>
+        </w:numPr>
+        <w:pStyle w:val="Compact"/>
+      </w:pPr>
+      <w:r>
+        <w:t xml:space="preserve">os posts em imagens (4 primeiro,</w:t>
+      </w:r>
+      <w:r>
+        <w:t xml:space="preserve"> </w:t>
+      </w:r>
+      <w:r>
+        <w:t xml:space="preserve">“</w:t>
+      </w:r>
+      <w:r>
+        <w:t xml:space="preserve">Mostrar mais</w:t>
+      </w:r>
+      <w:r>
+        <w:t xml:space="preserve">”</w:t>
+      </w:r>
+      <w:r>
+        <w:t xml:space="preserve">), ordenáveis por engajamento, curtidas, alcance, recentes, salvos, compartilhados, comentários ou visualizações;</w:t>
+      </w:r>
+    </w:p>
+    <w:p>
+      <w:pPr>
+        <w:numPr>
+          <w:ilvl w:val="1"/>
+          <w:numId w:val="1021"/>
+        </w:numPr>
+        <w:pStyle w:val="Compact"/>
+      </w:pPr>
+      <w:r>
+        <w:t xml:space="preserve">gráficos por tema, formato e tipo de mídia. A cor diz se está acima da média (verde), na média (azul) ou abaixo (vermelho), com</w:t>
+      </w:r>
+      <w:r>
+        <w:t xml:space="preserve"> </w:t>
+      </w:r>
+      <w:r>
+        <w:t xml:space="preserve">“</w:t>
+      </w:r>
+      <w:r>
+        <w:t xml:space="preserve">+X% vs. média</w:t>
+      </w:r>
+      <w:r>
+        <w:t xml:space="preserve">”</w:t>
+      </w:r>
+      <w:r>
+        <w:t xml:space="preserve">. Clicar na barra mostra os posts que formam o número;</w:t>
+      </w:r>
+    </w:p>
+    <w:p>
+      <w:pPr>
+        <w:numPr>
+          <w:ilvl w:val="1"/>
+          <w:numId w:val="1021"/>
+        </w:numPr>
+        <w:pStyle w:val="Compact"/>
+      </w:pPr>
+      <w:r>
+        <w:t xml:space="preserve">melhores dias da semana e horários de publicação, em linha.</w:t>
+      </w:r>
+    </w:p>
+    <w:p>
+      <w:pPr>
+        <w:numPr>
+          <w:ilvl w:val="0"/>
+          <w:numId w:val="1020"/>
+        </w:numPr>
+        <w:pStyle w:val="Compact"/>
+      </w:pPr>
+      <w:r>
+        <w:rPr>
+          <w:bCs/>
+          <w:b/>
+        </w:rPr>
+        <w:t xml:space="preserve">Insights automáticos.</w:t>
+      </w:r>
+      <w:r>
+        <w:t xml:space="preserve"> </w:t>
+      </w:r>
+      <w:r>
+        <w:t xml:space="preserve">O Growths lê o período e diz o que se destaca, cada item como fato, hipótese ou recomendação e com um botão para ver os posts:</w:t>
       </w:r>
     </w:p>
     <w:p>
@@ -2571,7 +2618,7 @@
         <w:pStyle w:val="Compact"/>
       </w:pPr>
       <w:r>
-        <w:t xml:space="preserve">posts, alcance, interações, engajamento, salvamentos, compartilhamentos e seguidores contra o período anterior;</w:t>
+        <w:t xml:space="preserve">o assunto que mais engaja e o que rende menos, pelas palavras das legendas;</w:t>
       </w:r>
     </w:p>
     <w:p>
@@ -2583,7 +2630,7 @@
         <w:pStyle w:val="Compact"/>
       </w:pPr>
       <w:r>
-        <w:t xml:space="preserve">top 1 e gráficos por dia;</w:t>
+        <w:t xml:space="preserve">o tema mais forte;</w:t>
       </w:r>
     </w:p>
     <w:p>
@@ -2595,22 +2642,7 @@
         <w:pStyle w:val="Compact"/>
       </w:pPr>
       <w:r>
-        <w:t xml:space="preserve">os posts em imagens (4 primeiro,</w:t>
-      </w:r>
-      <w:r>
-        <w:t xml:space="preserve"> </w:t>
-      </w:r>
-      <w:r>
-        <w:t xml:space="preserve">“</w:t>
-      </w:r>
-      <w:r>
-        <w:t xml:space="preserve">Mostrar mais</w:t>
-      </w:r>
-      <w:r>
-        <w:t xml:space="preserve">”</w:t>
-      </w:r>
-      <w:r>
-        <w:t xml:space="preserve">), ordenáveis por engajamento, curtidas, alcance, recentes, salvos, compartilhados, comentários ou visualizações;</w:t>
+        <w:t xml:space="preserve">o tipo de mídia que mais alcança;</w:t>
       </w:r>
     </w:p>
     <w:p>
@@ -2622,22 +2654,7 @@
         <w:pStyle w:val="Compact"/>
       </w:pPr>
       <w:r>
-        <w:t xml:space="preserve">gráficos por tema, formato e tipo de mídia. A cor diz se está acima da média (verde), na média (azul) ou abaixo (vermelho), com</w:t>
-      </w:r>
-      <w:r>
-        <w:t xml:space="preserve"> </w:t>
-      </w:r>
-      <w:r>
-        <w:t xml:space="preserve">“</w:t>
-      </w:r>
-      <w:r>
-        <w:t xml:space="preserve">+X% vs. média</w:t>
-      </w:r>
-      <w:r>
-        <w:t xml:space="preserve">”</w:t>
-      </w:r>
-      <w:r>
-        <w:t xml:space="preserve">. Clicar na barra mostra os posts que formam o número;</w:t>
+        <w:t xml:space="preserve">o post que puxou conversa;</w:t>
       </w:r>
     </w:p>
     <w:p>
@@ -2649,88 +2666,6 @@
         <w:pStyle w:val="Compact"/>
       </w:pPr>
       <w:r>
-        <w:t xml:space="preserve">melhores dias da semana e horários de publicação, em linha.</w:t>
-      </w:r>
-    </w:p>
-    <w:p>
-      <w:pPr>
-        <w:numPr>
-          <w:ilvl w:val="0"/>
-          <w:numId w:val="1021"/>
-        </w:numPr>
-        <w:pStyle w:val="Compact"/>
-      </w:pPr>
-      <w:r>
-        <w:rPr>
-          <w:bCs/>
-          <w:b/>
-        </w:rPr>
-        <w:t xml:space="preserve">Insights automáticos.</w:t>
-      </w:r>
-      <w:r>
-        <w:t xml:space="preserve"> </w:t>
-      </w:r>
-      <w:r>
-        <w:t xml:space="preserve">O Growths lê o período e diz o que se destaca, cada item como fato, hipótese ou recomendação e com um botão para ver os posts:</w:t>
-      </w:r>
-    </w:p>
-    <w:p>
-      <w:pPr>
-        <w:numPr>
-          <w:ilvl w:val="1"/>
-          <w:numId w:val="1023"/>
-        </w:numPr>
-        <w:pStyle w:val="Compact"/>
-      </w:pPr>
-      <w:r>
-        <w:t xml:space="preserve">o assunto que mais engaja e o que rende menos, pelas palavras das legendas;</w:t>
-      </w:r>
-    </w:p>
-    <w:p>
-      <w:pPr>
-        <w:numPr>
-          <w:ilvl w:val="1"/>
-          <w:numId w:val="1023"/>
-        </w:numPr>
-        <w:pStyle w:val="Compact"/>
-      </w:pPr>
-      <w:r>
-        <w:t xml:space="preserve">o tema mais forte;</w:t>
-      </w:r>
-    </w:p>
-    <w:p>
-      <w:pPr>
-        <w:numPr>
-          <w:ilvl w:val="1"/>
-          <w:numId w:val="1023"/>
-        </w:numPr>
-        <w:pStyle w:val="Compact"/>
-      </w:pPr>
-      <w:r>
-        <w:t xml:space="preserve">o tipo de mídia que mais alcança;</w:t>
-      </w:r>
-    </w:p>
-    <w:p>
-      <w:pPr>
-        <w:numPr>
-          <w:ilvl w:val="1"/>
-          <w:numId w:val="1023"/>
-        </w:numPr>
-        <w:pStyle w:val="Compact"/>
-      </w:pPr>
-      <w:r>
-        <w:t xml:space="preserve">o post que puxou conversa;</w:t>
-      </w:r>
-    </w:p>
-    <w:p>
-      <w:pPr>
-        <w:numPr>
-          <w:ilvl w:val="1"/>
-          <w:numId w:val="1023"/>
-        </w:numPr>
-        <w:pStyle w:val="Compact"/>
-      </w:pPr>
-      <w:r>
         <w:t xml:space="preserve">o que pode ter levado gente para a DM;</w:t>
       </w:r>
     </w:p>
@@ -2738,7 +2673,7 @@
       <w:pPr>
         <w:numPr>
           <w:ilvl w:val="1"/>
-          <w:numId w:val="1023"/>
+          <w:numId w:val="1022"/>
         </w:numPr>
         <w:pStyle w:val="Compact"/>
       </w:pPr>
@@ -2750,7 +2685,7 @@
       <w:pPr>
         <w:numPr>
           <w:ilvl w:val="1"/>
-          <w:numId w:val="1023"/>
+          <w:numId w:val="1022"/>
         </w:numPr>
         <w:pStyle w:val="Compact"/>
       </w:pPr>
@@ -2762,7 +2697,7 @@
       <w:pPr>
         <w:numPr>
           <w:ilvl w:val="1"/>
-          <w:numId w:val="1023"/>
+          <w:numId w:val="1022"/>
         </w:numPr>
         <w:pStyle w:val="Compact"/>
       </w:pPr>
@@ -2774,7 +2709,7 @@
       <w:pPr>
         <w:numPr>
           <w:ilvl w:val="0"/>
-          <w:numId w:val="1021"/>
+          <w:numId w:val="1020"/>
         </w:numPr>
         <w:pStyle w:val="Compact"/>
       </w:pPr>
@@ -2796,7 +2731,7 @@
       <w:pPr>
         <w:numPr>
           <w:ilvl w:val="0"/>
-          <w:numId w:val="1021"/>
+          <w:numId w:val="1020"/>
         </w:numPr>
         <w:pStyle w:val="Compact"/>
       </w:pPr>
@@ -2828,33 +2763,33 @@
       <w:pPr>
         <w:numPr>
           <w:ilvl w:val="0"/>
+          <w:numId w:val="1023"/>
+        </w:numPr>
+        <w:pStyle w:val="Compact"/>
+      </w:pPr>
+      <w:r>
+        <w:rPr>
+          <w:bCs/>
+          <w:b/>
+        </w:rPr>
+        <w:t xml:space="preserve">Estruturas de roteiro e copy.</w:t>
+      </w:r>
+      <w:r>
+        <w:t xml:space="preserve"> </w:t>
+      </w:r>
+      <w:r>
+        <w:t xml:space="preserve">Uma biblioteca interna com as etapas e as instruções que a IA segue. O cliente vê só o nome e para que serve cada uma. Começa com 7 estruturas:</w:t>
+      </w:r>
+    </w:p>
+    <w:p>
+      <w:pPr>
+        <w:numPr>
+          <w:ilvl w:val="1"/>
           <w:numId w:val="1024"/>
         </w:numPr>
         <w:pStyle w:val="Compact"/>
       </w:pPr>
       <w:r>
-        <w:rPr>
-          <w:bCs/>
-          <w:b/>
-        </w:rPr>
-        <w:t xml:space="preserve">Estruturas de roteiro e copy.</w:t>
-      </w:r>
-      <w:r>
-        <w:t xml:space="preserve"> </w:t>
-      </w:r>
-      <w:r>
-        <w:t xml:space="preserve">Uma biblioteca interna com as etapas e as instruções que a IA segue. O cliente vê só o nome e para que serve cada uma. Começa com 7 estruturas:</w:t>
-      </w:r>
-    </w:p>
-    <w:p>
-      <w:pPr>
-        <w:numPr>
-          <w:ilvl w:val="1"/>
-          <w:numId w:val="1025"/>
-        </w:numPr>
-        <w:pStyle w:val="Compact"/>
-      </w:pPr>
-      <w:r>
         <w:t xml:space="preserve">AIDA;</w:t>
       </w:r>
     </w:p>
@@ -2862,7 +2797,7 @@
       <w:pPr>
         <w:numPr>
           <w:ilvl w:val="1"/>
-          <w:numId w:val="1025"/>
+          <w:numId w:val="1024"/>
         </w:numPr>
         <w:pStyle w:val="Compact"/>
       </w:pPr>
@@ -2874,7 +2809,7 @@
       <w:pPr>
         <w:numPr>
           <w:ilvl w:val="1"/>
-          <w:numId w:val="1025"/>
+          <w:numId w:val="1024"/>
         </w:numPr>
         <w:pStyle w:val="Compact"/>
       </w:pPr>
@@ -2886,7 +2821,7 @@
       <w:pPr>
         <w:numPr>
           <w:ilvl w:val="1"/>
-          <w:numId w:val="1025"/>
+          <w:numId w:val="1024"/>
         </w:numPr>
         <w:pStyle w:val="Compact"/>
       </w:pPr>
@@ -2898,7 +2833,7 @@
       <w:pPr>
         <w:numPr>
           <w:ilvl w:val="1"/>
-          <w:numId w:val="1025"/>
+          <w:numId w:val="1024"/>
         </w:numPr>
         <w:pStyle w:val="Compact"/>
       </w:pPr>
@@ -2910,7 +2845,7 @@
       <w:pPr>
         <w:numPr>
           <w:ilvl w:val="1"/>
-          <w:numId w:val="1025"/>
+          <w:numId w:val="1024"/>
         </w:numPr>
         <w:pStyle w:val="Compact"/>
       </w:pPr>
@@ -2922,7 +2857,7 @@
       <w:pPr>
         <w:numPr>
           <w:ilvl w:val="1"/>
-          <w:numId w:val="1025"/>
+          <w:numId w:val="1024"/>
         </w:numPr>
         <w:pStyle w:val="Compact"/>
       </w:pPr>
@@ -2946,7 +2881,7 @@
       <w:pPr>
         <w:numPr>
           <w:ilvl w:val="0"/>
-          <w:numId w:val="1024"/>
+          <w:numId w:val="1023"/>
         </w:numPr>
         <w:pStyle w:val="Compact"/>
       </w:pPr>
@@ -3000,7 +2935,7 @@
       <w:pPr>
         <w:numPr>
           <w:ilvl w:val="0"/>
-          <w:numId w:val="1024"/>
+          <w:numId w:val="1023"/>
         </w:numPr>
         <w:pStyle w:val="Compact"/>
       </w:pPr>
@@ -3022,7 +2957,7 @@
       <w:pPr>
         <w:numPr>
           <w:ilvl w:val="0"/>
-          <w:numId w:val="1024"/>
+          <w:numId w:val="1023"/>
         </w:numPr>
         <w:pStyle w:val="Compact"/>
       </w:pPr>
@@ -3054,30 +2989,30 @@
       <w:pPr>
         <w:numPr>
           <w:ilvl w:val="0"/>
+          <w:numId w:val="1025"/>
+        </w:numPr>
+        <w:pStyle w:val="Compact"/>
+      </w:pPr>
+      <w:r>
+        <w:rPr>
+          <w:bCs/>
+          <w:b/>
+        </w:rPr>
+        <w:t xml:space="preserve">Rotina diária</w:t>
+      </w:r>
+      <w:r>
+        <w:t xml:space="preserve">, todos os dias por cliente:</w:t>
+      </w:r>
+    </w:p>
+    <w:p>
+      <w:pPr>
+        <w:numPr>
+          <w:ilvl w:val="1"/>
           <w:numId w:val="1026"/>
         </w:numPr>
         <w:pStyle w:val="Compact"/>
       </w:pPr>
       <w:r>
-        <w:rPr>
-          <w:bCs/>
-          <w:b/>
-        </w:rPr>
-        <w:t xml:space="preserve">Rotina diária</w:t>
-      </w:r>
-      <w:r>
-        <w:t xml:space="preserve">, todos os dias por cliente:</w:t>
-      </w:r>
-    </w:p>
-    <w:p>
-      <w:pPr>
-        <w:numPr>
-          <w:ilvl w:val="1"/>
-          <w:numId w:val="1027"/>
-        </w:numPr>
-        <w:pStyle w:val="Compact"/>
-      </w:pPr>
-      <w:r>
         <w:t xml:space="preserve">ler o que entrou nas pastas (da Mathisa e do cliente);</w:t>
       </w:r>
     </w:p>
@@ -3085,7 +3020,7 @@
       <w:pPr>
         <w:numPr>
           <w:ilvl w:val="1"/>
-          <w:numId w:val="1027"/>
+          <w:numId w:val="1026"/>
         </w:numPr>
         <w:pStyle w:val="Compact"/>
       </w:pPr>
@@ -3097,7 +3032,7 @@
       <w:pPr>
         <w:numPr>
           <w:ilvl w:val="1"/>
-          <w:numId w:val="1027"/>
+          <w:numId w:val="1026"/>
         </w:numPr>
         <w:pStyle w:val="Compact"/>
       </w:pPr>
@@ -3109,7 +3044,7 @@
       <w:pPr>
         <w:numPr>
           <w:ilvl w:val="1"/>
-          <w:numId w:val="1027"/>
+          <w:numId w:val="1026"/>
         </w:numPr>
         <w:pStyle w:val="Compact"/>
       </w:pPr>
@@ -3121,7 +3056,7 @@
       <w:pPr>
         <w:numPr>
           <w:ilvl w:val="0"/>
-          <w:numId w:val="1026"/>
+          <w:numId w:val="1025"/>
         </w:numPr>
         <w:pStyle w:val="Compact"/>
       </w:pPr>
@@ -3143,7 +3078,7 @@
       <w:pPr>
         <w:numPr>
           <w:ilvl w:val="0"/>
-          <w:numId w:val="1026"/>
+          <w:numId w:val="1025"/>
         </w:numPr>
         <w:pStyle w:val="Compact"/>
       </w:pPr>
@@ -3162,29 +3097,48 @@
       <w:pPr>
         <w:numPr>
           <w:ilvl w:val="0"/>
-          <w:numId w:val="1026"/>
-        </w:numPr>
-        <w:pStyle w:val="Compact"/>
-      </w:pPr>
-      <w:r>
-        <w:rPr>
-          <w:bCs/>
-          <w:b/>
-        </w:rPr>
-        <w:t xml:space="preserve">A rotina de ideias usando a ficha de cada produto</w:t>
-      </w:r>
-      <w:r>
-        <w:t xml:space="preserve"> </w:t>
-      </w:r>
-      <w:r>
-        <w:t xml:space="preserve">e o momento de venda (ex.: mais conteúdo do produto perto da abertura do carrinho).</w:t>
-      </w:r>
-    </w:p>
-    <w:p>
-      <w:pPr>
-        <w:numPr>
-          <w:ilvl w:val="0"/>
-          <w:numId w:val="1026"/>
+          <w:numId w:val="1025"/>
+        </w:numPr>
+        <w:pStyle w:val="Compact"/>
+      </w:pPr>
+      <w:r>
+        <w:rPr>
+          <w:bCs/>
+          <w:b/>
+        </w:rPr>
+        <w:t xml:space="preserve">Pesquisa com um botão</w:t>
+      </w:r>
+      <w:r>
+        <w:t xml:space="preserve">: leitura das pastas, da call e dos produtos, pesquisa na web e um relatório para ler; depois, o dossiê.</w:t>
+      </w:r>
+    </w:p>
+    <w:p>
+      <w:pPr>
+        <w:numPr>
+          <w:ilvl w:val="0"/>
+          <w:numId w:val="1025"/>
+        </w:numPr>
+        <w:pStyle w:val="Compact"/>
+      </w:pPr>
+      <w:r>
+        <w:rPr>
+          <w:bCs/>
+          <w:b/>
+        </w:rPr>
+        <w:t xml:space="preserve">A rotina de ideias usando os produtos</w:t>
+      </w:r>
+      <w:r>
+        <w:t xml:space="preserve"> </w:t>
+      </w:r>
+      <w:r>
+        <w:t xml:space="preserve">e o histórico de cada um.</w:t>
+      </w:r>
+    </w:p>
+    <w:p>
+      <w:pPr>
+        <w:numPr>
+          <w:ilvl w:val="0"/>
+          <w:numId w:val="1025"/>
         </w:numPr>
         <w:pStyle w:val="Compact"/>
       </w:pPr>
@@ -3203,7 +3157,7 @@
       <w:pPr>
         <w:numPr>
           <w:ilvl w:val="0"/>
-          <w:numId w:val="1026"/>
+          <w:numId w:val="1025"/>
         </w:numPr>
         <w:pStyle w:val="Compact"/>
       </w:pPr>
@@ -3233,22 +3187,190 @@
       <w:pPr>
         <w:numPr>
           <w:ilvl w:val="0"/>
+          <w:numId w:val="1027"/>
+        </w:numPr>
+        <w:pStyle w:val="Compact"/>
+      </w:pPr>
+      <w:r>
+        <w:rPr>
+          <w:bCs/>
+          <w:b/>
+        </w:rPr>
+        <w:t xml:space="preserve">Funil comercial (CRM).</w:t>
+      </w:r>
+      <w:r>
+        <w:t xml:space="preserve"> </w:t>
+      </w:r>
+      <w:r>
+        <w:t xml:space="preserve">Kanban de leads com etapas editáveis. Cada etapa tem</w:t>
+      </w:r>
+      <w:r>
+        <w:t xml:space="preserve"> </w:t>
+      </w:r>
+      <w:r>
+        <w:t xml:space="preserve">“</w:t>
+      </w:r>
+      <w:r>
+        <w:t xml:space="preserve">o que precisa acontecer</w:t>
+      </w:r>
+      <w:r>
+        <w:t xml:space="preserve">”</w:t>
+      </w:r>
+      <w:r>
+        <w:t xml:space="preserve">, mensagem padrão e aviso ao responsável. Também tem comercial responsável, filtros</w:t>
+      </w:r>
+      <w:r>
+        <w:t xml:space="preserve"> </w:t>
+      </w:r>
+      <w:r>
+        <w:t xml:space="preserve">“</w:t>
+      </w:r>
+      <w:r>
+        <w:t xml:space="preserve">só os meus</w:t>
+      </w:r>
+      <w:r>
+        <w:t xml:space="preserve">”</w:t>
+      </w:r>
+      <w:r>
+        <w:t xml:space="preserve"> </w:t>
+      </w:r>
+      <w:r>
+        <w:t xml:space="preserve">e</w:t>
+      </w:r>
+      <w:r>
+        <w:t xml:space="preserve"> </w:t>
+      </w:r>
+      <w:r>
+        <w:t xml:space="preserve">“</w:t>
+      </w:r>
+      <w:r>
+        <w:t xml:space="preserve">sem responsável</w:t>
+      </w:r>
+      <w:r>
+        <w:t xml:space="preserve">”</w:t>
+      </w:r>
+      <w:r>
+        <w:t xml:space="preserve">, selo verde/vermelho de qualificado com a pontuação e tags coloridas.</w:t>
+      </w:r>
+    </w:p>
+    <w:p>
+      <w:pPr>
+        <w:numPr>
+          <w:ilvl w:val="0"/>
+          <w:numId w:val="1027"/>
+        </w:numPr>
+        <w:pStyle w:val="Compact"/>
+      </w:pPr>
+      <w:r>
+        <w:rPr>
+          <w:bCs/>
+          <w:b/>
+        </w:rPr>
+        <w:t xml:space="preserve">Ficha do lead e do cliente:</w:t>
+      </w:r>
+    </w:p>
+    <w:p>
+      <w:pPr>
+        <w:numPr>
+          <w:ilvl w:val="1"/>
           <w:numId w:val="1028"/>
         </w:numPr>
         <w:pStyle w:val="Compact"/>
       </w:pPr>
       <w:r>
-        <w:rPr>
-          <w:bCs/>
-          <w:b/>
-        </w:rPr>
-        <w:t xml:space="preserve">Funil comercial (CRM).</w:t>
-      </w:r>
-      <w:r>
-        <w:t xml:space="preserve"> </w:t>
-      </w:r>
-      <w:r>
-        <w:t xml:space="preserve">Kanban de leads com etapas editáveis. Cada etapa tem</w:t>
+        <w:t xml:space="preserve">primeira origem e último clique;</w:t>
+      </w:r>
+    </w:p>
+    <w:p>
+      <w:pPr>
+        <w:numPr>
+          <w:ilvl w:val="1"/>
+          <w:numId w:val="1028"/>
+        </w:numPr>
+        <w:pStyle w:val="Compact"/>
+      </w:pPr>
+      <w:r>
+        <w:t xml:space="preserve">quantos contatos até a compra e a linha do tempo da jornada;</w:t>
+      </w:r>
+    </w:p>
+    <w:p>
+      <w:pPr>
+        <w:numPr>
+          <w:ilvl w:val="1"/>
+          <w:numId w:val="1028"/>
+        </w:numPr>
+        <w:pStyle w:val="Compact"/>
+      </w:pPr>
+      <w:r>
+        <w:t xml:space="preserve">responsáveis e o histórico de quem mudou;</w:t>
+      </w:r>
+    </w:p>
+    <w:p>
+      <w:pPr>
+        <w:numPr>
+          <w:ilvl w:val="1"/>
+          <w:numId w:val="1028"/>
+        </w:numPr>
+        <w:pStyle w:val="Compact"/>
+      </w:pPr>
+      <w:r>
+        <w:t xml:space="preserve">compras, contratos e oportunidades;</w:t>
+      </w:r>
+    </w:p>
+    <w:p>
+      <w:pPr>
+        <w:numPr>
+          <w:ilvl w:val="1"/>
+          <w:numId w:val="1028"/>
+        </w:numPr>
+        <w:pStyle w:val="Compact"/>
+      </w:pPr>
+      <w:r>
+        <w:t xml:space="preserve">pagamentos anteriores ao sistema.</w:t>
+      </w:r>
+    </w:p>
+    <w:p>
+      <w:pPr>
+        <w:numPr>
+          <w:ilvl w:val="0"/>
+          <w:numId w:val="1027"/>
+        </w:numPr>
+        <w:pStyle w:val="Compact"/>
+      </w:pPr>
+      <w:r>
+        <w:rPr>
+          <w:bCs/>
+          <w:b/>
+        </w:rPr>
+        <w:t xml:space="preserve">Identidade sem duplicar.</w:t>
+      </w:r>
+      <w:r>
+        <w:t xml:space="preserve"> </w:t>
+      </w:r>
+      <w:r>
+        <w:t xml:space="preserve">A mesma pessoa é reconhecida por telefone e e-mail. Cadastro repetido junta sozinho ou por botão, com histórico.</w:t>
+      </w:r>
+    </w:p>
+    <w:p>
+      <w:pPr>
+        <w:numPr>
+          <w:ilvl w:val="0"/>
+          <w:numId w:val="1027"/>
+        </w:numPr>
+        <w:pStyle w:val="Compact"/>
+      </w:pPr>
+      <w:r>
+        <w:rPr>
+          <w:bCs/>
+          <w:b/>
+        </w:rPr>
+        <w:t xml:space="preserve">Vendas.</w:t>
+      </w:r>
+      <w:r>
+        <w:t xml:space="preserve"> </w:t>
+      </w:r>
+      <w:r>
+        <w:t xml:space="preserve">Vendas aprovadas, bruto e líquido, ticket médio e reembolsos. A receita aparece por papel da oferta (order bump, upsell, downsell). Cada venda guarda o primeiro e o último toque, com o painel</w:t>
       </w:r>
       <w:r>
         <w:t xml:space="preserve"> </w:t>
@@ -3257,13 +3379,114 @@
         <w:t xml:space="preserve">“</w:t>
       </w:r>
       <w:r>
-        <w:t xml:space="preserve">o que precisa acontecer</w:t>
+        <w:t xml:space="preserve">Vendas por canal</w:t>
       </w:r>
       <w:r>
         <w:t xml:space="preserve">”</w:t>
       </w:r>
       <w:r>
-        <w:t xml:space="preserve">, mensagem padrão e aviso ao responsável. Também tem comercial responsável, filtros</w:t>
+        <w:t xml:space="preserve"> </w:t>
+      </w:r>
+      <w:r>
+        <w:t xml:space="preserve">(CAC e ROAS bruto).</w:t>
+      </w:r>
+    </w:p>
+    <w:p>
+      <w:pPr>
+        <w:numPr>
+          <w:ilvl w:val="0"/>
+          <w:numId w:val="1027"/>
+        </w:numPr>
+        <w:pStyle w:val="Compact"/>
+      </w:pPr>
+      <w:r>
+        <w:rPr>
+          <w:bCs/>
+          <w:b/>
+        </w:rPr>
+        <w:t xml:space="preserve">Contratos:</w:t>
+      </w:r>
+    </w:p>
+    <w:p>
+      <w:pPr>
+        <w:numPr>
+          <w:ilvl w:val="1"/>
+          <w:numId w:val="1029"/>
+        </w:numPr>
+        <w:pStyle w:val="Compact"/>
+      </w:pPr>
+      <w:r>
+        <w:t xml:space="preserve">status claros: pendente, assinado e ativo, cancelado, encerrado;</w:t>
+      </w:r>
+    </w:p>
+    <w:p>
+      <w:pPr>
+        <w:numPr>
+          <w:ilvl w:val="1"/>
+          <w:numId w:val="1029"/>
+        </w:numPr>
+        <w:pStyle w:val="Compact"/>
+      </w:pPr>
+      <w:r>
+        <w:t xml:space="preserve">parcelas personalizadas;</w:t>
+      </w:r>
+    </w:p>
+    <w:p>
+      <w:pPr>
+        <w:numPr>
+          <w:ilvl w:val="1"/>
+          <w:numId w:val="1029"/>
+        </w:numPr>
+        <w:pStyle w:val="Compact"/>
+      </w:pPr>
+      <w:r>
+        <w:t xml:space="preserve">alerta de vencimento a 40 e a 30 dias;</w:t>
+      </w:r>
+    </w:p>
+    <w:p>
+      <w:pPr>
+        <w:numPr>
+          <w:ilvl w:val="1"/>
+          <w:numId w:val="1029"/>
+        </w:numPr>
+        <w:pStyle w:val="Compact"/>
+      </w:pPr>
+      <w:r>
+        <w:t xml:space="preserve">renovar e negociar;</w:t>
+      </w:r>
+    </w:p>
+    <w:p>
+      <w:pPr>
+        <w:numPr>
+          <w:ilvl w:val="1"/>
+          <w:numId w:val="1029"/>
+        </w:numPr>
+        <w:pStyle w:val="Compact"/>
+      </w:pPr>
+      <w:r>
+        <w:t xml:space="preserve">números do mês e MRR/ARR.</w:t>
+      </w:r>
+    </w:p>
+    <w:p>
+      <w:pPr>
+        <w:numPr>
+          <w:ilvl w:val="0"/>
+          <w:numId w:val="1027"/>
+        </w:numPr>
+        <w:pStyle w:val="Compact"/>
+      </w:pPr>
+      <w:r>
+        <w:rPr>
+          <w:bCs/>
+          <w:b/>
+        </w:rPr>
+        <w:t xml:space="preserve">Oportunidades.</w:t>
+      </w:r>
+      <w:r>
+        <w:t xml:space="preserve"> </w:t>
+      </w:r>
+      <w:r>
+        <w:t xml:space="preserve">Kanban de novos negócios com quem já é cliente: outro produto, renovação ou aditivo.</w:t>
       </w:r>
       <w:r>
         <w:t xml:space="preserve"> </w:t>
@@ -3272,7 +3495,7 @@
         <w:t xml:space="preserve">“</w:t>
       </w:r>
       <w:r>
-        <w:t xml:space="preserve">só os meus</w:t>
+        <w:t xml:space="preserve">Ganhou</w:t>
       </w:r>
       <w:r>
         <w:t xml:space="preserve">”</w:t>
@@ -3281,275 +3504,6 @@
         <w:t xml:space="preserve"> </w:t>
       </w:r>
       <w:r>
-        <w:t xml:space="preserve">e</w:t>
-      </w:r>
-      <w:r>
-        <w:t xml:space="preserve"> </w:t>
-      </w:r>
-      <w:r>
-        <w:t xml:space="preserve">“</w:t>
-      </w:r>
-      <w:r>
-        <w:t xml:space="preserve">sem responsável</w:t>
-      </w:r>
-      <w:r>
-        <w:t xml:space="preserve">”</w:t>
-      </w:r>
-      <w:r>
-        <w:t xml:space="preserve">, selo verde/vermelho de qualificado com a pontuação e tags coloridas.</w:t>
-      </w:r>
-    </w:p>
-    <w:p>
-      <w:pPr>
-        <w:numPr>
-          <w:ilvl w:val="0"/>
-          <w:numId w:val="1028"/>
-        </w:numPr>
-        <w:pStyle w:val="Compact"/>
-      </w:pPr>
-      <w:r>
-        <w:rPr>
-          <w:bCs/>
-          <w:b/>
-        </w:rPr>
-        <w:t xml:space="preserve">Ficha do lead e do cliente:</w:t>
-      </w:r>
-    </w:p>
-    <w:p>
-      <w:pPr>
-        <w:numPr>
-          <w:ilvl w:val="1"/>
-          <w:numId w:val="1029"/>
-        </w:numPr>
-        <w:pStyle w:val="Compact"/>
-      </w:pPr>
-      <w:r>
-        <w:t xml:space="preserve">primeira origem e último clique;</w:t>
-      </w:r>
-    </w:p>
-    <w:p>
-      <w:pPr>
-        <w:numPr>
-          <w:ilvl w:val="1"/>
-          <w:numId w:val="1029"/>
-        </w:numPr>
-        <w:pStyle w:val="Compact"/>
-      </w:pPr>
-      <w:r>
-        <w:t xml:space="preserve">quantos contatos até a compra e a linha do tempo da jornada;</w:t>
-      </w:r>
-    </w:p>
-    <w:p>
-      <w:pPr>
-        <w:numPr>
-          <w:ilvl w:val="1"/>
-          <w:numId w:val="1029"/>
-        </w:numPr>
-        <w:pStyle w:val="Compact"/>
-      </w:pPr>
-      <w:r>
-        <w:t xml:space="preserve">responsáveis e o histórico de quem mudou;</w:t>
-      </w:r>
-    </w:p>
-    <w:p>
-      <w:pPr>
-        <w:numPr>
-          <w:ilvl w:val="1"/>
-          <w:numId w:val="1029"/>
-        </w:numPr>
-        <w:pStyle w:val="Compact"/>
-      </w:pPr>
-      <w:r>
-        <w:t xml:space="preserve">compras, contratos e oportunidades;</w:t>
-      </w:r>
-    </w:p>
-    <w:p>
-      <w:pPr>
-        <w:numPr>
-          <w:ilvl w:val="1"/>
-          <w:numId w:val="1029"/>
-        </w:numPr>
-        <w:pStyle w:val="Compact"/>
-      </w:pPr>
-      <w:r>
-        <w:t xml:space="preserve">pagamentos anteriores ao sistema.</w:t>
-      </w:r>
-    </w:p>
-    <w:p>
-      <w:pPr>
-        <w:numPr>
-          <w:ilvl w:val="0"/>
-          <w:numId w:val="1028"/>
-        </w:numPr>
-        <w:pStyle w:val="Compact"/>
-      </w:pPr>
-      <w:r>
-        <w:rPr>
-          <w:bCs/>
-          <w:b/>
-        </w:rPr>
-        <w:t xml:space="preserve">Identidade sem duplicar.</w:t>
-      </w:r>
-      <w:r>
-        <w:t xml:space="preserve"> </w:t>
-      </w:r>
-      <w:r>
-        <w:t xml:space="preserve">A mesma pessoa é reconhecida por telefone e e-mail. Cadastro repetido junta sozinho ou por botão, com histórico.</w:t>
-      </w:r>
-    </w:p>
-    <w:p>
-      <w:pPr>
-        <w:numPr>
-          <w:ilvl w:val="0"/>
-          <w:numId w:val="1028"/>
-        </w:numPr>
-        <w:pStyle w:val="Compact"/>
-      </w:pPr>
-      <w:r>
-        <w:rPr>
-          <w:bCs/>
-          <w:b/>
-        </w:rPr>
-        <w:t xml:space="preserve">Vendas.</w:t>
-      </w:r>
-      <w:r>
-        <w:t xml:space="preserve"> </w:t>
-      </w:r>
-      <w:r>
-        <w:t xml:space="preserve">Vendas aprovadas, bruto e líquido, ticket médio e reembolsos. A receita aparece por papel da oferta (order bump, upsell, downsell). Cada venda guarda o primeiro e o último toque, com o painel</w:t>
-      </w:r>
-      <w:r>
-        <w:t xml:space="preserve"> </w:t>
-      </w:r>
-      <w:r>
-        <w:t xml:space="preserve">“</w:t>
-      </w:r>
-      <w:r>
-        <w:t xml:space="preserve">Vendas por canal</w:t>
-      </w:r>
-      <w:r>
-        <w:t xml:space="preserve">”</w:t>
-      </w:r>
-      <w:r>
-        <w:t xml:space="preserve"> </w:t>
-      </w:r>
-      <w:r>
-        <w:t xml:space="preserve">(CAC e ROAS bruto).</w:t>
-      </w:r>
-    </w:p>
-    <w:p>
-      <w:pPr>
-        <w:numPr>
-          <w:ilvl w:val="0"/>
-          <w:numId w:val="1028"/>
-        </w:numPr>
-        <w:pStyle w:val="Compact"/>
-      </w:pPr>
-      <w:r>
-        <w:rPr>
-          <w:bCs/>
-          <w:b/>
-        </w:rPr>
-        <w:t xml:space="preserve">Contratos:</w:t>
-      </w:r>
-    </w:p>
-    <w:p>
-      <w:pPr>
-        <w:numPr>
-          <w:ilvl w:val="1"/>
-          <w:numId w:val="1030"/>
-        </w:numPr>
-        <w:pStyle w:val="Compact"/>
-      </w:pPr>
-      <w:r>
-        <w:t xml:space="preserve">status claros: pendente, assinado e ativo, cancelado, encerrado;</w:t>
-      </w:r>
-    </w:p>
-    <w:p>
-      <w:pPr>
-        <w:numPr>
-          <w:ilvl w:val="1"/>
-          <w:numId w:val="1030"/>
-        </w:numPr>
-        <w:pStyle w:val="Compact"/>
-      </w:pPr>
-      <w:r>
-        <w:t xml:space="preserve">parcelas personalizadas;</w:t>
-      </w:r>
-    </w:p>
-    <w:p>
-      <w:pPr>
-        <w:numPr>
-          <w:ilvl w:val="1"/>
-          <w:numId w:val="1030"/>
-        </w:numPr>
-        <w:pStyle w:val="Compact"/>
-      </w:pPr>
-      <w:r>
-        <w:t xml:space="preserve">alerta de vencimento a 40 e a 30 dias;</w:t>
-      </w:r>
-    </w:p>
-    <w:p>
-      <w:pPr>
-        <w:numPr>
-          <w:ilvl w:val="1"/>
-          <w:numId w:val="1030"/>
-        </w:numPr>
-        <w:pStyle w:val="Compact"/>
-      </w:pPr>
-      <w:r>
-        <w:t xml:space="preserve">renovar e negociar;</w:t>
-      </w:r>
-    </w:p>
-    <w:p>
-      <w:pPr>
-        <w:numPr>
-          <w:ilvl w:val="1"/>
-          <w:numId w:val="1030"/>
-        </w:numPr>
-        <w:pStyle w:val="Compact"/>
-      </w:pPr>
-      <w:r>
-        <w:t xml:space="preserve">números do mês e MRR/ARR.</w:t>
-      </w:r>
-    </w:p>
-    <w:p>
-      <w:pPr>
-        <w:numPr>
-          <w:ilvl w:val="0"/>
-          <w:numId w:val="1028"/>
-        </w:numPr>
-        <w:pStyle w:val="Compact"/>
-      </w:pPr>
-      <w:r>
-        <w:rPr>
-          <w:bCs/>
-          <w:b/>
-        </w:rPr>
-        <w:t xml:space="preserve">Oportunidades.</w:t>
-      </w:r>
-      <w:r>
-        <w:t xml:space="preserve"> </w:t>
-      </w:r>
-      <w:r>
-        <w:t xml:space="preserve">Kanban de novos negócios com quem já é cliente: outro produto, renovação ou aditivo.</w:t>
-      </w:r>
-      <w:r>
-        <w:t xml:space="preserve"> </w:t>
-      </w:r>
-      <w:r>
-        <w:t xml:space="preserve">“</w:t>
-      </w:r>
-      <w:r>
-        <w:t xml:space="preserve">Ganhou</w:t>
-      </w:r>
-      <w:r>
-        <w:t xml:space="preserve">”</w:t>
-      </w:r>
-      <w:r>
-        <w:t xml:space="preserve"> </w:t>
-      </w:r>
-      <w:r>
         <w:t xml:space="preserve">abre o contrato já preenchido.</w:t>
       </w:r>
     </w:p>
@@ -3557,7 +3511,7 @@
       <w:pPr>
         <w:numPr>
           <w:ilvl w:val="0"/>
-          <w:numId w:val="1028"/>
+          <w:numId w:val="1027"/>
         </w:numPr>
         <w:pStyle w:val="Compact"/>
       </w:pPr>
@@ -3579,7 +3533,7 @@
       <w:pPr>
         <w:numPr>
           <w:ilvl w:val="0"/>
-          <w:numId w:val="1028"/>
+          <w:numId w:val="1027"/>
         </w:numPr>
         <w:pStyle w:val="Compact"/>
       </w:pPr>
@@ -3601,7 +3555,7 @@
       <w:pPr>
         <w:numPr>
           <w:ilvl w:val="0"/>
-          <w:numId w:val="1028"/>
+          <w:numId w:val="1027"/>
         </w:numPr>
         <w:pStyle w:val="Compact"/>
       </w:pPr>
@@ -3623,7 +3577,7 @@
       <w:pPr>
         <w:numPr>
           <w:ilvl w:val="0"/>
-          <w:numId w:val="1028"/>
+          <w:numId w:val="1027"/>
         </w:numPr>
         <w:pStyle w:val="Compact"/>
       </w:pPr>
@@ -3662,6 +3616,25 @@
       <w:pPr>
         <w:numPr>
           <w:ilvl w:val="0"/>
+          <w:numId w:val="1030"/>
+        </w:numPr>
+        <w:pStyle w:val="Compact"/>
+      </w:pPr>
+      <w:r>
+        <w:rPr>
+          <w:bCs/>
+          <w:b/>
+        </w:rPr>
+        <w:t xml:space="preserve">Retenção &amp; Expansão</w:t>
+      </w:r>
+      <w:r>
+        <w:t xml:space="preserve">, com filtros de período da primeira compra, produto, canal, campanha, origem e segmento:</w:t>
+      </w:r>
+    </w:p>
+    <w:p>
+      <w:pPr>
+        <w:numPr>
+          <w:ilvl w:val="1"/>
           <w:numId w:val="1031"/>
         </w:numPr>
         <w:pStyle w:val="Compact"/>
@@ -3671,25 +3644,6 @@
           <w:bCs/>
           <w:b/>
         </w:rPr>
-        <w:t xml:space="preserve">Retenção &amp; Expansão</w:t>
-      </w:r>
-      <w:r>
-        <w:t xml:space="preserve">, com filtros de período da primeira compra, produto, canal, campanha, origem e segmento:</w:t>
-      </w:r>
-    </w:p>
-    <w:p>
-      <w:pPr>
-        <w:numPr>
-          <w:ilvl w:val="1"/>
-          <w:numId w:val="1032"/>
-        </w:numPr>
-        <w:pStyle w:val="Compact"/>
-      </w:pPr>
-      <w:r>
-        <w:rPr>
-          <w:bCs/>
-          <w:b/>
-        </w:rPr>
         <w:t xml:space="preserve">Coortes:</w:t>
       </w:r>
       <w:r>
@@ -3718,7 +3672,7 @@
       <w:pPr>
         <w:numPr>
           <w:ilvl w:val="1"/>
-          <w:numId w:val="1032"/>
+          <w:numId w:val="1031"/>
         </w:numPr>
         <w:pStyle w:val="Compact"/>
       </w:pPr>
@@ -3740,7 +3694,7 @@
       <w:pPr>
         <w:numPr>
           <w:ilvl w:val="1"/>
-          <w:numId w:val="1032"/>
+          <w:numId w:val="1031"/>
         </w:numPr>
         <w:pStyle w:val="Compact"/>
       </w:pPr>
@@ -3762,7 +3716,7 @@
       <w:pPr>
         <w:numPr>
           <w:ilvl w:val="1"/>
-          <w:numId w:val="1032"/>
+          <w:numId w:val="1031"/>
         </w:numPr>
         <w:pStyle w:val="Compact"/>
       </w:pPr>
@@ -3784,7 +3738,7 @@
       <w:pPr>
         <w:numPr>
           <w:ilvl w:val="0"/>
-          <w:numId w:val="1031"/>
+          <w:numId w:val="1030"/>
         </w:numPr>
         <w:pStyle w:val="Compact"/>
       </w:pPr>
@@ -3806,7 +3760,7 @@
       <w:pPr>
         <w:numPr>
           <w:ilvl w:val="0"/>
-          <w:numId w:val="1031"/>
+          <w:numId w:val="1030"/>
         </w:numPr>
         <w:pStyle w:val="Compact"/>
       </w:pPr>
@@ -3845,231 +3799,231 @@
       <w:pPr>
         <w:numPr>
           <w:ilvl w:val="0"/>
+          <w:numId w:val="1032"/>
+        </w:numPr>
+        <w:pStyle w:val="Compact"/>
+      </w:pPr>
+      <w:r>
+        <w:rPr>
+          <w:bCs/>
+          <w:b/>
+        </w:rPr>
+        <w:t xml:space="preserve">Contabilidade de verdade.</w:t>
+      </w:r>
+      <w:r>
+        <w:t xml:space="preserve"> </w:t>
+      </w:r>
+      <w:r>
+        <w:t xml:space="preserve">Cada venda, recebimento, conta e pagamento gera as partidas dobradas sozinho, pelas regras contábeis (que podem ser personalizadas). Nada se apaga: correção é estorno.</w:t>
+      </w:r>
+    </w:p>
+    <w:p>
+      <w:pPr>
+        <w:numPr>
+          <w:ilvl w:val="0"/>
+          <w:numId w:val="1032"/>
+        </w:numPr>
+        <w:pStyle w:val="Compact"/>
+      </w:pPr>
+      <w:r>
+        <w:rPr>
+          <w:bCs/>
+          <w:b/>
+        </w:rPr>
+        <w:t xml:space="preserve">Contas a receber.</w:t>
+      </w:r>
+      <w:r>
+        <w:t xml:space="preserve"> </w:t>
+      </w:r>
+      <w:r>
+        <w:t xml:space="preserve">Parcelas de contratos e vendas, provisionamento por mês e por cliente, MRR/ARR, receitas avulsas (com repetição) e desconto em parcela, que vira dedução da receita e não despesa. Também dá para cancelar, desfazer recebimento e reativar.</w:t>
+      </w:r>
+    </w:p>
+    <w:p>
+      <w:pPr>
+        <w:numPr>
+          <w:ilvl w:val="0"/>
+          <w:numId w:val="1032"/>
+        </w:numPr>
+        <w:pStyle w:val="Compact"/>
+      </w:pPr>
+      <w:r>
+        <w:rPr>
+          <w:bCs/>
+          <w:b/>
+        </w:rPr>
+        <w:t xml:space="preserve">Contas a pagar.</w:t>
+      </w:r>
+      <w:r>
+        <w:t xml:space="preserve"> </w:t>
+      </w:r>
+      <w:r>
+        <w:t xml:space="preserve">Conta única, recorrente fixa, recorrente variável (valor estimado que se confirma) ou parcelada. Tem formas de pagamento, inclusive cartão de outra pessoa, e fornecedores com valor e vencimento padrão.</w:t>
+      </w:r>
+    </w:p>
+    <w:p>
+      <w:pPr>
+        <w:numPr>
+          <w:ilvl w:val="0"/>
+          <w:numId w:val="1032"/>
+        </w:numPr>
+        <w:pStyle w:val="Compact"/>
+      </w:pPr>
+      <w:r>
+        <w:rPr>
+          <w:bCs/>
+          <w:b/>
+        </w:rPr>
+        <w:t xml:space="preserve">Baixa parcial.</w:t>
+      </w:r>
+      <w:r>
+        <w:t xml:space="preserve"> </w:t>
+      </w:r>
+      <w:r>
+        <w:t xml:space="preserve">Pagar ou receber uma parte deixa o saldo em aberto, sem bagunçar a despesa ou a receita do mês. Desfazer junta de novo.</w:t>
+      </w:r>
+    </w:p>
+    <w:p>
+      <w:pPr>
+        <w:numPr>
+          <w:ilvl w:val="0"/>
+          <w:numId w:val="1032"/>
+        </w:numPr>
+        <w:pStyle w:val="Compact"/>
+      </w:pPr>
+      <w:r>
+        <w:rPr>
+          <w:bCs/>
+          <w:b/>
+        </w:rPr>
+        <w:t xml:space="preserve">Cartão de crédito como fatura</w:t>
+      </w:r>
+      <w:r>
+        <w:t xml:space="preserve">, não como saldo. O dinheiro só sai do banco ao pagar a fatura.</w:t>
+      </w:r>
+    </w:p>
+    <w:p>
+      <w:pPr>
+        <w:numPr>
+          <w:ilvl w:val="0"/>
+          <w:numId w:val="1032"/>
+        </w:numPr>
+        <w:pStyle w:val="Compact"/>
+      </w:pPr>
+      <w:r>
+        <w:rPr>
+          <w:bCs/>
+          <w:b/>
+        </w:rPr>
+        <w:t xml:space="preserve">Dashboard financeiro.</w:t>
+      </w:r>
+      <w:r>
+        <w:t xml:space="preserve"> </w:t>
+      </w:r>
+      <w:r>
+        <w:t xml:space="preserve">Saldo em banco (abre o extrato com saldo linha a linha), a receber e a pagar no período, atraso, projeção, resultado contra caixa e a cascata de como o resultado se formou.</w:t>
+      </w:r>
+    </w:p>
+    <w:p>
+      <w:pPr>
+        <w:numPr>
+          <w:ilvl w:val="0"/>
+          <w:numId w:val="1032"/>
+        </w:numPr>
+        <w:pStyle w:val="Compact"/>
+      </w:pPr>
+      <w:r>
+        <w:rPr>
+          <w:bCs/>
+          <w:b/>
+        </w:rPr>
+        <w:t xml:space="preserve">Custos e margens:</w:t>
+      </w:r>
+    </w:p>
+    <w:p>
+      <w:pPr>
+        <w:numPr>
+          <w:ilvl w:val="1"/>
           <w:numId w:val="1033"/>
         </w:numPr>
         <w:pStyle w:val="Compact"/>
       </w:pPr>
       <w:r>
-        <w:rPr>
-          <w:bCs/>
-          <w:b/>
-        </w:rPr>
-        <w:t xml:space="preserve">Contabilidade de verdade.</w:t>
-      </w:r>
-      <w:r>
-        <w:t xml:space="preserve"> </w:t>
-      </w:r>
-      <w:r>
-        <w:t xml:space="preserve">Cada venda, recebimento, conta e pagamento gera as partidas dobradas sozinho, pelas regras contábeis (que podem ser personalizadas). Nada se apaga: correção é estorno.</w:t>
-      </w:r>
-    </w:p>
-    <w:p>
-      <w:pPr>
-        <w:numPr>
-          <w:ilvl w:val="0"/>
+        <w:t xml:space="preserve">custo do mês (fixo, variável, parcelado, pontual) e pró-labores;</w:t>
+      </w:r>
+    </w:p>
+    <w:p>
+      <w:pPr>
+        <w:numPr>
+          <w:ilvl w:val="1"/>
           <w:numId w:val="1033"/>
         </w:numPr>
         <w:pStyle w:val="Compact"/>
       </w:pPr>
       <w:r>
-        <w:rPr>
-          <w:bCs/>
-          <w:b/>
-        </w:rPr>
-        <w:t xml:space="preserve">Contas a receber.</w:t>
-      </w:r>
-      <w:r>
-        <w:t xml:space="preserve"> </w:t>
-      </w:r>
-      <w:r>
-        <w:t xml:space="preserve">Parcelas de contratos e vendas, provisionamento por mês e por cliente, MRR/ARR, receitas avulsas (com repetição) e desconto em parcela, que vira dedução da receita e não despesa. Também dá para cancelar, desfazer recebimento e reativar.</w:t>
-      </w:r>
-    </w:p>
-    <w:p>
-      <w:pPr>
-        <w:numPr>
-          <w:ilvl w:val="0"/>
+        <w:t xml:space="preserve">margem de contribuição por produto e lucro líquido;</w:t>
+      </w:r>
+    </w:p>
+    <w:p>
+      <w:pPr>
+        <w:numPr>
+          <w:ilvl w:val="1"/>
           <w:numId w:val="1033"/>
         </w:numPr>
         <w:pStyle w:val="Compact"/>
       </w:pPr>
       <w:r>
-        <w:rPr>
-          <w:bCs/>
-          <w:b/>
-        </w:rPr>
-        <w:t xml:space="preserve">Contas a pagar.</w:t>
-      </w:r>
-      <w:r>
-        <w:t xml:space="preserve"> </w:t>
-      </w:r>
-      <w:r>
-        <w:t xml:space="preserve">Conta única, recorrente fixa, recorrente variável (valor estimado que se confirma) ou parcelada. Tem formas de pagamento, inclusive cartão de outra pessoa, e fornecedores com valor e vencimento padrão.</w:t>
-      </w:r>
-    </w:p>
-    <w:p>
-      <w:pPr>
-        <w:numPr>
-          <w:ilvl w:val="0"/>
+        <w:t xml:space="preserve">ponto de equilíbrio e</w:t>
+      </w:r>
+      <w:r>
+        <w:t xml:space="preserve"> </w:t>
+      </w:r>
+      <w:r>
+        <w:t xml:space="preserve">“</w:t>
+      </w:r>
+      <w:r>
+        <w:t xml:space="preserve">quanto preciso vender</w:t>
+      </w:r>
+      <w:r>
+        <w:t xml:space="preserve">”</w:t>
+      </w:r>
+      <w:r>
+        <w:t xml:space="preserve">;</w:t>
+      </w:r>
+    </w:p>
+    <w:p>
+      <w:pPr>
+        <w:numPr>
+          <w:ilvl w:val="1"/>
           <w:numId w:val="1033"/>
         </w:numPr>
         <w:pStyle w:val="Compact"/>
       </w:pPr>
       <w:r>
-        <w:rPr>
-          <w:bCs/>
-          <w:b/>
-        </w:rPr>
-        <w:t xml:space="preserve">Baixa parcial.</w:t>
-      </w:r>
-      <w:r>
-        <w:t xml:space="preserve"> </w:t>
-      </w:r>
-      <w:r>
-        <w:t xml:space="preserve">Pagar ou receber uma parte deixa o saldo em aberto, sem bagunçar a despesa ou a receita do mês. Desfazer junta de novo.</w:t>
-      </w:r>
-    </w:p>
-    <w:p>
-      <w:pPr>
-        <w:numPr>
-          <w:ilvl w:val="0"/>
+        <w:t xml:space="preserve">comparação entre regimes tributários;</w:t>
+      </w:r>
+    </w:p>
+    <w:p>
+      <w:pPr>
+        <w:numPr>
+          <w:ilvl w:val="1"/>
           <w:numId w:val="1033"/>
         </w:numPr>
         <w:pStyle w:val="Compact"/>
       </w:pPr>
       <w:r>
-        <w:rPr>
-          <w:bCs/>
-          <w:b/>
-        </w:rPr>
-        <w:t xml:space="preserve">Cartão de crédito como fatura</w:t>
-      </w:r>
-      <w:r>
-        <w:t xml:space="preserve">, não como saldo. O dinheiro só sai do banco ao pagar a fatura.</w:t>
-      </w:r>
-    </w:p>
-    <w:p>
-      <w:pPr>
-        <w:numPr>
-          <w:ilvl w:val="0"/>
+        <w:t xml:space="preserve">cenários ruim, bom e ótimo de margem;</w:t>
+      </w:r>
+    </w:p>
+    <w:p>
+      <w:pPr>
+        <w:numPr>
+          <w:ilvl w:val="1"/>
           <w:numId w:val="1033"/>
         </w:numPr>
         <w:pStyle w:val="Compact"/>
       </w:pPr>
       <w:r>
-        <w:rPr>
-          <w:bCs/>
-          <w:b/>
-        </w:rPr>
-        <w:t xml:space="preserve">Dashboard financeiro.</w:t>
-      </w:r>
-      <w:r>
-        <w:t xml:space="preserve"> </w:t>
-      </w:r>
-      <w:r>
-        <w:t xml:space="preserve">Saldo em banco (abre o extrato com saldo linha a linha), a receber e a pagar no período, atraso, projeção, resultado contra caixa e a cascata de como o resultado se formou.</w:t>
-      </w:r>
-    </w:p>
-    <w:p>
-      <w:pPr>
-        <w:numPr>
-          <w:ilvl w:val="0"/>
-          <w:numId w:val="1033"/>
-        </w:numPr>
-        <w:pStyle w:val="Compact"/>
-      </w:pPr>
-      <w:r>
-        <w:rPr>
-          <w:bCs/>
-          <w:b/>
-        </w:rPr>
-        <w:t xml:space="preserve">Custos e margens:</w:t>
-      </w:r>
-    </w:p>
-    <w:p>
-      <w:pPr>
-        <w:numPr>
-          <w:ilvl w:val="1"/>
-          <w:numId w:val="1034"/>
-        </w:numPr>
-        <w:pStyle w:val="Compact"/>
-      </w:pPr>
-      <w:r>
-        <w:t xml:space="preserve">custo do mês (fixo, variável, parcelado, pontual) e pró-labores;</w:t>
-      </w:r>
-    </w:p>
-    <w:p>
-      <w:pPr>
-        <w:numPr>
-          <w:ilvl w:val="1"/>
-          <w:numId w:val="1034"/>
-        </w:numPr>
-        <w:pStyle w:val="Compact"/>
-      </w:pPr>
-      <w:r>
-        <w:t xml:space="preserve">margem de contribuição por produto e lucro líquido;</w:t>
-      </w:r>
-    </w:p>
-    <w:p>
-      <w:pPr>
-        <w:numPr>
-          <w:ilvl w:val="1"/>
-          <w:numId w:val="1034"/>
-        </w:numPr>
-        <w:pStyle w:val="Compact"/>
-      </w:pPr>
-      <w:r>
-        <w:t xml:space="preserve">ponto de equilíbrio e</w:t>
-      </w:r>
-      <w:r>
-        <w:t xml:space="preserve"> </w:t>
-      </w:r>
-      <w:r>
-        <w:t xml:space="preserve">“</w:t>
-      </w:r>
-      <w:r>
-        <w:t xml:space="preserve">quanto preciso vender</w:t>
-      </w:r>
-      <w:r>
-        <w:t xml:space="preserve">”</w:t>
-      </w:r>
-      <w:r>
-        <w:t xml:space="preserve">;</w:t>
-      </w:r>
-    </w:p>
-    <w:p>
-      <w:pPr>
-        <w:numPr>
-          <w:ilvl w:val="1"/>
-          <w:numId w:val="1034"/>
-        </w:numPr>
-        <w:pStyle w:val="Compact"/>
-      </w:pPr>
-      <w:r>
-        <w:t xml:space="preserve">comparação entre regimes tributários;</w:t>
-      </w:r>
-    </w:p>
-    <w:p>
-      <w:pPr>
-        <w:numPr>
-          <w:ilvl w:val="1"/>
-          <w:numId w:val="1034"/>
-        </w:numPr>
-        <w:pStyle w:val="Compact"/>
-      </w:pPr>
-      <w:r>
-        <w:t xml:space="preserve">cenários ruim, bom e ótimo de margem;</w:t>
-      </w:r>
-    </w:p>
-    <w:p>
-      <w:pPr>
-        <w:numPr>
-          <w:ilvl w:val="1"/>
-          <w:numId w:val="1034"/>
-        </w:numPr>
-        <w:pStyle w:val="Compact"/>
-      </w:pPr>
-      <w:r>
         <w:t xml:space="preserve">custo por área contra o mês anterior.</w:t>
       </w:r>
     </w:p>
@@ -4077,7 +4031,7 @@
       <w:pPr>
         <w:numPr>
           <w:ilvl w:val="0"/>
-          <w:numId w:val="1033"/>
+          <w:numId w:val="1032"/>
         </w:numPr>
         <w:pStyle w:val="Compact"/>
       </w:pPr>
@@ -4096,7 +4050,7 @@
       <w:pPr>
         <w:numPr>
           <w:ilvl w:val="0"/>
-          <w:numId w:val="1033"/>
+          <w:numId w:val="1032"/>
         </w:numPr>
         <w:pStyle w:val="Compact"/>
       </w:pPr>
@@ -4115,7 +4069,7 @@
       <w:pPr>
         <w:numPr>
           <w:ilvl w:val="0"/>
-          <w:numId w:val="1033"/>
+          <w:numId w:val="1032"/>
         </w:numPr>
         <w:pStyle w:val="Compact"/>
       </w:pPr>
@@ -4169,38 +4123,186 @@
       <w:pPr>
         <w:numPr>
           <w:ilvl w:val="0"/>
+          <w:numId w:val="1034"/>
+        </w:numPr>
+        <w:pStyle w:val="Compact"/>
+      </w:pPr>
+      <w:r>
+        <w:rPr>
+          <w:bCs/>
+          <w:b/>
+        </w:rPr>
+        <w:t xml:space="preserve">Diagnóstico Growth.</w:t>
+      </w:r>
+      <w:r>
+        <w:t xml:space="preserve"> </w:t>
+      </w:r>
+      <w:r>
+        <w:t xml:space="preserve">Sobe planilhas bagunçadas do cliente e o sistema identifica vendas, leads e investimento. Classifica cada venda (nova, renovação, upgrade, repetida) e mostra o que falta em 13 itens, com a mensagem pronta para pedir ao cliente e a planilha padronizada para baixar.</w:t>
+      </w:r>
+    </w:p>
+    <w:p>
+      <w:pPr>
+        <w:numPr>
+          <w:ilvl w:val="0"/>
+          <w:numId w:val="1034"/>
+        </w:numPr>
+        <w:pStyle w:val="Compact"/>
+      </w:pPr>
+      <w:r>
+        <w:rPr>
+          <w:bCs/>
+          <w:b/>
+        </w:rPr>
+        <w:t xml:space="preserve">Growth Model em planilha:</w:t>
+      </w:r>
+    </w:p>
+    <w:p>
+      <w:pPr>
+        <w:numPr>
+          <w:ilvl w:val="1"/>
           <w:numId w:val="1035"/>
         </w:numPr>
         <w:pStyle w:val="Compact"/>
       </w:pPr>
       <w:r>
-        <w:rPr>
-          <w:bCs/>
-          <w:b/>
-        </w:rPr>
-        <w:t xml:space="preserve">Diagnóstico Growth.</w:t>
-      </w:r>
-      <w:r>
-        <w:t xml:space="preserve"> </w:t>
-      </w:r>
-      <w:r>
-        <w:t xml:space="preserve">Sobe planilhas bagunçadas do cliente e o sistema identifica vendas, leads e investimento. Classifica cada venda (nova, renovação, upgrade, repetida) e mostra o que falta em 13 itens, com a mensagem pronta para pedir ao cliente e a planilha padronizada para baixar.</w:t>
-      </w:r>
-    </w:p>
-    <w:p>
-      <w:pPr>
-        <w:numPr>
-          <w:ilvl w:val="0"/>
+        <w:t xml:space="preserve">colunas Real + projeção (travado), Cenário (onde se mexe) e Efeito;</w:t>
+      </w:r>
+    </w:p>
+    <w:p>
+      <w:pPr>
+        <w:numPr>
+          <w:ilvl w:val="1"/>
           <w:numId w:val="1035"/>
         </w:numPr>
         <w:pStyle w:val="Compact"/>
       </w:pPr>
       <w:r>
-        <w:rPr>
-          <w:bCs/>
-          <w:b/>
-        </w:rPr>
-        <w:t xml:space="preserve">Growth Model em planilha:</w:t>
+        <w:t xml:space="preserve">mexeu numa célula, o resto recalcula: o preço sobe, a receita sobe, o imposto acompanha, a margem e o lucro mudam;</w:t>
+      </w:r>
+    </w:p>
+    <w:p>
+      <w:pPr>
+        <w:numPr>
+          <w:ilvl w:val="1"/>
+          <w:numId w:val="1035"/>
+        </w:numPr>
+        <w:pStyle w:val="Compact"/>
+      </w:pPr>
+      <w:r>
+        <w:t xml:space="preserve">amarelo é o que se mexeu, azul é o que mudou por consequência;</w:t>
+      </w:r>
+    </w:p>
+    <w:p>
+      <w:pPr>
+        <w:numPr>
+          <w:ilvl w:val="1"/>
+          <w:numId w:val="1035"/>
+        </w:numPr>
+        <w:pStyle w:val="Compact"/>
+      </w:pPr>
+      <w:r>
+        <w:t xml:space="preserve">resultado do período, um bloco por produto e uma seção por loop ou campanha;</w:t>
+      </w:r>
+    </w:p>
+    <w:p>
+      <w:pPr>
+        <w:numPr>
+          <w:ilvl w:val="1"/>
+          <w:numId w:val="1035"/>
+        </w:numPr>
+        <w:pStyle w:val="Compact"/>
+      </w:pPr>
+      <w:r>
+        <w:t xml:space="preserve">comparar até 3 cenários lado a lado.</w:t>
+      </w:r>
+    </w:p>
+    <w:p>
+      <w:pPr>
+        <w:numPr>
+          <w:ilvl w:val="0"/>
+          <w:numId w:val="1034"/>
+        </w:numPr>
+        <w:pStyle w:val="Compact"/>
+      </w:pPr>
+      <w:r>
+        <w:rPr>
+          <w:bCs/>
+          <w:b/>
+        </w:rPr>
+        <w:t xml:space="preserve">Cenários com ciclo de vida.</w:t>
+      </w:r>
+      <w:r>
+        <w:t xml:space="preserve"> </w:t>
+      </w:r>
+      <w:r>
+        <w:t xml:space="preserve">Em estudo, descartado (com motivo, e dá para reabrir), aprovado, ativo, encerrado, cancelado.</w:t>
+      </w:r>
+    </w:p>
+    <w:p>
+      <w:pPr>
+        <w:numPr>
+          <w:ilvl w:val="0"/>
+          <w:numId w:val="1034"/>
+        </w:numPr>
+        <w:pStyle w:val="Compact"/>
+      </w:pPr>
+      <w:r>
+        <w:rPr>
+          <w:bCs/>
+          <w:b/>
+        </w:rPr>
+        <w:t xml:space="preserve">Decisão.</w:t>
+      </w:r>
+      <w:r>
+        <w:t xml:space="preserve"> </w:t>
+      </w:r>
+      <w:r>
+        <w:t xml:space="preserve">ICE (impacto, confiança, facilidade) com justificativa. A aprovação congela o cenário e gera o documento de decisão imutável (contexto, hipótese, baseline contra projeção, riscos, responsável) e a ideia no Kanban.</w:t>
+      </w:r>
+    </w:p>
+    <w:p>
+      <w:pPr>
+        <w:numPr>
+          <w:ilvl w:val="0"/>
+          <w:numId w:val="1034"/>
+        </w:numPr>
+        <w:pStyle w:val="Compact"/>
+      </w:pPr>
+      <w:r>
+        <w:rPr>
+          <w:bCs/>
+          <w:b/>
+        </w:rPr>
+        <w:t xml:space="preserve">Ciclo de Growth (Kanban de experimentos).</w:t>
+      </w:r>
+      <w:r>
+        <w:t xml:space="preserve"> </w:t>
+      </w:r>
+      <w:r>
+        <w:t xml:space="preserve">Ideias → em avaliação → priorizadas → preparação → em teste → análise → concluídas. Cada experimento tem o desenho do teste: métrica-alvo, público, intervenção, critério de sucesso.</w:t>
+      </w:r>
+    </w:p>
+    <w:p>
+      <w:pPr>
+        <w:numPr>
+          <w:ilvl w:val="0"/>
+          <w:numId w:val="1034"/>
+        </w:numPr>
+        <w:pStyle w:val="Compact"/>
+      </w:pPr>
+      <w:r>
+        <w:rPr>
+          <w:bCs/>
+          <w:b/>
+        </w:rPr>
+        <w:t xml:space="preserve">Guardrails.</w:t>
+      </w:r>
+      <w:r>
+        <w:t xml:space="preserve"> </w:t>
+      </w:r>
+      <w:r>
+        <w:t xml:space="preserve">Limites de margem, lucro, ROAS, CAC, CPL e outros:</w:t>
       </w:r>
     </w:p>
     <w:p>
@@ -4212,7 +4314,22 @@
         <w:pStyle w:val="Compact"/>
       </w:pPr>
       <w:r>
-        <w:t xml:space="preserve">colunas Real + projeção (travado), Cenário (onde se mexe) e Efeito;</w:t>
+        <w:t xml:space="preserve">projetados no cenário:</w:t>
+      </w:r>
+      <w:r>
+        <w:t xml:space="preserve"> </w:t>
+      </w:r>
+      <w:r>
+        <w:t xml:space="preserve">“</w:t>
+      </w:r>
+      <w:r>
+        <w:t xml:space="preserve">este plano rompe o limite?</w:t>
+      </w:r>
+      <w:r>
+        <w:t xml:space="preserve">”</w:t>
+      </w:r>
+      <w:r>
+        <w:t xml:space="preserve">;</w:t>
       </w:r>
     </w:p>
     <w:p>
@@ -4224,7 +4341,7 @@
         <w:pStyle w:val="Compact"/>
       </w:pPr>
       <w:r>
-        <w:t xml:space="preserve">mexeu numa célula, o resto recalcula: o preço sobe, a receita sobe, o imposto acompanha, a margem e o lucro mudam;</w:t>
+        <w:t xml:space="preserve">monitorados de verdade quando o teste vai ao ar: antes, durante e depois;</w:t>
       </w:r>
     </w:p>
     <w:p>
@@ -4236,119 +4353,45 @@
         <w:pStyle w:val="Compact"/>
       </w:pPr>
       <w:r>
-        <w:t xml:space="preserve">amarelo é o que se mexeu, azul é o que mudou por consequência;</w:t>
-      </w:r>
-    </w:p>
-    <w:p>
-      <w:pPr>
-        <w:numPr>
-          <w:ilvl w:val="1"/>
-          <w:numId w:val="1036"/>
-        </w:numPr>
-        <w:pStyle w:val="Compact"/>
-      </w:pPr>
-      <w:r>
-        <w:t xml:space="preserve">resultado do período, um bloco por produto e uma seção por loop ou campanha;</w:t>
-      </w:r>
-    </w:p>
-    <w:p>
-      <w:pPr>
-        <w:numPr>
-          <w:ilvl w:val="1"/>
-          <w:numId w:val="1036"/>
-        </w:numPr>
-        <w:pStyle w:val="Compact"/>
-      </w:pPr>
-      <w:r>
-        <w:t xml:space="preserve">comparar até 3 cenários lado a lado.</w:t>
-      </w:r>
-    </w:p>
-    <w:p>
-      <w:pPr>
-        <w:numPr>
-          <w:ilvl w:val="0"/>
-          <w:numId w:val="1035"/>
-        </w:numPr>
-        <w:pStyle w:val="Compact"/>
-      </w:pPr>
-      <w:r>
-        <w:rPr>
-          <w:bCs/>
-          <w:b/>
-        </w:rPr>
-        <w:t xml:space="preserve">Cenários com ciclo de vida.</w:t>
-      </w:r>
-      <w:r>
-        <w:t xml:space="preserve"> </w:t>
-      </w:r>
-      <w:r>
-        <w:t xml:space="preserve">Em estudo, descartado (com motivo, e dá para reabrir), aprovado, ativo, encerrado, cancelado.</w:t>
-      </w:r>
-    </w:p>
-    <w:p>
-      <w:pPr>
-        <w:numPr>
-          <w:ilvl w:val="0"/>
-          <w:numId w:val="1035"/>
-        </w:numPr>
-        <w:pStyle w:val="Compact"/>
-      </w:pPr>
-      <w:r>
-        <w:rPr>
-          <w:bCs/>
-          <w:b/>
-        </w:rPr>
-        <w:t xml:space="preserve">Decisão.</w:t>
-      </w:r>
-      <w:r>
-        <w:t xml:space="preserve"> </w:t>
-      </w:r>
-      <w:r>
-        <w:t xml:space="preserve">ICE (impacto, confiança, facilidade) com justificativa. A aprovação congela o cenário e gera o documento de decisão imutável (contexto, hipótese, baseline contra projeção, riscos, responsável) e a ideia no Kanban.</w:t>
-      </w:r>
-    </w:p>
-    <w:p>
-      <w:pPr>
-        <w:numPr>
-          <w:ilvl w:val="0"/>
-          <w:numId w:val="1035"/>
-        </w:numPr>
-        <w:pStyle w:val="Compact"/>
-      </w:pPr>
-      <w:r>
-        <w:rPr>
-          <w:bCs/>
-          <w:b/>
-        </w:rPr>
-        <w:t xml:space="preserve">Ciclo de Growth (Kanban de experimentos).</w:t>
-      </w:r>
-      <w:r>
-        <w:t xml:space="preserve"> </w:t>
-      </w:r>
-      <w:r>
-        <w:t xml:space="preserve">Ideias → em avaliação → priorizadas → preparação → em teste → análise → concluídas. Cada experimento tem o desenho do teste: métrica-alvo, público, intervenção, critério de sucesso.</w:t>
-      </w:r>
-    </w:p>
-    <w:p>
-      <w:pPr>
-        <w:numPr>
-          <w:ilvl w:val="0"/>
-          <w:numId w:val="1035"/>
-        </w:numPr>
-        <w:pStyle w:val="Compact"/>
-      </w:pPr>
-      <w:r>
-        <w:rPr>
-          <w:bCs/>
-          <w:b/>
-        </w:rPr>
-        <w:t xml:space="preserve">Guardrails.</w:t>
-      </w:r>
-      <w:r>
-        <w:t xml:space="preserve"> </w:t>
-      </w:r>
-      <w:r>
-        <w:t xml:space="preserve">Limites de margem, lucro, ROAS, CAC, CPL e outros:</w:t>
+        <w:t xml:space="preserve">quando rompem, geram alerta com a ação sugerida. Nada é pausado sozinho.</w:t>
+      </w:r>
+    </w:p>
+    <w:p>
+      <w:pPr>
+        <w:numPr>
+          <w:ilvl w:val="0"/>
+          <w:numId w:val="1034"/>
+        </w:numPr>
+        <w:pStyle w:val="Compact"/>
+      </w:pPr>
+      <w:r>
+        <w:rPr>
+          <w:bCs/>
+          <w:b/>
+        </w:rPr>
+        <w:t xml:space="preserve">Resultados e aprendizados.</w:t>
+      </w:r>
+      <w:r>
+        <w:t xml:space="preserve"> </w:t>
+      </w:r>
+      <w:r>
+        <w:t xml:space="preserve">Baseline, projeção e realizado de cada teste, com a decisão: escalar, iterar ou interromper.</w:t>
+      </w:r>
+    </w:p>
+    <w:p>
+      <w:pPr>
+        <w:numPr>
+          <w:ilvl w:val="0"/>
+          <w:numId w:val="1034"/>
+        </w:numPr>
+        <w:pStyle w:val="Compact"/>
+      </w:pPr>
+      <w:r>
+        <w:rPr>
+          <w:bCs/>
+          <w:b/>
+        </w:rPr>
+        <w:t xml:space="preserve">Pesquisas:</w:t>
       </w:r>
     </w:p>
     <w:p>
@@ -4360,22 +4403,7 @@
         <w:pStyle w:val="Compact"/>
       </w:pPr>
       <w:r>
-        <w:t xml:space="preserve">projetados no cenário:</w:t>
-      </w:r>
-      <w:r>
-        <w:t xml:space="preserve"> </w:t>
-      </w:r>
-      <w:r>
-        <w:t xml:space="preserve">“</w:t>
-      </w:r>
-      <w:r>
-        <w:t xml:space="preserve">este plano rompe o limite?</w:t>
-      </w:r>
-      <w:r>
-        <w:t xml:space="preserve">”</w:t>
-      </w:r>
-      <w:r>
-        <w:t xml:space="preserve">;</w:t>
+        <w:t xml:space="preserve">construtor de perguntas, com modelos de lead, onboarding, jornada e descoberta da North Star;</w:t>
       </w:r>
     </w:p>
     <w:p>
@@ -4387,7 +4415,7 @@
         <w:pStyle w:val="Compact"/>
       </w:pPr>
       <w:r>
-        <w:t xml:space="preserve">monitorados de verdade quando o teste vai ao ar: antes, durante e depois;</w:t>
+        <w:t xml:space="preserve">página pública de resposta;</w:t>
       </w:r>
     </w:p>
     <w:p>
@@ -4399,80 +4427,6 @@
         <w:pStyle w:val="Compact"/>
       </w:pPr>
       <w:r>
-        <w:t xml:space="preserve">quando rompem, geram alerta com a ação sugerida. Nada é pausado sozinho.</w:t>
-      </w:r>
-    </w:p>
-    <w:p>
-      <w:pPr>
-        <w:numPr>
-          <w:ilvl w:val="0"/>
-          <w:numId w:val="1035"/>
-        </w:numPr>
-        <w:pStyle w:val="Compact"/>
-      </w:pPr>
-      <w:r>
-        <w:rPr>
-          <w:bCs/>
-          <w:b/>
-        </w:rPr>
-        <w:t xml:space="preserve">Resultados e aprendizados.</w:t>
-      </w:r>
-      <w:r>
-        <w:t xml:space="preserve"> </w:t>
-      </w:r>
-      <w:r>
-        <w:t xml:space="preserve">Baseline, projeção e realizado de cada teste, com a decisão: escalar, iterar ou interromper.</w:t>
-      </w:r>
-    </w:p>
-    <w:p>
-      <w:pPr>
-        <w:numPr>
-          <w:ilvl w:val="0"/>
-          <w:numId w:val="1035"/>
-        </w:numPr>
-        <w:pStyle w:val="Compact"/>
-      </w:pPr>
-      <w:r>
-        <w:rPr>
-          <w:bCs/>
-          <w:b/>
-        </w:rPr>
-        <w:t xml:space="preserve">Pesquisas:</w:t>
-      </w:r>
-    </w:p>
-    <w:p>
-      <w:pPr>
-        <w:numPr>
-          <w:ilvl w:val="1"/>
-          <w:numId w:val="1038"/>
-        </w:numPr>
-        <w:pStyle w:val="Compact"/>
-      </w:pPr>
-      <w:r>
-        <w:t xml:space="preserve">construtor de perguntas, com modelos de lead, onboarding, jornada e descoberta da North Star;</w:t>
-      </w:r>
-    </w:p>
-    <w:p>
-      <w:pPr>
-        <w:numPr>
-          <w:ilvl w:val="1"/>
-          <w:numId w:val="1038"/>
-        </w:numPr>
-        <w:pStyle w:val="Compact"/>
-      </w:pPr>
-      <w:r>
-        <w:t xml:space="preserve">página pública de resposta;</w:t>
-      </w:r>
-    </w:p>
-    <w:p>
-      <w:pPr>
-        <w:numPr>
-          <w:ilvl w:val="1"/>
-          <w:numId w:val="1038"/>
-        </w:numPr>
-        <w:pStyle w:val="Compact"/>
-      </w:pPr>
-      <w:r>
         <w:t xml:space="preserve">NPS, PMF e insights;</w:t>
       </w:r>
     </w:p>
@@ -4480,7 +4434,7 @@
       <w:pPr>
         <w:numPr>
           <w:ilvl w:val="1"/>
-          <w:numId w:val="1038"/>
+          <w:numId w:val="1037"/>
         </w:numPr>
         <w:pStyle w:val="Compact"/>
       </w:pPr>
@@ -4502,7 +4456,7 @@
       <w:pPr>
         <w:numPr>
           <w:ilvl w:val="1"/>
-          <w:numId w:val="1038"/>
+          <w:numId w:val="1037"/>
         </w:numPr>
         <w:pStyle w:val="Compact"/>
       </w:pPr>
@@ -4524,7 +4478,7 @@
       <w:pPr>
         <w:numPr>
           <w:ilvl w:val="1"/>
-          <w:numId w:val="1038"/>
+          <w:numId w:val="1037"/>
         </w:numPr>
         <w:pStyle w:val="Compact"/>
       </w:pPr>
@@ -4568,7 +4522,7 @@
       <w:pPr>
         <w:numPr>
           <w:ilvl w:val="0"/>
-          <w:numId w:val="1039"/>
+          <w:numId w:val="1038"/>
         </w:numPr>
         <w:pStyle w:val="Compact"/>
       </w:pPr>
@@ -4590,7 +4544,7 @@
       <w:pPr>
         <w:numPr>
           <w:ilvl w:val="0"/>
-          <w:numId w:val="1039"/>
+          <w:numId w:val="1038"/>
         </w:numPr>
         <w:pStyle w:val="Compact"/>
       </w:pPr>
@@ -4612,7 +4566,7 @@
       <w:pPr>
         <w:numPr>
           <w:ilvl w:val="0"/>
-          <w:numId w:val="1039"/>
+          <w:numId w:val="1038"/>
         </w:numPr>
         <w:pStyle w:val="Compact"/>
       </w:pPr>
@@ -4628,7 +4582,7 @@
       <w:pPr>
         <w:numPr>
           <w:ilvl w:val="0"/>
-          <w:numId w:val="1039"/>
+          <w:numId w:val="1038"/>
         </w:numPr>
         <w:pStyle w:val="Compact"/>
       </w:pPr>
@@ -4650,7 +4604,7 @@
       <w:pPr>
         <w:numPr>
           <w:ilvl w:val="0"/>
-          <w:numId w:val="1039"/>
+          <w:numId w:val="1038"/>
         </w:numPr>
         <w:pStyle w:val="Compact"/>
       </w:pPr>
@@ -4689,33 +4643,33 @@
       <w:pPr>
         <w:numPr>
           <w:ilvl w:val="0"/>
+          <w:numId w:val="1039"/>
+        </w:numPr>
+        <w:pStyle w:val="Compact"/>
+      </w:pPr>
+      <w:r>
+        <w:rPr>
+          <w:bCs/>
+          <w:b/>
+        </w:rPr>
+        <w:t xml:space="preserve">Importar e validar dados.</w:t>
+      </w:r>
+      <w:r>
+        <w:t xml:space="preserve"> </w:t>
+      </w:r>
+      <w:r>
+        <w:t xml:space="preserve">Sobe vários arquivos de uma vez, e o sistema diz o que é cada um:</w:t>
+      </w:r>
+    </w:p>
+    <w:p>
+      <w:pPr>
+        <w:numPr>
+          <w:ilvl w:val="1"/>
           <w:numId w:val="1040"/>
         </w:numPr>
         <w:pStyle w:val="Compact"/>
       </w:pPr>
       <w:r>
-        <w:rPr>
-          <w:bCs/>
-          <w:b/>
-        </w:rPr>
-        <w:t xml:space="preserve">Importar e validar dados.</w:t>
-      </w:r>
-      <w:r>
-        <w:t xml:space="preserve"> </w:t>
-      </w:r>
-      <w:r>
-        <w:t xml:space="preserve">Sobe vários arquivos de uma vez, e o sistema diz o que é cada um:</w:t>
-      </w:r>
-    </w:p>
-    <w:p>
-      <w:pPr>
-        <w:numPr>
-          <w:ilvl w:val="1"/>
-          <w:numId w:val="1041"/>
-        </w:numPr>
-        <w:pStyle w:val="Compact"/>
-      </w:pPr>
-      <w:r>
         <w:t xml:space="preserve">verde: pronto;</w:t>
       </w:r>
     </w:p>
@@ -4723,7 +4677,7 @@
       <w:pPr>
         <w:numPr>
           <w:ilvl w:val="1"/>
-          <w:numId w:val="1041"/>
+          <w:numId w:val="1040"/>
         </w:numPr>
         <w:pStyle w:val="Compact"/>
       </w:pPr>
@@ -4735,7 +4689,7 @@
       <w:pPr>
         <w:numPr>
           <w:ilvl w:val="1"/>
-          <w:numId w:val="1041"/>
+          <w:numId w:val="1040"/>
         </w:numPr>
         <w:pStyle w:val="Compact"/>
       </w:pPr>
@@ -4759,7 +4713,7 @@
       <w:pPr>
         <w:numPr>
           <w:ilvl w:val="0"/>
-          <w:numId w:val="1040"/>
+          <w:numId w:val="1039"/>
         </w:numPr>
         <w:pStyle w:val="Compact"/>
       </w:pPr>
@@ -4781,7 +4735,7 @@
       <w:pPr>
         <w:numPr>
           <w:ilvl w:val="0"/>
-          <w:numId w:val="1040"/>
+          <w:numId w:val="1039"/>
         </w:numPr>
         <w:pStyle w:val="Compact"/>
       </w:pPr>
@@ -4803,7 +4757,7 @@
       <w:pPr>
         <w:numPr>
           <w:ilvl w:val="0"/>
-          <w:numId w:val="1040"/>
+          <w:numId w:val="1039"/>
         </w:numPr>
         <w:pStyle w:val="Compact"/>
       </w:pPr>
@@ -4825,7 +4779,7 @@
       <w:pPr>
         <w:numPr>
           <w:ilvl w:val="0"/>
-          <w:numId w:val="1040"/>
+          <w:numId w:val="1039"/>
         </w:numPr>
         <w:pStyle w:val="Compact"/>
       </w:pPr>
@@ -4847,7 +4801,7 @@
       <w:pPr>
         <w:numPr>
           <w:ilvl w:val="0"/>
-          <w:numId w:val="1040"/>
+          <w:numId w:val="1039"/>
         </w:numPr>
         <w:pStyle w:val="Compact"/>
       </w:pPr>
@@ -4869,7 +4823,7 @@
       <w:pPr>
         <w:numPr>
           <w:ilvl w:val="0"/>
-          <w:numId w:val="1040"/>
+          <w:numId w:val="1039"/>
         </w:numPr>
         <w:pStyle w:val="Compact"/>
       </w:pPr>
@@ -4906,7 +4860,7 @@
       <w:pPr>
         <w:numPr>
           <w:ilvl w:val="0"/>
-          <w:numId w:val="1040"/>
+          <w:numId w:val="1039"/>
         </w:numPr>
         <w:pStyle w:val="Compact"/>
       </w:pPr>
@@ -4945,7 +4899,7 @@
       <w:pPr>
         <w:numPr>
           <w:ilvl w:val="0"/>
-          <w:numId w:val="1042"/>
+          <w:numId w:val="1041"/>
         </w:numPr>
         <w:pStyle w:val="Compact"/>
       </w:pPr>
@@ -4967,7 +4921,7 @@
       <w:pPr>
         <w:numPr>
           <w:ilvl w:val="0"/>
-          <w:numId w:val="1042"/>
+          <w:numId w:val="1041"/>
         </w:numPr>
         <w:pStyle w:val="Compact"/>
       </w:pPr>
@@ -4986,7 +4940,7 @@
       <w:pPr>
         <w:numPr>
           <w:ilvl w:val="0"/>
-          <w:numId w:val="1042"/>
+          <w:numId w:val="1041"/>
         </w:numPr>
         <w:pStyle w:val="Compact"/>
       </w:pPr>
@@ -5008,7 +4962,7 @@
       <w:pPr>
         <w:numPr>
           <w:ilvl w:val="0"/>
-          <w:numId w:val="1042"/>
+          <w:numId w:val="1041"/>
         </w:numPr>
         <w:pStyle w:val="Compact"/>
       </w:pPr>
@@ -5030,7 +4984,7 @@
       <w:pPr>
         <w:numPr>
           <w:ilvl w:val="0"/>
-          <w:numId w:val="1042"/>
+          <w:numId w:val="1041"/>
         </w:numPr>
         <w:pStyle w:val="Compact"/>
       </w:pPr>
@@ -5046,7 +5000,7 @@
       <w:pPr>
         <w:numPr>
           <w:ilvl w:val="0"/>
-          <w:numId w:val="1042"/>
+          <w:numId w:val="1041"/>
         </w:numPr>
         <w:pStyle w:val="Compact"/>
       </w:pPr>
@@ -5093,7 +5047,7 @@
       <w:pPr>
         <w:numPr>
           <w:ilvl w:val="0"/>
-          <w:numId w:val="1042"/>
+          <w:numId w:val="1041"/>
         </w:numPr>
         <w:pStyle w:val="Compact"/>
       </w:pPr>
@@ -5132,150 +5086,150 @@
       <w:pPr>
         <w:numPr>
           <w:ilvl w:val="0"/>
+          <w:numId w:val="1042"/>
+        </w:numPr>
+        <w:pStyle w:val="Compact"/>
+      </w:pPr>
+      <w:r>
+        <w:rPr>
+          <w:bCs/>
+          <w:b/>
+        </w:rPr>
+        <w:t xml:space="preserve">Ritmo.</w:t>
+      </w:r>
+      <w:r>
+        <w:t xml:space="preserve"> </w:t>
+      </w:r>
+      <w:r>
+        <w:t xml:space="preserve">Mais de 140 versões em 3 semanas (de 05/10 a 25/10/2026), cada uma com registro do que mudou, por quê e como foi testada.</w:t>
+      </w:r>
+    </w:p>
+    <w:p>
+      <w:pPr>
+        <w:numPr>
+          <w:ilvl w:val="0"/>
+          <w:numId w:val="1042"/>
+        </w:numPr>
+        <w:pStyle w:val="Compact"/>
+      </w:pPr>
+      <w:r>
+        <w:rPr>
+          <w:bCs/>
+          <w:b/>
+        </w:rPr>
+        <w:t xml:space="preserve">Testes de verdade.</w:t>
+      </w:r>
+      <w:r>
+        <w:t xml:space="preserve"> </w:t>
+      </w:r>
+      <w:r>
+        <w:t xml:space="preserve">Cada versão roda testes que abrem a tela real ligada a um banco completo e conferem número por número. Existe uma empresa fictícia, a Escola Aurora, com lançamento, anúncios, leads e vendas coerentes, para testar com dado realista.</w:t>
+      </w:r>
+    </w:p>
+    <w:p>
+      <w:pPr>
+        <w:numPr>
+          <w:ilvl w:val="0"/>
+          <w:numId w:val="1042"/>
+        </w:numPr>
+        <w:pStyle w:val="Compact"/>
+      </w:pPr>
+      <w:r>
+        <w:rPr>
+          <w:bCs/>
+          <w:b/>
+        </w:rPr>
+        <w:t xml:space="preserve">Auditoria de consistência.</w:t>
+      </w:r>
+      <w:r>
+        <w:t xml:space="preserve"> </w:t>
+      </w:r>
+      <w:r>
+        <w:t xml:space="preserve">Uma rodada comparou o mesmo número em todas as telas. O lucro do mesmo mês aparecia de três jeitos; foi corrigido para um lucro só.</w:t>
+      </w:r>
+    </w:p>
+    <w:p>
+      <w:pPr>
+        <w:numPr>
+          <w:ilvl w:val="0"/>
+          <w:numId w:val="1042"/>
+        </w:numPr>
+        <w:pStyle w:val="Compact"/>
+      </w:pPr>
+      <w:r>
+        <w:rPr>
+          <w:bCs/>
+          <w:b/>
+        </w:rPr>
+        <w:t xml:space="preserve">Decisões documentadas.</w:t>
+      </w:r>
+      <w:r>
+        <w:t xml:space="preserve"> </w:t>
+      </w:r>
+      <w:r>
+        <w:t xml:space="preserve">O sistema guarda cada decisão com o pedido que a originou. Exemplos:</w:t>
+      </w:r>
+    </w:p>
+    <w:p>
+      <w:pPr>
+        <w:numPr>
+          <w:ilvl w:val="1"/>
           <w:numId w:val="1043"/>
         </w:numPr>
         <w:pStyle w:val="Compact"/>
       </w:pPr>
       <w:r>
-        <w:rPr>
-          <w:bCs/>
-          <w:b/>
-        </w:rPr>
-        <w:t xml:space="preserve">Ritmo.</w:t>
-      </w:r>
-      <w:r>
-        <w:t xml:space="preserve"> </w:t>
-      </w:r>
-      <w:r>
-        <w:t xml:space="preserve">Mais de 140 versões em 3 semanas (de 05/10 a 25/10/2026), cada uma com registro do que mudou, por quê e como foi testada.</w:t>
-      </w:r>
-    </w:p>
-    <w:p>
-      <w:pPr>
-        <w:numPr>
-          <w:ilvl w:val="0"/>
+        <w:t xml:space="preserve">“</w:t>
+      </w:r>
+      <w:r>
+        <w:t xml:space="preserve">ROAS oficial é o bruto</w:t>
+      </w:r>
+      <w:r>
+        <w:t xml:space="preserve">”</w:t>
+      </w:r>
+      <w:r>
+        <w:t xml:space="preserve">;</w:t>
+      </w:r>
+    </w:p>
+    <w:p>
+      <w:pPr>
+        <w:numPr>
+          <w:ilvl w:val="1"/>
           <w:numId w:val="1043"/>
         </w:numPr>
         <w:pStyle w:val="Compact"/>
       </w:pPr>
       <w:r>
-        <w:rPr>
-          <w:bCs/>
-          <w:b/>
-        </w:rPr>
-        <w:t xml:space="preserve">Testes de verdade.</w:t>
-      </w:r>
-      <w:r>
-        <w:t xml:space="preserve"> </w:t>
-      </w:r>
-      <w:r>
-        <w:t xml:space="preserve">Cada versão roda testes que abrem a tela real ligada a um banco completo e conferem número por número. Existe uma empresa fictícia, a Escola Aurora, com lançamento, anúncios, leads e vendas coerentes, para testar com dado realista.</w:t>
-      </w:r>
-    </w:p>
-    <w:p>
-      <w:pPr>
-        <w:numPr>
-          <w:ilvl w:val="0"/>
+        <w:t xml:space="preserve">“</w:t>
+      </w:r>
+      <w:r>
+        <w:t xml:space="preserve">mesmo telefone junta sozinho</w:t>
+      </w:r>
+      <w:r>
+        <w:t xml:space="preserve">”</w:t>
+      </w:r>
+      <w:r>
+        <w:t xml:space="preserve">;</w:t>
+      </w:r>
+    </w:p>
+    <w:p>
+      <w:pPr>
+        <w:numPr>
+          <w:ilvl w:val="1"/>
           <w:numId w:val="1043"/>
         </w:numPr>
         <w:pStyle w:val="Compact"/>
       </w:pPr>
       <w:r>
-        <w:rPr>
-          <w:bCs/>
-          <w:b/>
-        </w:rPr>
-        <w:t xml:space="preserve">Auditoria de consistência.</w:t>
-      </w:r>
-      <w:r>
-        <w:t xml:space="preserve"> </w:t>
-      </w:r>
-      <w:r>
-        <w:t xml:space="preserve">Uma rodada comparou o mesmo número em todas as telas. O lucro do mesmo mês aparecia de três jeitos; foi corrigido para um lucro só.</w:t>
-      </w:r>
-    </w:p>
-    <w:p>
-      <w:pPr>
-        <w:numPr>
-          <w:ilvl w:val="0"/>
-          <w:numId w:val="1043"/>
-        </w:numPr>
-        <w:pStyle w:val="Compact"/>
-      </w:pPr>
-      <w:r>
-        <w:rPr>
-          <w:bCs/>
-          <w:b/>
-        </w:rPr>
-        <w:t xml:space="preserve">Decisões documentadas.</w:t>
-      </w:r>
-      <w:r>
-        <w:t xml:space="preserve"> </w:t>
-      </w:r>
-      <w:r>
-        <w:t xml:space="preserve">O sistema guarda cada decisão com o pedido que a originou. Exemplos:</w:t>
-      </w:r>
-    </w:p>
-    <w:p>
-      <w:pPr>
-        <w:numPr>
-          <w:ilvl w:val="1"/>
-          <w:numId w:val="1044"/>
-        </w:numPr>
-        <w:pStyle w:val="Compact"/>
-      </w:pPr>
-      <w:r>
         <w:t xml:space="preserve">“</w:t>
       </w:r>
       <w:r>
-        <w:t xml:space="preserve">ROAS oficial é o bruto</w:t>
+        <w:t xml:space="preserve">contrato recorrente: só contrato novo é recompra</w:t>
       </w:r>
       <w:r>
         <w:t xml:space="preserve">”</w:t>
       </w:r>
       <w:r>
-        <w:t xml:space="preserve">;</w:t>
-      </w:r>
-    </w:p>
-    <w:p>
-      <w:pPr>
-        <w:numPr>
-          <w:ilvl w:val="1"/>
-          <w:numId w:val="1044"/>
-        </w:numPr>
-        <w:pStyle w:val="Compact"/>
-      </w:pPr>
-      <w:r>
-        <w:t xml:space="preserve">“</w:t>
-      </w:r>
-      <w:r>
-        <w:t xml:space="preserve">mesmo telefone junta sozinho</w:t>
-      </w:r>
-      <w:r>
-        <w:t xml:space="preserve">”</w:t>
-      </w:r>
-      <w:r>
-        <w:t xml:space="preserve">;</w:t>
-      </w:r>
-    </w:p>
-    <w:p>
-      <w:pPr>
-        <w:numPr>
-          <w:ilvl w:val="1"/>
-          <w:numId w:val="1044"/>
-        </w:numPr>
-        <w:pStyle w:val="Compact"/>
-      </w:pPr>
-      <w:r>
-        <w:t xml:space="preserve">“</w:t>
-      </w:r>
-      <w:r>
-        <w:t xml:space="preserve">contrato recorrente: só contrato novo é recompra</w:t>
-      </w:r>
-      <w:r>
-        <w:t xml:space="preserve">”</w:t>
-      </w:r>
-      <w:r>
         <w:t xml:space="preserve">.</w:t>
       </w:r>
     </w:p>
@@ -5283,7 +5237,7 @@
       <w:pPr>
         <w:numPr>
           <w:ilvl w:val="0"/>
-          <w:numId w:val="1043"/>
+          <w:numId w:val="1042"/>
         </w:numPr>
         <w:pStyle w:val="Compact"/>
       </w:pPr>
@@ -5330,7 +5284,7 @@
       <w:pPr>
         <w:numPr>
           <w:ilvl w:val="0"/>
-          <w:numId w:val="1045"/>
+          <w:numId w:val="1044"/>
         </w:numPr>
         <w:pStyle w:val="Compact"/>
       </w:pPr>
@@ -5354,7 +5308,7 @@
       <w:pPr>
         <w:numPr>
           <w:ilvl w:val="0"/>
-          <w:numId w:val="1045"/>
+          <w:numId w:val="1044"/>
         </w:numPr>
         <w:pStyle w:val="Compact"/>
       </w:pPr>
@@ -5384,7 +5338,7 @@
       <w:pPr>
         <w:numPr>
           <w:ilvl w:val="0"/>
-          <w:numId w:val="1045"/>
+          <w:numId w:val="1044"/>
         </w:numPr>
         <w:pStyle w:val="Compact"/>
       </w:pPr>
@@ -5396,7 +5350,7 @@
       <w:pPr>
         <w:numPr>
           <w:ilvl w:val="0"/>
-          <w:numId w:val="1045"/>
+          <w:numId w:val="1044"/>
         </w:numPr>
         <w:pStyle w:val="Compact"/>
       </w:pPr>
@@ -5408,7 +5362,7 @@
       <w:pPr>
         <w:numPr>
           <w:ilvl w:val="0"/>
-          <w:numId w:val="1045"/>
+          <w:numId w:val="1044"/>
         </w:numPr>
         <w:pStyle w:val="Compact"/>
       </w:pPr>
@@ -5420,7 +5374,7 @@
       <w:pPr>
         <w:numPr>
           <w:ilvl w:val="0"/>
-          <w:numId w:val="1045"/>
+          <w:numId w:val="1044"/>
         </w:numPr>
         <w:pStyle w:val="Compact"/>
       </w:pPr>
@@ -5432,7 +5386,7 @@
       <w:pPr>
         <w:numPr>
           <w:ilvl w:val="0"/>
-          <w:numId w:val="1045"/>
+          <w:numId w:val="1044"/>
         </w:numPr>
         <w:pStyle w:val="Compact"/>
       </w:pPr>
@@ -5444,7 +5398,7 @@
       <w:pPr>
         <w:numPr>
           <w:ilvl w:val="0"/>
-          <w:numId w:val="1045"/>
+          <w:numId w:val="1044"/>
         </w:numPr>
         <w:pStyle w:val="Compact"/>
       </w:pPr>
@@ -5456,7 +5410,7 @@
       <w:pPr>
         <w:numPr>
           <w:ilvl w:val="0"/>
-          <w:numId w:val="1045"/>
+          <w:numId w:val="1044"/>
         </w:numPr>
         <w:pStyle w:val="Compact"/>
       </w:pPr>
@@ -5468,7 +5422,7 @@
       <w:pPr>
         <w:numPr>
           <w:ilvl w:val="0"/>
-          <w:numId w:val="1045"/>
+          <w:numId w:val="1044"/>
         </w:numPr>
         <w:pStyle w:val="Compact"/>
       </w:pPr>
@@ -5480,7 +5434,7 @@
       <w:pPr>
         <w:numPr>
           <w:ilvl w:val="0"/>
-          <w:numId w:val="1045"/>
+          <w:numId w:val="1044"/>
         </w:numPr>
         <w:pStyle w:val="Compact"/>
       </w:pPr>
@@ -5492,7 +5446,7 @@
       <w:pPr>
         <w:numPr>
           <w:ilvl w:val="0"/>
-          <w:numId w:val="1045"/>
+          <w:numId w:val="1044"/>
         </w:numPr>
         <w:pStyle w:val="Compact"/>
       </w:pPr>
@@ -5504,7 +5458,7 @@
       <w:pPr>
         <w:numPr>
           <w:ilvl w:val="0"/>
-          <w:numId w:val="1045"/>
+          <w:numId w:val="1044"/>
         </w:numPr>
         <w:pStyle w:val="Compact"/>
       </w:pPr>
@@ -5516,7 +5470,7 @@
       <w:pPr>
         <w:numPr>
           <w:ilvl w:val="0"/>
-          <w:numId w:val="1045"/>
+          <w:numId w:val="1044"/>
         </w:numPr>
         <w:pStyle w:val="Compact"/>
       </w:pPr>
@@ -5528,19 +5482,19 @@
       <w:pPr>
         <w:numPr>
           <w:ilvl w:val="0"/>
-          <w:numId w:val="1045"/>
-        </w:numPr>
-        <w:pStyle w:val="Compact"/>
-      </w:pPr>
-      <w:r>
-        <w:t xml:space="preserve">A ficha do produto: as 7 perguntas que todo conteúdo de venda precisa responder antes de ir ao ar.</w:t>
-      </w:r>
-    </w:p>
-    <w:p>
-      <w:pPr>
-        <w:numPr>
-          <w:ilvl w:val="0"/>
-          <w:numId w:val="1045"/>
+          <w:numId w:val="1044"/>
+        </w:numPr>
+        <w:pStyle w:val="Compact"/>
+      </w:pPr>
+      <w:r>
+        <w:t xml:space="preserve">A esteira explicada: por onde o cliente entra e o que compra depois.</w:t>
+      </w:r>
+    </w:p>
+    <w:p>
+      <w:pPr>
+        <w:numPr>
+          <w:ilvl w:val="0"/>
+          <w:numId w:val="1044"/>
         </w:numPr>
         <w:pStyle w:val="Compact"/>
       </w:pPr>
@@ -5570,7 +5524,7 @@
       <w:pPr>
         <w:numPr>
           <w:ilvl w:val="0"/>
-          <w:numId w:val="1045"/>
+          <w:numId w:val="1044"/>
         </w:numPr>
         <w:pStyle w:val="Compact"/>
       </w:pPr>
@@ -5599,16 +5553,104 @@
       <w:pPr>
         <w:numPr>
           <w:ilvl w:val="0"/>
+          <w:numId w:val="1045"/>
+        </w:numPr>
+        <w:pStyle w:val="Compact"/>
+      </w:pPr>
+      <w:r>
+        <w:rPr>
+          <w:bCs/>
+          <w:b/>
+        </w:rPr>
+        <w:t xml:space="preserve">05 a 06/10/2026:</w:t>
+      </w:r>
+    </w:p>
+    <w:p>
+      <w:pPr>
+        <w:numPr>
+          <w:ilvl w:val="1"/>
           <w:numId w:val="1046"/>
         </w:numPr>
         <w:pStyle w:val="Compact"/>
       </w:pPr>
       <w:r>
-        <w:rPr>
-          <w:bCs/>
-          <w:b/>
-        </w:rPr>
-        <w:t xml:space="preserve">05 a 06/10/2026:</w:t>
+        <w:t xml:space="preserve">base do sistema: workspaces, pessoas, vendas com contabilidade automática, contas a receber, campanhas;</w:t>
+      </w:r>
+    </w:p>
+    <w:p>
+      <w:pPr>
+        <w:numPr>
+          <w:ilvl w:val="1"/>
+          <w:numId w:val="1046"/>
+        </w:numPr>
+        <w:pStyle w:val="Compact"/>
+      </w:pPr>
+      <w:r>
+        <w:t xml:space="preserve">financeiro completo;</w:t>
+      </w:r>
+    </w:p>
+    <w:p>
+      <w:pPr>
+        <w:numPr>
+          <w:ilvl w:val="1"/>
+          <w:numId w:val="1046"/>
+        </w:numPr>
+        <w:pStyle w:val="Compact"/>
+      </w:pPr>
+      <w:r>
+        <w:t xml:space="preserve">CRM, funis e jornada do lead;</w:t>
+      </w:r>
+    </w:p>
+    <w:p>
+      <w:pPr>
+        <w:numPr>
+          <w:ilvl w:val="1"/>
+          <w:numId w:val="1046"/>
+        </w:numPr>
+        <w:pStyle w:val="Compact"/>
+      </w:pPr>
+      <w:r>
+        <w:t xml:space="preserve">mídia paga, vídeos, RevOps, projetos;</w:t>
+      </w:r>
+    </w:p>
+    <w:p>
+      <w:pPr>
+        <w:numPr>
+          <w:ilvl w:val="1"/>
+          <w:numId w:val="1046"/>
+        </w:numPr>
+        <w:pStyle w:val="Compact"/>
+      </w:pPr>
+      <w:r>
+        <w:t xml:space="preserve">Growth Model e Ciclo de Growth;</w:t>
+      </w:r>
+    </w:p>
+    <w:p>
+      <w:pPr>
+        <w:numPr>
+          <w:ilvl w:val="1"/>
+          <w:numId w:val="1046"/>
+        </w:numPr>
+        <w:pStyle w:val="Compact"/>
+      </w:pPr>
+      <w:r>
+        <w:t xml:space="preserve">pesquisas e planejamento de conteúdo.</w:t>
+      </w:r>
+    </w:p>
+    <w:p>
+      <w:pPr>
+        <w:numPr>
+          <w:ilvl w:val="0"/>
+          <w:numId w:val="1045"/>
+        </w:numPr>
+        <w:pStyle w:val="Compact"/>
+      </w:pPr>
+      <w:r>
+        <w:rPr>
+          <w:bCs/>
+          <w:b/>
+        </w:rPr>
+        <w:t xml:space="preserve">07 a 08/10:</w:t>
       </w:r>
     </w:p>
     <w:p>
@@ -5620,7 +5662,7 @@
         <w:pStyle w:val="Compact"/>
       </w:pPr>
       <w:r>
-        <w:t xml:space="preserve">base do sistema: workspaces, pessoas, vendas com contabilidade automática, contas a receber, campanhas;</w:t>
+        <w:t xml:space="preserve">contratos com parcelas personalizadas, oportunidades, renovação;</w:t>
       </w:r>
     </w:p>
     <w:p>
@@ -5632,7 +5674,7 @@
         <w:pStyle w:val="Compact"/>
       </w:pPr>
       <w:r>
-        <w:t xml:space="preserve">financeiro completo;</w:t>
+        <w:t xml:space="preserve">novo visual, Growth Starter, importação inteligente;</w:t>
       </w:r>
     </w:p>
     <w:p>
@@ -5644,7 +5686,19 @@
         <w:pStyle w:val="Compact"/>
       </w:pPr>
       <w:r>
-        <w:t xml:space="preserve">CRM, funis e jornada do lead;</w:t>
+        <w:t xml:space="preserve">“</w:t>
+      </w:r>
+      <w:r>
+        <w:t xml:space="preserve">Pergunte aos dados</w:t>
+      </w:r>
+      <w:r>
+        <w:t xml:space="preserve">”</w:t>
+      </w:r>
+      <w:r>
+        <w:t xml:space="preserve"> </w:t>
+      </w:r>
+      <w:r>
+        <w:t xml:space="preserve">com IA conferida;</w:t>
       </w:r>
     </w:p>
     <w:p>
@@ -5656,7 +5710,7 @@
         <w:pStyle w:val="Compact"/>
       </w:pPr>
       <w:r>
-        <w:t xml:space="preserve">mídia paga, vídeos, RevOps, projetos;</w:t>
+        <w:t xml:space="preserve">dashboards de mídia e vendas;</w:t>
       </w:r>
     </w:p>
     <w:p>
@@ -5668,35 +5722,23 @@
         <w:pStyle w:val="Compact"/>
       </w:pPr>
       <w:r>
-        <w:t xml:space="preserve">Growth Model e Ciclo de Growth;</w:t>
-      </w:r>
-    </w:p>
-    <w:p>
-      <w:pPr>
-        <w:numPr>
-          <w:ilvl w:val="1"/>
-          <w:numId w:val="1047"/>
-        </w:numPr>
-        <w:pStyle w:val="Compact"/>
-      </w:pPr>
-      <w:r>
-        <w:t xml:space="preserve">pesquisas e planejamento de conteúdo.</w:t>
-      </w:r>
-    </w:p>
-    <w:p>
-      <w:pPr>
-        <w:numPr>
-          <w:ilvl w:val="0"/>
-          <w:numId w:val="1046"/>
-        </w:numPr>
-        <w:pStyle w:val="Compact"/>
-      </w:pPr>
-      <w:r>
-        <w:rPr>
-          <w:bCs/>
-          <w:b/>
-        </w:rPr>
-        <w:t xml:space="preserve">07 a 08/10:</w:t>
+        <w:t xml:space="preserve">Growth Model automático e calculadora de campanha.</w:t>
+      </w:r>
+    </w:p>
+    <w:p>
+      <w:pPr>
+        <w:numPr>
+          <w:ilvl w:val="0"/>
+          <w:numId w:val="1045"/>
+        </w:numPr>
+        <w:pStyle w:val="Compact"/>
+      </w:pPr>
+      <w:r>
+        <w:rPr>
+          <w:bCs/>
+          <w:b/>
+        </w:rPr>
+        <w:t xml:space="preserve">10 a 11/10:</w:t>
       </w:r>
     </w:p>
     <w:p>
@@ -5708,7 +5750,7 @@
         <w:pStyle w:val="Compact"/>
       </w:pPr>
       <w:r>
-        <w:t xml:space="preserve">contratos com parcelas personalizadas, oportunidades, renovação;</w:t>
+        <w:t xml:space="preserve">estratégia em blocos e simulador de lucro;</w:t>
       </w:r>
     </w:p>
     <w:p>
@@ -5720,7 +5762,7 @@
         <w:pStyle w:val="Compact"/>
       </w:pPr>
       <w:r>
-        <w:t xml:space="preserve">novo visual, Growth Starter, importação inteligente;</w:t>
+        <w:t xml:space="preserve">pacotes de acesso, cartões de crédito, Casa;</w:t>
       </w:r>
     </w:p>
     <w:p>
@@ -5732,59 +5774,68 @@
         <w:pStyle w:val="Compact"/>
       </w:pPr>
       <w:r>
+        <w:t xml:space="preserve">segurança e confiança do dado: identidade, auditoria, qualidade, dicionário;</w:t>
+      </w:r>
+    </w:p>
+    <w:p>
+      <w:pPr>
+        <w:numPr>
+          <w:ilvl w:val="1"/>
+          <w:numId w:val="1048"/>
+        </w:numPr>
+        <w:pStyle w:val="Compact"/>
+      </w:pPr>
+      <w:r>
+        <w:t xml:space="preserve">captação e atribuição;</w:t>
+      </w:r>
+    </w:p>
+    <w:p>
+      <w:pPr>
+        <w:numPr>
+          <w:ilvl w:val="1"/>
+          <w:numId w:val="1048"/>
+        </w:numPr>
+        <w:pStyle w:val="Compact"/>
+      </w:pPr>
+      <w:r>
+        <w:t xml:space="preserve">projetos com modelos, custos e margens;</w:t>
+      </w:r>
+    </w:p>
+    <w:p>
+      <w:pPr>
+        <w:numPr>
+          <w:ilvl w:val="1"/>
+          <w:numId w:val="1048"/>
+        </w:numPr>
+        <w:pStyle w:val="Compact"/>
+      </w:pPr>
+      <w:r>
         <w:t xml:space="preserve">“</w:t>
       </w:r>
       <w:r>
-        <w:t xml:space="preserve">Pergunte aos dados</w:t>
+        <w:t xml:space="preserve">Growth Now</w:t>
       </w:r>
       <w:r>
         <w:t xml:space="preserve">”</w:t>
       </w:r>
       <w:r>
-        <w:t xml:space="preserve"> </w:t>
-      </w:r>
-      <w:r>
-        <w:t xml:space="preserve">com IA conferida;</w:t>
-      </w:r>
-    </w:p>
-    <w:p>
-      <w:pPr>
-        <w:numPr>
-          <w:ilvl w:val="1"/>
-          <w:numId w:val="1048"/>
-        </w:numPr>
-        <w:pStyle w:val="Compact"/>
-      </w:pPr>
-      <w:r>
-        <w:t xml:space="preserve">dashboards de mídia e vendas;</w:t>
-      </w:r>
-    </w:p>
-    <w:p>
-      <w:pPr>
-        <w:numPr>
-          <w:ilvl w:val="1"/>
-          <w:numId w:val="1048"/>
-        </w:numPr>
-        <w:pStyle w:val="Compact"/>
-      </w:pPr>
-      <w:r>
-        <w:t xml:space="preserve">Growth Model automático e calculadora de campanha.</w:t>
-      </w:r>
-    </w:p>
-    <w:p>
-      <w:pPr>
-        <w:numPr>
-          <w:ilvl w:val="0"/>
-          <w:numId w:val="1046"/>
-        </w:numPr>
-        <w:pStyle w:val="Compact"/>
-      </w:pPr>
-      <w:r>
-        <w:rPr>
-          <w:bCs/>
-          <w:b/>
-        </w:rPr>
-        <w:t xml:space="preserve">10 a 11/10:</w:t>
+        <w:t xml:space="preserve">: ofertas, cenários, decisão, guardrails.</w:t>
+      </w:r>
+    </w:p>
+    <w:p>
+      <w:pPr>
+        <w:numPr>
+          <w:ilvl w:val="0"/>
+          <w:numId w:val="1045"/>
+        </w:numPr>
+        <w:pStyle w:val="Compact"/>
+      </w:pPr>
+      <w:r>
+        <w:rPr>
+          <w:bCs/>
+          <w:b/>
+        </w:rPr>
+        <w:t xml:space="preserve">12 a 17/10:</w:t>
       </w:r>
     </w:p>
     <w:p>
@@ -5796,7 +5847,7 @@
         <w:pStyle w:val="Compact"/>
       </w:pPr>
       <w:r>
-        <w:t xml:space="preserve">estratégia em blocos e simulador de lucro;</w:t>
+        <w:t xml:space="preserve">visual azul;</w:t>
       </w:r>
     </w:p>
     <w:p>
@@ -5808,7 +5859,7 @@
         <w:pStyle w:val="Compact"/>
       </w:pPr>
       <w:r>
-        <w:t xml:space="preserve">pacotes de acesso, cartões de crédito, Casa;</w:t>
+        <w:t xml:space="preserve">Growth Model em planilha;</w:t>
       </w:r>
     </w:p>
     <w:p>
@@ -5820,7 +5871,7 @@
         <w:pStyle w:val="Compact"/>
       </w:pPr>
       <w:r>
-        <w:t xml:space="preserve">segurança e confiança do dado: identidade, auditoria, qualidade, dicionário;</w:t>
+        <w:t xml:space="preserve">Retenção &amp; Expansão (coortes, recompra, RFM);</w:t>
       </w:r>
     </w:p>
     <w:p>
@@ -5832,7 +5883,7 @@
         <w:pStyle w:val="Compact"/>
       </w:pPr>
       <w:r>
-        <w:t xml:space="preserve">captação e atribuição;</w:t>
+        <w:t xml:space="preserve">cenários com ciclo de vida, ideias pelo ChatGPT;</w:t>
       </w:r>
     </w:p>
     <w:p>
@@ -5844,7 +5895,7 @@
         <w:pStyle w:val="Compact"/>
       </w:pPr>
       <w:r>
-        <w:t xml:space="preserve">projetos com modelos, custos e margens;</w:t>
+        <w:t xml:space="preserve">auditoria de consistência e correção;</w:t>
       </w:r>
     </w:p>
     <w:p>
@@ -5856,32 +5907,23 @@
         <w:pStyle w:val="Compact"/>
       </w:pPr>
       <w:r>
-        <w:t xml:space="preserve">“</w:t>
-      </w:r>
-      <w:r>
-        <w:t xml:space="preserve">Growth Now</w:t>
-      </w:r>
-      <w:r>
-        <w:t xml:space="preserve">”</w:t>
-      </w:r>
-      <w:r>
-        <w:t xml:space="preserve">: ofertas, cenários, decisão, guardrails.</w:t>
-      </w:r>
-    </w:p>
-    <w:p>
-      <w:pPr>
-        <w:numPr>
-          <w:ilvl w:val="0"/>
-          <w:numId w:val="1046"/>
-        </w:numPr>
-        <w:pStyle w:val="Compact"/>
-      </w:pPr>
-      <w:r>
-        <w:rPr>
-          <w:bCs/>
-          <w:b/>
-        </w:rPr>
-        <w:t xml:space="preserve">12 a 17/10:</w:t>
+        <w:t xml:space="preserve">Escola Aurora; leads por formulário.</w:t>
+      </w:r>
+    </w:p>
+    <w:p>
+      <w:pPr>
+        <w:numPr>
+          <w:ilvl w:val="0"/>
+          <w:numId w:val="1045"/>
+        </w:numPr>
+        <w:pStyle w:val="Compact"/>
+      </w:pPr>
+      <w:r>
+        <w:rPr>
+          <w:bCs/>
+          <w:b/>
+        </w:rPr>
+        <w:t xml:space="preserve">19 a 21/10:</w:t>
       </w:r>
     </w:p>
     <w:p>
@@ -5893,7 +5935,7 @@
         <w:pStyle w:val="Compact"/>
       </w:pPr>
       <w:r>
-        <w:t xml:space="preserve">visual azul;</w:t>
+        <w:t xml:space="preserve">metas de leads; árvore dos números;</w:t>
       </w:r>
     </w:p>
     <w:p>
@@ -5905,7 +5947,7 @@
         <w:pStyle w:val="Compact"/>
       </w:pPr>
       <w:r>
-        <w:t xml:space="preserve">Growth Model em planilha;</w:t>
+        <w:t xml:space="preserve">comissões e conexões com Meta e Google;</w:t>
       </w:r>
     </w:p>
     <w:p>
@@ -5917,7 +5959,7 @@
         <w:pStyle w:val="Compact"/>
       </w:pPr>
       <w:r>
-        <w:t xml:space="preserve">Retenção &amp; Expansão (coortes, recompra, RFM);</w:t>
+        <w:t xml:space="preserve">visual com destaque e dashboard em camadas;</w:t>
       </w:r>
     </w:p>
     <w:p>
@@ -5929,7 +5971,7 @@
         <w:pStyle w:val="Compact"/>
       </w:pPr>
       <w:r>
-        <w:t xml:space="preserve">cenários com ciclo de vida, ideias pelo ChatGPT;</w:t>
+        <w:t xml:space="preserve">gráficos com função (ondas 1 a 3);</w:t>
       </w:r>
     </w:p>
     <w:p>
@@ -5941,7 +5983,7 @@
         <w:pStyle w:val="Compact"/>
       </w:pPr>
       <w:r>
-        <w:t xml:space="preserve">auditoria de consistência e correção;</w:t>
+        <w:t xml:space="preserve">painel da campanha dia a dia; qualificação por pontos;</w:t>
       </w:r>
     </w:p>
     <w:p>
@@ -5953,23 +5995,23 @@
         <w:pStyle w:val="Compact"/>
       </w:pPr>
       <w:r>
-        <w:t xml:space="preserve">Escola Aurora; leads por formulário.</w:t>
-      </w:r>
-    </w:p>
-    <w:p>
-      <w:pPr>
-        <w:numPr>
-          <w:ilvl w:val="0"/>
-          <w:numId w:val="1046"/>
-        </w:numPr>
-        <w:pStyle w:val="Compact"/>
-      </w:pPr>
-      <w:r>
-        <w:rPr>
-          <w:bCs/>
-          <w:b/>
-        </w:rPr>
-        <w:t xml:space="preserve">19 a 21/10:</w:t>
+        <w:t xml:space="preserve">formulário de captação; selo de qualificado.</w:t>
+      </w:r>
+    </w:p>
+    <w:p>
+      <w:pPr>
+        <w:numPr>
+          <w:ilvl w:val="0"/>
+          <w:numId w:val="1045"/>
+        </w:numPr>
+        <w:pStyle w:val="Compact"/>
+      </w:pPr>
+      <w:r>
+        <w:rPr>
+          <w:bCs/>
+          <w:b/>
+        </w:rPr>
+        <w:t xml:space="preserve">24 a 25/10:</w:t>
       </w:r>
     </w:p>
     <w:p>
@@ -5981,7 +6023,7 @@
         <w:pStyle w:val="Compact"/>
       </w:pPr>
       <w:r>
-        <w:t xml:space="preserve">metas de leads; árvore dos números;</w:t>
+        <w:t xml:space="preserve">Pergunte ao Growths e alertas;</w:t>
       </w:r>
     </w:p>
     <w:p>
@@ -5993,7 +6035,7 @@
         <w:pStyle w:val="Compact"/>
       </w:pPr>
       <w:r>
-        <w:t xml:space="preserve">comissões e conexões com Meta e Google;</w:t>
+        <w:t xml:space="preserve">Máquina de Conteúdo; Instagram (dashboard, DMs, insights);</w:t>
       </w:r>
     </w:p>
     <w:p>
@@ -6005,7 +6047,7 @@
         <w:pStyle w:val="Compact"/>
       </w:pPr>
       <w:r>
-        <w:t xml:space="preserve">visual com destaque e dashboard em camadas;</w:t>
+        <w:t xml:space="preserve">Growth’s Content com pasta no Drive, configuração em 9 passos, estruturas de roteiro e copy, custos de IA, pastas da Mathisa;</w:t>
       </w:r>
     </w:p>
     <w:p>
@@ -6017,7 +6059,7 @@
         <w:pStyle w:val="Compact"/>
       </w:pPr>
       <w:r>
-        <w:t xml:space="preserve">gráficos com função (ondas 1 a 3);</w:t>
+        <w:t xml:space="preserve">painel da produção no Kanban;</w:t>
       </w:r>
     </w:p>
     <w:p>
@@ -6029,95 +6071,7 @@
         <w:pStyle w:val="Compact"/>
       </w:pPr>
       <w:r>
-        <w:t xml:space="preserve">painel da campanha dia a dia; qualificação por pontos;</w:t>
-      </w:r>
-    </w:p>
-    <w:p>
-      <w:pPr>
-        <w:numPr>
-          <w:ilvl w:val="1"/>
-          <w:numId w:val="1051"/>
-        </w:numPr>
-        <w:pStyle w:val="Compact"/>
-      </w:pPr>
-      <w:r>
-        <w:t xml:space="preserve">formulário de captação; selo de qualificado.</w:t>
-      </w:r>
-    </w:p>
-    <w:p>
-      <w:pPr>
-        <w:numPr>
-          <w:ilvl w:val="0"/>
-          <w:numId w:val="1046"/>
-        </w:numPr>
-        <w:pStyle w:val="Compact"/>
-      </w:pPr>
-      <w:r>
-        <w:rPr>
-          <w:bCs/>
-          <w:b/>
-        </w:rPr>
-        <w:t xml:space="preserve">24 a 25/10:</w:t>
-      </w:r>
-    </w:p>
-    <w:p>
-      <w:pPr>
-        <w:numPr>
-          <w:ilvl w:val="1"/>
-          <w:numId w:val="1052"/>
-        </w:numPr>
-        <w:pStyle w:val="Compact"/>
-      </w:pPr>
-      <w:r>
-        <w:t xml:space="preserve">Pergunte ao Growths e alertas;</w:t>
-      </w:r>
-    </w:p>
-    <w:p>
-      <w:pPr>
-        <w:numPr>
-          <w:ilvl w:val="1"/>
-          <w:numId w:val="1052"/>
-        </w:numPr>
-        <w:pStyle w:val="Compact"/>
-      </w:pPr>
-      <w:r>
-        <w:t xml:space="preserve">Máquina de Conteúdo; Instagram (dashboard, DMs, insights);</w:t>
-      </w:r>
-    </w:p>
-    <w:p>
-      <w:pPr>
-        <w:numPr>
-          <w:ilvl w:val="1"/>
-          <w:numId w:val="1052"/>
-        </w:numPr>
-        <w:pStyle w:val="Compact"/>
-      </w:pPr>
-      <w:r>
-        <w:t xml:space="preserve">Growth’s Content com pasta no Drive, configuração em 9 passos, estruturas de roteiro e copy, custos de IA, pastas da Mathisa;</w:t>
-      </w:r>
-    </w:p>
-    <w:p>
-      <w:pPr>
-        <w:numPr>
-          <w:ilvl w:val="1"/>
-          <w:numId w:val="1052"/>
-        </w:numPr>
-        <w:pStyle w:val="Compact"/>
-      </w:pPr>
-      <w:r>
-        <w:t xml:space="preserve">painel da produção no Kanban;</w:t>
-      </w:r>
-    </w:p>
-    <w:p>
-      <w:pPr>
-        <w:numPr>
-          <w:ilvl w:val="1"/>
-          <w:numId w:val="1052"/>
-        </w:numPr>
-        <w:pStyle w:val="Compact"/>
-      </w:pPr>
-      <w:r>
-        <w:t xml:space="preserve">ficha de conteúdo de cada produto, com as ideias ligadas a ele.</w:t>
+        <w:t xml:space="preserve">produtos no conteúdo (nome, valor e histórico), com as ideias ligadas a eles, e o bloco Produtos e esteira no questionário.</w:t>
       </w:r>
     </w:p>
     <w:bookmarkEnd w:id="50"/>
@@ -6597,9 +6551,6 @@
     <w:abstractNumId w:val="991"/>
   </w:num>
   <w:num w:numId="1051">
-    <w:abstractNumId w:val="991"/>
-  </w:num>
-  <w:num w:numId="1052">
     <w:abstractNumId w:val="991"/>
   </w:num>
 </w:numbering>

</xml_diff>

<commit_message>
v0.151 (pendente) — Growth's Content: pesquisa com um botão (pastas + call + produtos + canais + web) e dossiê; função content-pesquisa; Apps Script lê as pastas
Fora do main até aplicar o banco e publicar a função (a confirmação da ferramenta expirou).

Co-Authored-By: Claude Opus 5.5 <noreply@anthropic.com>
Claude-Session: https://claude.ai/code/session_01KZYD1VyufGDrBDPUSE7fwE
</commit_message>
<xml_diff>
--- a/docs/Growths-o-sistema.docx
+++ b/docs/Growths-o-sistema.docx
@@ -42,7 +42,7 @@
         <w:t xml:space="preserve"> </w:t>
       </w:r>
       <w:r>
-        <w:t xml:space="preserve">25/10/2026, versão 0.150.</w:t>
+        <w:t xml:space="preserve">25/10/2026, versão 0.151.</w:t>
       </w:r>
     </w:p>
     <w:p>
@@ -1952,13 +1952,13 @@
           <w:bCs/>
           <w:b/>
         </w:rPr>
-        <w:t xml:space="preserve">Pesquisa e tese</w:t>
-      </w:r>
-      <w:r>
-        <w:t xml:space="preserve"> </w:t>
-      </w:r>
-      <w:r>
-        <w:t xml:space="preserve">(em construção). Um botão</w:t>
+        <w:t xml:space="preserve">Pesquisa.</w:t>
+      </w:r>
+      <w:r>
+        <w:t xml:space="preserve"> </w:t>
+      </w:r>
+      <w:r>
+        <w:t xml:space="preserve">Um botão,</w:t>
       </w:r>
       <w:r>
         <w:t xml:space="preserve"> </w:t>
@@ -1973,7 +1973,43 @@
         <w:t xml:space="preserve">”</w:t>
       </w:r>
       <w:r>
-        <w:t xml:space="preserve">: a IA lê as pastas (do cliente e da Mathisa), as respostas da call, os produtos e os canais, pesquisa na web e entrega um relatório para ler. Dele sai a tese: diferencial, mecanismo do problema e da solução, construção do produto, narrativa e voz.</w:t>
+        <w:t xml:space="preserve">. A IA lê as pastas do cliente (a principal e as outras que ele compartilhou) e as pastas com os padrões da Mathisa, junta as respostas da call, os produtos com o histórico e os canais, e pesquisa na web o mercado, as tendências, os concorrentes e o que o público pergunta. Entrega um relatório para ler, com:</w:t>
+      </w:r>
+    </w:p>
+    <w:p>
+      <w:pPr>
+        <w:numPr>
+          <w:ilvl w:val="1"/>
+          <w:numId w:val="1017"/>
+        </w:numPr>
+        <w:pStyle w:val="Compact"/>
+      </w:pPr>
+      <w:r>
+        <w:t xml:space="preserve">cada afirmação marcada como fato, hipótese ou recomendação;</w:t>
+      </w:r>
+    </w:p>
+    <w:p>
+      <w:pPr>
+        <w:numPr>
+          <w:ilvl w:val="1"/>
+          <w:numId w:val="1017"/>
+        </w:numPr>
+        <w:pStyle w:val="Compact"/>
+      </w:pPr>
+      <w:r>
+        <w:t xml:space="preserve">as fontes de cada fato;</w:t>
+      </w:r>
+    </w:p>
+    <w:p>
+      <w:pPr>
+        <w:numPr>
+          <w:ilvl w:val="1"/>
+          <w:numId w:val="1017"/>
+        </w:numPr>
+        <w:pStyle w:val="Compact"/>
+      </w:pPr>
+      <w:r>
+        <w:t xml:space="preserve">a lista do que foi lido e do que não foi lido (por exemplo, vídeo sem transcrição), com o motivo.</w:t>
       </w:r>
     </w:p>
     <w:p>
@@ -1989,28 +2025,13 @@
           <w:bCs/>
           <w:b/>
         </w:rPr>
-        <w:t xml:space="preserve">Dossiê e aprovação</w:t>
-      </w:r>
-      <w:r>
-        <w:t xml:space="preserve"> </w:t>
-      </w:r>
-      <w:r>
-        <w:t xml:space="preserve">(em construção). O dossiê da marca na tela e em PDF para o cliente aprovar. Aprovado, vira o padrão editável e gera a</w:t>
-      </w:r>
-      <w:r>
-        <w:t xml:space="preserve"> </w:t>
-      </w:r>
-      <w:r>
-        <w:t xml:space="preserve">“</w:t>
-      </w:r>
-      <w:r>
-        <w:t xml:space="preserve">skill do cliente</w:t>
-      </w:r>
-      <w:r>
-        <w:t xml:space="preserve">”</w:t>
-      </w:r>
-      <w:r>
-        <w:t xml:space="preserve">.</w:t>
+        <w:t xml:space="preserve">Dossiê.</w:t>
+      </w:r>
+      <w:r>
+        <w:t xml:space="preserve"> </w:t>
+      </w:r>
+      <w:r>
+        <w:t xml:space="preserve">Depois de ler o relatório, um clique gera o dossiê da marca em seções: diferencial, mecanismo do problema, mecanismo da solução, construção do produto, narrativa, voz, persona, concorrência e oportunidades de conteúdo. Cada nova geração é uma versão. A aprovação do cliente, o PDF e a skill do cliente vêm na sequência.</w:t>
       </w:r>
     </w:p>
     <w:p>
@@ -2093,7 +2114,7 @@
       <w:pPr>
         <w:numPr>
           <w:ilvl w:val="0"/>
-          <w:numId w:val="1017"/>
+          <w:numId w:val="1018"/>
         </w:numPr>
         <w:pStyle w:val="Compact"/>
       </w:pPr>
@@ -2115,195 +2136,195 @@
       <w:pPr>
         <w:numPr>
           <w:ilvl w:val="1"/>
+          <w:numId w:val="1019"/>
+        </w:numPr>
+        <w:pStyle w:val="Compact"/>
+      </w:pPr>
+      <w:r>
+        <w:t xml:space="preserve">4 territórios: Estratégia; Negócios, com Empreendedorismo; Dados + IA; Vida Real &amp; Crenças;</w:t>
+      </w:r>
+    </w:p>
+    <w:p>
+      <w:pPr>
+        <w:numPr>
+          <w:ilvl w:val="1"/>
+          <w:numId w:val="1019"/>
+        </w:numPr>
+        <w:pStyle w:val="Compact"/>
+      </w:pPr>
+      <w:r>
+        <w:t xml:space="preserve">frentes e camadas transversais;</w:t>
+      </w:r>
+    </w:p>
+    <w:p>
+      <w:pPr>
+        <w:numPr>
+          <w:ilvl w:val="1"/>
+          <w:numId w:val="1019"/>
+        </w:numPr>
+        <w:pStyle w:val="Compact"/>
+      </w:pPr>
+      <w:r>
+        <w:t xml:space="preserve">5 formatos, incluindo Carrossel caderno e Série musical 1× por semana;</w:t>
+      </w:r>
+    </w:p>
+    <w:p>
+      <w:pPr>
+        <w:numPr>
+          <w:ilvl w:val="1"/>
+          <w:numId w:val="1019"/>
+        </w:numPr>
+        <w:pStyle w:val="Compact"/>
+      </w:pPr>
+      <w:r>
+        <w:t xml:space="preserve">quadros de autoridade;</w:t>
+      </w:r>
+    </w:p>
+    <w:p>
+      <w:pPr>
+        <w:numPr>
+          <w:ilvl w:val="1"/>
+          <w:numId w:val="1019"/>
+        </w:numPr>
+        <w:pStyle w:val="Compact"/>
+      </w:pPr>
+      <w:r>
+        <w:t xml:space="preserve">destinos: Rebecka, Mathisa ou Ambas.</w:t>
+      </w:r>
+    </w:p>
+    <w:p>
+      <w:pPr>
+        <w:numPr>
+          <w:ilvl w:val="0"/>
           <w:numId w:val="1018"/>
         </w:numPr>
         <w:pStyle w:val="Compact"/>
       </w:pPr>
       <w:r>
-        <w:t xml:space="preserve">4 territórios: Estratégia; Negócios, com Empreendedorismo; Dados + IA; Vida Real &amp; Crenças;</w:t>
-      </w:r>
-    </w:p>
-    <w:p>
-      <w:pPr>
-        <w:numPr>
-          <w:ilvl w:val="1"/>
+        <w:rPr>
+          <w:bCs/>
+          <w:b/>
+        </w:rPr>
+        <w:t xml:space="preserve">Ideias e pautas (Kanban).</w:t>
+      </w:r>
+      <w:r>
+        <w:t xml:space="preserve"> </w:t>
+      </w:r>
+      <w:r>
+        <w:t xml:space="preserve">Ideia → pauta aprovada → em produção → pronto → agendado → publicado. Cada pauta tem palavra-chave e perguntas de busca, e o score de 6 critérios (timing, potencial estratégico, impacto, facilidade, robustez da evidência, novidade) com o VALIDAR.</w:t>
+      </w:r>
+    </w:p>
+    <w:p>
+      <w:pPr>
+        <w:numPr>
+          <w:ilvl w:val="0"/>
           <w:numId w:val="1018"/>
         </w:numPr>
         <w:pStyle w:val="Compact"/>
       </w:pPr>
       <w:r>
-        <w:t xml:space="preserve">frentes e camadas transversais;</w:t>
-      </w:r>
-    </w:p>
-    <w:p>
-      <w:pPr>
-        <w:numPr>
-          <w:ilvl w:val="1"/>
+        <w:rPr>
+          <w:bCs/>
+          <w:b/>
+        </w:rPr>
+        <w:t xml:space="preserve">Painel da produção</w:t>
+      </w:r>
+      <w:r>
+        <w:t xml:space="preserve"> </w:t>
+      </w:r>
+      <w:r>
+        <w:t xml:space="preserve">(no topo do Kanban):</w:t>
+      </w:r>
+    </w:p>
+    <w:p>
+      <w:pPr>
+        <w:numPr>
+          <w:ilvl w:val="1"/>
+          <w:numId w:val="1020"/>
+        </w:numPr>
+        <w:pStyle w:val="Compact"/>
+      </w:pPr>
+      <w:r>
+        <w:t xml:space="preserve">quantos conteúdos estão em cada etapa;</w:t>
+      </w:r>
+    </w:p>
+    <w:p>
+      <w:pPr>
+        <w:numPr>
+          <w:ilvl w:val="1"/>
+          <w:numId w:val="1020"/>
+        </w:numPr>
+        <w:pStyle w:val="Compact"/>
+      </w:pPr>
+      <w:r>
+        <w:t xml:space="preserve">quantos estão prontos para a semana atual contra a meta;</w:t>
+      </w:r>
+    </w:p>
+    <w:p>
+      <w:pPr>
+        <w:numPr>
+          <w:ilvl w:val="1"/>
+          <w:numId w:val="1020"/>
+        </w:numPr>
+        <w:pStyle w:val="Compact"/>
+      </w:pPr>
+      <w:r>
+        <w:t xml:space="preserve">um calendário da semana atual e das 5 seguintes, com um ponto colorido por conteúdo, dizendo quais semanas estão completas e quanto falta nas outras.</w:t>
+      </w:r>
+    </w:p>
+    <w:p>
+      <w:pPr>
+        <w:numPr>
+          <w:ilvl w:val="0"/>
           <w:numId w:val="1018"/>
         </w:numPr>
         <w:pStyle w:val="Compact"/>
       </w:pPr>
       <w:r>
-        <w:t xml:space="preserve">5 formatos, incluindo Carrossel caderno e Série musical 1× por semana;</w:t>
-      </w:r>
-    </w:p>
-    <w:p>
-      <w:pPr>
-        <w:numPr>
-          <w:ilvl w:val="1"/>
+        <w:rPr>
+          <w:bCs/>
+          <w:b/>
+        </w:rPr>
+        <w:t xml:space="preserve">Priorização.</w:t>
+      </w:r>
+      <w:r>
+        <w:t xml:space="preserve"> </w:t>
+      </w:r>
+      <w:r>
+        <w:t xml:space="preserve">Quadro de validação e reservas, do maior para o menor score.</w:t>
+      </w:r>
+    </w:p>
+    <w:p>
+      <w:pPr>
+        <w:numPr>
+          <w:ilvl w:val="0"/>
           <w:numId w:val="1018"/>
         </w:numPr>
         <w:pStyle w:val="Compact"/>
       </w:pPr>
       <w:r>
-        <w:t xml:space="preserve">quadros de autoridade;</w:t>
-      </w:r>
-    </w:p>
-    <w:p>
-      <w:pPr>
-        <w:numPr>
-          <w:ilvl w:val="1"/>
+        <w:rPr>
+          <w:bCs/>
+          <w:b/>
+        </w:rPr>
+        <w:t xml:space="preserve">Máquina.</w:t>
+      </w:r>
+      <w:r>
+        <w:t xml:space="preserve"> </w:t>
+      </w:r>
+      <w:r>
+        <w:t xml:space="preserve">A matriz território × formato: cada célula é uma combinação replicável, e dá para ver onde há buraco.</w:t>
+      </w:r>
+    </w:p>
+    <w:p>
+      <w:pPr>
+        <w:numPr>
+          <w:ilvl w:val="0"/>
           <w:numId w:val="1018"/>
         </w:numPr>
         <w:pStyle w:val="Compact"/>
       </w:pPr>
       <w:r>
-        <w:t xml:space="preserve">destinos: Rebecka, Mathisa ou Ambas.</w:t>
-      </w:r>
-    </w:p>
-    <w:p>
-      <w:pPr>
-        <w:numPr>
-          <w:ilvl w:val="0"/>
-          <w:numId w:val="1017"/>
-        </w:numPr>
-        <w:pStyle w:val="Compact"/>
-      </w:pPr>
-      <w:r>
-        <w:rPr>
-          <w:bCs/>
-          <w:b/>
-        </w:rPr>
-        <w:t xml:space="preserve">Ideias e pautas (Kanban).</w:t>
-      </w:r>
-      <w:r>
-        <w:t xml:space="preserve"> </w:t>
-      </w:r>
-      <w:r>
-        <w:t xml:space="preserve">Ideia → pauta aprovada → em produção → pronto → agendado → publicado. Cada pauta tem palavra-chave e perguntas de busca, e o score de 6 critérios (timing, potencial estratégico, impacto, facilidade, robustez da evidência, novidade) com o VALIDAR.</w:t>
-      </w:r>
-    </w:p>
-    <w:p>
-      <w:pPr>
-        <w:numPr>
-          <w:ilvl w:val="0"/>
-          <w:numId w:val="1017"/>
-        </w:numPr>
-        <w:pStyle w:val="Compact"/>
-      </w:pPr>
-      <w:r>
-        <w:rPr>
-          <w:bCs/>
-          <w:b/>
-        </w:rPr>
-        <w:t xml:space="preserve">Painel da produção</w:t>
-      </w:r>
-      <w:r>
-        <w:t xml:space="preserve"> </w:t>
-      </w:r>
-      <w:r>
-        <w:t xml:space="preserve">(no topo do Kanban):</w:t>
-      </w:r>
-    </w:p>
-    <w:p>
-      <w:pPr>
-        <w:numPr>
-          <w:ilvl w:val="1"/>
-          <w:numId w:val="1019"/>
-        </w:numPr>
-        <w:pStyle w:val="Compact"/>
-      </w:pPr>
-      <w:r>
-        <w:t xml:space="preserve">quantos conteúdos estão em cada etapa;</w:t>
-      </w:r>
-    </w:p>
-    <w:p>
-      <w:pPr>
-        <w:numPr>
-          <w:ilvl w:val="1"/>
-          <w:numId w:val="1019"/>
-        </w:numPr>
-        <w:pStyle w:val="Compact"/>
-      </w:pPr>
-      <w:r>
-        <w:t xml:space="preserve">quantos estão prontos para a semana atual contra a meta;</w:t>
-      </w:r>
-    </w:p>
-    <w:p>
-      <w:pPr>
-        <w:numPr>
-          <w:ilvl w:val="1"/>
-          <w:numId w:val="1019"/>
-        </w:numPr>
-        <w:pStyle w:val="Compact"/>
-      </w:pPr>
-      <w:r>
-        <w:t xml:space="preserve">um calendário da semana atual e das 5 seguintes, com um ponto colorido por conteúdo, dizendo quais semanas estão completas e quanto falta nas outras.</w:t>
-      </w:r>
-    </w:p>
-    <w:p>
-      <w:pPr>
-        <w:numPr>
-          <w:ilvl w:val="0"/>
-          <w:numId w:val="1017"/>
-        </w:numPr>
-        <w:pStyle w:val="Compact"/>
-      </w:pPr>
-      <w:r>
-        <w:rPr>
-          <w:bCs/>
-          <w:b/>
-        </w:rPr>
-        <w:t xml:space="preserve">Priorização.</w:t>
-      </w:r>
-      <w:r>
-        <w:t xml:space="preserve"> </w:t>
-      </w:r>
-      <w:r>
-        <w:t xml:space="preserve">Quadro de validação e reservas, do maior para o menor score.</w:t>
-      </w:r>
-    </w:p>
-    <w:p>
-      <w:pPr>
-        <w:numPr>
-          <w:ilvl w:val="0"/>
-          <w:numId w:val="1017"/>
-        </w:numPr>
-        <w:pStyle w:val="Compact"/>
-      </w:pPr>
-      <w:r>
-        <w:rPr>
-          <w:bCs/>
-          <w:b/>
-        </w:rPr>
-        <w:t xml:space="preserve">Máquina.</w:t>
-      </w:r>
-      <w:r>
-        <w:t xml:space="preserve"> </w:t>
-      </w:r>
-      <w:r>
-        <w:t xml:space="preserve">A matriz território × formato: cada célula é uma combinação replicável, e dá para ver onde há buraco.</w:t>
-      </w:r>
-    </w:p>
-    <w:p>
-      <w:pPr>
-        <w:numPr>
-          <w:ilvl w:val="0"/>
-          <w:numId w:val="1017"/>
-        </w:numPr>
-        <w:pStyle w:val="Compact"/>
-      </w:pPr>
-      <w:r>
         <w:rPr>
           <w:bCs/>
           <w:b/>
@@ -2321,7 +2342,7 @@
       <w:pPr>
         <w:numPr>
           <w:ilvl w:val="0"/>
-          <w:numId w:val="1017"/>
+          <w:numId w:val="1018"/>
         </w:numPr>
         <w:pStyle w:val="Compact"/>
       </w:pPr>
@@ -2343,7 +2364,7 @@
       <w:pPr>
         <w:numPr>
           <w:ilvl w:val="0"/>
-          <w:numId w:val="1017"/>
+          <w:numId w:val="1018"/>
         </w:numPr>
         <w:pStyle w:val="Compact"/>
       </w:pPr>
@@ -2365,7 +2386,7 @@
       <w:pPr>
         <w:numPr>
           <w:ilvl w:val="0"/>
-          <w:numId w:val="1017"/>
+          <w:numId w:val="1018"/>
         </w:numPr>
         <w:pStyle w:val="Compact"/>
       </w:pPr>
@@ -2387,7 +2408,7 @@
       <w:pPr>
         <w:numPr>
           <w:ilvl w:val="0"/>
-          <w:numId w:val="1017"/>
+          <w:numId w:val="1018"/>
         </w:numPr>
         <w:pStyle w:val="Compact"/>
       </w:pPr>
@@ -2409,7 +2430,7 @@
       <w:pPr>
         <w:numPr>
           <w:ilvl w:val="0"/>
-          <w:numId w:val="1017"/>
+          <w:numId w:val="1018"/>
         </w:numPr>
         <w:pStyle w:val="Compact"/>
       </w:pPr>
@@ -2431,7 +2452,7 @@
       <w:pPr>
         <w:numPr>
           <w:ilvl w:val="0"/>
-          <w:numId w:val="1017"/>
+          <w:numId w:val="1018"/>
         </w:numPr>
         <w:pStyle w:val="Compact"/>
       </w:pPr>
@@ -2463,7 +2484,7 @@
       <w:pPr>
         <w:numPr>
           <w:ilvl w:val="0"/>
-          <w:numId w:val="1020"/>
+          <w:numId w:val="1021"/>
         </w:numPr>
         <w:pStyle w:val="Compact"/>
       </w:pPr>
@@ -2485,7 +2506,7 @@
       <w:pPr>
         <w:numPr>
           <w:ilvl w:val="0"/>
-          <w:numId w:val="1020"/>
+          <w:numId w:val="1021"/>
         </w:numPr>
         <w:pStyle w:val="Compact"/>
       </w:pPr>
@@ -2501,237 +2522,237 @@
       <w:pPr>
         <w:numPr>
           <w:ilvl w:val="1"/>
+          <w:numId w:val="1022"/>
+        </w:numPr>
+        <w:pStyle w:val="Compact"/>
+      </w:pPr>
+      <w:r>
+        <w:t xml:space="preserve">posts, alcance, interações, engajamento, salvamentos, compartilhamentos e seguidores contra o período anterior;</w:t>
+      </w:r>
+    </w:p>
+    <w:p>
+      <w:pPr>
+        <w:numPr>
+          <w:ilvl w:val="1"/>
+          <w:numId w:val="1022"/>
+        </w:numPr>
+        <w:pStyle w:val="Compact"/>
+      </w:pPr>
+      <w:r>
+        <w:t xml:space="preserve">top 1 e gráficos por dia;</w:t>
+      </w:r>
+    </w:p>
+    <w:p>
+      <w:pPr>
+        <w:numPr>
+          <w:ilvl w:val="1"/>
+          <w:numId w:val="1022"/>
+        </w:numPr>
+        <w:pStyle w:val="Compact"/>
+      </w:pPr>
+      <w:r>
+        <w:t xml:space="preserve">os posts em imagens (4 primeiro,</w:t>
+      </w:r>
+      <w:r>
+        <w:t xml:space="preserve"> </w:t>
+      </w:r>
+      <w:r>
+        <w:t xml:space="preserve">“</w:t>
+      </w:r>
+      <w:r>
+        <w:t xml:space="preserve">Mostrar mais</w:t>
+      </w:r>
+      <w:r>
+        <w:t xml:space="preserve">”</w:t>
+      </w:r>
+      <w:r>
+        <w:t xml:space="preserve">), ordenáveis por engajamento, curtidas, alcance, recentes, salvos, compartilhados, comentários ou visualizações;</w:t>
+      </w:r>
+    </w:p>
+    <w:p>
+      <w:pPr>
+        <w:numPr>
+          <w:ilvl w:val="1"/>
+          <w:numId w:val="1022"/>
+        </w:numPr>
+        <w:pStyle w:val="Compact"/>
+      </w:pPr>
+      <w:r>
+        <w:t xml:space="preserve">gráficos por tema, formato e tipo de mídia. A cor diz se está acima da média (verde), na média (azul) ou abaixo (vermelho), com</w:t>
+      </w:r>
+      <w:r>
+        <w:t xml:space="preserve"> </w:t>
+      </w:r>
+      <w:r>
+        <w:t xml:space="preserve">“</w:t>
+      </w:r>
+      <w:r>
+        <w:t xml:space="preserve">+X% vs. média</w:t>
+      </w:r>
+      <w:r>
+        <w:t xml:space="preserve">”</w:t>
+      </w:r>
+      <w:r>
+        <w:t xml:space="preserve">. Clicar na barra mostra os posts que formam o número;</w:t>
+      </w:r>
+    </w:p>
+    <w:p>
+      <w:pPr>
+        <w:numPr>
+          <w:ilvl w:val="1"/>
+          <w:numId w:val="1022"/>
+        </w:numPr>
+        <w:pStyle w:val="Compact"/>
+      </w:pPr>
+      <w:r>
+        <w:t xml:space="preserve">melhores dias da semana e horários de publicação, em linha.</w:t>
+      </w:r>
+    </w:p>
+    <w:p>
+      <w:pPr>
+        <w:numPr>
+          <w:ilvl w:val="0"/>
           <w:numId w:val="1021"/>
         </w:numPr>
         <w:pStyle w:val="Compact"/>
       </w:pPr>
       <w:r>
-        <w:t xml:space="preserve">posts, alcance, interações, engajamento, salvamentos, compartilhamentos e seguidores contra o período anterior;</w:t>
-      </w:r>
-    </w:p>
-    <w:p>
-      <w:pPr>
-        <w:numPr>
-          <w:ilvl w:val="1"/>
+        <w:rPr>
+          <w:bCs/>
+          <w:b/>
+        </w:rPr>
+        <w:t xml:space="preserve">Insights automáticos.</w:t>
+      </w:r>
+      <w:r>
+        <w:t xml:space="preserve"> </w:t>
+      </w:r>
+      <w:r>
+        <w:t xml:space="preserve">O Growths lê o período e diz o que se destaca, cada item como fato, hipótese ou recomendação e com um botão para ver os posts:</w:t>
+      </w:r>
+    </w:p>
+    <w:p>
+      <w:pPr>
+        <w:numPr>
+          <w:ilvl w:val="1"/>
+          <w:numId w:val="1023"/>
+        </w:numPr>
+        <w:pStyle w:val="Compact"/>
+      </w:pPr>
+      <w:r>
+        <w:t xml:space="preserve">o assunto que mais engaja e o que rende menos, pelas palavras das legendas;</w:t>
+      </w:r>
+    </w:p>
+    <w:p>
+      <w:pPr>
+        <w:numPr>
+          <w:ilvl w:val="1"/>
+          <w:numId w:val="1023"/>
+        </w:numPr>
+        <w:pStyle w:val="Compact"/>
+      </w:pPr>
+      <w:r>
+        <w:t xml:space="preserve">o tema mais forte;</w:t>
+      </w:r>
+    </w:p>
+    <w:p>
+      <w:pPr>
+        <w:numPr>
+          <w:ilvl w:val="1"/>
+          <w:numId w:val="1023"/>
+        </w:numPr>
+        <w:pStyle w:val="Compact"/>
+      </w:pPr>
+      <w:r>
+        <w:t xml:space="preserve">o tipo de mídia que mais alcança;</w:t>
+      </w:r>
+    </w:p>
+    <w:p>
+      <w:pPr>
+        <w:numPr>
+          <w:ilvl w:val="1"/>
+          <w:numId w:val="1023"/>
+        </w:numPr>
+        <w:pStyle w:val="Compact"/>
+      </w:pPr>
+      <w:r>
+        <w:t xml:space="preserve">o post que puxou conversa;</w:t>
+      </w:r>
+    </w:p>
+    <w:p>
+      <w:pPr>
+        <w:numPr>
+          <w:ilvl w:val="1"/>
+          <w:numId w:val="1023"/>
+        </w:numPr>
+        <w:pStyle w:val="Compact"/>
+      </w:pPr>
+      <w:r>
+        <w:t xml:space="preserve">o que pode ter levado gente para a DM;</w:t>
+      </w:r>
+    </w:p>
+    <w:p>
+      <w:pPr>
+        <w:numPr>
+          <w:ilvl w:val="1"/>
+          <w:numId w:val="1023"/>
+        </w:numPr>
+        <w:pStyle w:val="Compact"/>
+      </w:pPr>
+      <w:r>
+        <w:t xml:space="preserve">o mais salvo e o mais compartilhado;</w:t>
+      </w:r>
+    </w:p>
+    <w:p>
+      <w:pPr>
+        <w:numPr>
+          <w:ilvl w:val="1"/>
+          <w:numId w:val="1023"/>
+        </w:numPr>
+        <w:pStyle w:val="Compact"/>
+      </w:pPr>
+      <w:r>
+        <w:t xml:space="preserve">o melhor dia;</w:t>
+      </w:r>
+    </w:p>
+    <w:p>
+      <w:pPr>
+        <w:numPr>
+          <w:ilvl w:val="1"/>
+          <w:numId w:val="1023"/>
+        </w:numPr>
+        <w:pStyle w:val="Compact"/>
+      </w:pPr>
+      <w:r>
+        <w:t xml:space="preserve">a comparação com o período anterior.</w:t>
+      </w:r>
+    </w:p>
+    <w:p>
+      <w:pPr>
+        <w:numPr>
+          <w:ilvl w:val="0"/>
           <w:numId w:val="1021"/>
         </w:numPr>
         <w:pStyle w:val="Compact"/>
       </w:pPr>
       <w:r>
-        <w:t xml:space="preserve">top 1 e gráficos por dia;</w:t>
-      </w:r>
-    </w:p>
-    <w:p>
-      <w:pPr>
-        <w:numPr>
-          <w:ilvl w:val="1"/>
+        <w:rPr>
+          <w:bCs/>
+          <w:b/>
+        </w:rPr>
+        <w:t xml:space="preserve">Classificar o post</w:t>
+      </w:r>
+      <w:r>
+        <w:t xml:space="preserve"> </w:t>
+      </w:r>
+      <w:r>
+        <w:t xml:space="preserve">que não veio da Máquina (frente e formato) no próprio post.</w:t>
+      </w:r>
+    </w:p>
+    <w:p>
+      <w:pPr>
+        <w:numPr>
+          <w:ilvl w:val="0"/>
           <w:numId w:val="1021"/>
-        </w:numPr>
-        <w:pStyle w:val="Compact"/>
-      </w:pPr>
-      <w:r>
-        <w:t xml:space="preserve">os posts em imagens (4 primeiro,</w:t>
-      </w:r>
-      <w:r>
-        <w:t xml:space="preserve"> </w:t>
-      </w:r>
-      <w:r>
-        <w:t xml:space="preserve">“</w:t>
-      </w:r>
-      <w:r>
-        <w:t xml:space="preserve">Mostrar mais</w:t>
-      </w:r>
-      <w:r>
-        <w:t xml:space="preserve">”</w:t>
-      </w:r>
-      <w:r>
-        <w:t xml:space="preserve">), ordenáveis por engajamento, curtidas, alcance, recentes, salvos, compartilhados, comentários ou visualizações;</w:t>
-      </w:r>
-    </w:p>
-    <w:p>
-      <w:pPr>
-        <w:numPr>
-          <w:ilvl w:val="1"/>
-          <w:numId w:val="1021"/>
-        </w:numPr>
-        <w:pStyle w:val="Compact"/>
-      </w:pPr>
-      <w:r>
-        <w:t xml:space="preserve">gráficos por tema, formato e tipo de mídia. A cor diz se está acima da média (verde), na média (azul) ou abaixo (vermelho), com</w:t>
-      </w:r>
-      <w:r>
-        <w:t xml:space="preserve"> </w:t>
-      </w:r>
-      <w:r>
-        <w:t xml:space="preserve">“</w:t>
-      </w:r>
-      <w:r>
-        <w:t xml:space="preserve">+X% vs. média</w:t>
-      </w:r>
-      <w:r>
-        <w:t xml:space="preserve">”</w:t>
-      </w:r>
-      <w:r>
-        <w:t xml:space="preserve">. Clicar na barra mostra os posts que formam o número;</w:t>
-      </w:r>
-    </w:p>
-    <w:p>
-      <w:pPr>
-        <w:numPr>
-          <w:ilvl w:val="1"/>
-          <w:numId w:val="1021"/>
-        </w:numPr>
-        <w:pStyle w:val="Compact"/>
-      </w:pPr>
-      <w:r>
-        <w:t xml:space="preserve">melhores dias da semana e horários de publicação, em linha.</w:t>
-      </w:r>
-    </w:p>
-    <w:p>
-      <w:pPr>
-        <w:numPr>
-          <w:ilvl w:val="0"/>
-          <w:numId w:val="1020"/>
-        </w:numPr>
-        <w:pStyle w:val="Compact"/>
-      </w:pPr>
-      <w:r>
-        <w:rPr>
-          <w:bCs/>
-          <w:b/>
-        </w:rPr>
-        <w:t xml:space="preserve">Insights automáticos.</w:t>
-      </w:r>
-      <w:r>
-        <w:t xml:space="preserve"> </w:t>
-      </w:r>
-      <w:r>
-        <w:t xml:space="preserve">O Growths lê o período e diz o que se destaca, cada item como fato, hipótese ou recomendação e com um botão para ver os posts:</w:t>
-      </w:r>
-    </w:p>
-    <w:p>
-      <w:pPr>
-        <w:numPr>
-          <w:ilvl w:val="1"/>
-          <w:numId w:val="1022"/>
-        </w:numPr>
-        <w:pStyle w:val="Compact"/>
-      </w:pPr>
-      <w:r>
-        <w:t xml:space="preserve">o assunto que mais engaja e o que rende menos, pelas palavras das legendas;</w:t>
-      </w:r>
-    </w:p>
-    <w:p>
-      <w:pPr>
-        <w:numPr>
-          <w:ilvl w:val="1"/>
-          <w:numId w:val="1022"/>
-        </w:numPr>
-        <w:pStyle w:val="Compact"/>
-      </w:pPr>
-      <w:r>
-        <w:t xml:space="preserve">o tema mais forte;</w:t>
-      </w:r>
-    </w:p>
-    <w:p>
-      <w:pPr>
-        <w:numPr>
-          <w:ilvl w:val="1"/>
-          <w:numId w:val="1022"/>
-        </w:numPr>
-        <w:pStyle w:val="Compact"/>
-      </w:pPr>
-      <w:r>
-        <w:t xml:space="preserve">o tipo de mídia que mais alcança;</w:t>
-      </w:r>
-    </w:p>
-    <w:p>
-      <w:pPr>
-        <w:numPr>
-          <w:ilvl w:val="1"/>
-          <w:numId w:val="1022"/>
-        </w:numPr>
-        <w:pStyle w:val="Compact"/>
-      </w:pPr>
-      <w:r>
-        <w:t xml:space="preserve">o post que puxou conversa;</w:t>
-      </w:r>
-    </w:p>
-    <w:p>
-      <w:pPr>
-        <w:numPr>
-          <w:ilvl w:val="1"/>
-          <w:numId w:val="1022"/>
-        </w:numPr>
-        <w:pStyle w:val="Compact"/>
-      </w:pPr>
-      <w:r>
-        <w:t xml:space="preserve">o que pode ter levado gente para a DM;</w:t>
-      </w:r>
-    </w:p>
-    <w:p>
-      <w:pPr>
-        <w:numPr>
-          <w:ilvl w:val="1"/>
-          <w:numId w:val="1022"/>
-        </w:numPr>
-        <w:pStyle w:val="Compact"/>
-      </w:pPr>
-      <w:r>
-        <w:t xml:space="preserve">o mais salvo e o mais compartilhado;</w:t>
-      </w:r>
-    </w:p>
-    <w:p>
-      <w:pPr>
-        <w:numPr>
-          <w:ilvl w:val="1"/>
-          <w:numId w:val="1022"/>
-        </w:numPr>
-        <w:pStyle w:val="Compact"/>
-      </w:pPr>
-      <w:r>
-        <w:t xml:space="preserve">o melhor dia;</w:t>
-      </w:r>
-    </w:p>
-    <w:p>
-      <w:pPr>
-        <w:numPr>
-          <w:ilvl w:val="1"/>
-          <w:numId w:val="1022"/>
-        </w:numPr>
-        <w:pStyle w:val="Compact"/>
-      </w:pPr>
-      <w:r>
-        <w:t xml:space="preserve">a comparação com o período anterior.</w:t>
-      </w:r>
-    </w:p>
-    <w:p>
-      <w:pPr>
-        <w:numPr>
-          <w:ilvl w:val="0"/>
-          <w:numId w:val="1020"/>
-        </w:numPr>
-        <w:pStyle w:val="Compact"/>
-      </w:pPr>
-      <w:r>
-        <w:rPr>
-          <w:bCs/>
-          <w:b/>
-        </w:rPr>
-        <w:t xml:space="preserve">Classificar o post</w:t>
-      </w:r>
-      <w:r>
-        <w:t xml:space="preserve"> </w:t>
-      </w:r>
-      <w:r>
-        <w:t xml:space="preserve">que não veio da Máquina (frente e formato) no próprio post.</w:t>
-      </w:r>
-    </w:p>
-    <w:p>
-      <w:pPr>
-        <w:numPr>
-          <w:ilvl w:val="0"/>
-          <w:numId w:val="1020"/>
         </w:numPr>
         <w:pStyle w:val="Compact"/>
       </w:pPr>
@@ -2763,7 +2784,7 @@
       <w:pPr>
         <w:numPr>
           <w:ilvl w:val="0"/>
-          <w:numId w:val="1023"/>
+          <w:numId w:val="1024"/>
         </w:numPr>
         <w:pStyle w:val="Compact"/>
       </w:pPr>
@@ -2785,179 +2806,179 @@
       <w:pPr>
         <w:numPr>
           <w:ilvl w:val="1"/>
+          <w:numId w:val="1025"/>
+        </w:numPr>
+        <w:pStyle w:val="Compact"/>
+      </w:pPr>
+      <w:r>
+        <w:t xml:space="preserve">AIDA;</w:t>
+      </w:r>
+    </w:p>
+    <w:p>
+      <w:pPr>
+        <w:numPr>
+          <w:ilvl w:val="1"/>
+          <w:numId w:val="1025"/>
+        </w:numPr>
+        <w:pStyle w:val="Compact"/>
+      </w:pPr>
+      <w:r>
+        <w:t xml:space="preserve">PAS;</w:t>
+      </w:r>
+    </w:p>
+    <w:p>
+      <w:pPr>
+        <w:numPr>
+          <w:ilvl w:val="1"/>
+          <w:numId w:val="1025"/>
+        </w:numPr>
+        <w:pStyle w:val="Compact"/>
+      </w:pPr>
+      <w:r>
+        <w:t xml:space="preserve">Antes, depois e a ponte;</w:t>
+      </w:r>
+    </w:p>
+    <w:p>
+      <w:pPr>
+        <w:numPr>
+          <w:ilvl w:val="1"/>
+          <w:numId w:val="1025"/>
+        </w:numPr>
+        <w:pStyle w:val="Compact"/>
+      </w:pPr>
+      <w:r>
+        <w:t xml:space="preserve">Gancho, conteúdo e chamada para Reels;</w:t>
+      </w:r>
+    </w:p>
+    <w:p>
+      <w:pPr>
+        <w:numPr>
+          <w:ilvl w:val="1"/>
+          <w:numId w:val="1025"/>
+        </w:numPr>
+        <w:pStyle w:val="Compact"/>
+      </w:pPr>
+      <w:r>
+        <w:t xml:space="preserve">Carrossel educativo;</w:t>
+      </w:r>
+    </w:p>
+    <w:p>
+      <w:pPr>
+        <w:numPr>
+          <w:ilvl w:val="1"/>
+          <w:numId w:val="1025"/>
+        </w:numPr>
+        <w:pStyle w:val="Compact"/>
+      </w:pPr>
+      <w:r>
+        <w:t xml:space="preserve">Storytelling em jornada curta;</w:t>
+      </w:r>
+    </w:p>
+    <w:p>
+      <w:pPr>
+        <w:numPr>
+          <w:ilvl w:val="1"/>
+          <w:numId w:val="1025"/>
+        </w:numPr>
+        <w:pStyle w:val="Compact"/>
+      </w:pPr>
+      <w:r>
+        <w:t xml:space="preserve">copy pelos 5 níveis de consciência.</w:t>
+      </w:r>
+    </w:p>
+    <w:p>
+      <w:pPr>
+        <w:numPr>
+          <w:ilvl w:val="0"/>
+          <w:numId w:val="1000"/>
+        </w:numPr>
+        <w:pStyle w:val="Compact"/>
+      </w:pPr>
+      <w:r>
+        <w:t xml:space="preserve">A equipe pode criar outras (como as do método MIRA), editar, reordenar e desativar.</w:t>
+      </w:r>
+    </w:p>
+    <w:p>
+      <w:pPr>
+        <w:numPr>
+          <w:ilvl w:val="0"/>
           <w:numId w:val="1024"/>
         </w:numPr>
         <w:pStyle w:val="Compact"/>
       </w:pPr>
       <w:r>
-        <w:t xml:space="preserve">AIDA;</w:t>
-      </w:r>
-    </w:p>
-    <w:p>
-      <w:pPr>
-        <w:numPr>
-          <w:ilvl w:val="1"/>
+        <w:rPr>
+          <w:bCs/>
+          <w:b/>
+        </w:rPr>
+        <w:t xml:space="preserve">Pastas da Mathisa.</w:t>
+      </w:r>
+      <w:r>
+        <w:t xml:space="preserve"> </w:t>
+      </w:r>
+      <w:r>
+        <w:t xml:space="preserve">Pastas do Drive da Mathisa que a IA lê junto com as do cliente, para todos os clientes ou para um. A regra: as pastas da Mathisa são os</w:t>
+      </w:r>
+      <w:r>
+        <w:t xml:space="preserve"> </w:t>
+      </w:r>
+      <w:r>
+        <w:rPr>
+          <w:bCs/>
+          <w:b/>
+        </w:rPr>
+        <w:t xml:space="preserve">padrões</w:t>
+      </w:r>
+      <w:r>
+        <w:t xml:space="preserve"> </w:t>
+      </w:r>
+      <w:r>
+        <w:t xml:space="preserve">(método, estruturas, exemplos, o que muda pouco). As pastas do cliente são as</w:t>
+      </w:r>
+      <w:r>
+        <w:t xml:space="preserve"> </w:t>
+      </w:r>
+      <w:r>
+        <w:rPr>
+          <w:bCs/>
+          <w:b/>
+        </w:rPr>
+        <w:t xml:space="preserve">novidades</w:t>
+      </w:r>
+      <w:r>
+        <w:t xml:space="preserve"> </w:t>
+      </w:r>
+      <w:r>
+        <w:t xml:space="preserve">(método novo, estudo novo, material novo). Quando os dois falam do mesmo assunto, a novidade do cliente vale para aquele cliente.</w:t>
+      </w:r>
+    </w:p>
+    <w:p>
+      <w:pPr>
+        <w:numPr>
+          <w:ilvl w:val="0"/>
           <w:numId w:val="1024"/>
         </w:numPr>
         <w:pStyle w:val="Compact"/>
       </w:pPr>
       <w:r>
-        <w:t xml:space="preserve">PAS;</w:t>
-      </w:r>
-    </w:p>
-    <w:p>
-      <w:pPr>
-        <w:numPr>
-          <w:ilvl w:val="1"/>
+        <w:rPr>
+          <w:bCs/>
+          <w:b/>
+        </w:rPr>
+        <w:t xml:space="preserve">Custos de IA.</w:t>
+      </w:r>
+      <w:r>
+        <w:t xml:space="preserve"> </w:t>
+      </w:r>
+      <w:r>
+        <w:t xml:space="preserve">Uma tela que só a Rebecka vê: tokens, buscas na web e custo por cliente e por mês, em dólar e em reais (com o câmbio informado por ela). Serve para medir o custo real antes de definir os planos.</w:t>
+      </w:r>
+    </w:p>
+    <w:p>
+      <w:pPr>
+        <w:numPr>
+          <w:ilvl w:val="0"/>
           <w:numId w:val="1024"/>
-        </w:numPr>
-        <w:pStyle w:val="Compact"/>
-      </w:pPr>
-      <w:r>
-        <w:t xml:space="preserve">Antes, depois e a ponte;</w:t>
-      </w:r>
-    </w:p>
-    <w:p>
-      <w:pPr>
-        <w:numPr>
-          <w:ilvl w:val="1"/>
-          <w:numId w:val="1024"/>
-        </w:numPr>
-        <w:pStyle w:val="Compact"/>
-      </w:pPr>
-      <w:r>
-        <w:t xml:space="preserve">Gancho, conteúdo e chamada para Reels;</w:t>
-      </w:r>
-    </w:p>
-    <w:p>
-      <w:pPr>
-        <w:numPr>
-          <w:ilvl w:val="1"/>
-          <w:numId w:val="1024"/>
-        </w:numPr>
-        <w:pStyle w:val="Compact"/>
-      </w:pPr>
-      <w:r>
-        <w:t xml:space="preserve">Carrossel educativo;</w:t>
-      </w:r>
-    </w:p>
-    <w:p>
-      <w:pPr>
-        <w:numPr>
-          <w:ilvl w:val="1"/>
-          <w:numId w:val="1024"/>
-        </w:numPr>
-        <w:pStyle w:val="Compact"/>
-      </w:pPr>
-      <w:r>
-        <w:t xml:space="preserve">Storytelling em jornada curta;</w:t>
-      </w:r>
-    </w:p>
-    <w:p>
-      <w:pPr>
-        <w:numPr>
-          <w:ilvl w:val="1"/>
-          <w:numId w:val="1024"/>
-        </w:numPr>
-        <w:pStyle w:val="Compact"/>
-      </w:pPr>
-      <w:r>
-        <w:t xml:space="preserve">copy pelos 5 níveis de consciência.</w:t>
-      </w:r>
-    </w:p>
-    <w:p>
-      <w:pPr>
-        <w:numPr>
-          <w:ilvl w:val="0"/>
-          <w:numId w:val="1000"/>
-        </w:numPr>
-        <w:pStyle w:val="Compact"/>
-      </w:pPr>
-      <w:r>
-        <w:t xml:space="preserve">A equipe pode criar outras (como as do método MIRA), editar, reordenar e desativar.</w:t>
-      </w:r>
-    </w:p>
-    <w:p>
-      <w:pPr>
-        <w:numPr>
-          <w:ilvl w:val="0"/>
-          <w:numId w:val="1023"/>
-        </w:numPr>
-        <w:pStyle w:val="Compact"/>
-      </w:pPr>
-      <w:r>
-        <w:rPr>
-          <w:bCs/>
-          <w:b/>
-        </w:rPr>
-        <w:t xml:space="preserve">Pastas da Mathisa.</w:t>
-      </w:r>
-      <w:r>
-        <w:t xml:space="preserve"> </w:t>
-      </w:r>
-      <w:r>
-        <w:t xml:space="preserve">Pastas do Drive da Mathisa que a IA lê junto com as do cliente, para todos os clientes ou para um. A regra: as pastas da Mathisa são os</w:t>
-      </w:r>
-      <w:r>
-        <w:t xml:space="preserve"> </w:t>
-      </w:r>
-      <w:r>
-        <w:rPr>
-          <w:bCs/>
-          <w:b/>
-        </w:rPr>
-        <w:t xml:space="preserve">padrões</w:t>
-      </w:r>
-      <w:r>
-        <w:t xml:space="preserve"> </w:t>
-      </w:r>
-      <w:r>
-        <w:t xml:space="preserve">(método, estruturas, exemplos, o que muda pouco). As pastas do cliente são as</w:t>
-      </w:r>
-      <w:r>
-        <w:t xml:space="preserve"> </w:t>
-      </w:r>
-      <w:r>
-        <w:rPr>
-          <w:bCs/>
-          <w:b/>
-        </w:rPr>
-        <w:t xml:space="preserve">novidades</w:t>
-      </w:r>
-      <w:r>
-        <w:t xml:space="preserve"> </w:t>
-      </w:r>
-      <w:r>
-        <w:t xml:space="preserve">(método novo, estudo novo, material novo). Quando os dois falam do mesmo assunto, a novidade do cliente vale para aquele cliente.</w:t>
-      </w:r>
-    </w:p>
-    <w:p>
-      <w:pPr>
-        <w:numPr>
-          <w:ilvl w:val="0"/>
-          <w:numId w:val="1023"/>
-        </w:numPr>
-        <w:pStyle w:val="Compact"/>
-      </w:pPr>
-      <w:r>
-        <w:rPr>
-          <w:bCs/>
-          <w:b/>
-        </w:rPr>
-        <w:t xml:space="preserve">Custos de IA.</w:t>
-      </w:r>
-      <w:r>
-        <w:t xml:space="preserve"> </w:t>
-      </w:r>
-      <w:r>
-        <w:t xml:space="preserve">Uma tela que só a Rebecka vê: tokens, buscas na web e custo por cliente e por mês, em dólar e em reais (com o câmbio informado por ela). Serve para medir o custo real antes de definir os planos.</w:t>
-      </w:r>
-    </w:p>
-    <w:p>
-      <w:pPr>
-        <w:numPr>
-          <w:ilvl w:val="0"/>
-          <w:numId w:val="1023"/>
         </w:numPr>
         <w:pStyle w:val="Compact"/>
       </w:pPr>
@@ -2989,7 +3010,7 @@
       <w:pPr>
         <w:numPr>
           <w:ilvl w:val="0"/>
-          <w:numId w:val="1025"/>
+          <w:numId w:val="1026"/>
         </w:numPr>
         <w:pStyle w:val="Compact"/>
       </w:pPr>
@@ -3008,119 +3029,119 @@
       <w:pPr>
         <w:numPr>
           <w:ilvl w:val="1"/>
+          <w:numId w:val="1027"/>
+        </w:numPr>
+        <w:pStyle w:val="Compact"/>
+      </w:pPr>
+      <w:r>
+        <w:t xml:space="preserve">ler o que entrou nas pastas (da Mathisa e do cliente);</w:t>
+      </w:r>
+    </w:p>
+    <w:p>
+      <w:pPr>
+        <w:numPr>
+          <w:ilvl w:val="1"/>
+          <w:numId w:val="1027"/>
+        </w:numPr>
+        <w:pStyle w:val="Compact"/>
+      </w:pPr>
+      <w:r>
+        <w:t xml:space="preserve">buscar na web sobre o nicho (notícias, tendências, concorrentes), com fonte;</w:t>
+      </w:r>
+    </w:p>
+    <w:p>
+      <w:pPr>
+        <w:numPr>
+          <w:ilvl w:val="1"/>
+          <w:numId w:val="1027"/>
+        </w:numPr>
+        <w:pStyle w:val="Compact"/>
+      </w:pPr>
+      <w:r>
+        <w:t xml:space="preserve">gerar ideias pela linha editorial, persona, voz e estruturas escolhidas, no formato e na quantidade da rotina;</w:t>
+      </w:r>
+    </w:p>
+    <w:p>
+      <w:pPr>
+        <w:numPr>
+          <w:ilvl w:val="1"/>
+          <w:numId w:val="1027"/>
+        </w:numPr>
+        <w:pStyle w:val="Compact"/>
+      </w:pPr>
+      <w:r>
+        <w:t xml:space="preserve">registrar o custo de cada rodada.</w:t>
+      </w:r>
+    </w:p>
+    <w:p>
+      <w:pPr>
+        <w:numPr>
+          <w:ilvl w:val="0"/>
           <w:numId w:val="1026"/>
         </w:numPr>
         <w:pStyle w:val="Compact"/>
       </w:pPr>
       <w:r>
-        <w:t xml:space="preserve">ler o que entrou nas pastas (da Mathisa e do cliente);</w:t>
-      </w:r>
-    </w:p>
-    <w:p>
-      <w:pPr>
-        <w:numPr>
-          <w:ilvl w:val="1"/>
+        <w:rPr>
+          <w:bCs/>
+          <w:b/>
+        </w:rPr>
+        <w:t xml:space="preserve">Leitura dos outros canais</w:t>
+      </w:r>
+      <w:r>
+        <w:t xml:space="preserve"> </w:t>
+      </w:r>
+      <w:r>
+        <w:t xml:space="preserve">(YouTube, TikTok, LinkedIn, Threads) pela conexão.</w:t>
+      </w:r>
+    </w:p>
+    <w:p>
+      <w:pPr>
+        <w:numPr>
+          <w:ilvl w:val="0"/>
           <w:numId w:val="1026"/>
         </w:numPr>
         <w:pStyle w:val="Compact"/>
       </w:pPr>
       <w:r>
-        <w:t xml:space="preserve">buscar na web sobre o nicho (notícias, tendências, concorrentes), com fonte;</w:t>
-      </w:r>
-    </w:p>
-    <w:p>
-      <w:pPr>
-        <w:numPr>
-          <w:ilvl w:val="1"/>
+        <w:rPr>
+          <w:bCs/>
+          <w:b/>
+        </w:rPr>
+        <w:t xml:space="preserve">Pesquisa, tese, dossiê e skill do cliente</w:t>
+      </w:r>
+      <w:r>
+        <w:t xml:space="preserve">, com aprovação.</w:t>
+      </w:r>
+    </w:p>
+    <w:p>
+      <w:pPr>
+        <w:numPr>
+          <w:ilvl w:val="0"/>
           <w:numId w:val="1026"/>
         </w:numPr>
         <w:pStyle w:val="Compact"/>
       </w:pPr>
       <w:r>
-        <w:t xml:space="preserve">gerar ideias pela linha editorial, persona, voz e estruturas escolhidas, no formato e na quantidade da rotina;</w:t>
-      </w:r>
-    </w:p>
-    <w:p>
-      <w:pPr>
-        <w:numPr>
-          <w:ilvl w:val="1"/>
+        <w:rPr>
+          <w:bCs/>
+          <w:b/>
+        </w:rPr>
+        <w:t xml:space="preserve">Aprovação do dossiê pelo cliente</w:t>
+      </w:r>
+      <w:r>
+        <w:t xml:space="preserve">, o PDF e a skill do cliente.</w:t>
+      </w:r>
+    </w:p>
+    <w:p>
+      <w:pPr>
+        <w:numPr>
+          <w:ilvl w:val="0"/>
           <w:numId w:val="1026"/>
         </w:numPr>
         <w:pStyle w:val="Compact"/>
       </w:pPr>
       <w:r>
-        <w:t xml:space="preserve">registrar o custo de cada rodada.</w:t>
-      </w:r>
-    </w:p>
-    <w:p>
-      <w:pPr>
-        <w:numPr>
-          <w:ilvl w:val="0"/>
-          <w:numId w:val="1025"/>
-        </w:numPr>
-        <w:pStyle w:val="Compact"/>
-      </w:pPr>
-      <w:r>
-        <w:rPr>
-          <w:bCs/>
-          <w:b/>
-        </w:rPr>
-        <w:t xml:space="preserve">Leitura dos outros canais</w:t>
-      </w:r>
-      <w:r>
-        <w:t xml:space="preserve"> </w:t>
-      </w:r>
-      <w:r>
-        <w:t xml:space="preserve">(YouTube, TikTok, LinkedIn, Threads) pela conexão.</w:t>
-      </w:r>
-    </w:p>
-    <w:p>
-      <w:pPr>
-        <w:numPr>
-          <w:ilvl w:val="0"/>
-          <w:numId w:val="1025"/>
-        </w:numPr>
-        <w:pStyle w:val="Compact"/>
-      </w:pPr>
-      <w:r>
-        <w:rPr>
-          <w:bCs/>
-          <w:b/>
-        </w:rPr>
-        <w:t xml:space="preserve">Pesquisa, tese, dossiê e skill do cliente</w:t>
-      </w:r>
-      <w:r>
-        <w:t xml:space="preserve">, com aprovação.</w:t>
-      </w:r>
-    </w:p>
-    <w:p>
-      <w:pPr>
-        <w:numPr>
-          <w:ilvl w:val="0"/>
-          <w:numId w:val="1025"/>
-        </w:numPr>
-        <w:pStyle w:val="Compact"/>
-      </w:pPr>
-      <w:r>
-        <w:rPr>
-          <w:bCs/>
-          <w:b/>
-        </w:rPr>
-        <w:t xml:space="preserve">Pesquisa com um botão</w:t>
-      </w:r>
-      <w:r>
-        <w:t xml:space="preserve">: leitura das pastas, da call e dos produtos, pesquisa na web e um relatório para ler; depois, o dossiê.</w:t>
-      </w:r>
-    </w:p>
-    <w:p>
-      <w:pPr>
-        <w:numPr>
-          <w:ilvl w:val="0"/>
-          <w:numId w:val="1025"/>
-        </w:numPr>
-        <w:pStyle w:val="Compact"/>
-      </w:pPr>
-      <w:r>
         <w:rPr>
           <w:bCs/>
           <w:b/>
@@ -3138,7 +3159,7 @@
       <w:pPr>
         <w:numPr>
           <w:ilvl w:val="0"/>
-          <w:numId w:val="1025"/>
+          <w:numId w:val="1026"/>
         </w:numPr>
         <w:pStyle w:val="Compact"/>
       </w:pPr>
@@ -3157,7 +3178,7 @@
       <w:pPr>
         <w:numPr>
           <w:ilvl w:val="0"/>
-          <w:numId w:val="1025"/>
+          <w:numId w:val="1026"/>
         </w:numPr>
         <w:pStyle w:val="Compact"/>
       </w:pPr>
@@ -3187,7 +3208,7 @@
       <w:pPr>
         <w:numPr>
           <w:ilvl w:val="0"/>
-          <w:numId w:val="1027"/>
+          <w:numId w:val="1028"/>
         </w:numPr>
         <w:pStyle w:val="Compact"/>
       </w:pPr>
@@ -3257,7 +3278,7 @@
       <w:pPr>
         <w:numPr>
           <w:ilvl w:val="0"/>
-          <w:numId w:val="1027"/>
+          <w:numId w:val="1028"/>
         </w:numPr>
         <w:pStyle w:val="Compact"/>
       </w:pPr>
@@ -3273,249 +3294,249 @@
       <w:pPr>
         <w:numPr>
           <w:ilvl w:val="1"/>
+          <w:numId w:val="1029"/>
+        </w:numPr>
+        <w:pStyle w:val="Compact"/>
+      </w:pPr>
+      <w:r>
+        <w:t xml:space="preserve">primeira origem e último clique;</w:t>
+      </w:r>
+    </w:p>
+    <w:p>
+      <w:pPr>
+        <w:numPr>
+          <w:ilvl w:val="1"/>
+          <w:numId w:val="1029"/>
+        </w:numPr>
+        <w:pStyle w:val="Compact"/>
+      </w:pPr>
+      <w:r>
+        <w:t xml:space="preserve">quantos contatos até a compra e a linha do tempo da jornada;</w:t>
+      </w:r>
+    </w:p>
+    <w:p>
+      <w:pPr>
+        <w:numPr>
+          <w:ilvl w:val="1"/>
+          <w:numId w:val="1029"/>
+        </w:numPr>
+        <w:pStyle w:val="Compact"/>
+      </w:pPr>
+      <w:r>
+        <w:t xml:space="preserve">responsáveis e o histórico de quem mudou;</w:t>
+      </w:r>
+    </w:p>
+    <w:p>
+      <w:pPr>
+        <w:numPr>
+          <w:ilvl w:val="1"/>
+          <w:numId w:val="1029"/>
+        </w:numPr>
+        <w:pStyle w:val="Compact"/>
+      </w:pPr>
+      <w:r>
+        <w:t xml:space="preserve">compras, contratos e oportunidades;</w:t>
+      </w:r>
+    </w:p>
+    <w:p>
+      <w:pPr>
+        <w:numPr>
+          <w:ilvl w:val="1"/>
+          <w:numId w:val="1029"/>
+        </w:numPr>
+        <w:pStyle w:val="Compact"/>
+      </w:pPr>
+      <w:r>
+        <w:t xml:space="preserve">pagamentos anteriores ao sistema.</w:t>
+      </w:r>
+    </w:p>
+    <w:p>
+      <w:pPr>
+        <w:numPr>
+          <w:ilvl w:val="0"/>
           <w:numId w:val="1028"/>
         </w:numPr>
         <w:pStyle w:val="Compact"/>
       </w:pPr>
       <w:r>
-        <w:t xml:space="preserve">primeira origem e último clique;</w:t>
-      </w:r>
-    </w:p>
-    <w:p>
-      <w:pPr>
-        <w:numPr>
-          <w:ilvl w:val="1"/>
+        <w:rPr>
+          <w:bCs/>
+          <w:b/>
+        </w:rPr>
+        <w:t xml:space="preserve">Identidade sem duplicar.</w:t>
+      </w:r>
+      <w:r>
+        <w:t xml:space="preserve"> </w:t>
+      </w:r>
+      <w:r>
+        <w:t xml:space="preserve">A mesma pessoa é reconhecida por telefone e e-mail. Cadastro repetido junta sozinho ou por botão, com histórico.</w:t>
+      </w:r>
+    </w:p>
+    <w:p>
+      <w:pPr>
+        <w:numPr>
+          <w:ilvl w:val="0"/>
           <w:numId w:val="1028"/>
         </w:numPr>
         <w:pStyle w:val="Compact"/>
       </w:pPr>
       <w:r>
-        <w:t xml:space="preserve">quantos contatos até a compra e a linha do tempo da jornada;</w:t>
-      </w:r>
-    </w:p>
-    <w:p>
-      <w:pPr>
-        <w:numPr>
-          <w:ilvl w:val="1"/>
+        <w:rPr>
+          <w:bCs/>
+          <w:b/>
+        </w:rPr>
+        <w:t xml:space="preserve">Vendas.</w:t>
+      </w:r>
+      <w:r>
+        <w:t xml:space="preserve"> </w:t>
+      </w:r>
+      <w:r>
+        <w:t xml:space="preserve">Vendas aprovadas, bruto e líquido, ticket médio e reembolsos. A receita aparece por papel da oferta (order bump, upsell, downsell). Cada venda guarda o primeiro e o último toque, com o painel</w:t>
+      </w:r>
+      <w:r>
+        <w:t xml:space="preserve"> </w:t>
+      </w:r>
+      <w:r>
+        <w:t xml:space="preserve">“</w:t>
+      </w:r>
+      <w:r>
+        <w:t xml:space="preserve">Vendas por canal</w:t>
+      </w:r>
+      <w:r>
+        <w:t xml:space="preserve">”</w:t>
+      </w:r>
+      <w:r>
+        <w:t xml:space="preserve"> </w:t>
+      </w:r>
+      <w:r>
+        <w:t xml:space="preserve">(CAC e ROAS bruto).</w:t>
+      </w:r>
+    </w:p>
+    <w:p>
+      <w:pPr>
+        <w:numPr>
+          <w:ilvl w:val="0"/>
           <w:numId w:val="1028"/>
         </w:numPr>
         <w:pStyle w:val="Compact"/>
       </w:pPr>
       <w:r>
-        <w:t xml:space="preserve">responsáveis e o histórico de quem mudou;</w:t>
-      </w:r>
-    </w:p>
-    <w:p>
-      <w:pPr>
-        <w:numPr>
-          <w:ilvl w:val="1"/>
+        <w:rPr>
+          <w:bCs/>
+          <w:b/>
+        </w:rPr>
+        <w:t xml:space="preserve">Contratos:</w:t>
+      </w:r>
+    </w:p>
+    <w:p>
+      <w:pPr>
+        <w:numPr>
+          <w:ilvl w:val="1"/>
+          <w:numId w:val="1030"/>
+        </w:numPr>
+        <w:pStyle w:val="Compact"/>
+      </w:pPr>
+      <w:r>
+        <w:t xml:space="preserve">status claros: pendente, assinado e ativo, cancelado, encerrado;</w:t>
+      </w:r>
+    </w:p>
+    <w:p>
+      <w:pPr>
+        <w:numPr>
+          <w:ilvl w:val="1"/>
+          <w:numId w:val="1030"/>
+        </w:numPr>
+        <w:pStyle w:val="Compact"/>
+      </w:pPr>
+      <w:r>
+        <w:t xml:space="preserve">parcelas personalizadas;</w:t>
+      </w:r>
+    </w:p>
+    <w:p>
+      <w:pPr>
+        <w:numPr>
+          <w:ilvl w:val="1"/>
+          <w:numId w:val="1030"/>
+        </w:numPr>
+        <w:pStyle w:val="Compact"/>
+      </w:pPr>
+      <w:r>
+        <w:t xml:space="preserve">alerta de vencimento a 40 e a 30 dias;</w:t>
+      </w:r>
+    </w:p>
+    <w:p>
+      <w:pPr>
+        <w:numPr>
+          <w:ilvl w:val="1"/>
+          <w:numId w:val="1030"/>
+        </w:numPr>
+        <w:pStyle w:val="Compact"/>
+      </w:pPr>
+      <w:r>
+        <w:t xml:space="preserve">renovar e negociar;</w:t>
+      </w:r>
+    </w:p>
+    <w:p>
+      <w:pPr>
+        <w:numPr>
+          <w:ilvl w:val="1"/>
+          <w:numId w:val="1030"/>
+        </w:numPr>
+        <w:pStyle w:val="Compact"/>
+      </w:pPr>
+      <w:r>
+        <w:t xml:space="preserve">números do mês e MRR/ARR.</w:t>
+      </w:r>
+    </w:p>
+    <w:p>
+      <w:pPr>
+        <w:numPr>
+          <w:ilvl w:val="0"/>
           <w:numId w:val="1028"/>
         </w:numPr>
         <w:pStyle w:val="Compact"/>
       </w:pPr>
       <w:r>
-        <w:t xml:space="preserve">compras, contratos e oportunidades;</w:t>
-      </w:r>
-    </w:p>
-    <w:p>
-      <w:pPr>
-        <w:numPr>
-          <w:ilvl w:val="1"/>
+        <w:rPr>
+          <w:bCs/>
+          <w:b/>
+        </w:rPr>
+        <w:t xml:space="preserve">Oportunidades.</w:t>
+      </w:r>
+      <w:r>
+        <w:t xml:space="preserve"> </w:t>
+      </w:r>
+      <w:r>
+        <w:t xml:space="preserve">Kanban de novos negócios com quem já é cliente: outro produto, renovação ou aditivo.</w:t>
+      </w:r>
+      <w:r>
+        <w:t xml:space="preserve"> </w:t>
+      </w:r>
+      <w:r>
+        <w:t xml:space="preserve">“</w:t>
+      </w:r>
+      <w:r>
+        <w:t xml:space="preserve">Ganhou</w:t>
+      </w:r>
+      <w:r>
+        <w:t xml:space="preserve">”</w:t>
+      </w:r>
+      <w:r>
+        <w:t xml:space="preserve"> </w:t>
+      </w:r>
+      <w:r>
+        <w:t xml:space="preserve">abre o contrato já preenchido.</w:t>
+      </w:r>
+    </w:p>
+    <w:p>
+      <w:pPr>
+        <w:numPr>
+          <w:ilvl w:val="0"/>
           <w:numId w:val="1028"/>
         </w:numPr>
         <w:pStyle w:val="Compact"/>
       </w:pPr>
       <w:r>
-        <w:t xml:space="preserve">pagamentos anteriores ao sistema.</w:t>
-      </w:r>
-    </w:p>
-    <w:p>
-      <w:pPr>
-        <w:numPr>
-          <w:ilvl w:val="0"/>
-          <w:numId w:val="1027"/>
-        </w:numPr>
-        <w:pStyle w:val="Compact"/>
-      </w:pPr>
-      <w:r>
-        <w:rPr>
-          <w:bCs/>
-          <w:b/>
-        </w:rPr>
-        <w:t xml:space="preserve">Identidade sem duplicar.</w:t>
-      </w:r>
-      <w:r>
-        <w:t xml:space="preserve"> </w:t>
-      </w:r>
-      <w:r>
-        <w:t xml:space="preserve">A mesma pessoa é reconhecida por telefone e e-mail. Cadastro repetido junta sozinho ou por botão, com histórico.</w:t>
-      </w:r>
-    </w:p>
-    <w:p>
-      <w:pPr>
-        <w:numPr>
-          <w:ilvl w:val="0"/>
-          <w:numId w:val="1027"/>
-        </w:numPr>
-        <w:pStyle w:val="Compact"/>
-      </w:pPr>
-      <w:r>
-        <w:rPr>
-          <w:bCs/>
-          <w:b/>
-        </w:rPr>
-        <w:t xml:space="preserve">Vendas.</w:t>
-      </w:r>
-      <w:r>
-        <w:t xml:space="preserve"> </w:t>
-      </w:r>
-      <w:r>
-        <w:t xml:space="preserve">Vendas aprovadas, bruto e líquido, ticket médio e reembolsos. A receita aparece por papel da oferta (order bump, upsell, downsell). Cada venda guarda o primeiro e o último toque, com o painel</w:t>
-      </w:r>
-      <w:r>
-        <w:t xml:space="preserve"> </w:t>
-      </w:r>
-      <w:r>
-        <w:t xml:space="preserve">“</w:t>
-      </w:r>
-      <w:r>
-        <w:t xml:space="preserve">Vendas por canal</w:t>
-      </w:r>
-      <w:r>
-        <w:t xml:space="preserve">”</w:t>
-      </w:r>
-      <w:r>
-        <w:t xml:space="preserve"> </w:t>
-      </w:r>
-      <w:r>
-        <w:t xml:space="preserve">(CAC e ROAS bruto).</w:t>
-      </w:r>
-    </w:p>
-    <w:p>
-      <w:pPr>
-        <w:numPr>
-          <w:ilvl w:val="0"/>
-          <w:numId w:val="1027"/>
-        </w:numPr>
-        <w:pStyle w:val="Compact"/>
-      </w:pPr>
-      <w:r>
-        <w:rPr>
-          <w:bCs/>
-          <w:b/>
-        </w:rPr>
-        <w:t xml:space="preserve">Contratos:</w:t>
-      </w:r>
-    </w:p>
-    <w:p>
-      <w:pPr>
-        <w:numPr>
-          <w:ilvl w:val="1"/>
-          <w:numId w:val="1029"/>
-        </w:numPr>
-        <w:pStyle w:val="Compact"/>
-      </w:pPr>
-      <w:r>
-        <w:t xml:space="preserve">status claros: pendente, assinado e ativo, cancelado, encerrado;</w:t>
-      </w:r>
-    </w:p>
-    <w:p>
-      <w:pPr>
-        <w:numPr>
-          <w:ilvl w:val="1"/>
-          <w:numId w:val="1029"/>
-        </w:numPr>
-        <w:pStyle w:val="Compact"/>
-      </w:pPr>
-      <w:r>
-        <w:t xml:space="preserve">parcelas personalizadas;</w:t>
-      </w:r>
-    </w:p>
-    <w:p>
-      <w:pPr>
-        <w:numPr>
-          <w:ilvl w:val="1"/>
-          <w:numId w:val="1029"/>
-        </w:numPr>
-        <w:pStyle w:val="Compact"/>
-      </w:pPr>
-      <w:r>
-        <w:t xml:space="preserve">alerta de vencimento a 40 e a 30 dias;</w:t>
-      </w:r>
-    </w:p>
-    <w:p>
-      <w:pPr>
-        <w:numPr>
-          <w:ilvl w:val="1"/>
-          <w:numId w:val="1029"/>
-        </w:numPr>
-        <w:pStyle w:val="Compact"/>
-      </w:pPr>
-      <w:r>
-        <w:t xml:space="preserve">renovar e negociar;</w:t>
-      </w:r>
-    </w:p>
-    <w:p>
-      <w:pPr>
-        <w:numPr>
-          <w:ilvl w:val="1"/>
-          <w:numId w:val="1029"/>
-        </w:numPr>
-        <w:pStyle w:val="Compact"/>
-      </w:pPr>
-      <w:r>
-        <w:t xml:space="preserve">números do mês e MRR/ARR.</w:t>
-      </w:r>
-    </w:p>
-    <w:p>
-      <w:pPr>
-        <w:numPr>
-          <w:ilvl w:val="0"/>
-          <w:numId w:val="1027"/>
-        </w:numPr>
-        <w:pStyle w:val="Compact"/>
-      </w:pPr>
-      <w:r>
-        <w:rPr>
-          <w:bCs/>
-          <w:b/>
-        </w:rPr>
-        <w:t xml:space="preserve">Oportunidades.</w:t>
-      </w:r>
-      <w:r>
-        <w:t xml:space="preserve"> </w:t>
-      </w:r>
-      <w:r>
-        <w:t xml:space="preserve">Kanban de novos negócios com quem já é cliente: outro produto, renovação ou aditivo.</w:t>
-      </w:r>
-      <w:r>
-        <w:t xml:space="preserve"> </w:t>
-      </w:r>
-      <w:r>
-        <w:t xml:space="preserve">“</w:t>
-      </w:r>
-      <w:r>
-        <w:t xml:space="preserve">Ganhou</w:t>
-      </w:r>
-      <w:r>
-        <w:t xml:space="preserve">”</w:t>
-      </w:r>
-      <w:r>
-        <w:t xml:space="preserve"> </w:t>
-      </w:r>
-      <w:r>
-        <w:t xml:space="preserve">abre o contrato já preenchido.</w:t>
-      </w:r>
-    </w:p>
-    <w:p>
-      <w:pPr>
-        <w:numPr>
-          <w:ilvl w:val="0"/>
-          <w:numId w:val="1027"/>
-        </w:numPr>
-        <w:pStyle w:val="Compact"/>
-      </w:pPr>
-      <w:r>
         <w:rPr>
           <w:bCs/>
           <w:b/>
@@ -3533,7 +3554,7 @@
       <w:pPr>
         <w:numPr>
           <w:ilvl w:val="0"/>
-          <w:numId w:val="1027"/>
+          <w:numId w:val="1028"/>
         </w:numPr>
         <w:pStyle w:val="Compact"/>
       </w:pPr>
@@ -3555,7 +3576,7 @@
       <w:pPr>
         <w:numPr>
           <w:ilvl w:val="0"/>
-          <w:numId w:val="1027"/>
+          <w:numId w:val="1028"/>
         </w:numPr>
         <w:pStyle w:val="Compact"/>
       </w:pPr>
@@ -3577,7 +3598,7 @@
       <w:pPr>
         <w:numPr>
           <w:ilvl w:val="0"/>
-          <w:numId w:val="1027"/>
+          <w:numId w:val="1028"/>
         </w:numPr>
         <w:pStyle w:val="Compact"/>
       </w:pPr>
@@ -3616,7 +3637,7 @@
       <w:pPr>
         <w:numPr>
           <w:ilvl w:val="0"/>
-          <w:numId w:val="1030"/>
+          <w:numId w:val="1031"/>
         </w:numPr>
         <w:pStyle w:val="Compact"/>
       </w:pPr>
@@ -3635,6 +3656,109 @@
       <w:pPr>
         <w:numPr>
           <w:ilvl w:val="1"/>
+          <w:numId w:val="1032"/>
+        </w:numPr>
+        <w:pStyle w:val="Compact"/>
+      </w:pPr>
+      <w:r>
+        <w:rPr>
+          <w:bCs/>
+          <w:b/>
+        </w:rPr>
+        <w:t xml:space="preserve">Coortes:</w:t>
+      </w:r>
+      <w:r>
+        <w:t xml:space="preserve"> </w:t>
+      </w:r>
+      <w:r>
+        <w:t xml:space="preserve">segunda compra em 30, 60, 90, 180 e 365 dias, receita acumulada por cliente, curva D0 a D365 e matriz de coortes. Coorte que não completou o prazo aparece como</w:t>
+      </w:r>
+      <w:r>
+        <w:t xml:space="preserve"> </w:t>
+      </w:r>
+      <w:r>
+        <w:t xml:space="preserve">“</w:t>
+      </w:r>
+      <w:r>
+        <w:t xml:space="preserve">indisponível</w:t>
+      </w:r>
+      <w:r>
+        <w:t xml:space="preserve">”</w:t>
+      </w:r>
+      <w:r>
+        <w:t xml:space="preserve">, com o parcial à mostra.</w:t>
+      </w:r>
+    </w:p>
+    <w:p>
+      <w:pPr>
+        <w:numPr>
+          <w:ilvl w:val="1"/>
+          <w:numId w:val="1032"/>
+        </w:numPr>
+        <w:pStyle w:val="Compact"/>
+      </w:pPr>
+      <w:r>
+        <w:rPr>
+          <w:bCs/>
+          <w:b/>
+        </w:rPr>
+        <w:t xml:space="preserve">Recompra:</w:t>
+      </w:r>
+      <w:r>
+        <w:t xml:space="preserve"> </w:t>
+      </w:r>
+      <w:r>
+        <w:t xml:space="preserve">taxa, intervalo entre compras, frequência, ticket de recompra, receita de novos contra existentes e o papel de cada produto de entrada (expande, recompra moderada, não expande).</w:t>
+      </w:r>
+    </w:p>
+    <w:p>
+      <w:pPr>
+        <w:numPr>
+          <w:ilvl w:val="1"/>
+          <w:numId w:val="1032"/>
+        </w:numPr>
+        <w:pStyle w:val="Compact"/>
+      </w:pPr>
+      <w:r>
+        <w:rPr>
+          <w:bCs/>
+          <w:b/>
+        </w:rPr>
+        <w:t xml:space="preserve">RFM:</w:t>
+      </w:r>
+      <w:r>
+        <w:t xml:space="preserve"> </w:t>
+      </w:r>
+      <w:r>
+        <w:t xml:space="preserve">sete segmentos com regras editáveis, a grade R×F e o cruzamento com produto, campanha, canal e origem.</w:t>
+      </w:r>
+    </w:p>
+    <w:p>
+      <w:pPr>
+        <w:numPr>
+          <w:ilvl w:val="1"/>
+          <w:numId w:val="1032"/>
+        </w:numPr>
+        <w:pStyle w:val="Compact"/>
+      </w:pPr>
+      <w:r>
+        <w:rPr>
+          <w:bCs/>
+          <w:b/>
+        </w:rPr>
+        <w:t xml:space="preserve">Investigar:</w:t>
+      </w:r>
+      <w:r>
+        <w:t xml:space="preserve"> </w:t>
+      </w:r>
+      <w:r>
+        <w:t xml:space="preserve">qualquer número abre a lista de clientes com o histórico, exportável.</w:t>
+      </w:r>
+    </w:p>
+    <w:p>
+      <w:pPr>
+        <w:numPr>
+          <w:ilvl w:val="0"/>
           <w:numId w:val="1031"/>
         </w:numPr>
         <w:pStyle w:val="Compact"/>
@@ -3644,123 +3768,20 @@
           <w:bCs/>
           <w:b/>
         </w:rPr>
-        <w:t xml:space="preserve">Coortes:</w:t>
-      </w:r>
-      <w:r>
-        <w:t xml:space="preserve"> </w:t>
-      </w:r>
-      <w:r>
-        <w:t xml:space="preserve">segunda compra em 30, 60, 90, 180 e 365 dias, receita acumulada por cliente, curva D0 a D365 e matriz de coortes. Coorte que não completou o prazo aparece como</w:t>
-      </w:r>
-      <w:r>
-        <w:t xml:space="preserve"> </w:t>
-      </w:r>
-      <w:r>
-        <w:t xml:space="preserve">“</w:t>
-      </w:r>
-      <w:r>
-        <w:t xml:space="preserve">indisponível</w:t>
-      </w:r>
-      <w:r>
-        <w:t xml:space="preserve">”</w:t>
-      </w:r>
-      <w:r>
-        <w:t xml:space="preserve">, com o parcial à mostra.</w:t>
-      </w:r>
-    </w:p>
-    <w:p>
-      <w:pPr>
-        <w:numPr>
-          <w:ilvl w:val="1"/>
+        <w:t xml:space="preserve">Alunos.</w:t>
+      </w:r>
+      <w:r>
+        <w:t xml:space="preserve"> </w:t>
+      </w:r>
+      <w:r>
+        <w:t xml:space="preserve">Kanban do onboarding e da jornada do aluno, com CS responsável. O aluno nasce sozinho na venda ou no contrato.</w:t>
+      </w:r>
+    </w:p>
+    <w:p>
+      <w:pPr>
+        <w:numPr>
+          <w:ilvl w:val="0"/>
           <w:numId w:val="1031"/>
-        </w:numPr>
-        <w:pStyle w:val="Compact"/>
-      </w:pPr>
-      <w:r>
-        <w:rPr>
-          <w:bCs/>
-          <w:b/>
-        </w:rPr>
-        <w:t xml:space="preserve">Recompra:</w:t>
-      </w:r>
-      <w:r>
-        <w:t xml:space="preserve"> </w:t>
-      </w:r>
-      <w:r>
-        <w:t xml:space="preserve">taxa, intervalo entre compras, frequência, ticket de recompra, receita de novos contra existentes e o papel de cada produto de entrada (expande, recompra moderada, não expande).</w:t>
-      </w:r>
-    </w:p>
-    <w:p>
-      <w:pPr>
-        <w:numPr>
-          <w:ilvl w:val="1"/>
-          <w:numId w:val="1031"/>
-        </w:numPr>
-        <w:pStyle w:val="Compact"/>
-      </w:pPr>
-      <w:r>
-        <w:rPr>
-          <w:bCs/>
-          <w:b/>
-        </w:rPr>
-        <w:t xml:space="preserve">RFM:</w:t>
-      </w:r>
-      <w:r>
-        <w:t xml:space="preserve"> </w:t>
-      </w:r>
-      <w:r>
-        <w:t xml:space="preserve">sete segmentos com regras editáveis, a grade R×F e o cruzamento com produto, campanha, canal e origem.</w:t>
-      </w:r>
-    </w:p>
-    <w:p>
-      <w:pPr>
-        <w:numPr>
-          <w:ilvl w:val="1"/>
-          <w:numId w:val="1031"/>
-        </w:numPr>
-        <w:pStyle w:val="Compact"/>
-      </w:pPr>
-      <w:r>
-        <w:rPr>
-          <w:bCs/>
-          <w:b/>
-        </w:rPr>
-        <w:t xml:space="preserve">Investigar:</w:t>
-      </w:r>
-      <w:r>
-        <w:t xml:space="preserve"> </w:t>
-      </w:r>
-      <w:r>
-        <w:t xml:space="preserve">qualquer número abre a lista de clientes com o histórico, exportável.</w:t>
-      </w:r>
-    </w:p>
-    <w:p>
-      <w:pPr>
-        <w:numPr>
-          <w:ilvl w:val="0"/>
-          <w:numId w:val="1030"/>
-        </w:numPr>
-        <w:pStyle w:val="Compact"/>
-      </w:pPr>
-      <w:r>
-        <w:rPr>
-          <w:bCs/>
-          <w:b/>
-        </w:rPr>
-        <w:t xml:space="preserve">Alunos.</w:t>
-      </w:r>
-      <w:r>
-        <w:t xml:space="preserve"> </w:t>
-      </w:r>
-      <w:r>
-        <w:t xml:space="preserve">Kanban do onboarding e da jornada do aluno, com CS responsável. O aluno nasce sozinho na venda ou no contrato.</w:t>
-      </w:r>
-    </w:p>
-    <w:p>
-      <w:pPr>
-        <w:numPr>
-          <w:ilvl w:val="0"/>
-          <w:numId w:val="1030"/>
         </w:numPr>
         <w:pStyle w:val="Compact"/>
       </w:pPr>
@@ -3799,7 +3820,7 @@
       <w:pPr>
         <w:numPr>
           <w:ilvl w:val="0"/>
-          <w:numId w:val="1032"/>
+          <w:numId w:val="1033"/>
         </w:numPr>
         <w:pStyle w:val="Compact"/>
       </w:pPr>
@@ -3821,7 +3842,7 @@
       <w:pPr>
         <w:numPr>
           <w:ilvl w:val="0"/>
-          <w:numId w:val="1032"/>
+          <w:numId w:val="1033"/>
         </w:numPr>
         <w:pStyle w:val="Compact"/>
       </w:pPr>
@@ -3843,7 +3864,7 @@
       <w:pPr>
         <w:numPr>
           <w:ilvl w:val="0"/>
-          <w:numId w:val="1032"/>
+          <w:numId w:val="1033"/>
         </w:numPr>
         <w:pStyle w:val="Compact"/>
       </w:pPr>
@@ -3865,7 +3886,7 @@
       <w:pPr>
         <w:numPr>
           <w:ilvl w:val="0"/>
-          <w:numId w:val="1032"/>
+          <w:numId w:val="1033"/>
         </w:numPr>
         <w:pStyle w:val="Compact"/>
       </w:pPr>
@@ -3887,7 +3908,7 @@
       <w:pPr>
         <w:numPr>
           <w:ilvl w:val="0"/>
-          <w:numId w:val="1032"/>
+          <w:numId w:val="1033"/>
         </w:numPr>
         <w:pStyle w:val="Compact"/>
       </w:pPr>
@@ -3906,7 +3927,7 @@
       <w:pPr>
         <w:numPr>
           <w:ilvl w:val="0"/>
-          <w:numId w:val="1032"/>
+          <w:numId w:val="1033"/>
         </w:numPr>
         <w:pStyle w:val="Compact"/>
       </w:pPr>
@@ -3928,7 +3949,7 @@
       <w:pPr>
         <w:numPr>
           <w:ilvl w:val="0"/>
-          <w:numId w:val="1032"/>
+          <w:numId w:val="1033"/>
         </w:numPr>
         <w:pStyle w:val="Compact"/>
       </w:pPr>
@@ -3944,132 +3965,132 @@
       <w:pPr>
         <w:numPr>
           <w:ilvl w:val="1"/>
+          <w:numId w:val="1034"/>
+        </w:numPr>
+        <w:pStyle w:val="Compact"/>
+      </w:pPr>
+      <w:r>
+        <w:t xml:space="preserve">custo do mês (fixo, variável, parcelado, pontual) e pró-labores;</w:t>
+      </w:r>
+    </w:p>
+    <w:p>
+      <w:pPr>
+        <w:numPr>
+          <w:ilvl w:val="1"/>
+          <w:numId w:val="1034"/>
+        </w:numPr>
+        <w:pStyle w:val="Compact"/>
+      </w:pPr>
+      <w:r>
+        <w:t xml:space="preserve">margem de contribuição por produto e lucro líquido;</w:t>
+      </w:r>
+    </w:p>
+    <w:p>
+      <w:pPr>
+        <w:numPr>
+          <w:ilvl w:val="1"/>
+          <w:numId w:val="1034"/>
+        </w:numPr>
+        <w:pStyle w:val="Compact"/>
+      </w:pPr>
+      <w:r>
+        <w:t xml:space="preserve">ponto de equilíbrio e</w:t>
+      </w:r>
+      <w:r>
+        <w:t xml:space="preserve"> </w:t>
+      </w:r>
+      <w:r>
+        <w:t xml:space="preserve">“</w:t>
+      </w:r>
+      <w:r>
+        <w:t xml:space="preserve">quanto preciso vender</w:t>
+      </w:r>
+      <w:r>
+        <w:t xml:space="preserve">”</w:t>
+      </w:r>
+      <w:r>
+        <w:t xml:space="preserve">;</w:t>
+      </w:r>
+    </w:p>
+    <w:p>
+      <w:pPr>
+        <w:numPr>
+          <w:ilvl w:val="1"/>
+          <w:numId w:val="1034"/>
+        </w:numPr>
+        <w:pStyle w:val="Compact"/>
+      </w:pPr>
+      <w:r>
+        <w:t xml:space="preserve">comparação entre regimes tributários;</w:t>
+      </w:r>
+    </w:p>
+    <w:p>
+      <w:pPr>
+        <w:numPr>
+          <w:ilvl w:val="1"/>
+          <w:numId w:val="1034"/>
+        </w:numPr>
+        <w:pStyle w:val="Compact"/>
+      </w:pPr>
+      <w:r>
+        <w:t xml:space="preserve">cenários ruim, bom e ótimo de margem;</w:t>
+      </w:r>
+    </w:p>
+    <w:p>
+      <w:pPr>
+        <w:numPr>
+          <w:ilvl w:val="1"/>
+          <w:numId w:val="1034"/>
+        </w:numPr>
+        <w:pStyle w:val="Compact"/>
+      </w:pPr>
+      <w:r>
+        <w:t xml:space="preserve">custo por área contra o mês anterior.</w:t>
+      </w:r>
+    </w:p>
+    <w:p>
+      <w:pPr>
+        <w:numPr>
+          <w:ilvl w:val="0"/>
           <w:numId w:val="1033"/>
         </w:numPr>
         <w:pStyle w:val="Compact"/>
       </w:pPr>
       <w:r>
-        <w:t xml:space="preserve">custo do mês (fixo, variável, parcelado, pontual) e pró-labores;</w:t>
-      </w:r>
-    </w:p>
-    <w:p>
-      <w:pPr>
-        <w:numPr>
-          <w:ilvl w:val="1"/>
+        <w:rPr>
+          <w:bCs/>
+          <w:b/>
+        </w:rPr>
+        <w:t xml:space="preserve">Saldo mínimo de caixa</w:t>
+      </w:r>
+      <w:r>
+        <w:t xml:space="preserve">, com aviso no Dashboard.</w:t>
+      </w:r>
+    </w:p>
+    <w:p>
+      <w:pPr>
+        <w:numPr>
+          <w:ilvl w:val="0"/>
           <w:numId w:val="1033"/>
         </w:numPr>
         <w:pStyle w:val="Compact"/>
       </w:pPr>
       <w:r>
-        <w:t xml:space="preserve">margem de contribuição por produto e lucro líquido;</w:t>
-      </w:r>
-    </w:p>
-    <w:p>
-      <w:pPr>
-        <w:numPr>
-          <w:ilvl w:val="1"/>
+        <w:rPr>
+          <w:bCs/>
+          <w:b/>
+        </w:rPr>
+        <w:t xml:space="preserve">Plano de contas por cliente</w:t>
+      </w:r>
+      <w:r>
+        <w:t xml:space="preserve">: importar, baixar e ligar as contas do sistema.</w:t>
+      </w:r>
+    </w:p>
+    <w:p>
+      <w:pPr>
+        <w:numPr>
+          <w:ilvl w:val="0"/>
           <w:numId w:val="1033"/>
-        </w:numPr>
-        <w:pStyle w:val="Compact"/>
-      </w:pPr>
-      <w:r>
-        <w:t xml:space="preserve">ponto de equilíbrio e</w:t>
-      </w:r>
-      <w:r>
-        <w:t xml:space="preserve"> </w:t>
-      </w:r>
-      <w:r>
-        <w:t xml:space="preserve">“</w:t>
-      </w:r>
-      <w:r>
-        <w:t xml:space="preserve">quanto preciso vender</w:t>
-      </w:r>
-      <w:r>
-        <w:t xml:space="preserve">”</w:t>
-      </w:r>
-      <w:r>
-        <w:t xml:space="preserve">;</w:t>
-      </w:r>
-    </w:p>
-    <w:p>
-      <w:pPr>
-        <w:numPr>
-          <w:ilvl w:val="1"/>
-          <w:numId w:val="1033"/>
-        </w:numPr>
-        <w:pStyle w:val="Compact"/>
-      </w:pPr>
-      <w:r>
-        <w:t xml:space="preserve">comparação entre regimes tributários;</w:t>
-      </w:r>
-    </w:p>
-    <w:p>
-      <w:pPr>
-        <w:numPr>
-          <w:ilvl w:val="1"/>
-          <w:numId w:val="1033"/>
-        </w:numPr>
-        <w:pStyle w:val="Compact"/>
-      </w:pPr>
-      <w:r>
-        <w:t xml:space="preserve">cenários ruim, bom e ótimo de margem;</w:t>
-      </w:r>
-    </w:p>
-    <w:p>
-      <w:pPr>
-        <w:numPr>
-          <w:ilvl w:val="1"/>
-          <w:numId w:val="1033"/>
-        </w:numPr>
-        <w:pStyle w:val="Compact"/>
-      </w:pPr>
-      <w:r>
-        <w:t xml:space="preserve">custo por área contra o mês anterior.</w:t>
-      </w:r>
-    </w:p>
-    <w:p>
-      <w:pPr>
-        <w:numPr>
-          <w:ilvl w:val="0"/>
-          <w:numId w:val="1032"/>
-        </w:numPr>
-        <w:pStyle w:val="Compact"/>
-      </w:pPr>
-      <w:r>
-        <w:rPr>
-          <w:bCs/>
-          <w:b/>
-        </w:rPr>
-        <w:t xml:space="preserve">Saldo mínimo de caixa</w:t>
-      </w:r>
-      <w:r>
-        <w:t xml:space="preserve">, com aviso no Dashboard.</w:t>
-      </w:r>
-    </w:p>
-    <w:p>
-      <w:pPr>
-        <w:numPr>
-          <w:ilvl w:val="0"/>
-          <w:numId w:val="1032"/>
-        </w:numPr>
-        <w:pStyle w:val="Compact"/>
-      </w:pPr>
-      <w:r>
-        <w:rPr>
-          <w:bCs/>
-          <w:b/>
-        </w:rPr>
-        <w:t xml:space="preserve">Plano de contas por cliente</w:t>
-      </w:r>
-      <w:r>
-        <w:t xml:space="preserve">: importar, baixar e ligar as contas do sistema.</w:t>
-      </w:r>
-    </w:p>
-    <w:p>
-      <w:pPr>
-        <w:numPr>
-          <w:ilvl w:val="0"/>
-          <w:numId w:val="1032"/>
         </w:numPr>
         <w:pStyle w:val="Compact"/>
       </w:pPr>
@@ -4123,7 +4144,7 @@
       <w:pPr>
         <w:numPr>
           <w:ilvl w:val="0"/>
-          <w:numId w:val="1034"/>
+          <w:numId w:val="1035"/>
         </w:numPr>
         <w:pStyle w:val="Compact"/>
       </w:pPr>
@@ -4145,7 +4166,7 @@
       <w:pPr>
         <w:numPr>
           <w:ilvl w:val="0"/>
-          <w:numId w:val="1034"/>
+          <w:numId w:val="1035"/>
         </w:numPr>
         <w:pStyle w:val="Compact"/>
       </w:pPr>
@@ -4161,210 +4182,210 @@
       <w:pPr>
         <w:numPr>
           <w:ilvl w:val="1"/>
+          <w:numId w:val="1036"/>
+        </w:numPr>
+        <w:pStyle w:val="Compact"/>
+      </w:pPr>
+      <w:r>
+        <w:t xml:space="preserve">colunas Real + projeção (travado), Cenário (onde se mexe) e Efeito;</w:t>
+      </w:r>
+    </w:p>
+    <w:p>
+      <w:pPr>
+        <w:numPr>
+          <w:ilvl w:val="1"/>
+          <w:numId w:val="1036"/>
+        </w:numPr>
+        <w:pStyle w:val="Compact"/>
+      </w:pPr>
+      <w:r>
+        <w:t xml:space="preserve">mexeu numa célula, o resto recalcula: o preço sobe, a receita sobe, o imposto acompanha, a margem e o lucro mudam;</w:t>
+      </w:r>
+    </w:p>
+    <w:p>
+      <w:pPr>
+        <w:numPr>
+          <w:ilvl w:val="1"/>
+          <w:numId w:val="1036"/>
+        </w:numPr>
+        <w:pStyle w:val="Compact"/>
+      </w:pPr>
+      <w:r>
+        <w:t xml:space="preserve">amarelo é o que se mexeu, azul é o que mudou por consequência;</w:t>
+      </w:r>
+    </w:p>
+    <w:p>
+      <w:pPr>
+        <w:numPr>
+          <w:ilvl w:val="1"/>
+          <w:numId w:val="1036"/>
+        </w:numPr>
+        <w:pStyle w:val="Compact"/>
+      </w:pPr>
+      <w:r>
+        <w:t xml:space="preserve">resultado do período, um bloco por produto e uma seção por loop ou campanha;</w:t>
+      </w:r>
+    </w:p>
+    <w:p>
+      <w:pPr>
+        <w:numPr>
+          <w:ilvl w:val="1"/>
+          <w:numId w:val="1036"/>
+        </w:numPr>
+        <w:pStyle w:val="Compact"/>
+      </w:pPr>
+      <w:r>
+        <w:t xml:space="preserve">comparar até 3 cenários lado a lado.</w:t>
+      </w:r>
+    </w:p>
+    <w:p>
+      <w:pPr>
+        <w:numPr>
+          <w:ilvl w:val="0"/>
           <w:numId w:val="1035"/>
         </w:numPr>
         <w:pStyle w:val="Compact"/>
       </w:pPr>
       <w:r>
-        <w:t xml:space="preserve">colunas Real + projeção (travado), Cenário (onde se mexe) e Efeito;</w:t>
-      </w:r>
-    </w:p>
-    <w:p>
-      <w:pPr>
-        <w:numPr>
-          <w:ilvl w:val="1"/>
+        <w:rPr>
+          <w:bCs/>
+          <w:b/>
+        </w:rPr>
+        <w:t xml:space="preserve">Cenários com ciclo de vida.</w:t>
+      </w:r>
+      <w:r>
+        <w:t xml:space="preserve"> </w:t>
+      </w:r>
+      <w:r>
+        <w:t xml:space="preserve">Em estudo, descartado (com motivo, e dá para reabrir), aprovado, ativo, encerrado, cancelado.</w:t>
+      </w:r>
+    </w:p>
+    <w:p>
+      <w:pPr>
+        <w:numPr>
+          <w:ilvl w:val="0"/>
           <w:numId w:val="1035"/>
         </w:numPr>
         <w:pStyle w:val="Compact"/>
       </w:pPr>
       <w:r>
-        <w:t xml:space="preserve">mexeu numa célula, o resto recalcula: o preço sobe, a receita sobe, o imposto acompanha, a margem e o lucro mudam;</w:t>
-      </w:r>
-    </w:p>
-    <w:p>
-      <w:pPr>
-        <w:numPr>
-          <w:ilvl w:val="1"/>
+        <w:rPr>
+          <w:bCs/>
+          <w:b/>
+        </w:rPr>
+        <w:t xml:space="preserve">Decisão.</w:t>
+      </w:r>
+      <w:r>
+        <w:t xml:space="preserve"> </w:t>
+      </w:r>
+      <w:r>
+        <w:t xml:space="preserve">ICE (impacto, confiança, facilidade) com justificativa. A aprovação congela o cenário e gera o documento de decisão imutável (contexto, hipótese, baseline contra projeção, riscos, responsável) e a ideia no Kanban.</w:t>
+      </w:r>
+    </w:p>
+    <w:p>
+      <w:pPr>
+        <w:numPr>
+          <w:ilvl w:val="0"/>
           <w:numId w:val="1035"/>
         </w:numPr>
         <w:pStyle w:val="Compact"/>
       </w:pPr>
       <w:r>
-        <w:t xml:space="preserve">amarelo é o que se mexeu, azul é o que mudou por consequência;</w:t>
-      </w:r>
-    </w:p>
-    <w:p>
-      <w:pPr>
-        <w:numPr>
-          <w:ilvl w:val="1"/>
+        <w:rPr>
+          <w:bCs/>
+          <w:b/>
+        </w:rPr>
+        <w:t xml:space="preserve">Ciclo de Growth (Kanban de experimentos).</w:t>
+      </w:r>
+      <w:r>
+        <w:t xml:space="preserve"> </w:t>
+      </w:r>
+      <w:r>
+        <w:t xml:space="preserve">Ideias → em avaliação → priorizadas → preparação → em teste → análise → concluídas. Cada experimento tem o desenho do teste: métrica-alvo, público, intervenção, critério de sucesso.</w:t>
+      </w:r>
+    </w:p>
+    <w:p>
+      <w:pPr>
+        <w:numPr>
+          <w:ilvl w:val="0"/>
           <w:numId w:val="1035"/>
         </w:numPr>
         <w:pStyle w:val="Compact"/>
       </w:pPr>
       <w:r>
-        <w:t xml:space="preserve">resultado do período, um bloco por produto e uma seção por loop ou campanha;</w:t>
-      </w:r>
-    </w:p>
-    <w:p>
-      <w:pPr>
-        <w:numPr>
-          <w:ilvl w:val="1"/>
+        <w:rPr>
+          <w:bCs/>
+          <w:b/>
+        </w:rPr>
+        <w:t xml:space="preserve">Guardrails.</w:t>
+      </w:r>
+      <w:r>
+        <w:t xml:space="preserve"> </w:t>
+      </w:r>
+      <w:r>
+        <w:t xml:space="preserve">Limites de margem, lucro, ROAS, CAC, CPL e outros:</w:t>
+      </w:r>
+    </w:p>
+    <w:p>
+      <w:pPr>
+        <w:numPr>
+          <w:ilvl w:val="1"/>
+          <w:numId w:val="1037"/>
+        </w:numPr>
+        <w:pStyle w:val="Compact"/>
+      </w:pPr>
+      <w:r>
+        <w:t xml:space="preserve">projetados no cenário:</w:t>
+      </w:r>
+      <w:r>
+        <w:t xml:space="preserve"> </w:t>
+      </w:r>
+      <w:r>
+        <w:t xml:space="preserve">“</w:t>
+      </w:r>
+      <w:r>
+        <w:t xml:space="preserve">este plano rompe o limite?</w:t>
+      </w:r>
+      <w:r>
+        <w:t xml:space="preserve">”</w:t>
+      </w:r>
+      <w:r>
+        <w:t xml:space="preserve">;</w:t>
+      </w:r>
+    </w:p>
+    <w:p>
+      <w:pPr>
+        <w:numPr>
+          <w:ilvl w:val="1"/>
+          <w:numId w:val="1037"/>
+        </w:numPr>
+        <w:pStyle w:val="Compact"/>
+      </w:pPr>
+      <w:r>
+        <w:t xml:space="preserve">monitorados de verdade quando o teste vai ao ar: antes, durante e depois;</w:t>
+      </w:r>
+    </w:p>
+    <w:p>
+      <w:pPr>
+        <w:numPr>
+          <w:ilvl w:val="1"/>
+          <w:numId w:val="1037"/>
+        </w:numPr>
+        <w:pStyle w:val="Compact"/>
+      </w:pPr>
+      <w:r>
+        <w:t xml:space="preserve">quando rompem, geram alerta com a ação sugerida. Nada é pausado sozinho.</w:t>
+      </w:r>
+    </w:p>
+    <w:p>
+      <w:pPr>
+        <w:numPr>
+          <w:ilvl w:val="0"/>
           <w:numId w:val="1035"/>
         </w:numPr>
         <w:pStyle w:val="Compact"/>
       </w:pPr>
       <w:r>
-        <w:t xml:space="preserve">comparar até 3 cenários lado a lado.</w:t>
-      </w:r>
-    </w:p>
-    <w:p>
-      <w:pPr>
-        <w:numPr>
-          <w:ilvl w:val="0"/>
-          <w:numId w:val="1034"/>
-        </w:numPr>
-        <w:pStyle w:val="Compact"/>
-      </w:pPr>
-      <w:r>
-        <w:rPr>
-          <w:bCs/>
-          <w:b/>
-        </w:rPr>
-        <w:t xml:space="preserve">Cenários com ciclo de vida.</w:t>
-      </w:r>
-      <w:r>
-        <w:t xml:space="preserve"> </w:t>
-      </w:r>
-      <w:r>
-        <w:t xml:space="preserve">Em estudo, descartado (com motivo, e dá para reabrir), aprovado, ativo, encerrado, cancelado.</w:t>
-      </w:r>
-    </w:p>
-    <w:p>
-      <w:pPr>
-        <w:numPr>
-          <w:ilvl w:val="0"/>
-          <w:numId w:val="1034"/>
-        </w:numPr>
-        <w:pStyle w:val="Compact"/>
-      </w:pPr>
-      <w:r>
-        <w:rPr>
-          <w:bCs/>
-          <w:b/>
-        </w:rPr>
-        <w:t xml:space="preserve">Decisão.</w:t>
-      </w:r>
-      <w:r>
-        <w:t xml:space="preserve"> </w:t>
-      </w:r>
-      <w:r>
-        <w:t xml:space="preserve">ICE (impacto, confiança, facilidade) com justificativa. A aprovação congela o cenário e gera o documento de decisão imutável (contexto, hipótese, baseline contra projeção, riscos, responsável) e a ideia no Kanban.</w:t>
-      </w:r>
-    </w:p>
-    <w:p>
-      <w:pPr>
-        <w:numPr>
-          <w:ilvl w:val="0"/>
-          <w:numId w:val="1034"/>
-        </w:numPr>
-        <w:pStyle w:val="Compact"/>
-      </w:pPr>
-      <w:r>
-        <w:rPr>
-          <w:bCs/>
-          <w:b/>
-        </w:rPr>
-        <w:t xml:space="preserve">Ciclo de Growth (Kanban de experimentos).</w:t>
-      </w:r>
-      <w:r>
-        <w:t xml:space="preserve"> </w:t>
-      </w:r>
-      <w:r>
-        <w:t xml:space="preserve">Ideias → em avaliação → priorizadas → preparação → em teste → análise → concluídas. Cada experimento tem o desenho do teste: métrica-alvo, público, intervenção, critério de sucesso.</w:t>
-      </w:r>
-    </w:p>
-    <w:p>
-      <w:pPr>
-        <w:numPr>
-          <w:ilvl w:val="0"/>
-          <w:numId w:val="1034"/>
-        </w:numPr>
-        <w:pStyle w:val="Compact"/>
-      </w:pPr>
-      <w:r>
-        <w:rPr>
-          <w:bCs/>
-          <w:b/>
-        </w:rPr>
-        <w:t xml:space="preserve">Guardrails.</w:t>
-      </w:r>
-      <w:r>
-        <w:t xml:space="preserve"> </w:t>
-      </w:r>
-      <w:r>
-        <w:t xml:space="preserve">Limites de margem, lucro, ROAS, CAC, CPL e outros:</w:t>
-      </w:r>
-    </w:p>
-    <w:p>
-      <w:pPr>
-        <w:numPr>
-          <w:ilvl w:val="1"/>
-          <w:numId w:val="1036"/>
-        </w:numPr>
-        <w:pStyle w:val="Compact"/>
-      </w:pPr>
-      <w:r>
-        <w:t xml:space="preserve">projetados no cenário:</w:t>
-      </w:r>
-      <w:r>
-        <w:t xml:space="preserve"> </w:t>
-      </w:r>
-      <w:r>
-        <w:t xml:space="preserve">“</w:t>
-      </w:r>
-      <w:r>
-        <w:t xml:space="preserve">este plano rompe o limite?</w:t>
-      </w:r>
-      <w:r>
-        <w:t xml:space="preserve">”</w:t>
-      </w:r>
-      <w:r>
-        <w:t xml:space="preserve">;</w:t>
-      </w:r>
-    </w:p>
-    <w:p>
-      <w:pPr>
-        <w:numPr>
-          <w:ilvl w:val="1"/>
-          <w:numId w:val="1036"/>
-        </w:numPr>
-        <w:pStyle w:val="Compact"/>
-      </w:pPr>
-      <w:r>
-        <w:t xml:space="preserve">monitorados de verdade quando o teste vai ao ar: antes, durante e depois;</w:t>
-      </w:r>
-    </w:p>
-    <w:p>
-      <w:pPr>
-        <w:numPr>
-          <w:ilvl w:val="1"/>
-          <w:numId w:val="1036"/>
-        </w:numPr>
-        <w:pStyle w:val="Compact"/>
-      </w:pPr>
-      <w:r>
-        <w:t xml:space="preserve">quando rompem, geram alerta com a ação sugerida. Nada é pausado sozinho.</w:t>
-      </w:r>
-    </w:p>
-    <w:p>
-      <w:pPr>
-        <w:numPr>
-          <w:ilvl w:val="0"/>
-          <w:numId w:val="1034"/>
-        </w:numPr>
-        <w:pStyle w:val="Compact"/>
-      </w:pPr>
-      <w:r>
         <w:rPr>
           <w:bCs/>
           <w:b/>
@@ -4382,7 +4403,7 @@
       <w:pPr>
         <w:numPr>
           <w:ilvl w:val="0"/>
-          <w:numId w:val="1034"/>
+          <w:numId w:val="1035"/>
         </w:numPr>
         <w:pStyle w:val="Compact"/>
       </w:pPr>
@@ -4398,7 +4419,7 @@
       <w:pPr>
         <w:numPr>
           <w:ilvl w:val="1"/>
-          <w:numId w:val="1037"/>
+          <w:numId w:val="1038"/>
         </w:numPr>
         <w:pStyle w:val="Compact"/>
       </w:pPr>
@@ -4410,7 +4431,7 @@
       <w:pPr>
         <w:numPr>
           <w:ilvl w:val="1"/>
-          <w:numId w:val="1037"/>
+          <w:numId w:val="1038"/>
         </w:numPr>
         <w:pStyle w:val="Compact"/>
       </w:pPr>
@@ -4422,7 +4443,7 @@
       <w:pPr>
         <w:numPr>
           <w:ilvl w:val="1"/>
-          <w:numId w:val="1037"/>
+          <w:numId w:val="1038"/>
         </w:numPr>
         <w:pStyle w:val="Compact"/>
       </w:pPr>
@@ -4434,7 +4455,7 @@
       <w:pPr>
         <w:numPr>
           <w:ilvl w:val="1"/>
-          <w:numId w:val="1037"/>
+          <w:numId w:val="1038"/>
         </w:numPr>
         <w:pStyle w:val="Compact"/>
       </w:pPr>
@@ -4456,7 +4477,7 @@
       <w:pPr>
         <w:numPr>
           <w:ilvl w:val="1"/>
-          <w:numId w:val="1037"/>
+          <w:numId w:val="1038"/>
         </w:numPr>
         <w:pStyle w:val="Compact"/>
       </w:pPr>
@@ -4478,7 +4499,7 @@
       <w:pPr>
         <w:numPr>
           <w:ilvl w:val="1"/>
-          <w:numId w:val="1037"/>
+          <w:numId w:val="1038"/>
         </w:numPr>
         <w:pStyle w:val="Compact"/>
       </w:pPr>
@@ -4522,7 +4543,7 @@
       <w:pPr>
         <w:numPr>
           <w:ilvl w:val="0"/>
-          <w:numId w:val="1038"/>
+          <w:numId w:val="1039"/>
         </w:numPr>
         <w:pStyle w:val="Compact"/>
       </w:pPr>
@@ -4544,7 +4565,7 @@
       <w:pPr>
         <w:numPr>
           <w:ilvl w:val="0"/>
-          <w:numId w:val="1038"/>
+          <w:numId w:val="1039"/>
         </w:numPr>
         <w:pStyle w:val="Compact"/>
       </w:pPr>
@@ -4566,7 +4587,7 @@
       <w:pPr>
         <w:numPr>
           <w:ilvl w:val="0"/>
-          <w:numId w:val="1038"/>
+          <w:numId w:val="1039"/>
         </w:numPr>
         <w:pStyle w:val="Compact"/>
       </w:pPr>
@@ -4582,7 +4603,7 @@
       <w:pPr>
         <w:numPr>
           <w:ilvl w:val="0"/>
-          <w:numId w:val="1038"/>
+          <w:numId w:val="1039"/>
         </w:numPr>
         <w:pStyle w:val="Compact"/>
       </w:pPr>
@@ -4604,7 +4625,7 @@
       <w:pPr>
         <w:numPr>
           <w:ilvl w:val="0"/>
-          <w:numId w:val="1038"/>
+          <w:numId w:val="1039"/>
         </w:numPr>
         <w:pStyle w:val="Compact"/>
       </w:pPr>
@@ -4643,7 +4664,7 @@
       <w:pPr>
         <w:numPr>
           <w:ilvl w:val="0"/>
-          <w:numId w:val="1039"/>
+          <w:numId w:val="1040"/>
         </w:numPr>
         <w:pStyle w:val="Compact"/>
       </w:pPr>
@@ -4665,103 +4686,103 @@
       <w:pPr>
         <w:numPr>
           <w:ilvl w:val="1"/>
+          <w:numId w:val="1041"/>
+        </w:numPr>
+        <w:pStyle w:val="Compact"/>
+      </w:pPr>
+      <w:r>
+        <w:t xml:space="preserve">verde: pronto;</w:t>
+      </w:r>
+    </w:p>
+    <w:p>
+      <w:pPr>
+        <w:numPr>
+          <w:ilvl w:val="1"/>
+          <w:numId w:val="1041"/>
+        </w:numPr>
+        <w:pStyle w:val="Compact"/>
+      </w:pPr>
+      <w:r>
+        <w:t xml:space="preserve">vermelho: tem problema, com o motivo;</w:t>
+      </w:r>
+    </w:p>
+    <w:p>
+      <w:pPr>
+        <w:numPr>
+          <w:ilvl w:val="1"/>
+          <w:numId w:val="1041"/>
+        </w:numPr>
+        <w:pStyle w:val="Compact"/>
+      </w:pPr>
+      <w:r>
+        <w:t xml:space="preserve">amarelo: em dúvida.</w:t>
+      </w:r>
+    </w:p>
+    <w:p>
+      <w:pPr>
+        <w:numPr>
+          <w:ilvl w:val="0"/>
+          <w:numId w:val="1000"/>
+        </w:numPr>
+        <w:pStyle w:val="Compact"/>
+      </w:pPr>
+      <w:r>
+        <w:t xml:space="preserve">Depois vem o de-para campo a campo. Colunas sem campo viram campos personalizados.</w:t>
+      </w:r>
+    </w:p>
+    <w:p>
+      <w:pPr>
+        <w:numPr>
+          <w:ilvl w:val="0"/>
           <w:numId w:val="1040"/>
         </w:numPr>
         <w:pStyle w:val="Compact"/>
       </w:pPr>
       <w:r>
-        <w:t xml:space="preserve">verde: pronto;</w:t>
-      </w:r>
-    </w:p>
-    <w:p>
-      <w:pPr>
-        <w:numPr>
-          <w:ilvl w:val="1"/>
+        <w:rPr>
+          <w:bCs/>
+          <w:b/>
+        </w:rPr>
+        <w:t xml:space="preserve">Qualidade dos dados.</w:t>
+      </w:r>
+      <w:r>
+        <w:t xml:space="preserve"> </w:t>
+      </w:r>
+      <w:r>
+        <w:t xml:space="preserve">10 verificações automáticas, como venda sem origem, mais cliques que impressões, dias sem dado de mídia e mídia dos anúncios diferente do financeiro. Os dashboards marcam com ⚠ os números afetados.</w:t>
+      </w:r>
+    </w:p>
+    <w:p>
+      <w:pPr>
+        <w:numPr>
+          <w:ilvl w:val="0"/>
           <w:numId w:val="1040"/>
         </w:numPr>
         <w:pStyle w:val="Compact"/>
       </w:pPr>
       <w:r>
-        <w:t xml:space="preserve">vermelho: tem problema, com o motivo;</w:t>
-      </w:r>
-    </w:p>
-    <w:p>
-      <w:pPr>
-        <w:numPr>
-          <w:ilvl w:val="1"/>
+        <w:rPr>
+          <w:bCs/>
+          <w:b/>
+        </w:rPr>
+        <w:t xml:space="preserve">Dicionário de métricas.</w:t>
+      </w:r>
+      <w:r>
+        <w:t xml:space="preserve"> </w:t>
+      </w:r>
+      <w:r>
+        <w:t xml:space="preserve">A definição oficial de cada indicador, com o ⓘ nos cartões.</w:t>
+      </w:r>
+    </w:p>
+    <w:p>
+      <w:pPr>
+        <w:numPr>
+          <w:ilvl w:val="0"/>
           <w:numId w:val="1040"/>
         </w:numPr>
         <w:pStyle w:val="Compact"/>
       </w:pPr>
       <w:r>
-        <w:t xml:space="preserve">amarelo: em dúvida.</w:t>
-      </w:r>
-    </w:p>
-    <w:p>
-      <w:pPr>
-        <w:numPr>
-          <w:ilvl w:val="0"/>
-          <w:numId w:val="1000"/>
-        </w:numPr>
-        <w:pStyle w:val="Compact"/>
-      </w:pPr>
-      <w:r>
-        <w:t xml:space="preserve">Depois vem o de-para campo a campo. Colunas sem campo viram campos personalizados.</w:t>
-      </w:r>
-    </w:p>
-    <w:p>
-      <w:pPr>
-        <w:numPr>
-          <w:ilvl w:val="0"/>
-          <w:numId w:val="1039"/>
-        </w:numPr>
-        <w:pStyle w:val="Compact"/>
-      </w:pPr>
-      <w:r>
-        <w:rPr>
-          <w:bCs/>
-          <w:b/>
-        </w:rPr>
-        <w:t xml:space="preserve">Qualidade dos dados.</w:t>
-      </w:r>
-      <w:r>
-        <w:t xml:space="preserve"> </w:t>
-      </w:r>
-      <w:r>
-        <w:t xml:space="preserve">10 verificações automáticas, como venda sem origem, mais cliques que impressões, dias sem dado de mídia e mídia dos anúncios diferente do financeiro. Os dashboards marcam com ⚠ os números afetados.</w:t>
-      </w:r>
-    </w:p>
-    <w:p>
-      <w:pPr>
-        <w:numPr>
-          <w:ilvl w:val="0"/>
-          <w:numId w:val="1039"/>
-        </w:numPr>
-        <w:pStyle w:val="Compact"/>
-      </w:pPr>
-      <w:r>
-        <w:rPr>
-          <w:bCs/>
-          <w:b/>
-        </w:rPr>
-        <w:t xml:space="preserve">Dicionário de métricas.</w:t>
-      </w:r>
-      <w:r>
-        <w:t xml:space="preserve"> </w:t>
-      </w:r>
-      <w:r>
-        <w:t xml:space="preserve">A definição oficial de cada indicador, com o ⓘ nos cartões.</w:t>
-      </w:r>
-    </w:p>
-    <w:p>
-      <w:pPr>
-        <w:numPr>
-          <w:ilvl w:val="0"/>
-          <w:numId w:val="1039"/>
-        </w:numPr>
-        <w:pStyle w:val="Compact"/>
-      </w:pPr>
-      <w:r>
         <w:rPr>
           <w:bCs/>
           <w:b/>
@@ -4779,7 +4800,7 @@
       <w:pPr>
         <w:numPr>
           <w:ilvl w:val="0"/>
-          <w:numId w:val="1039"/>
+          <w:numId w:val="1040"/>
         </w:numPr>
         <w:pStyle w:val="Compact"/>
       </w:pPr>
@@ -4801,7 +4822,7 @@
       <w:pPr>
         <w:numPr>
           <w:ilvl w:val="0"/>
-          <w:numId w:val="1039"/>
+          <w:numId w:val="1040"/>
         </w:numPr>
         <w:pStyle w:val="Compact"/>
       </w:pPr>
@@ -4823,7 +4844,7 @@
       <w:pPr>
         <w:numPr>
           <w:ilvl w:val="0"/>
-          <w:numId w:val="1039"/>
+          <w:numId w:val="1040"/>
         </w:numPr>
         <w:pStyle w:val="Compact"/>
       </w:pPr>
@@ -4860,7 +4881,7 @@
       <w:pPr>
         <w:numPr>
           <w:ilvl w:val="0"/>
-          <w:numId w:val="1039"/>
+          <w:numId w:val="1040"/>
         </w:numPr>
         <w:pStyle w:val="Compact"/>
       </w:pPr>
@@ -4899,7 +4920,7 @@
       <w:pPr>
         <w:numPr>
           <w:ilvl w:val="0"/>
-          <w:numId w:val="1041"/>
+          <w:numId w:val="1042"/>
         </w:numPr>
         <w:pStyle w:val="Compact"/>
       </w:pPr>
@@ -4921,7 +4942,7 @@
       <w:pPr>
         <w:numPr>
           <w:ilvl w:val="0"/>
-          <w:numId w:val="1041"/>
+          <w:numId w:val="1042"/>
         </w:numPr>
         <w:pStyle w:val="Compact"/>
       </w:pPr>
@@ -4940,7 +4961,7 @@
       <w:pPr>
         <w:numPr>
           <w:ilvl w:val="0"/>
-          <w:numId w:val="1041"/>
+          <w:numId w:val="1042"/>
         </w:numPr>
         <w:pStyle w:val="Compact"/>
       </w:pPr>
@@ -4962,7 +4983,7 @@
       <w:pPr>
         <w:numPr>
           <w:ilvl w:val="0"/>
-          <w:numId w:val="1041"/>
+          <w:numId w:val="1042"/>
         </w:numPr>
         <w:pStyle w:val="Compact"/>
       </w:pPr>
@@ -4984,7 +5005,7 @@
       <w:pPr>
         <w:numPr>
           <w:ilvl w:val="0"/>
-          <w:numId w:val="1041"/>
+          <w:numId w:val="1042"/>
         </w:numPr>
         <w:pStyle w:val="Compact"/>
       </w:pPr>
@@ -5000,7 +5021,7 @@
       <w:pPr>
         <w:numPr>
           <w:ilvl w:val="0"/>
-          <w:numId w:val="1041"/>
+          <w:numId w:val="1042"/>
         </w:numPr>
         <w:pStyle w:val="Compact"/>
       </w:pPr>
@@ -5047,7 +5068,7 @@
       <w:pPr>
         <w:numPr>
           <w:ilvl w:val="0"/>
-          <w:numId w:val="1041"/>
+          <w:numId w:val="1042"/>
         </w:numPr>
         <w:pStyle w:val="Compact"/>
       </w:pPr>
@@ -5086,7 +5107,7 @@
       <w:pPr>
         <w:numPr>
           <w:ilvl w:val="0"/>
-          <w:numId w:val="1042"/>
+          <w:numId w:val="1043"/>
         </w:numPr>
         <w:pStyle w:val="Compact"/>
       </w:pPr>
@@ -5108,7 +5129,7 @@
       <w:pPr>
         <w:numPr>
           <w:ilvl w:val="0"/>
-          <w:numId w:val="1042"/>
+          <w:numId w:val="1043"/>
         </w:numPr>
         <w:pStyle w:val="Compact"/>
       </w:pPr>
@@ -5130,7 +5151,7 @@
       <w:pPr>
         <w:numPr>
           <w:ilvl w:val="0"/>
-          <w:numId w:val="1042"/>
+          <w:numId w:val="1043"/>
         </w:numPr>
         <w:pStyle w:val="Compact"/>
       </w:pPr>
@@ -5152,7 +5173,7 @@
       <w:pPr>
         <w:numPr>
           <w:ilvl w:val="0"/>
-          <w:numId w:val="1042"/>
+          <w:numId w:val="1043"/>
         </w:numPr>
         <w:pStyle w:val="Compact"/>
       </w:pPr>
@@ -5174,70 +5195,70 @@
       <w:pPr>
         <w:numPr>
           <w:ilvl w:val="1"/>
+          <w:numId w:val="1044"/>
+        </w:numPr>
+        <w:pStyle w:val="Compact"/>
+      </w:pPr>
+      <w:r>
+        <w:t xml:space="preserve">“</w:t>
+      </w:r>
+      <w:r>
+        <w:t xml:space="preserve">ROAS oficial é o bruto</w:t>
+      </w:r>
+      <w:r>
+        <w:t xml:space="preserve">”</w:t>
+      </w:r>
+      <w:r>
+        <w:t xml:space="preserve">;</w:t>
+      </w:r>
+    </w:p>
+    <w:p>
+      <w:pPr>
+        <w:numPr>
+          <w:ilvl w:val="1"/>
+          <w:numId w:val="1044"/>
+        </w:numPr>
+        <w:pStyle w:val="Compact"/>
+      </w:pPr>
+      <w:r>
+        <w:t xml:space="preserve">“</w:t>
+      </w:r>
+      <w:r>
+        <w:t xml:space="preserve">mesmo telefone junta sozinho</w:t>
+      </w:r>
+      <w:r>
+        <w:t xml:space="preserve">”</w:t>
+      </w:r>
+      <w:r>
+        <w:t xml:space="preserve">;</w:t>
+      </w:r>
+    </w:p>
+    <w:p>
+      <w:pPr>
+        <w:numPr>
+          <w:ilvl w:val="1"/>
+          <w:numId w:val="1044"/>
+        </w:numPr>
+        <w:pStyle w:val="Compact"/>
+      </w:pPr>
+      <w:r>
+        <w:t xml:space="preserve">“</w:t>
+      </w:r>
+      <w:r>
+        <w:t xml:space="preserve">contrato recorrente: só contrato novo é recompra</w:t>
+      </w:r>
+      <w:r>
+        <w:t xml:space="preserve">”</w:t>
+      </w:r>
+      <w:r>
+        <w:t xml:space="preserve">.</w:t>
+      </w:r>
+    </w:p>
+    <w:p>
+      <w:pPr>
+        <w:numPr>
+          <w:ilvl w:val="0"/>
           <w:numId w:val="1043"/>
-        </w:numPr>
-        <w:pStyle w:val="Compact"/>
-      </w:pPr>
-      <w:r>
-        <w:t xml:space="preserve">“</w:t>
-      </w:r>
-      <w:r>
-        <w:t xml:space="preserve">ROAS oficial é o bruto</w:t>
-      </w:r>
-      <w:r>
-        <w:t xml:space="preserve">”</w:t>
-      </w:r>
-      <w:r>
-        <w:t xml:space="preserve">;</w:t>
-      </w:r>
-    </w:p>
-    <w:p>
-      <w:pPr>
-        <w:numPr>
-          <w:ilvl w:val="1"/>
-          <w:numId w:val="1043"/>
-        </w:numPr>
-        <w:pStyle w:val="Compact"/>
-      </w:pPr>
-      <w:r>
-        <w:t xml:space="preserve">“</w:t>
-      </w:r>
-      <w:r>
-        <w:t xml:space="preserve">mesmo telefone junta sozinho</w:t>
-      </w:r>
-      <w:r>
-        <w:t xml:space="preserve">”</w:t>
-      </w:r>
-      <w:r>
-        <w:t xml:space="preserve">;</w:t>
-      </w:r>
-    </w:p>
-    <w:p>
-      <w:pPr>
-        <w:numPr>
-          <w:ilvl w:val="1"/>
-          <w:numId w:val="1043"/>
-        </w:numPr>
-        <w:pStyle w:val="Compact"/>
-      </w:pPr>
-      <w:r>
-        <w:t xml:space="preserve">“</w:t>
-      </w:r>
-      <w:r>
-        <w:t xml:space="preserve">contrato recorrente: só contrato novo é recompra</w:t>
-      </w:r>
-      <w:r>
-        <w:t xml:space="preserve">”</w:t>
-      </w:r>
-      <w:r>
-        <w:t xml:space="preserve">.</w:t>
-      </w:r>
-    </w:p>
-    <w:p>
-      <w:pPr>
-        <w:numPr>
-          <w:ilvl w:val="0"/>
-          <w:numId w:val="1042"/>
         </w:numPr>
         <w:pStyle w:val="Compact"/>
       </w:pPr>
@@ -5284,7 +5305,7 @@
       <w:pPr>
         <w:numPr>
           <w:ilvl w:val="0"/>
-          <w:numId w:val="1044"/>
+          <w:numId w:val="1045"/>
         </w:numPr>
         <w:pStyle w:val="Compact"/>
       </w:pPr>
@@ -5308,7 +5329,7 @@
       <w:pPr>
         <w:numPr>
           <w:ilvl w:val="0"/>
-          <w:numId w:val="1044"/>
+          <w:numId w:val="1045"/>
         </w:numPr>
         <w:pStyle w:val="Compact"/>
       </w:pPr>
@@ -5338,7 +5359,7 @@
       <w:pPr>
         <w:numPr>
           <w:ilvl w:val="0"/>
-          <w:numId w:val="1044"/>
+          <w:numId w:val="1045"/>
         </w:numPr>
         <w:pStyle w:val="Compact"/>
       </w:pPr>
@@ -5350,7 +5371,7 @@
       <w:pPr>
         <w:numPr>
           <w:ilvl w:val="0"/>
-          <w:numId w:val="1044"/>
+          <w:numId w:val="1045"/>
         </w:numPr>
         <w:pStyle w:val="Compact"/>
       </w:pPr>
@@ -5362,7 +5383,7 @@
       <w:pPr>
         <w:numPr>
           <w:ilvl w:val="0"/>
-          <w:numId w:val="1044"/>
+          <w:numId w:val="1045"/>
         </w:numPr>
         <w:pStyle w:val="Compact"/>
       </w:pPr>
@@ -5374,7 +5395,7 @@
       <w:pPr>
         <w:numPr>
           <w:ilvl w:val="0"/>
-          <w:numId w:val="1044"/>
+          <w:numId w:val="1045"/>
         </w:numPr>
         <w:pStyle w:val="Compact"/>
       </w:pPr>
@@ -5386,7 +5407,7 @@
       <w:pPr>
         <w:numPr>
           <w:ilvl w:val="0"/>
-          <w:numId w:val="1044"/>
+          <w:numId w:val="1045"/>
         </w:numPr>
         <w:pStyle w:val="Compact"/>
       </w:pPr>
@@ -5398,7 +5419,7 @@
       <w:pPr>
         <w:numPr>
           <w:ilvl w:val="0"/>
-          <w:numId w:val="1044"/>
+          <w:numId w:val="1045"/>
         </w:numPr>
         <w:pStyle w:val="Compact"/>
       </w:pPr>
@@ -5410,7 +5431,7 @@
       <w:pPr>
         <w:numPr>
           <w:ilvl w:val="0"/>
-          <w:numId w:val="1044"/>
+          <w:numId w:val="1045"/>
         </w:numPr>
         <w:pStyle w:val="Compact"/>
       </w:pPr>
@@ -5422,7 +5443,7 @@
       <w:pPr>
         <w:numPr>
           <w:ilvl w:val="0"/>
-          <w:numId w:val="1044"/>
+          <w:numId w:val="1045"/>
         </w:numPr>
         <w:pStyle w:val="Compact"/>
       </w:pPr>
@@ -5434,7 +5455,7 @@
       <w:pPr>
         <w:numPr>
           <w:ilvl w:val="0"/>
-          <w:numId w:val="1044"/>
+          <w:numId w:val="1045"/>
         </w:numPr>
         <w:pStyle w:val="Compact"/>
       </w:pPr>
@@ -5446,7 +5467,7 @@
       <w:pPr>
         <w:numPr>
           <w:ilvl w:val="0"/>
-          <w:numId w:val="1044"/>
+          <w:numId w:val="1045"/>
         </w:numPr>
         <w:pStyle w:val="Compact"/>
       </w:pPr>
@@ -5458,7 +5479,7 @@
       <w:pPr>
         <w:numPr>
           <w:ilvl w:val="0"/>
-          <w:numId w:val="1044"/>
+          <w:numId w:val="1045"/>
         </w:numPr>
         <w:pStyle w:val="Compact"/>
       </w:pPr>
@@ -5470,7 +5491,7 @@
       <w:pPr>
         <w:numPr>
           <w:ilvl w:val="0"/>
-          <w:numId w:val="1044"/>
+          <w:numId w:val="1045"/>
         </w:numPr>
         <w:pStyle w:val="Compact"/>
       </w:pPr>
@@ -5482,7 +5503,7 @@
       <w:pPr>
         <w:numPr>
           <w:ilvl w:val="0"/>
-          <w:numId w:val="1044"/>
+          <w:numId w:val="1045"/>
         </w:numPr>
         <w:pStyle w:val="Compact"/>
       </w:pPr>
@@ -5494,7 +5515,31 @@
       <w:pPr>
         <w:numPr>
           <w:ilvl w:val="0"/>
-          <w:numId w:val="1044"/>
+          <w:numId w:val="1045"/>
+        </w:numPr>
+        <w:pStyle w:val="Compact"/>
+      </w:pPr>
+      <w:r>
+        <w:t xml:space="preserve">Da pasta ao dossiê: como a IA lê o material do cliente sem inventar nada.</w:t>
+      </w:r>
+    </w:p>
+    <w:p>
+      <w:pPr>
+        <w:numPr>
+          <w:ilvl w:val="0"/>
+          <w:numId w:val="1045"/>
+        </w:numPr>
+        <w:pStyle w:val="Compact"/>
+      </w:pPr>
+      <w:r>
+        <w:t xml:space="preserve">Fato, hipótese ou recomendação: como ler uma pesquisa feita por IA.</w:t>
+      </w:r>
+    </w:p>
+    <w:p>
+      <w:pPr>
+        <w:numPr>
+          <w:ilvl w:val="0"/>
+          <w:numId w:val="1045"/>
         </w:numPr>
         <w:pStyle w:val="Compact"/>
       </w:pPr>
@@ -5524,7 +5569,7 @@
       <w:pPr>
         <w:numPr>
           <w:ilvl w:val="0"/>
-          <w:numId w:val="1044"/>
+          <w:numId w:val="1045"/>
         </w:numPr>
         <w:pStyle w:val="Compact"/>
       </w:pPr>
@@ -5553,7 +5598,7 @@
       <w:pPr>
         <w:numPr>
           <w:ilvl w:val="0"/>
-          <w:numId w:val="1045"/>
+          <w:numId w:val="1046"/>
         </w:numPr>
         <w:pStyle w:val="Compact"/>
       </w:pPr>
@@ -5569,444 +5614,444 @@
       <w:pPr>
         <w:numPr>
           <w:ilvl w:val="1"/>
+          <w:numId w:val="1047"/>
+        </w:numPr>
+        <w:pStyle w:val="Compact"/>
+      </w:pPr>
+      <w:r>
+        <w:t xml:space="preserve">base do sistema: workspaces, pessoas, vendas com contabilidade automática, contas a receber, campanhas;</w:t>
+      </w:r>
+    </w:p>
+    <w:p>
+      <w:pPr>
+        <w:numPr>
+          <w:ilvl w:val="1"/>
+          <w:numId w:val="1047"/>
+        </w:numPr>
+        <w:pStyle w:val="Compact"/>
+      </w:pPr>
+      <w:r>
+        <w:t xml:space="preserve">financeiro completo;</w:t>
+      </w:r>
+    </w:p>
+    <w:p>
+      <w:pPr>
+        <w:numPr>
+          <w:ilvl w:val="1"/>
+          <w:numId w:val="1047"/>
+        </w:numPr>
+        <w:pStyle w:val="Compact"/>
+      </w:pPr>
+      <w:r>
+        <w:t xml:space="preserve">CRM, funis e jornada do lead;</w:t>
+      </w:r>
+    </w:p>
+    <w:p>
+      <w:pPr>
+        <w:numPr>
+          <w:ilvl w:val="1"/>
+          <w:numId w:val="1047"/>
+        </w:numPr>
+        <w:pStyle w:val="Compact"/>
+      </w:pPr>
+      <w:r>
+        <w:t xml:space="preserve">mídia paga, vídeos, RevOps, projetos;</w:t>
+      </w:r>
+    </w:p>
+    <w:p>
+      <w:pPr>
+        <w:numPr>
+          <w:ilvl w:val="1"/>
+          <w:numId w:val="1047"/>
+        </w:numPr>
+        <w:pStyle w:val="Compact"/>
+      </w:pPr>
+      <w:r>
+        <w:t xml:space="preserve">Growth Model e Ciclo de Growth;</w:t>
+      </w:r>
+    </w:p>
+    <w:p>
+      <w:pPr>
+        <w:numPr>
+          <w:ilvl w:val="1"/>
+          <w:numId w:val="1047"/>
+        </w:numPr>
+        <w:pStyle w:val="Compact"/>
+      </w:pPr>
+      <w:r>
+        <w:t xml:space="preserve">pesquisas e planejamento de conteúdo.</w:t>
+      </w:r>
+    </w:p>
+    <w:p>
+      <w:pPr>
+        <w:numPr>
+          <w:ilvl w:val="0"/>
           <w:numId w:val="1046"/>
         </w:numPr>
         <w:pStyle w:val="Compact"/>
       </w:pPr>
       <w:r>
-        <w:t xml:space="preserve">base do sistema: workspaces, pessoas, vendas com contabilidade automática, contas a receber, campanhas;</w:t>
-      </w:r>
-    </w:p>
-    <w:p>
-      <w:pPr>
-        <w:numPr>
-          <w:ilvl w:val="1"/>
+        <w:rPr>
+          <w:bCs/>
+          <w:b/>
+        </w:rPr>
+        <w:t xml:space="preserve">07 a 08/10:</w:t>
+      </w:r>
+    </w:p>
+    <w:p>
+      <w:pPr>
+        <w:numPr>
+          <w:ilvl w:val="1"/>
+          <w:numId w:val="1048"/>
+        </w:numPr>
+        <w:pStyle w:val="Compact"/>
+      </w:pPr>
+      <w:r>
+        <w:t xml:space="preserve">contratos com parcelas personalizadas, oportunidades, renovação;</w:t>
+      </w:r>
+    </w:p>
+    <w:p>
+      <w:pPr>
+        <w:numPr>
+          <w:ilvl w:val="1"/>
+          <w:numId w:val="1048"/>
+        </w:numPr>
+        <w:pStyle w:val="Compact"/>
+      </w:pPr>
+      <w:r>
+        <w:t xml:space="preserve">novo visual, Growth Starter, importação inteligente;</w:t>
+      </w:r>
+    </w:p>
+    <w:p>
+      <w:pPr>
+        <w:numPr>
+          <w:ilvl w:val="1"/>
+          <w:numId w:val="1048"/>
+        </w:numPr>
+        <w:pStyle w:val="Compact"/>
+      </w:pPr>
+      <w:r>
+        <w:t xml:space="preserve">“</w:t>
+      </w:r>
+      <w:r>
+        <w:t xml:space="preserve">Pergunte aos dados</w:t>
+      </w:r>
+      <w:r>
+        <w:t xml:space="preserve">”</w:t>
+      </w:r>
+      <w:r>
+        <w:t xml:space="preserve"> </w:t>
+      </w:r>
+      <w:r>
+        <w:t xml:space="preserve">com IA conferida;</w:t>
+      </w:r>
+    </w:p>
+    <w:p>
+      <w:pPr>
+        <w:numPr>
+          <w:ilvl w:val="1"/>
+          <w:numId w:val="1048"/>
+        </w:numPr>
+        <w:pStyle w:val="Compact"/>
+      </w:pPr>
+      <w:r>
+        <w:t xml:space="preserve">dashboards de mídia e vendas;</w:t>
+      </w:r>
+    </w:p>
+    <w:p>
+      <w:pPr>
+        <w:numPr>
+          <w:ilvl w:val="1"/>
+          <w:numId w:val="1048"/>
+        </w:numPr>
+        <w:pStyle w:val="Compact"/>
+      </w:pPr>
+      <w:r>
+        <w:t xml:space="preserve">Growth Model automático e calculadora de campanha.</w:t>
+      </w:r>
+    </w:p>
+    <w:p>
+      <w:pPr>
+        <w:numPr>
+          <w:ilvl w:val="0"/>
           <w:numId w:val="1046"/>
         </w:numPr>
         <w:pStyle w:val="Compact"/>
       </w:pPr>
       <w:r>
-        <w:t xml:space="preserve">financeiro completo;</w:t>
-      </w:r>
-    </w:p>
-    <w:p>
-      <w:pPr>
-        <w:numPr>
-          <w:ilvl w:val="1"/>
+        <w:rPr>
+          <w:bCs/>
+          <w:b/>
+        </w:rPr>
+        <w:t xml:space="preserve">10 a 11/10:</w:t>
+      </w:r>
+    </w:p>
+    <w:p>
+      <w:pPr>
+        <w:numPr>
+          <w:ilvl w:val="1"/>
+          <w:numId w:val="1049"/>
+        </w:numPr>
+        <w:pStyle w:val="Compact"/>
+      </w:pPr>
+      <w:r>
+        <w:t xml:space="preserve">estratégia em blocos e simulador de lucro;</w:t>
+      </w:r>
+    </w:p>
+    <w:p>
+      <w:pPr>
+        <w:numPr>
+          <w:ilvl w:val="1"/>
+          <w:numId w:val="1049"/>
+        </w:numPr>
+        <w:pStyle w:val="Compact"/>
+      </w:pPr>
+      <w:r>
+        <w:t xml:space="preserve">pacotes de acesso, cartões de crédito, Casa;</w:t>
+      </w:r>
+    </w:p>
+    <w:p>
+      <w:pPr>
+        <w:numPr>
+          <w:ilvl w:val="1"/>
+          <w:numId w:val="1049"/>
+        </w:numPr>
+        <w:pStyle w:val="Compact"/>
+      </w:pPr>
+      <w:r>
+        <w:t xml:space="preserve">segurança e confiança do dado: identidade, auditoria, qualidade, dicionário;</w:t>
+      </w:r>
+    </w:p>
+    <w:p>
+      <w:pPr>
+        <w:numPr>
+          <w:ilvl w:val="1"/>
+          <w:numId w:val="1049"/>
+        </w:numPr>
+        <w:pStyle w:val="Compact"/>
+      </w:pPr>
+      <w:r>
+        <w:t xml:space="preserve">captação e atribuição;</w:t>
+      </w:r>
+    </w:p>
+    <w:p>
+      <w:pPr>
+        <w:numPr>
+          <w:ilvl w:val="1"/>
+          <w:numId w:val="1049"/>
+        </w:numPr>
+        <w:pStyle w:val="Compact"/>
+      </w:pPr>
+      <w:r>
+        <w:t xml:space="preserve">projetos com modelos, custos e margens;</w:t>
+      </w:r>
+    </w:p>
+    <w:p>
+      <w:pPr>
+        <w:numPr>
+          <w:ilvl w:val="1"/>
+          <w:numId w:val="1049"/>
+        </w:numPr>
+        <w:pStyle w:val="Compact"/>
+      </w:pPr>
+      <w:r>
+        <w:t xml:space="preserve">“</w:t>
+      </w:r>
+      <w:r>
+        <w:t xml:space="preserve">Growth Now</w:t>
+      </w:r>
+      <w:r>
+        <w:t xml:space="preserve">”</w:t>
+      </w:r>
+      <w:r>
+        <w:t xml:space="preserve">: ofertas, cenários, decisão, guardrails.</w:t>
+      </w:r>
+    </w:p>
+    <w:p>
+      <w:pPr>
+        <w:numPr>
+          <w:ilvl w:val="0"/>
           <w:numId w:val="1046"/>
         </w:numPr>
         <w:pStyle w:val="Compact"/>
       </w:pPr>
       <w:r>
-        <w:t xml:space="preserve">CRM, funis e jornada do lead;</w:t>
-      </w:r>
-    </w:p>
-    <w:p>
-      <w:pPr>
-        <w:numPr>
-          <w:ilvl w:val="1"/>
+        <w:rPr>
+          <w:bCs/>
+          <w:b/>
+        </w:rPr>
+        <w:t xml:space="preserve">12 a 17/10:</w:t>
+      </w:r>
+    </w:p>
+    <w:p>
+      <w:pPr>
+        <w:numPr>
+          <w:ilvl w:val="1"/>
+          <w:numId w:val="1050"/>
+        </w:numPr>
+        <w:pStyle w:val="Compact"/>
+      </w:pPr>
+      <w:r>
+        <w:t xml:space="preserve">visual azul;</w:t>
+      </w:r>
+    </w:p>
+    <w:p>
+      <w:pPr>
+        <w:numPr>
+          <w:ilvl w:val="1"/>
+          <w:numId w:val="1050"/>
+        </w:numPr>
+        <w:pStyle w:val="Compact"/>
+      </w:pPr>
+      <w:r>
+        <w:t xml:space="preserve">Growth Model em planilha;</w:t>
+      </w:r>
+    </w:p>
+    <w:p>
+      <w:pPr>
+        <w:numPr>
+          <w:ilvl w:val="1"/>
+          <w:numId w:val="1050"/>
+        </w:numPr>
+        <w:pStyle w:val="Compact"/>
+      </w:pPr>
+      <w:r>
+        <w:t xml:space="preserve">Retenção &amp; Expansão (coortes, recompra, RFM);</w:t>
+      </w:r>
+    </w:p>
+    <w:p>
+      <w:pPr>
+        <w:numPr>
+          <w:ilvl w:val="1"/>
+          <w:numId w:val="1050"/>
+        </w:numPr>
+        <w:pStyle w:val="Compact"/>
+      </w:pPr>
+      <w:r>
+        <w:t xml:space="preserve">cenários com ciclo de vida, ideias pelo ChatGPT;</w:t>
+      </w:r>
+    </w:p>
+    <w:p>
+      <w:pPr>
+        <w:numPr>
+          <w:ilvl w:val="1"/>
+          <w:numId w:val="1050"/>
+        </w:numPr>
+        <w:pStyle w:val="Compact"/>
+      </w:pPr>
+      <w:r>
+        <w:t xml:space="preserve">auditoria de consistência e correção;</w:t>
+      </w:r>
+    </w:p>
+    <w:p>
+      <w:pPr>
+        <w:numPr>
+          <w:ilvl w:val="1"/>
+          <w:numId w:val="1050"/>
+        </w:numPr>
+        <w:pStyle w:val="Compact"/>
+      </w:pPr>
+      <w:r>
+        <w:t xml:space="preserve">Escola Aurora; leads por formulário.</w:t>
+      </w:r>
+    </w:p>
+    <w:p>
+      <w:pPr>
+        <w:numPr>
+          <w:ilvl w:val="0"/>
           <w:numId w:val="1046"/>
         </w:numPr>
         <w:pStyle w:val="Compact"/>
       </w:pPr>
       <w:r>
-        <w:t xml:space="preserve">mídia paga, vídeos, RevOps, projetos;</w:t>
-      </w:r>
-    </w:p>
-    <w:p>
-      <w:pPr>
-        <w:numPr>
-          <w:ilvl w:val="1"/>
+        <w:rPr>
+          <w:bCs/>
+          <w:b/>
+        </w:rPr>
+        <w:t xml:space="preserve">19 a 21/10:</w:t>
+      </w:r>
+    </w:p>
+    <w:p>
+      <w:pPr>
+        <w:numPr>
+          <w:ilvl w:val="1"/>
+          <w:numId w:val="1051"/>
+        </w:numPr>
+        <w:pStyle w:val="Compact"/>
+      </w:pPr>
+      <w:r>
+        <w:t xml:space="preserve">metas de leads; árvore dos números;</w:t>
+      </w:r>
+    </w:p>
+    <w:p>
+      <w:pPr>
+        <w:numPr>
+          <w:ilvl w:val="1"/>
+          <w:numId w:val="1051"/>
+        </w:numPr>
+        <w:pStyle w:val="Compact"/>
+      </w:pPr>
+      <w:r>
+        <w:t xml:space="preserve">comissões e conexões com Meta e Google;</w:t>
+      </w:r>
+    </w:p>
+    <w:p>
+      <w:pPr>
+        <w:numPr>
+          <w:ilvl w:val="1"/>
+          <w:numId w:val="1051"/>
+        </w:numPr>
+        <w:pStyle w:val="Compact"/>
+      </w:pPr>
+      <w:r>
+        <w:t xml:space="preserve">visual com destaque e dashboard em camadas;</w:t>
+      </w:r>
+    </w:p>
+    <w:p>
+      <w:pPr>
+        <w:numPr>
+          <w:ilvl w:val="1"/>
+          <w:numId w:val="1051"/>
+        </w:numPr>
+        <w:pStyle w:val="Compact"/>
+      </w:pPr>
+      <w:r>
+        <w:t xml:space="preserve">gráficos com função (ondas 1 a 3);</w:t>
+      </w:r>
+    </w:p>
+    <w:p>
+      <w:pPr>
+        <w:numPr>
+          <w:ilvl w:val="1"/>
+          <w:numId w:val="1051"/>
+        </w:numPr>
+        <w:pStyle w:val="Compact"/>
+      </w:pPr>
+      <w:r>
+        <w:t xml:space="preserve">painel da campanha dia a dia; qualificação por pontos;</w:t>
+      </w:r>
+    </w:p>
+    <w:p>
+      <w:pPr>
+        <w:numPr>
+          <w:ilvl w:val="1"/>
+          <w:numId w:val="1051"/>
+        </w:numPr>
+        <w:pStyle w:val="Compact"/>
+      </w:pPr>
+      <w:r>
+        <w:t xml:space="preserve">formulário de captação; selo de qualificado.</w:t>
+      </w:r>
+    </w:p>
+    <w:p>
+      <w:pPr>
+        <w:numPr>
+          <w:ilvl w:val="0"/>
           <w:numId w:val="1046"/>
         </w:numPr>
         <w:pStyle w:val="Compact"/>
       </w:pPr>
       <w:r>
-        <w:t xml:space="preserve">Growth Model e Ciclo de Growth;</w:t>
-      </w:r>
-    </w:p>
-    <w:p>
-      <w:pPr>
-        <w:numPr>
-          <w:ilvl w:val="1"/>
-          <w:numId w:val="1046"/>
-        </w:numPr>
-        <w:pStyle w:val="Compact"/>
-      </w:pPr>
-      <w:r>
-        <w:t xml:space="preserve">pesquisas e planejamento de conteúdo.</w:t>
-      </w:r>
-    </w:p>
-    <w:p>
-      <w:pPr>
-        <w:numPr>
-          <w:ilvl w:val="0"/>
-          <w:numId w:val="1045"/>
-        </w:numPr>
-        <w:pStyle w:val="Compact"/>
-      </w:pPr>
-      <w:r>
-        <w:rPr>
-          <w:bCs/>
-          <w:b/>
-        </w:rPr>
-        <w:t xml:space="preserve">07 a 08/10:</w:t>
-      </w:r>
-    </w:p>
-    <w:p>
-      <w:pPr>
-        <w:numPr>
-          <w:ilvl w:val="1"/>
-          <w:numId w:val="1047"/>
-        </w:numPr>
-        <w:pStyle w:val="Compact"/>
-      </w:pPr>
-      <w:r>
-        <w:t xml:space="preserve">contratos com parcelas personalizadas, oportunidades, renovação;</w:t>
-      </w:r>
-    </w:p>
-    <w:p>
-      <w:pPr>
-        <w:numPr>
-          <w:ilvl w:val="1"/>
-          <w:numId w:val="1047"/>
-        </w:numPr>
-        <w:pStyle w:val="Compact"/>
-      </w:pPr>
-      <w:r>
-        <w:t xml:space="preserve">novo visual, Growth Starter, importação inteligente;</w:t>
-      </w:r>
-    </w:p>
-    <w:p>
-      <w:pPr>
-        <w:numPr>
-          <w:ilvl w:val="1"/>
-          <w:numId w:val="1047"/>
-        </w:numPr>
-        <w:pStyle w:val="Compact"/>
-      </w:pPr>
-      <w:r>
-        <w:t xml:space="preserve">“</w:t>
-      </w:r>
-      <w:r>
-        <w:t xml:space="preserve">Pergunte aos dados</w:t>
-      </w:r>
-      <w:r>
-        <w:t xml:space="preserve">”</w:t>
-      </w:r>
-      <w:r>
-        <w:t xml:space="preserve"> </w:t>
-      </w:r>
-      <w:r>
-        <w:t xml:space="preserve">com IA conferida;</w:t>
-      </w:r>
-    </w:p>
-    <w:p>
-      <w:pPr>
-        <w:numPr>
-          <w:ilvl w:val="1"/>
-          <w:numId w:val="1047"/>
-        </w:numPr>
-        <w:pStyle w:val="Compact"/>
-      </w:pPr>
-      <w:r>
-        <w:t xml:space="preserve">dashboards de mídia e vendas;</w:t>
-      </w:r>
-    </w:p>
-    <w:p>
-      <w:pPr>
-        <w:numPr>
-          <w:ilvl w:val="1"/>
-          <w:numId w:val="1047"/>
-        </w:numPr>
-        <w:pStyle w:val="Compact"/>
-      </w:pPr>
-      <w:r>
-        <w:t xml:space="preserve">Growth Model automático e calculadora de campanha.</w:t>
-      </w:r>
-    </w:p>
-    <w:p>
-      <w:pPr>
-        <w:numPr>
-          <w:ilvl w:val="0"/>
-          <w:numId w:val="1045"/>
-        </w:numPr>
-        <w:pStyle w:val="Compact"/>
-      </w:pPr>
-      <w:r>
-        <w:rPr>
-          <w:bCs/>
-          <w:b/>
-        </w:rPr>
-        <w:t xml:space="preserve">10 a 11/10:</w:t>
-      </w:r>
-    </w:p>
-    <w:p>
-      <w:pPr>
-        <w:numPr>
-          <w:ilvl w:val="1"/>
-          <w:numId w:val="1048"/>
-        </w:numPr>
-        <w:pStyle w:val="Compact"/>
-      </w:pPr>
-      <w:r>
-        <w:t xml:space="preserve">estratégia em blocos e simulador de lucro;</w:t>
-      </w:r>
-    </w:p>
-    <w:p>
-      <w:pPr>
-        <w:numPr>
-          <w:ilvl w:val="1"/>
-          <w:numId w:val="1048"/>
-        </w:numPr>
-        <w:pStyle w:val="Compact"/>
-      </w:pPr>
-      <w:r>
-        <w:t xml:space="preserve">pacotes de acesso, cartões de crédito, Casa;</w:t>
-      </w:r>
-    </w:p>
-    <w:p>
-      <w:pPr>
-        <w:numPr>
-          <w:ilvl w:val="1"/>
-          <w:numId w:val="1048"/>
-        </w:numPr>
-        <w:pStyle w:val="Compact"/>
-      </w:pPr>
-      <w:r>
-        <w:t xml:space="preserve">segurança e confiança do dado: identidade, auditoria, qualidade, dicionário;</w:t>
-      </w:r>
-    </w:p>
-    <w:p>
-      <w:pPr>
-        <w:numPr>
-          <w:ilvl w:val="1"/>
-          <w:numId w:val="1048"/>
-        </w:numPr>
-        <w:pStyle w:val="Compact"/>
-      </w:pPr>
-      <w:r>
-        <w:t xml:space="preserve">captação e atribuição;</w:t>
-      </w:r>
-    </w:p>
-    <w:p>
-      <w:pPr>
-        <w:numPr>
-          <w:ilvl w:val="1"/>
-          <w:numId w:val="1048"/>
-        </w:numPr>
-        <w:pStyle w:val="Compact"/>
-      </w:pPr>
-      <w:r>
-        <w:t xml:space="preserve">projetos com modelos, custos e margens;</w:t>
-      </w:r>
-    </w:p>
-    <w:p>
-      <w:pPr>
-        <w:numPr>
-          <w:ilvl w:val="1"/>
-          <w:numId w:val="1048"/>
-        </w:numPr>
-        <w:pStyle w:val="Compact"/>
-      </w:pPr>
-      <w:r>
-        <w:t xml:space="preserve">“</w:t>
-      </w:r>
-      <w:r>
-        <w:t xml:space="preserve">Growth Now</w:t>
-      </w:r>
-      <w:r>
-        <w:t xml:space="preserve">”</w:t>
-      </w:r>
-      <w:r>
-        <w:t xml:space="preserve">: ofertas, cenários, decisão, guardrails.</w:t>
-      </w:r>
-    </w:p>
-    <w:p>
-      <w:pPr>
-        <w:numPr>
-          <w:ilvl w:val="0"/>
-          <w:numId w:val="1045"/>
-        </w:numPr>
-        <w:pStyle w:val="Compact"/>
-      </w:pPr>
-      <w:r>
-        <w:rPr>
-          <w:bCs/>
-          <w:b/>
-        </w:rPr>
-        <w:t xml:space="preserve">12 a 17/10:</w:t>
-      </w:r>
-    </w:p>
-    <w:p>
-      <w:pPr>
-        <w:numPr>
-          <w:ilvl w:val="1"/>
-          <w:numId w:val="1049"/>
-        </w:numPr>
-        <w:pStyle w:val="Compact"/>
-      </w:pPr>
-      <w:r>
-        <w:t xml:space="preserve">visual azul;</w:t>
-      </w:r>
-    </w:p>
-    <w:p>
-      <w:pPr>
-        <w:numPr>
-          <w:ilvl w:val="1"/>
-          <w:numId w:val="1049"/>
-        </w:numPr>
-        <w:pStyle w:val="Compact"/>
-      </w:pPr>
-      <w:r>
-        <w:t xml:space="preserve">Growth Model em planilha;</w:t>
-      </w:r>
-    </w:p>
-    <w:p>
-      <w:pPr>
-        <w:numPr>
-          <w:ilvl w:val="1"/>
-          <w:numId w:val="1049"/>
-        </w:numPr>
-        <w:pStyle w:val="Compact"/>
-      </w:pPr>
-      <w:r>
-        <w:t xml:space="preserve">Retenção &amp; Expansão (coortes, recompra, RFM);</w:t>
-      </w:r>
-    </w:p>
-    <w:p>
-      <w:pPr>
-        <w:numPr>
-          <w:ilvl w:val="1"/>
-          <w:numId w:val="1049"/>
-        </w:numPr>
-        <w:pStyle w:val="Compact"/>
-      </w:pPr>
-      <w:r>
-        <w:t xml:space="preserve">cenários com ciclo de vida, ideias pelo ChatGPT;</w:t>
-      </w:r>
-    </w:p>
-    <w:p>
-      <w:pPr>
-        <w:numPr>
-          <w:ilvl w:val="1"/>
-          <w:numId w:val="1049"/>
-        </w:numPr>
-        <w:pStyle w:val="Compact"/>
-      </w:pPr>
-      <w:r>
-        <w:t xml:space="preserve">auditoria de consistência e correção;</w:t>
-      </w:r>
-    </w:p>
-    <w:p>
-      <w:pPr>
-        <w:numPr>
-          <w:ilvl w:val="1"/>
-          <w:numId w:val="1049"/>
-        </w:numPr>
-        <w:pStyle w:val="Compact"/>
-      </w:pPr>
-      <w:r>
-        <w:t xml:space="preserve">Escola Aurora; leads por formulário.</w:t>
-      </w:r>
-    </w:p>
-    <w:p>
-      <w:pPr>
-        <w:numPr>
-          <w:ilvl w:val="0"/>
-          <w:numId w:val="1045"/>
-        </w:numPr>
-        <w:pStyle w:val="Compact"/>
-      </w:pPr>
-      <w:r>
-        <w:rPr>
-          <w:bCs/>
-          <w:b/>
-        </w:rPr>
-        <w:t xml:space="preserve">19 a 21/10:</w:t>
-      </w:r>
-    </w:p>
-    <w:p>
-      <w:pPr>
-        <w:numPr>
-          <w:ilvl w:val="1"/>
-          <w:numId w:val="1050"/>
-        </w:numPr>
-        <w:pStyle w:val="Compact"/>
-      </w:pPr>
-      <w:r>
-        <w:t xml:space="preserve">metas de leads; árvore dos números;</w:t>
-      </w:r>
-    </w:p>
-    <w:p>
-      <w:pPr>
-        <w:numPr>
-          <w:ilvl w:val="1"/>
-          <w:numId w:val="1050"/>
-        </w:numPr>
-        <w:pStyle w:val="Compact"/>
-      </w:pPr>
-      <w:r>
-        <w:t xml:space="preserve">comissões e conexões com Meta e Google;</w:t>
-      </w:r>
-    </w:p>
-    <w:p>
-      <w:pPr>
-        <w:numPr>
-          <w:ilvl w:val="1"/>
-          <w:numId w:val="1050"/>
-        </w:numPr>
-        <w:pStyle w:val="Compact"/>
-      </w:pPr>
-      <w:r>
-        <w:t xml:space="preserve">visual com destaque e dashboard em camadas;</w:t>
-      </w:r>
-    </w:p>
-    <w:p>
-      <w:pPr>
-        <w:numPr>
-          <w:ilvl w:val="1"/>
-          <w:numId w:val="1050"/>
-        </w:numPr>
-        <w:pStyle w:val="Compact"/>
-      </w:pPr>
-      <w:r>
-        <w:t xml:space="preserve">gráficos com função (ondas 1 a 3);</w:t>
-      </w:r>
-    </w:p>
-    <w:p>
-      <w:pPr>
-        <w:numPr>
-          <w:ilvl w:val="1"/>
-          <w:numId w:val="1050"/>
-        </w:numPr>
-        <w:pStyle w:val="Compact"/>
-      </w:pPr>
-      <w:r>
-        <w:t xml:space="preserve">painel da campanha dia a dia; qualificação por pontos;</w:t>
-      </w:r>
-    </w:p>
-    <w:p>
-      <w:pPr>
-        <w:numPr>
-          <w:ilvl w:val="1"/>
-          <w:numId w:val="1050"/>
-        </w:numPr>
-        <w:pStyle w:val="Compact"/>
-      </w:pPr>
-      <w:r>
-        <w:t xml:space="preserve">formulário de captação; selo de qualificado.</w:t>
-      </w:r>
-    </w:p>
-    <w:p>
-      <w:pPr>
-        <w:numPr>
-          <w:ilvl w:val="0"/>
-          <w:numId w:val="1045"/>
-        </w:numPr>
-        <w:pStyle w:val="Compact"/>
-      </w:pPr>
-      <w:r>
         <w:rPr>
           <w:bCs/>
           <w:b/>
@@ -6018,7 +6063,7 @@
       <w:pPr>
         <w:numPr>
           <w:ilvl w:val="1"/>
-          <w:numId w:val="1051"/>
+          <w:numId w:val="1052"/>
         </w:numPr>
         <w:pStyle w:val="Compact"/>
       </w:pPr>
@@ -6030,7 +6075,7 @@
       <w:pPr>
         <w:numPr>
           <w:ilvl w:val="1"/>
-          <w:numId w:val="1051"/>
+          <w:numId w:val="1052"/>
         </w:numPr>
         <w:pStyle w:val="Compact"/>
       </w:pPr>
@@ -6042,7 +6087,7 @@
       <w:pPr>
         <w:numPr>
           <w:ilvl w:val="1"/>
-          <w:numId w:val="1051"/>
+          <w:numId w:val="1052"/>
         </w:numPr>
         <w:pStyle w:val="Compact"/>
       </w:pPr>
@@ -6054,7 +6099,7 @@
       <w:pPr>
         <w:numPr>
           <w:ilvl w:val="1"/>
-          <w:numId w:val="1051"/>
+          <w:numId w:val="1052"/>
         </w:numPr>
         <w:pStyle w:val="Compact"/>
       </w:pPr>
@@ -6066,12 +6111,24 @@
       <w:pPr>
         <w:numPr>
           <w:ilvl w:val="1"/>
-          <w:numId w:val="1051"/>
-        </w:numPr>
-        <w:pStyle w:val="Compact"/>
-      </w:pPr>
-      <w:r>
-        <w:t xml:space="preserve">produtos no conteúdo (nome, valor e histórico), com as ideias ligadas a eles, e o bloco Produtos e esteira no questionário.</w:t>
+          <w:numId w:val="1052"/>
+        </w:numPr>
+        <w:pStyle w:val="Compact"/>
+      </w:pPr>
+      <w:r>
+        <w:t xml:space="preserve">produtos no conteúdo (nome, valor e histórico), com as ideias ligadas a eles, e o bloco Produtos e esteira no questionário;</w:t>
+      </w:r>
+    </w:p>
+    <w:p>
+      <w:pPr>
+        <w:numPr>
+          <w:ilvl w:val="1"/>
+          <w:numId w:val="1052"/>
+        </w:numPr>
+        <w:pStyle w:val="Compact"/>
+      </w:pPr>
+      <w:r>
+        <w:t xml:space="preserve">pesquisa com um botão (pastas, call, produtos, canais e web) e o dossiê em seções.</w:t>
       </w:r>
     </w:p>
     <w:bookmarkEnd w:id="50"/>
@@ -6551,6 +6608,9 @@
     <w:abstractNumId w:val="991"/>
   </w:num>
   <w:num w:numId="1051">
+    <w:abstractNumId w:val="991"/>
+  </w:num>
+  <w:num w:numId="1052">
     <w:abstractNumId w:val="991"/>
   </w:num>
 </w:numbering>

</xml_diff>

<commit_message>
Apps Script v4: pastas da Mathisa primeiro, cota por pasta, fontes e .zip pulados, Word/Excel/PowerPoint convertidos, função autorizar
Co-Authored-By: Claude Opus 5.5 <noreply@anthropic.com>
Claude-Session: https://claude.ai/code/session_01KZYD1VyufGDrBDPUSE7fwE
</commit_message>
<xml_diff>
--- a/docs/Growths-o-sistema.docx
+++ b/docs/Growths-o-sistema.docx
@@ -2010,6 +2010,18 @@
       </w:pPr>
       <w:r>
         <w:t xml:space="preserve">a lista do que foi lido e do que não foi lido (por exemplo, vídeo sem transcrição), com o motivo.</w:t>
+      </w:r>
+    </w:p>
+    <w:p>
+      <w:pPr>
+        <w:numPr>
+          <w:ilvl w:val="0"/>
+          <w:numId w:val="1000"/>
+        </w:numPr>
+        <w:pStyle w:val="Compact"/>
+      </w:pPr>
+      <w:r>
+        <w:t xml:space="preserve">Como a leitura funciona: as pastas da Mathisa são lidas primeiro, e cada pasta tem a sua própria cota de arquivos e de texto, para que uma pasta grande do cliente não tome o lugar dos padrões. Documentos, planilhas e apresentações do Google, Word, Excel e PowerPoint (convertidos na hora) e PDFs entram; fontes, arquivos compactados e e-books são pulados sem gastar a cota.</w:t>
       </w:r>
     </w:p>
     <w:p>

</xml_diff>

<commit_message>
v0.152 a v0.156 — Data Storytelling: camada semântica de cores e números, piloto no Dashboard, cores pelo significado em todas as telas, gráficos, contexto por módulo, alertas em quatro categorias e dicionário com direção e referência (banco aplicado em produção)
Co-Authored-By: Claude Opus 5.5 <noreply@anthropic.com>
Claude-Session: https://claude.ai/code/session_01KZYD1VyufGDrBDPUSE7fwE
</commit_message>
<xml_diff>
--- a/docs/Growths-o-sistema.docx
+++ b/docs/Growths-o-sistema.docx
@@ -42,7 +42,7 @@
         <w:t xml:space="preserve"> </w:t>
       </w:r>
       <w:r>
-        <w:t xml:space="preserve">25/10/2026, versão 0.151.</w:t>
+        <w:t xml:space="preserve">26/10/2026, versão 0.156.</w:t>
       </w:r>
     </w:p>
     <w:p>
@@ -707,7 +707,40 @@
         <w:t xml:space="preserve"> </w:t>
       </w:r>
       <w:r>
-        <w:t xml:space="preserve">Até 4 avisos do que mudou contra o período anterior, cada um separado em fato, conta, hipótese e onde investigar.</w:t>
+        <w:t xml:space="preserve">Até 4 avisos do que mudou contra o período anterior, cada um com a categoria (favorável, desfavorável ou atenção) e separado em fato, conta, referência, hipótese e onde investigar. Quando o período é um mês inteiro, a comparação é com o mês anterior inteiro: assim uma despesa lançada no dia 1 não some da conta e não cria uma queda de margem que não existiu.</w:t>
+      </w:r>
+    </w:p>
+    <w:p>
+      <w:pPr>
+        <w:pStyle w:val="BodyText"/>
+      </w:pPr>
+      <w:r>
+        <w:rPr>
+          <w:bCs/>
+          <w:b/>
+        </w:rPr>
+        <w:t xml:space="preserve">Cada número diz contra o quê.</w:t>
+      </w:r>
+      <w:r>
+        <w:t xml:space="preserve"> </w:t>
+      </w:r>
+      <w:r>
+        <w:t xml:space="preserve">O cartão da receita mostra a variação das próprias vendas contra o mês anterior, com o valor de antes. O lucro mostra a diferença em reais (porcentagem sobre um lucro negativo não tem leitura) e fica vermelho quando está negativo. O saldo em banco também. Os cartões pequenos da mesma linha usam a mesma escala (</w:t>
+      </w:r>
+      <w:r>
+        <w:t xml:space="preserve">“</w:t>
+      </w:r>
+      <w:r>
+        <w:t xml:space="preserve">mil</w:t>
+      </w:r>
+      <w:r>
+        <w:t xml:space="preserve">”</w:t>
+      </w:r>
+      <w:r>
+        <w:t xml:space="preserve"> </w:t>
+      </w:r>
+      <w:r>
+        <w:t xml:space="preserve">em todos), com o valor completo ao passar o mouse.</w:t>
       </w:r>
     </w:p>
     <w:bookmarkEnd w:id="23"/>
@@ -4783,7 +4816,7 @@
         <w:t xml:space="preserve"> </w:t>
       </w:r>
       <w:r>
-        <w:t xml:space="preserve">A definição oficial de cada indicador, com o ⓘ nos cartões.</w:t>
+        <w:t xml:space="preserve">A definição oficial de cada indicador, com o ⓘ nos cartões. Para cada número: a unidade, quantas casas, a direção (quanto maior melhor, quanto menor melhor, faixa ou neutra), se o zero é limite e de onde vem a referência que dá a cor.</w:t>
       </w:r>
     </w:p>
     <w:p>
@@ -4947,7 +4980,91 @@
         <w:t xml:space="preserve"> </w:t>
       </w:r>
       <w:r>
-        <w:t xml:space="preserve">Verde no que é bom, vermelho no negativo, uma ação principal por tela.</w:t>
+        <w:t xml:space="preserve">Uma ação principal por tela.</w:t>
+      </w:r>
+    </w:p>
+    <w:p>
+      <w:pPr>
+        <w:numPr>
+          <w:ilvl w:val="0"/>
+          <w:numId w:val="1042"/>
+        </w:numPr>
+        <w:pStyle w:val="Compact"/>
+      </w:pPr>
+      <w:r>
+        <w:rPr>
+          <w:bCs/>
+          <w:b/>
+        </w:rPr>
+        <w:t xml:space="preserve">Cor com significado (Data Storytelling).</w:t>
+      </w:r>
+      <w:r>
+        <w:t xml:space="preserve"> </w:t>
+      </w:r>
+      <w:r>
+        <w:t xml:space="preserve">Quatro cores só para leitura de dados: verde (favorável), vermelho (desfavorável), âmbar (atenção) e azul (informação e comparação). A cor nunca vem sozinha: sempre com seta ou símbolo (▲ ▼ ✓ ✕ ⚠) e uma palavra, porque verde e vermelho se confundem para quem tem daltonismo. Lucro, resultado, margem, ROI e saldo têm o zero como limite: negativo em vermelho, positivo em verde, âmbar quando passa de zero mas não chega na meta ou no cenário cadastrado. As outras métricas só ganham cor quando há meta, limite ou período anterior comparável, e cada uma tem a sua direção: CAC caindo é bom, margem caindo é ruim, investimento subindo é neutro. Variações abaixo de 5% ficam neutras.</w:t>
+      </w:r>
+    </w:p>
+    <w:p>
+      <w:pPr>
+        <w:numPr>
+          <w:ilvl w:val="0"/>
+          <w:numId w:val="1042"/>
+        </w:numPr>
+        <w:pStyle w:val="Compact"/>
+      </w:pPr>
+      <w:r>
+        <w:rPr>
+          <w:bCs/>
+          <w:b/>
+        </w:rPr>
+        <w:t xml:space="preserve">Números num padrão só.</w:t>
+      </w:r>
+      <w:r>
+        <w:t xml:space="preserve"> </w:t>
+      </w:r>
+      <w:r>
+        <w:t xml:space="preserve">Sinal de menos verdadeiro, reais abreviados em cartões e completos em tabelas, pontos percentuais para taxas, ROAS com uma casa (4,5x) e LTV:CAC como razão (3,2:1).</w:t>
+      </w:r>
+      <w:r>
+        <w:t xml:space="preserve"> </w:t>
+      </w:r>
+      <w:r>
+        <w:t xml:space="preserve">“</w:t>
+      </w:r>
+      <w:r>
+        <w:t xml:space="preserve">—</w:t>
+      </w:r>
+      <w:r>
+        <w:t xml:space="preserve">”</w:t>
+      </w:r>
+      <w:r>
+        <w:t xml:space="preserve"> </w:t>
+      </w:r>
+      <w:r>
+        <w:t xml:space="preserve">quer dizer sem dado; zero quer dizer zero.</w:t>
+      </w:r>
+    </w:p>
+    <w:p>
+      <w:pPr>
+        <w:numPr>
+          <w:ilvl w:val="0"/>
+          <w:numId w:val="1042"/>
+        </w:numPr>
+        <w:pStyle w:val="Compact"/>
+      </w:pPr>
+      <w:r>
+        <w:rPr>
+          <w:bCs/>
+          <w:b/>
+        </w:rPr>
+        <w:t xml:space="preserve">Gráficos limpos.</w:t>
+      </w:r>
+      <w:r>
+        <w:t xml:space="preserve"> </w:t>
+      </w:r>
+      <w:r>
+        <w:t xml:space="preserve">Verde e vermelho saem das linhas e barras comuns e ficam para o que é bom ou ruim. Meta, limite e saldo mínimo aparecem como linha tracejada com o valor escrito. Na cascata do resultado, receitas, deduções e despesas ficam neutras e só o resultado ganha cor.</w:t>
       </w:r>
     </w:p>
     <w:p>
@@ -5134,7 +5251,7 @@
         <w:t xml:space="preserve"> </w:t>
       </w:r>
       <w:r>
-        <w:t xml:space="preserve">Mais de 140 versões em 3 semanas (de 05/10 a 25/10/2026), cada uma com registro do que mudou, por quê e como foi testada.</w:t>
+        <w:t xml:space="preserve">Mais de 150 versões em 3 semanas (de 05/10 a 26/10/2026), cada uma com registro do que mudou, por quê e como foi testada.</w:t>
       </w:r>
     </w:p>
     <w:p>
@@ -5590,6 +5707,102 @@
       </w:r>
     </w:p>
     <w:p>
+      <w:pPr>
+        <w:numPr>
+          <w:ilvl w:val="0"/>
+          <w:numId w:val="1045"/>
+        </w:numPr>
+        <w:pStyle w:val="Compact"/>
+      </w:pPr>
+      <w:r>
+        <w:t xml:space="preserve">“</w:t>
+      </w:r>
+      <w:r>
+        <w:t xml:space="preserve">Seu dashboard pinta de verde o que não é bom</w:t>
+      </w:r>
+      <w:r>
+        <w:t xml:space="preserve">”</w:t>
+      </w:r>
+      <w:r>
+        <w:t xml:space="preserve">: a cor tem que seguir a direção da métrica, não o sinal.</w:t>
+      </w:r>
+    </w:p>
+    <w:p>
+      <w:pPr>
+        <w:numPr>
+          <w:ilvl w:val="0"/>
+          <w:numId w:val="1045"/>
+        </w:numPr>
+        <w:pStyle w:val="Compact"/>
+      </w:pPr>
+      <w:r>
+        <w:t xml:space="preserve">CAC caiu 40%: verde. Investimento subiu 40%: nem verde nem vermelho. Por quê.</w:t>
+      </w:r>
+    </w:p>
+    <w:p>
+      <w:pPr>
+        <w:numPr>
+          <w:ilvl w:val="0"/>
+          <w:numId w:val="1045"/>
+        </w:numPr>
+        <w:pStyle w:val="Compact"/>
+      </w:pPr>
+      <w:r>
+        <w:t xml:space="preserve">Ponto percentual não é porcentagem: a margem que cai de 25% para 20% caiu 5 p.p. e 20%.</w:t>
+      </w:r>
+    </w:p>
+    <w:p>
+      <w:pPr>
+        <w:numPr>
+          <w:ilvl w:val="0"/>
+          <w:numId w:val="1045"/>
+        </w:numPr>
+        <w:pStyle w:val="Compact"/>
+      </w:pPr>
+      <w:r>
+        <w:t xml:space="preserve">O dia 1 que sumiu da conta: como uma janela de comparação mal escolhida inventa uma queda de margem.</w:t>
+      </w:r>
+    </w:p>
+    <w:p>
+      <w:pPr>
+        <w:numPr>
+          <w:ilvl w:val="0"/>
+          <w:numId w:val="1045"/>
+        </w:numPr>
+        <w:pStyle w:val="Compact"/>
+      </w:pPr>
+      <w:r>
+        <w:t xml:space="preserve">Lucro negativo não cai</w:t>
+      </w:r>
+      <w:r>
+        <w:t xml:space="preserve"> </w:t>
+      </w:r>
+      <w:r>
+        <w:t xml:space="preserve">“</w:t>
+      </w:r>
+      <w:r>
+        <w:t xml:space="preserve">242%</w:t>
+      </w:r>
+      <w:r>
+        <w:t xml:space="preserve">”</w:t>
+      </w:r>
+      <w:r>
+        <w:t xml:space="preserve">: quando falar em reais e não em porcentagem.</w:t>
+      </w:r>
+    </w:p>
+    <w:p>
+      <w:pPr>
+        <w:numPr>
+          <w:ilvl w:val="0"/>
+          <w:numId w:val="1045"/>
+        </w:numPr>
+        <w:pStyle w:val="Compact"/>
+      </w:pPr>
+      <w:r>
+        <w:t xml:space="preserve">Cor nunca sozinha: dashboards que funcionam para quem tem daltonismo.</w:t>
+      </w:r>
+    </w:p>
+    <w:p>
       <w:r>
         <w:pict>
           <v:rect style="width:0;height:1.5pt" o:hralign="center" o:hrstd="t" o:hr="t"/>
@@ -6141,6 +6354,34 @@
       </w:pPr>
       <w:r>
         <w:t xml:space="preserve">pesquisa com um botão (pastas, call, produtos, canais e web) e o dossiê em seções.</w:t>
+      </w:r>
+    </w:p>
+    <w:p>
+      <w:pPr>
+        <w:numPr>
+          <w:ilvl w:val="0"/>
+          <w:numId w:val="1046"/>
+        </w:numPr>
+        <w:pStyle w:val="Compact"/>
+      </w:pPr>
+      <w:r>
+        <w:rPr>
+          <w:bCs/>
+          <w:b/>
+        </w:rPr>
+        <w:t xml:space="preserve">26/10:</w:t>
+      </w:r>
+    </w:p>
+    <w:p>
+      <w:pPr>
+        <w:numPr>
+          <w:ilvl w:val="1"/>
+          <w:numId w:val="1053"/>
+        </w:numPr>
+        <w:pStyle w:val="Compact"/>
+      </w:pPr>
+      <w:r>
+        <w:t xml:space="preserve">auditoria de Data Storytelling e a camada de leitura dos dados em todo o sistema: cores com significado, zero como limite dos saldos, números padronizados, comparações com a base escrita, gráficos sem cor pelo sinal, frases que contam o que aconteceu, alertas em quatro categorias e o dicionário com direção e referência.</w:t>
       </w:r>
     </w:p>
     <w:bookmarkEnd w:id="50"/>
@@ -6623,6 +6864,9 @@
     <w:abstractNumId w:val="991"/>
   </w:num>
   <w:num w:numId="1052">
+    <w:abstractNumId w:val="991"/>
+  </w:num>
+  <w:num w:numId="1053">
     <w:abstractNumId w:val="991"/>
   </w:num>
 </w:numbering>

</xml_diff>

<commit_message>
v0.157 — Banco de narrativas: frases de análise na tabela narrativa_modelos (código, versão, aprovação, histórico) e piloto no Dashboard financeiro (cascata com sobraram/faltaram, ponte do resultado, caixa e saldo mínimo juntos); migração ainda não aplicada em produção
Co-Authored-By: Claude Opus 5.5 <noreply@anthropic.com>
Claude-Session: https://claude.ai/code/session_01KZYD1VyufGDrBDPUSE7fwE
</commit_message>
<xml_diff>
--- a/docs/Growths-o-sistema.docx
+++ b/docs/Growths-o-sistema.docx
@@ -42,7 +42,7 @@
         <w:t xml:space="preserve"> </w:t>
       </w:r>
       <w:r>
-        <w:t xml:space="preserve">26/10/2026, versão 0.156.</w:t>
+        <w:t xml:space="preserve">26/10/2026, versão 0.157.</w:t>
       </w:r>
     </w:p>
     <w:p>
@@ -3987,7 +3987,61 @@
         <w:t xml:space="preserve"> </w:t>
       </w:r>
       <w:r>
-        <w:t xml:space="preserve">Saldo em banco (abre o extrato com saldo linha a linha), a receber e a pagar no período, atraso, projeção, resultado contra caixa e a cascata de como o resultado se formou.</w:t>
+        <w:t xml:space="preserve">Saldo em banco (abre o extrato com saldo linha a linha), a receber e a pagar no período, atraso, projeção, resultado contra caixa e a cascata de como o resultado se formou. A cascata diz</w:t>
+      </w:r>
+      <w:r>
+        <w:t xml:space="preserve"> </w:t>
+      </w:r>
+      <w:r>
+        <w:t xml:space="preserve">“</w:t>
+      </w:r>
+      <w:r>
+        <w:t xml:space="preserve">sobraram</w:t>
+      </w:r>
+      <w:r>
+        <w:t xml:space="preserve">”</w:t>
+      </w:r>
+      <w:r>
+        <w:t xml:space="preserve"> </w:t>
+      </w:r>
+      <w:r>
+        <w:t xml:space="preserve">ou</w:t>
+      </w:r>
+      <w:r>
+        <w:t xml:space="preserve"> </w:t>
+      </w:r>
+      <w:r>
+        <w:t xml:space="preserve">“</w:t>
+      </w:r>
+      <w:r>
+        <w:t xml:space="preserve">faltaram</w:t>
+      </w:r>
+      <w:r>
+        <w:t xml:space="preserve">”</w:t>
+      </w:r>
+      <w:r>
+        <w:t xml:space="preserve"> </w:t>
+      </w:r>
+      <w:r>
+        <w:t xml:space="preserve">conforme o sinal do resultado. Um gráfico de ponte mostra o que mudou do período anterior para este: parte do resultado anterior, cada barra é quanto a receita ou uma conta mexeu, e chega no resultado atual; ao lado, a conta que mais pesou aparece como</w:t>
+      </w:r>
+      <w:r>
+        <w:t xml:space="preserve"> </w:t>
+      </w:r>
+      <w:r>
+        <w:t xml:space="preserve">“</w:t>
+      </w:r>
+      <w:r>
+        <w:t xml:space="preserve">possível fator associado</w:t>
+      </w:r>
+      <w:r>
+        <w:t xml:space="preserve">”</w:t>
+      </w:r>
+      <w:r>
+        <w:t xml:space="preserve"> </w:t>
+      </w:r>
+      <w:r>
+        <w:t xml:space="preserve">(nunca como causa). Caixa projetado e saldo mínimo ficam num painel só, com o aviso de quando o caixa fura o mínimo (ou o zero, se não houver mínimo).</w:t>
       </w:r>
     </w:p>
     <w:p>
@@ -5080,6 +5134,46 @@
           <w:bCs/>
           <w:b/>
         </w:rPr>
+        <w:t xml:space="preserve">Frases que vêm do banco, não da cabeça da IA.</w:t>
+      </w:r>
+      <w:r>
+        <w:t xml:space="preserve"> </w:t>
+      </w:r>
+      <w:r>
+        <w:t xml:space="preserve">Cada frase de análise é um modelo guardado numa tabela, com código, versão e aprovação. A tela só preenche os números que ela mesma calculou; se faltar um número, a frase não aparece. Mudar o texto cria uma versão nova, que volta para</w:t>
+      </w:r>
+      <w:r>
+        <w:t xml:space="preserve"> </w:t>
+      </w:r>
+      <w:r>
+        <w:t xml:space="preserve">“</w:t>
+      </w:r>
+      <w:r>
+        <w:t xml:space="preserve">proposta</w:t>
+      </w:r>
+      <w:r>
+        <w:t xml:space="preserve">”</w:t>
+      </w:r>
+      <w:r>
+        <w:t xml:space="preserve"> </w:t>
+      </w:r>
+      <w:r>
+        <w:t xml:space="preserve">até ser aprovada, e a antiga fica no histórico. O Dicionário de métricas mostra todas as frases e quais estão aprovadas. O Dashboard financeiro é o primeiro a usar.</w:t>
+      </w:r>
+    </w:p>
+    <w:p>
+      <w:pPr>
+        <w:numPr>
+          <w:ilvl w:val="0"/>
+          <w:numId w:val="1042"/>
+        </w:numPr>
+        <w:pStyle w:val="Compact"/>
+      </w:pPr>
+      <w:r>
+        <w:rPr>
+          <w:bCs/>
+          <w:b/>
+        </w:rPr>
         <w:t xml:space="preserve">Menu em níveis</w:t>
       </w:r>
       <w:r>
@@ -5803,6 +5897,93 @@
       </w:r>
     </w:p>
     <w:p>
+      <w:pPr>
+        <w:numPr>
+          <w:ilvl w:val="0"/>
+          <w:numId w:val="1045"/>
+        </w:numPr>
+        <w:pStyle w:val="Compact"/>
+      </w:pPr>
+      <w:r>
+        <w:t xml:space="preserve">“</w:t>
+      </w:r>
+      <w:r>
+        <w:t xml:space="preserve">A IA não escreve seus números</w:t>
+      </w:r>
+      <w:r>
+        <w:t xml:space="preserve">”</w:t>
+      </w:r>
+      <w:r>
+        <w:t xml:space="preserve">: frases de análise com modelo aprovado, e só número calculado entra nelas.</w:t>
+      </w:r>
+    </w:p>
+    <w:p>
+      <w:pPr>
+        <w:numPr>
+          <w:ilvl w:val="0"/>
+          <w:numId w:val="1045"/>
+        </w:numPr>
+        <w:pStyle w:val="Compact"/>
+      </w:pPr>
+      <w:r>
+        <w:t xml:space="preserve">Sobrou ou faltou? Quando a frase do relatório contradiz o próprio número.</w:t>
+      </w:r>
+    </w:p>
+    <w:p>
+      <w:pPr>
+        <w:numPr>
+          <w:ilvl w:val="0"/>
+          <w:numId w:val="1045"/>
+        </w:numPr>
+        <w:pStyle w:val="Compact"/>
+      </w:pPr>
+      <w:r>
+        <w:t xml:space="preserve">A ponte do resultado: o gráfico que responde</w:t>
+      </w:r>
+      <w:r>
+        <w:t xml:space="preserve"> </w:t>
+      </w:r>
+      <w:r>
+        <w:t xml:space="preserve">“</w:t>
+      </w:r>
+      <w:r>
+        <w:t xml:space="preserve">por que meu lucro piorou</w:t>
+      </w:r>
+      <w:r>
+        <w:t xml:space="preserve">”</w:t>
+      </w:r>
+      <w:r>
+        <w:t xml:space="preserve"> </w:t>
+      </w:r>
+      <w:r>
+        <w:t xml:space="preserve">em uma olhada.</w:t>
+      </w:r>
+    </w:p>
+    <w:p>
+      <w:pPr>
+        <w:numPr>
+          <w:ilvl w:val="0"/>
+          <w:numId w:val="1045"/>
+        </w:numPr>
+        <w:pStyle w:val="Compact"/>
+      </w:pPr>
+      <w:r>
+        <w:t xml:space="preserve">Possível fator não é causa: como um dashboard deve falar de hipótese.</w:t>
+      </w:r>
+    </w:p>
+    <w:p>
+      <w:pPr>
+        <w:numPr>
+          <w:ilvl w:val="0"/>
+          <w:numId w:val="1045"/>
+        </w:numPr>
+        <w:pStyle w:val="Compact"/>
+      </w:pPr>
+      <w:r>
+        <w:t xml:space="preserve">Versão e aprovação para frases: governança de texto num sistema de dados.</w:t>
+      </w:r>
+    </w:p>
+    <w:p>
       <w:r>
         <w:pict>
           <v:rect style="width:0;height:1.5pt" o:hralign="center" o:hrstd="t" o:hr="t"/>
@@ -6382,6 +6563,18 @@
       </w:pPr>
       <w:r>
         <w:t xml:space="preserve">auditoria de Data Storytelling e a camada de leitura dos dados em todo o sistema: cores com significado, zero como limite dos saldos, números padronizados, comparações com a base escrita, gráficos sem cor pelo sinal, frases que contam o que aconteceu, alertas em quatro categorias e o dicionário com direção e referência.</w:t>
+      </w:r>
+    </w:p>
+    <w:p>
+      <w:pPr>
+        <w:numPr>
+          <w:ilvl w:val="1"/>
+          <w:numId w:val="1053"/>
+        </w:numPr>
+        <w:pStyle w:val="Compact"/>
+      </w:pPr>
+      <w:r>
+        <w:t xml:space="preserve">biblioteca de visualizações, banco de narrativas e auditoria das telas; as frases de análise passam a morar numa tabela no banco, com versão e aprovação, começando pelo Dashboard financeiro (frase da cascata corrigida, ponte do resultado, caixa e saldo mínimo juntos).</w:t>
       </w:r>
     </w:p>
     <w:bookmarkEnd w:id="50"/>

</xml_diff>

<commit_message>
v0.158 — Telas em grade: Dashboard e Dashboard financeiro em blocos lado a lado, gráficos desenhados no tamanho do bloco, uma coluna no celular (backup antes em backup-v0.157 e backup-v0.156)
Co-Authored-By: Claude Opus 5.5 <noreply@anthropic.com>
Claude-Session: https://claude.ai/code/session_01KZYD1VyufGDrBDPUSE7fwE
</commit_message>
<xml_diff>
--- a/docs/Growths-o-sistema.docx
+++ b/docs/Growths-o-sistema.docx
@@ -42,7 +42,7 @@
         <w:t xml:space="preserve"> </w:t>
       </w:r>
       <w:r>
-        <w:t xml:space="preserve">26/10/2026, versão 0.157.</w:t>
+        <w:t xml:space="preserve">26/10/2026, versão 0.158.</w:t>
       </w:r>
     </w:p>
     <w:p>
@@ -5174,6 +5174,28 @@
           <w:bCs/>
           <w:b/>
         </w:rPr>
+        <w:t xml:space="preserve">Painéis em blocos.</w:t>
+      </w:r>
+      <w:r>
+        <w:t xml:space="preserve"> </w:t>
+      </w:r>
+      <w:r>
+        <w:t xml:space="preserve">O Dashboard e o Dashboard financeiro são divididos em blocos lado a lado, como um painel de BI, para nenhum gráfico tomar a tela inteira. O gráfico mais importante fica maior e os de apoio ficam ao lado; cada gráfico é desenhado no tamanho do seu bloco, para a letra continuar legível, e no celular tudo vira uma coluna.</w:t>
+      </w:r>
+    </w:p>
+    <w:p>
+      <w:pPr>
+        <w:numPr>
+          <w:ilvl w:val="0"/>
+          <w:numId w:val="1042"/>
+        </w:numPr>
+        <w:pStyle w:val="Compact"/>
+      </w:pPr>
+      <w:r>
+        <w:rPr>
+          <w:bCs/>
+          <w:b/>
+        </w:rPr>
         <w:t xml:space="preserve">Menu em níveis</w:t>
       </w:r>
       <w:r>
@@ -5984,6 +6006,30 @@
       </w:r>
     </w:p>
     <w:p>
+      <w:pPr>
+        <w:numPr>
+          <w:ilvl w:val="0"/>
+          <w:numId w:val="1045"/>
+        </w:numPr>
+        <w:pStyle w:val="Compact"/>
+      </w:pPr>
+      <w:r>
+        <w:t xml:space="preserve">Um gráfico por tela é desperdício: como montar um painel em blocos que se lê em um minuto.</w:t>
+      </w:r>
+    </w:p>
+    <w:p>
+      <w:pPr>
+        <w:numPr>
+          <w:ilvl w:val="0"/>
+          <w:numId w:val="1045"/>
+        </w:numPr>
+        <w:pStyle w:val="Compact"/>
+      </w:pPr>
+      <w:r>
+        <w:t xml:space="preserve">O backup antes da mudança: por que toda versão do Growths tem caminho de volta.</w:t>
+      </w:r>
+    </w:p>
+    <w:p>
       <w:r>
         <w:pict>
           <v:rect style="width:0;height:1.5pt" o:hralign="center" o:hrstd="t" o:hr="t"/>
@@ -6575,6 +6621,18 @@
       </w:pPr>
       <w:r>
         <w:t xml:space="preserve">biblioteca de visualizações, banco de narrativas e auditoria das telas; as frases de análise passam a morar numa tabela no banco, com versão e aprovação, começando pelo Dashboard financeiro (frase da cascata corrigida, ponte do resultado, caixa e saldo mínimo juntos).</w:t>
+      </w:r>
+    </w:p>
+    <w:p>
+      <w:pPr>
+        <w:numPr>
+          <w:ilvl w:val="1"/>
+          <w:numId w:val="1053"/>
+        </w:numPr>
+        <w:pStyle w:val="Compact"/>
+      </w:pPr>
+      <w:r>
+        <w:t xml:space="preserve">Dashboard e Dashboard financeiro em blocos lado a lado (grade de painel de BI), com backup da versão anterior.</w:t>
       </w:r>
     </w:p>
     <w:bookmarkEnd w:id="50"/>

</xml_diff>

<commit_message>
v0.160 — Produção volta ao Kanban com calendário (aprovação em cada cartão); Linha editorial com subtemas e conteúdos por segmento; ideia aprovada com tema, subtema, formato e data (SQL ainda não aplicado em produção)
Co-Authored-By: Claude Opus 5.5 <noreply@anthropic.com>
Claude-Session: https://claude.ai/code/session_01KZYD1VyufGDrBDPUSE7fwE
</commit_message>
<xml_diff>
--- a/docs/Growths-o-sistema.docx
+++ b/docs/Growths-o-sistema.docx
@@ -42,7 +42,7 @@
         <w:t xml:space="preserve"> </w:t>
       </w:r>
       <w:r>
-        <w:t xml:space="preserve">26/10/2026, versão 0.159.</w:t>
+        <w:t xml:space="preserve">26/10/2026, versão 0.160.</w:t>
       </w:r>
     </w:p>
     <w:p>
@@ -1613,13 +1613,13 @@
         <w:t xml:space="preserve">.</w:t>
       </w:r>
     </w:p>
-    <w:bookmarkStart w:id="34" w:name="o-módulo-em-cinco-abas-desde-a-v0.159"/>
+    <w:bookmarkStart w:id="34" w:name="X5c078783c0eed007d568ca6280478fd0ccacf28"/>
     <w:p>
       <w:pPr>
         <w:pStyle w:val="Heading3"/>
       </w:pPr>
       <w:r>
-        <w:t xml:space="preserve">4.0 O módulo em cinco abas (desde a v0.159)</w:t>
+        <w:t xml:space="preserve">4.0 O módulo em seis abas (desde a v0.159, ajustado na v0.160)</w:t>
       </w:r>
     </w:p>
     <w:p>
@@ -1665,6 +1665,28 @@
           <w:bCs/>
           <w:b/>
         </w:rPr>
+        <w:t xml:space="preserve">Linha editorial:</w:t>
+      </w:r>
+      <w:r>
+        <w:t xml:space="preserve"> </w:t>
+      </w:r>
+      <w:r>
+        <w:t xml:space="preserve">as linhas (territórios), os temas (frentes), os subtemas opcionais e os formatos. Todo conteúdo nasce com essa segmentação, e uma tabela mostra quantos conteúdos há em cada linha, tema, subtema e formato, de ideia a publicado.</w:t>
+      </w:r>
+    </w:p>
+    <w:p>
+      <w:pPr>
+        <w:numPr>
+          <w:ilvl w:val="0"/>
+          <w:numId w:val="1014"/>
+        </w:numPr>
+        <w:pStyle w:val="Compact"/>
+      </w:pPr>
+      <w:r>
+        <w:rPr>
+          <w:bCs/>
+          <w:b/>
+        </w:rPr>
         <w:t xml:space="preserve">Identidade visual:</w:t>
       </w:r>
       <w:r>
@@ -1693,7 +1715,7 @@
         <w:t xml:space="preserve"> </w:t>
       </w:r>
       <w:r>
-        <w:t xml:space="preserve">aprovar ou descartar.</w:t>
+        <w:t xml:space="preserve">aprovar ou descartar. Aprovar pede o tema, o subtema, o formato e a data de publicação, e a ideia entra no calendário.</w:t>
       </w:r>
     </w:p>
     <w:p>
@@ -1715,7 +1737,7 @@
         <w:t xml:space="preserve"> </w:t>
       </w:r>
       <w:r>
-        <w:t xml:space="preserve">cada peça passa por Roteiro, Peça, Aprovada e Agendada. O roteiro é aprovado antes de qualquer arte ou vídeo; a arte ou o vídeo tem versões e pedidos de ajuste; a aprovada vai para o calendário.</w:t>
+        <w:t xml:space="preserve">o Kanban com o painel da semana, o calendário das próximas semanas e as colunas por etapa. Cada cartão diz se o roteiro ou a peça falta aprovar; o botão Roteiro e peça abre a aprovação: o roteiro é aprovado antes de qualquer arte ou vídeo, a arte ou o vídeo tem versões e pedidos de ajuste, e a aprovada vai para a data.</w:t>
       </w:r>
     </w:p>
     <w:p>
@@ -1737,7 +1759,7 @@
         <w:t xml:space="preserve"> </w:t>
       </w:r>
       <w:r>
-        <w:t xml:space="preserve">as abas de antes (dashboard, quadro completo, priorização, máquina, semana, fechamento, persona, produtos, linha editorial, estruturas, canais).</w:t>
+        <w:t xml:space="preserve">as outras abas de antes (dashboard, semana, priorização, máquina, fechamento, persona, produtos, estruturas, canais).</w:t>
       </w:r>
     </w:p>
     <w:p>
@@ -6198,6 +6220,30 @@
         <w:pStyle w:val="Compact"/>
       </w:pPr>
       <w:r>
+        <w:t xml:space="preserve">Linha, tema e subtema: segmentar o conteúdo no nascimento para o relatório fazer sentido depois.</w:t>
+      </w:r>
+    </w:p>
+    <w:p>
+      <w:pPr>
+        <w:numPr>
+          <w:ilvl w:val="0"/>
+          <w:numId w:val="1046"/>
+        </w:numPr>
+        <w:pStyle w:val="Compact"/>
+      </w:pPr>
+      <w:r>
+        <w:t xml:space="preserve">Aprovação sem perder o calendário: o Kanban que mostra o que falta aprovar e quando publica.</w:t>
+      </w:r>
+    </w:p>
+    <w:p>
+      <w:pPr>
+        <w:numPr>
+          <w:ilvl w:val="0"/>
+          <w:numId w:val="1046"/>
+        </w:numPr>
+        <w:pStyle w:val="Compact"/>
+      </w:pPr>
+      <w:r>
         <w:t xml:space="preserve">O backup antes da mudança: por que toda versão do Growths tem caminho de volta.</w:t>
       </w:r>
     </w:p>
@@ -6817,6 +6863,18 @@
       </w:pPr>
       <w:r>
         <w:t xml:space="preserve">Growth’s Content em cinco abas: base do cliente com dossiê e ficha aprovada, identidade visual, ideias, produção com roteiro, versões e aprovação; as ferramentas de antes em Mais ferramentas.</w:t>
+      </w:r>
+    </w:p>
+    <w:p>
+      <w:pPr>
+        <w:numPr>
+          <w:ilvl w:val="1"/>
+          <w:numId w:val="1054"/>
+        </w:numPr>
+        <w:pStyle w:val="Compact"/>
+      </w:pPr>
+      <w:r>
+        <w:t xml:space="preserve">Produção de volta ao Kanban com calendário, com a aprovação dentro de cada cartão; linha editorial com subtemas na configuração; ideia aprovada já com tema e data.</w:t>
       </w:r>
     </w:p>
     <w:bookmarkEnd w:id="51"/>

</xml_diff>

<commit_message>
v0.161 — Pesquisas: modelo Must-have de consultoria de desenvolvimento de produto (25 perguntas em 6 passos) e leitura do must-have em três faixas, sem contar Não se aplica
Co-Authored-By: Claude Opus 5.5 <noreply@anthropic.com>
Claude-Session: https://claude.ai/code/session_01KZYD1VyufGDrBDPUSE7fwE
</commit_message>
<xml_diff>
--- a/docs/Growths-o-sistema.docx
+++ b/docs/Growths-o-sistema.docx
@@ -42,7 +42,7 @@
         <w:t xml:space="preserve"> </w:t>
       </w:r>
       <w:r>
-        <w:t xml:space="preserve">26/10/2026, versão 0.160.</w:t>
+        <w:t xml:space="preserve">26/10/2026, versão 0.161.</w:t>
       </w:r>
     </w:p>
     <w:p>
@@ -4681,7 +4681,23 @@
         <w:pStyle w:val="Compact"/>
       </w:pPr>
       <w:r>
-        <w:t xml:space="preserve">construtor de perguntas, com modelos de lead, onboarding, jornada e descoberta da North Star;</w:t>
+        <w:t xml:space="preserve">construtor de perguntas, com modelos de lead, onboarding, jornada, descoberta da North Star e</w:t>
+      </w:r>
+      <w:r>
+        <w:t xml:space="preserve"> </w:t>
+      </w:r>
+      <w:r>
+        <w:rPr>
+          <w:bCs/>
+          <w:b/>
+        </w:rPr>
+        <w:t xml:space="preserve">must-have de consultoria</w:t>
+      </w:r>
+      <w:r>
+        <w:t xml:space="preserve"> </w:t>
+      </w:r>
+      <w:r>
+        <w:t xml:space="preserve">(o cliente diz quão desapontado ficaria sem a consultoria, o que faria no lugar, quanto valeu cada entrega e o que travou a execução);</w:t>
       </w:r>
     </w:p>
     <w:p>
@@ -4705,7 +4721,22 @@
         <w:pStyle w:val="Compact"/>
       </w:pPr>
       <w:r>
-        <w:t xml:space="preserve">NPS, PMF e insights;</w:t>
+        <w:t xml:space="preserve">NPS, PMF e insights; o must-have aparece em três faixas (40% ou mais, 25% a 40%, menos de 25%) com o próximo passo, sem contar quem marcou</w:t>
+      </w:r>
+      <w:r>
+        <w:t xml:space="preserve"> </w:t>
+      </w:r>
+      <w:r>
+        <w:t xml:space="preserve">“</w:t>
+      </w:r>
+      <w:r>
+        <w:t xml:space="preserve">Não se aplica</w:t>
+      </w:r>
+      <w:r>
+        <w:t xml:space="preserve">”</w:t>
+      </w:r>
+      <w:r>
+        <w:t xml:space="preserve">;</w:t>
       </w:r>
     </w:p>
     <w:p>
@@ -6244,6 +6275,39 @@
         <w:pStyle w:val="Compact"/>
       </w:pPr>
       <w:r>
+        <w:t xml:space="preserve">Sua consultoria é must-have? A pergunta do desapontamento aplicada a um serviço.</w:t>
+      </w:r>
+    </w:p>
+    <w:p>
+      <w:pPr>
+        <w:numPr>
+          <w:ilvl w:val="0"/>
+          <w:numId w:val="1046"/>
+        </w:numPr>
+        <w:pStyle w:val="Compact"/>
+      </w:pPr>
+      <w:r>
+        <w:t xml:space="preserve">“</w:t>
+      </w:r>
+      <w:r>
+        <w:t xml:space="preserve">O que você teria feito no lugar?</w:t>
+      </w:r>
+      <w:r>
+        <w:t xml:space="preserve">”</w:t>
+      </w:r>
+      <w:r>
+        <w:t xml:space="preserve">: descobrir o concorrente real de uma consultoria.</w:t>
+      </w:r>
+    </w:p>
+    <w:p>
+      <w:pPr>
+        <w:numPr>
+          <w:ilvl w:val="0"/>
+          <w:numId w:val="1046"/>
+        </w:numPr>
+        <w:pStyle w:val="Compact"/>
+      </w:pPr>
+      <w:r>
         <w:t xml:space="preserve">O backup antes da mudança: por que toda versão do Growths tem caminho de volta.</w:t>
       </w:r>
     </w:p>
@@ -6875,6 +6939,18 @@
       </w:pPr>
       <w:r>
         <w:t xml:space="preserve">Produção de volta ao Kanban com calendário, com a aprovação dentro de cada cartão; linha editorial com subtemas na configuração; ideia aprovada já com tema e data.</w:t>
+      </w:r>
+    </w:p>
+    <w:p>
+      <w:pPr>
+        <w:numPr>
+          <w:ilvl w:val="1"/>
+          <w:numId w:val="1054"/>
+        </w:numPr>
+        <w:pStyle w:val="Compact"/>
+      </w:pPr>
+      <w:r>
+        <w:t xml:space="preserve">modelo de pesquisa must-have para consultoria, com a leitura em três faixas nos resultados.</w:t>
       </w:r>
     </w:p>
     <w:bookmarkEnd w:id="51"/>

</xml_diff>

<commit_message>
v0.164 — Cockpit na entrada: um painel por área (Geral, Marketing, Vendas, Financeiro, Clientes), cada um abrindo o dashboard do módulo
Co-Authored-By: Claude Opus 5.5 <noreply@anthropic.com>
</commit_message>
<xml_diff>
--- a/docs/Growths-o-sistema.docx
+++ b/docs/Growths-o-sistema.docx
@@ -30,7 +30,7 @@
         <w:t>Última atualização:</w:t>
       </w:r>
       <w:r>
-        <w:t xml:space="preserve"> 29/10/2026, versão 0.163.</w:t>
+        <w:t xml:space="preserve"> 29/10/2026, versão 0.164.</w:t>
       </w:r>
     </w:p>
     <w:p>
@@ -483,6 +483,22 @@
         <w:pStyle w:val="Heading3"/>
       </w:pPr>
       <w:r>
+        <w:t>Cockpit</w:t>
+      </w:r>
+    </w:p>
+    <w:p>
+      <w:pPr>
+        <w:pStyle w:val="FirstParagraph"/>
+      </w:pPr>
+      <w:r>
+        <w:t>A tela inicial. Um painel pequeno por área (Geral, Marketing, Vendas, Financeiro e Clientes), cada um com os números que mais importam no período: caixa, receita, margem e lucro; campanhas e leads; vendas, ticket e conversão; a receber, a pagar e MRR; alunos ativos, alertas e satisfação. Clicar num painel abre o dashboard daquela área, com tudo em detalhe. Cada pessoa só vê os painéis das áreas a que tem acesso.</w:t>
+      </w:r>
+    </w:p>
+    <w:p>
+      <w:pPr>
+        <w:pStyle w:val="Heading3"/>
+      </w:pPr>
+      <w:r>
         <w:t>Dashboard geral</w:t>
       </w:r>
     </w:p>
@@ -491,7 +507,7 @@
         <w:pStyle w:val="FirstParagraph"/>
       </w:pPr>
       <w:r>
-        <w:t>A tela inicial. Mostra o negócio inteiro num período escolhido:</w:t>
+        <w:t>O detalhe do painel Geral do Cockpit. Mostra o negócio inteiro num período escolhido:</w:t>
       </w:r>
     </w:p>
     <w:p>
@@ -5094,6 +5110,24 @@
       </w:pPr>
       <w:r>
         <w:t>14. Histórico resumido</w:t>
+      </w:r>
+    </w:p>
+    <w:p>
+      <w:pPr>
+        <w:pStyle w:val="Compact"/>
+        <w:numPr>
+          <w:ilvl w:val="0"/>
+          <w:numId w:val="1001"/>
+        </w:numPr>
+      </w:pPr>
+      <w:r>
+        <w:rPr>
+          <w:b/>
+        </w:rPr>
+        <w:t>29/10 (v0.164):</w:t>
+      </w:r>
+      <w:r>
+        <w:t xml:space="preserve"> Cockpit na entrada: um painel por área (Geral, Marketing, Vendas, Financeiro e Clientes), cada um abrindo o dashboard do módulo.</w:t>
       </w:r>
     </w:p>
     <w:p>

</xml_diff>

<commit_message>
v0.165: Strategy Canvas S1 a S3 na tela
Marketing → Estratégias (Canvas): biblioteca com categoria, versão, situação e filtros;
estratégia em Mapa (mover blocos, ligar com sim/não/divisão, propriedades, componentes) e Lista;
Publicar versão e Versões; campanhas mostram a versão que usam. Duplicar leva o mapa.
Migração ganha a tela mkt-estrategias em acesso_telas. Teste t165_strategy_canvas.py.

Co-Authored-By: Claude Opus 5.5 <noreply@anthropic.com>
</commit_message>
<xml_diff>
--- a/docs/Growths-o-sistema.docx
+++ b/docs/Growths-o-sistema.docx
@@ -30,7 +30,7 @@
         <w:t>Última atualização:</w:t>
       </w:r>
       <w:r>
-        <w:t xml:space="preserve"> 29/10/2026, versão 0.164.</w:t>
+        <w:t xml:space="preserve"> 29/10/2026, versão 0.165.</w:t>
       </w:r>
     </w:p>
     <w:p>
@@ -919,6 +919,24 @@
         <w:rPr>
           <w:b/>
         </w:rPr>
+        <w:t>Estratégias (Canvas).</w:t>
+      </w:r>
+      <w:r>
+        <w:t xml:space="preserve"> Em Marketing → Estratégias (Canvas), cada estratégia pode ser vista como mapa: blocos arrastáveis, setas com sim, não e divisão em %, e um painel com objetivo, canal, responsável, oferta e métricas de cada bloco. "Publicar versão" congela a estratégia; a campanha guarda a versão que usou, e mudar a estratégia depois não mexe nela.</w:t>
+      </w:r>
+    </w:p>
+    <w:p>
+      <w:pPr>
+        <w:pStyle w:val="Compact"/>
+        <w:numPr>
+          <w:ilvl w:val="0"/>
+          <w:numId w:val="1001"/>
+        </w:numPr>
+      </w:pPr>
+      <w:r>
+        <w:rPr>
+          <w:b/>
+        </w:rPr>
         <w:t>Campanha híbrida, só paga ou só orgânica.</w:t>
       </w:r>
       <w:r>
@@ -5110,6 +5128,24 @@
       </w:pPr>
       <w:r>
         <w:t>14. Histórico resumido</w:t>
+      </w:r>
+    </w:p>
+    <w:p>
+      <w:pPr>
+        <w:pStyle w:val="Compact"/>
+        <w:numPr>
+          <w:ilvl w:val="0"/>
+          <w:numId w:val="1001"/>
+        </w:numPr>
+      </w:pPr>
+      <w:r>
+        <w:rPr>
+          <w:b/>
+        </w:rPr>
+        <w:t>29/10 (v0.165):</w:t>
+      </w:r>
+      <w:r>
+        <w:t xml:space="preserve"> Strategy Canvas: biblioteca de estratégias no Marketing, mapa visual com ligações e ramificações, e versões que cada campanha guarda.</w:t>
       </w:r>
     </w:p>
     <w:p>

</xml_diff>

<commit_message>
v0.166: desenhos nos blocos do Strategy Canvas
Cada bloco do mapa mostra o que é: mini página (captura, vendas, obrigado, checkout) com foto,
título, botão e preço; anúncio com o símbolo da Meta, Google ou YouTube; post do Instagram;
player de VSL e webinar; e-mail; lógica. WhatsApp com o símbolo e a escolha API | Grupo no bloco
(troca as métricas). Foto por link https ou envio (reduzida a 360 px). Teste t166_canvas_desenhos.py.

Co-Authored-By: Claude Opus 5.5 <noreply@anthropic.com>
</commit_message>
<xml_diff>
--- a/docs/Growths-o-sistema.docx
+++ b/docs/Growths-o-sistema.docx
@@ -30,7 +30,7 @@
         <w:t>Última atualização:</w:t>
       </w:r>
       <w:r>
-        <w:t xml:space="preserve"> 29/10/2026, versão 0.165.</w:t>
+        <w:t xml:space="preserve"> 29/10/2026, versão 0.166.</w:t>
       </w:r>
     </w:p>
     <w:p>
@@ -922,7 +922,7 @@
         <w:t>Estratégias (Canvas).</w:t>
       </w:r>
       <w:r>
-        <w:t xml:space="preserve"> Em Marketing → Estratégias (Canvas), cada estratégia pode ser vista como mapa: blocos arrastáveis, setas com sim, não e divisão em %, e um painel com objetivo, canal, responsável, oferta e métricas de cada bloco. "Publicar versão" congela a estratégia; a campanha guarda a versão que usou, e mudar a estratégia depois não mexe nela.</w:t>
+        <w:t xml:space="preserve"> Em Marketing → Estratégias (Canvas), cada estratégia pode ser vista como mapa: blocos arrastáveis, setas com sim, não e divisão em %, e um painel com objetivo, canal, responsável, oferta e métricas de cada bloco. "Publicar versão" congela a estratégia; a campanha guarda a versão que usou, e mudar a estratégia depois não mexe nela. Cada bloco mostra o desenho do que é: a página de captura ou de vendas vira uma mini página com a foto e os textos que você define, o anúncio leva o símbolo da Meta ou do Google, e o WhatsApp tem o símbolo e a escolha entre API e grupo.</w:t>
       </w:r>
     </w:p>
     <w:p>
@@ -5128,6 +5128,24 @@
       </w:pPr>
       <w:r>
         <w:t>14. Histórico resumido</w:t>
+      </w:r>
+    </w:p>
+    <w:p>
+      <w:pPr>
+        <w:pStyle w:val="Compact"/>
+        <w:numPr>
+          <w:ilvl w:val="0"/>
+          <w:numId w:val="1001"/>
+        </w:numPr>
+      </w:pPr>
+      <w:r>
+        <w:rPr>
+          <w:b/>
+        </w:rPr>
+        <w:t>29/10 (v0.166):</w:t>
+      </w:r>
+      <w:r>
+        <w:t xml:space="preserve"> Desenhos nos blocos do Canvas: mini páginas com foto e textos, anúncios com o símbolo da Meta e do Google, WhatsApp com API ou Grupo.</w:t>
       </w:r>
     </w:p>
     <w:p>

</xml_diff>

<commit_message>
v0.167: ajustar os cards do Canvas
Arrastar o card por qualquer ponto (grade de 20 px; Alt solta livre), canto para mudar o
tamanho de cada card (60% a 200%, salvo em props.tam; setas e Ajustar acompanham) e botão
Organizar (colunas por fase, na ordem, sem encostar). O palco não rola mais por dentro.
Teste t167_canvas_ajuste.py.

Co-Authored-By: Claude Opus 5.5 <noreply@anthropic.com>
</commit_message>
<xml_diff>
--- a/docs/Growths-o-sistema.docx
+++ b/docs/Growths-o-sistema.docx
@@ -30,7 +30,7 @@
         <w:t>Última atualização:</w:t>
       </w:r>
       <w:r>
-        <w:t xml:space="preserve"> 29/10/2026, versão 0.166.</w:t>
+        <w:t xml:space="preserve"> 29/10/2026, versão 0.167.</w:t>
       </w:r>
     </w:p>
     <w:p>
@@ -922,7 +922,7 @@
         <w:t>Estratégias (Canvas).</w:t>
       </w:r>
       <w:r>
-        <w:t xml:space="preserve"> Em Marketing → Estratégias (Canvas), cada estratégia pode ser vista como mapa: blocos arrastáveis, setas com sim, não e divisão em %, e um painel com objetivo, canal, responsável, oferta e métricas de cada bloco. "Publicar versão" congela a estratégia; a campanha guarda a versão que usou, e mudar a estratégia depois não mexe nela. Cada bloco mostra o desenho do que é: a página de captura ou de vendas vira uma mini página com a foto e os textos que você define, o anúncio leva o símbolo da Meta ou do Google, e o WhatsApp tem o símbolo e a escolha entre API e grupo.</w:t>
+        <w:t xml:space="preserve"> Em Marketing → Estratégias (Canvas), cada estratégia pode ser vista como mapa: blocos arrastáveis, setas com sim, não e divisão em %, e um painel com objetivo, canal, responsável, oferta e métricas de cada bloco. "Publicar versão" congela a estratégia; a campanha guarda a versão que usou, e mudar a estratégia depois não mexe nela. Cada bloco mostra o desenho do que é: a página de captura ou de vendas vira uma mini página com a foto e os textos que você define, o anúncio leva o símbolo da Meta ou do Google, e o WhatsApp tem o símbolo e a escolha entre API e grupo. Os cards se arrastam por qualquer ponto e se alinham numa grade, cada um pode ficar maior ou menor pelo canto, e o botão Organizar arruma tudo em colunas por fase.</w:t>
       </w:r>
     </w:p>
     <w:p>
@@ -5128,6 +5128,24 @@
       </w:pPr>
       <w:r>
         <w:t>14. Histórico resumido</w:t>
+      </w:r>
+    </w:p>
+    <w:p>
+      <w:pPr>
+        <w:pStyle w:val="Compact"/>
+        <w:numPr>
+          <w:ilvl w:val="0"/>
+          <w:numId w:val="1001"/>
+        </w:numPr>
+      </w:pPr>
+      <w:r>
+        <w:rPr>
+          <w:b/>
+        </w:rPr>
+        <w:t>29/10 (v0.167):</w:t>
+      </w:r>
+      <w:r>
+        <w:t xml:space="preserve"> Ajustar os cards do Canvas: arrastar por qualquer ponto, mudar o tamanho pelo canto e Organizar por fase.</w:t>
       </w:r>
     </w:p>
     <w:p>

</xml_diff>

<commit_message>
v0.168: Canvas por fase e correção do workspace
Trocar de workspace fecha a estratégia aberta e estratégia de outro workspace não abre
(blocos novos iam para o workspace errado e ligar dava "Os dois blocos precisam ser desta
estratégia"). Mapa com cor por fase, faixa em volta dos blocos de cada fase e legenda que
destaca uma fase. Teste t168_canvas_fases.py.

Co-Authored-By: Claude Opus 5.5 <noreply@anthropic.com>
</commit_message>
<xml_diff>
--- a/docs/Growths-o-sistema.docx
+++ b/docs/Growths-o-sistema.docx
@@ -30,7 +30,7 @@
         <w:t>Última atualização:</w:t>
       </w:r>
       <w:r>
-        <w:t xml:space="preserve"> 29/10/2026, versão 0.167.</w:t>
+        <w:t xml:space="preserve"> 29/10/2026, versão 0.168.</w:t>
       </w:r>
     </w:p>
     <w:p>
@@ -922,7 +922,7 @@
         <w:t>Estratégias (Canvas).</w:t>
       </w:r>
       <w:r>
-        <w:t xml:space="preserve"> Em Marketing → Estratégias (Canvas), cada estratégia pode ser vista como mapa: blocos arrastáveis, setas com sim, não e divisão em %, e um painel com objetivo, canal, responsável, oferta e métricas de cada bloco. "Publicar versão" congela a estratégia; a campanha guarda a versão que usou, e mudar a estratégia depois não mexe nela. Cada bloco mostra o desenho do que é: a página de captura ou de vendas vira uma mini página com a foto e os textos que você define, o anúncio leva o símbolo da Meta ou do Google, e o WhatsApp tem o símbolo e a escolha entre API e grupo. Os cards se arrastam por qualquer ponto e se alinham numa grade, cada um pode ficar maior ou menor pelo canto, e o botão Organizar arruma tudo em colunas por fase.</w:t>
+        <w:t xml:space="preserve"> Em Marketing → Estratégias (Canvas), cada estratégia pode ser vista como mapa: blocos arrastáveis, setas com sim, não e divisão em %, e um painel com objetivo, canal, responsável, oferta e métricas de cada bloco. "Publicar versão" congela a estratégia; a campanha guarda a versão que usou, e mudar a estratégia depois não mexe nela. Cada bloco mostra o desenho do que é: a página de captura ou de vendas vira uma mini página com a foto e os textos que você define, o anúncio leva o símbolo da Meta ou do Google, e o WhatsApp tem o símbolo e a escolha entre API e grupo. Os cards se arrastam por qualquer ponto e se alinham numa grade, cada um pode ficar maior ou menor pelo canto, e o botão Organizar arruma tudo em colunas por fase. O funil inteiro (da captação às vendas e depois o CS) fica num mapa só: cada fase tem uma cor e uma faixa em volta dos seus blocos, e clicar no nome da fase destaca só ela.</w:t>
       </w:r>
     </w:p>
     <w:p>
@@ -5128,6 +5128,24 @@
       </w:pPr>
       <w:r>
         <w:t>14. Histórico resumido</w:t>
+      </w:r>
+    </w:p>
+    <w:p>
+      <w:pPr>
+        <w:pStyle w:val="Compact"/>
+        <w:numPr>
+          <w:ilvl w:val="0"/>
+          <w:numId w:val="1001"/>
+        </w:numPr>
+      </w:pPr>
+      <w:r>
+        <w:rPr>
+          <w:b/>
+        </w:rPr>
+        <w:t>29/10 (v0.168):</w:t>
+      </w:r>
+      <w:r>
+        <w:t xml:space="preserve"> Canvas por fase: o funil inteiro num mapa só, com cor e faixa para Captação, Aquecimento, Vendas e Pós-venda (CS).</w:t>
       </w:r>
     </w:p>
     <w:p>

</xml_diff>

<commit_message>
v0.169: lixeira nos cards do Canvas
Um clique na lixeira do card exclui o bloco (métricas e ligações juntas) e o mapa mostra
Desfazer por 8 segundos, que devolve tudo no mesmo lugar. Teste t169_canvas_lixeira.py.

Co-Authored-By: Claude Opus 5.5 <noreply@anthropic.com>
</commit_message>
<xml_diff>
--- a/docs/Growths-o-sistema.docx
+++ b/docs/Growths-o-sistema.docx
@@ -30,7 +30,7 @@
         <w:t>Última atualização:</w:t>
       </w:r>
       <w:r>
-        <w:t xml:space="preserve"> 29/10/2026, versão 0.168.</w:t>
+        <w:t xml:space="preserve"> 29/10/2026, versão 0.169.</w:t>
       </w:r>
     </w:p>
     <w:p>
@@ -5128,6 +5128,24 @@
       </w:pPr>
       <w:r>
         <w:t>14. Histórico resumido</w:t>
+      </w:r>
+    </w:p>
+    <w:p>
+      <w:pPr>
+        <w:pStyle w:val="Compact"/>
+        <w:numPr>
+          <w:ilvl w:val="0"/>
+          <w:numId w:val="1001"/>
+        </w:numPr>
+      </w:pPr>
+      <w:r>
+        <w:rPr>
+          <w:b/>
+        </w:rPr>
+        <w:t>29/10 (v0.169):</w:t>
+      </w:r>
+      <w:r>
+        <w:t xml:space="preserve"> Lixeira nos cards do Canvas, com Desfazer por alguns segundos.</w:t>
       </w:r>
     </w:p>
     <w:p>

</xml_diff>

<commit_message>
v0.170: criar a estratégia pelo mapa
"Criar no mapa" abre um mapa em branco (rascunho). Publicar versão no rascunho pede nome,
tipo, categoria, produto e objetivo, grava a estratégia e publica a versão 1 com as etapas do
mapa. Rascunho vazio sem nome some ao voltar. Teste t170_canvas_criar_no_mapa.py.

Co-Authored-By: Claude Opus 5.5 <noreply@anthropic.com>
</commit_message>
<xml_diff>
--- a/docs/Growths-o-sistema.docx
+++ b/docs/Growths-o-sistema.docx
@@ -30,7 +30,7 @@
         <w:t>Última atualização:</w:t>
       </w:r>
       <w:r>
-        <w:t xml:space="preserve"> 29/10/2026, versão 0.169.</w:t>
+        <w:t xml:space="preserve"> 29/10/2026, versão 0.170.</w:t>
       </w:r>
     </w:p>
     <w:p>
@@ -922,7 +922,7 @@
         <w:t>Estratégias (Canvas).</w:t>
       </w:r>
       <w:r>
-        <w:t xml:space="preserve"> Em Marketing → Estratégias (Canvas), cada estratégia pode ser vista como mapa: blocos arrastáveis, setas com sim, não e divisão em %, e um painel com objetivo, canal, responsável, oferta e métricas de cada bloco. "Publicar versão" congela a estratégia; a campanha guarda a versão que usou, e mudar a estratégia depois não mexe nela. Cada bloco mostra o desenho do que é: a página de captura ou de vendas vira uma mini página com a foto e os textos que você define, o anúncio leva o símbolo da Meta ou do Google, e o WhatsApp tem o símbolo e a escolha entre API e grupo. Os cards se arrastam por qualquer ponto e se alinham numa grade, cada um pode ficar maior ou menor pelo canto, e o botão Organizar arruma tudo em colunas por fase. O funil inteiro (da captação às vendas e depois o CS) fica num mapa só: cada fase tem uma cor e uma faixa em volta dos seus blocos, e clicar no nome da fase destaca só ela.</w:t>
+        <w:t xml:space="preserve"> Em Marketing → Estratégias (Canvas), dá para começar pelo mapa ("Criar no mapa"): monta o funil e, ao publicar, dá o nome e a estratégia entra na lista. cada estratégia pode ser vista como mapa: blocos arrastáveis, setas com sim, não e divisão em %, e um painel com objetivo, canal, responsável, oferta e métricas de cada bloco. "Publicar versão" congela a estratégia; a campanha guarda a versão que usou, e mudar a estratégia depois não mexe nela. Cada bloco mostra o desenho do que é: a página de captura ou de vendas vira uma mini página com a foto e os textos que você define, o anúncio leva o símbolo da Meta ou do Google, e o WhatsApp tem o símbolo e a escolha entre API e grupo. Os cards se arrastam por qualquer ponto e se alinham numa grade, cada um pode ficar maior ou menor pelo canto, e o botão Organizar arruma tudo em colunas por fase. O funil inteiro (da captação às vendas e depois o CS) fica num mapa só: cada fase tem uma cor e uma faixa em volta dos seus blocos, e clicar no nome da fase destaca só ela.</w:t>
       </w:r>
     </w:p>
     <w:p>
@@ -5128,6 +5128,24 @@
       </w:pPr>
       <w:r>
         <w:t>14. Histórico resumido</w:t>
+      </w:r>
+    </w:p>
+    <w:p>
+      <w:pPr>
+        <w:pStyle w:val="Compact"/>
+        <w:numPr>
+          <w:ilvl w:val="0"/>
+          <w:numId w:val="1001"/>
+        </w:numPr>
+      </w:pPr>
+      <w:r>
+        <w:rPr>
+          <w:b/>
+        </w:rPr>
+        <w:t>29/10 (v0.170):</w:t>
+      </w:r>
+      <w:r>
+        <w:t xml:space="preserve"> Criar a estratégia direto no mapa: monta o funil e, ao publicar, dá o nome e ela entra na lista com as etapas.</w:t>
       </w:r>
     </w:p>
     <w:p>

</xml_diff>

<commit_message>
v0.171: publicar a estratégia (correção), fase no card e Passagem para o CS
estrategia_publicar passa a security definer: authenticated não executa pode_operar e toda
publicação dava 403 ("Sem permissão"). funis.criado_em para as estratégias novas.
Fase no próprio card (as métricas vão junto), soltar na faixa define a fase, bloco
Passagem para o CS. Testes canvas_s1_s3 e t171_canvas_fase_no_card.py.

Co-Authored-By: Claude Opus 5.5 <noreply@anthropic.com>
</commit_message>
<xml_diff>
--- a/docs/Growths-o-sistema.docx
+++ b/docs/Growths-o-sistema.docx
@@ -30,7 +30,7 @@
         <w:t>Última atualização:</w:t>
       </w:r>
       <w:r>
-        <w:t xml:space="preserve"> 29/10/2026, versão 0.170.</w:t>
+        <w:t xml:space="preserve"> 29/10/2026, versão 0.171.</w:t>
       </w:r>
     </w:p>
     <w:p>
@@ -922,7 +922,7 @@
         <w:t>Estratégias (Canvas).</w:t>
       </w:r>
       <w:r>
-        <w:t xml:space="preserve"> Em Marketing → Estratégias (Canvas), dá para começar pelo mapa ("Criar no mapa"): monta o funil e, ao publicar, dá o nome e a estratégia entra na lista. cada estratégia pode ser vista como mapa: blocos arrastáveis, setas com sim, não e divisão em %, e um painel com objetivo, canal, responsável, oferta e métricas de cada bloco. "Publicar versão" congela a estratégia; a campanha guarda a versão que usou, e mudar a estratégia depois não mexe nela. Cada bloco mostra o desenho do que é: a página de captura ou de vendas vira uma mini página com a foto e os textos que você define, o anúncio leva o símbolo da Meta ou do Google, e o WhatsApp tem o símbolo e a escolha entre API e grupo. Os cards se arrastam por qualquer ponto e se alinham numa grade, cada um pode ficar maior ou menor pelo canto, e o botão Organizar arruma tudo em colunas por fase. O funil inteiro (da captação às vendas e depois o CS) fica num mapa só: cada fase tem uma cor e uma faixa em volta dos seus blocos, e clicar no nome da fase destaca só ela.</w:t>
+        <w:t xml:space="preserve"> Em Marketing → Estratégias (Canvas), dá para começar pelo mapa ("Criar no mapa"): monta o funil e, ao publicar, dá o nome e a estratégia entra na lista. cada estratégia pode ser vista como mapa: blocos arrastáveis, setas com sim, não e divisão em %, e um painel com objetivo, canal, responsável, oferta e métricas de cada bloco. "Publicar versão" congela a estratégia; a campanha guarda a versão que usou, e mudar a estratégia depois não mexe nela. Cada bloco mostra o desenho do que é: a página de captura ou de vendas vira uma mini página com a foto e os textos que você define, o anúncio leva o símbolo da Meta ou do Google, e o WhatsApp tem o símbolo e a escolha entre API e grupo. Os cards se arrastam por qualquer ponto e se alinham numa grade, cada um pode ficar maior ou menor pelo canto, e o botão Organizar arruma tudo em colunas por fase. O funil inteiro (da captação às vendas e depois o CS) fica num mapa só: cada fase tem uma cor e uma faixa em volta dos seus blocos, e clicar no nome da fase destaca só ela. A fase de cada bloco muda clicando na etiqueta do card, e o bloco "Passagem para o CS" marca onde o cliente passa a ser do CS.</w:t>
       </w:r>
     </w:p>
     <w:p>
@@ -5128,6 +5128,24 @@
       </w:pPr>
       <w:r>
         <w:t>14. Histórico resumido</w:t>
+      </w:r>
+    </w:p>
+    <w:p>
+      <w:pPr>
+        <w:pStyle w:val="Compact"/>
+        <w:numPr>
+          <w:ilvl w:val="0"/>
+          <w:numId w:val="1001"/>
+        </w:numPr>
+      </w:pPr>
+      <w:r>
+        <w:rPr>
+          <w:b/>
+        </w:rPr>
+        <w:t>29/10 (v0.171):</w:t>
+      </w:r>
+      <w:r>
+        <w:t xml:space="preserve"> Publicar a estratégia volta a funcionar; a fase muda no próprio card; bloco Passagem para o CS.</w:t>
       </w:r>
     </w:p>
     <w:p>

</xml_diff>

<commit_message>
v0.172: resumo da estratégia e criar campanha a partir dela
Aba Resumo (padrão da estratégia publicada): dados, versão e funil por fase com a métrica
principal e o caminho de cada bloco. Botão Criar campanha abre a campanha com a estratégia
já escolhida, copia as etapas e abre a campanha. Teste t172_estrategia_resumo_campanha.py.

Co-Authored-By: Claude Opus 5.5 <noreply@anthropic.com>
</commit_message>
<xml_diff>
--- a/docs/Growths-o-sistema.docx
+++ b/docs/Growths-o-sistema.docx
@@ -30,7 +30,7 @@
         <w:t>Última atualização:</w:t>
       </w:r>
       <w:r>
-        <w:t xml:space="preserve"> 29/10/2026, versão 0.171.</w:t>
+        <w:t xml:space="preserve"> 30/10/2026, versão 0.172.</w:t>
       </w:r>
     </w:p>
     <w:p>
@@ -922,7 +922,7 @@
         <w:t>Estratégias (Canvas).</w:t>
       </w:r>
       <w:r>
-        <w:t xml:space="preserve"> Em Marketing → Estratégias (Canvas), dá para começar pelo mapa ("Criar no mapa"): monta o funil e, ao publicar, dá o nome e a estratégia entra na lista. cada estratégia pode ser vista como mapa: blocos arrastáveis, setas com sim, não e divisão em %, e um painel com objetivo, canal, responsável, oferta e métricas de cada bloco. "Publicar versão" congela a estratégia; a campanha guarda a versão que usou, e mudar a estratégia depois não mexe nela. Cada bloco mostra o desenho do que é: a página de captura ou de vendas vira uma mini página com a foto e os textos que você define, o anúncio leva o símbolo da Meta ou do Google, e o WhatsApp tem o símbolo e a escolha entre API e grupo. Os cards se arrastam por qualquer ponto e se alinham numa grade, cada um pode ficar maior ou menor pelo canto, e o botão Organizar arruma tudo em colunas por fase. O funil inteiro (da captação às vendas e depois o CS) fica num mapa só: cada fase tem uma cor e uma faixa em volta dos seus blocos, e clicar no nome da fase destaca só ela. A fase de cada bloco muda clicando na etiqueta do card, e o bloco "Passagem para o CS" marca onde o cliente passa a ser do CS.</w:t>
+        <w:t xml:space="preserve"> Em Marketing → Estratégias (Canvas), dá para começar pelo mapa ("Criar no mapa"): monta o funil e, ao publicar, dá o nome e a estratégia entra na lista. cada estratégia pode ser vista como mapa: blocos arrastáveis, setas com sim, não e divisão em %, e um painel com objetivo, canal, responsável, oferta e métricas de cada bloco. "Publicar versão" congela a estratégia; a campanha guarda a versão que usou, e mudar a estratégia depois não mexe nela. Cada bloco mostra o desenho do que é: a página de captura ou de vendas vira uma mini página com a foto e os textos que você define, o anúncio leva o símbolo da Meta ou do Google, e o WhatsApp tem o símbolo e a escolha entre API e grupo. Os cards se arrastam por qualquer ponto e se alinham numa grade, cada um pode ficar maior ou menor pelo canto, e o botão Organizar arruma tudo em colunas por fase. O funil inteiro (da captação às vendas e depois o CS) fica num mapa só: cada fase tem uma cor e uma faixa em volta dos seus blocos, e clicar no nome da fase destaca só ela. A fase de cada bloco muda clicando na etiqueta do card, e o bloco "Passagem para o CS" marca onde o cliente passa a ser do CS. A estratégia publicada abre no Resumo (dados, versão e funil por fase), e o botão "Criar campanha" cria a campanha já com ela e com as etapas copiadas.</w:t>
       </w:r>
     </w:p>
     <w:p>
@@ -5128,6 +5128,24 @@
       </w:pPr>
       <w:r>
         <w:t>14. Histórico resumido</w:t>
+      </w:r>
+    </w:p>
+    <w:p>
+      <w:pPr>
+        <w:pStyle w:val="Compact"/>
+        <w:numPr>
+          <w:ilvl w:val="0"/>
+          <w:numId w:val="1001"/>
+        </w:numPr>
+      </w:pPr>
+      <w:r>
+        <w:rPr>
+          <w:b/>
+        </w:rPr>
+        <w:t>30/10 (v0.172):</w:t>
+      </w:r>
+      <w:r>
+        <w:t xml:space="preserve"> Resumo da estratégia (funil por fase) e Criar campanha direto da estratégia.</w:t>
       </w:r>
     </w:p>
     <w:p>

</xml_diff>

<commit_message>
v0.173: E1 — CPF/CNPJ na pessoa e linha do tempo única do cliente
pessoas.documento (CPF ou CNPJ só com dígitos, validado, único por workspace), campo no
cadastro, ficha e busca. Linha do tempo única na ficha com filtro por tipo. Mesclagem leva o
documento, recusa documentos diferentes e deixa de falhar quando nenhum cadastro tem tags.
Testes pessoa_documento_cenarios.sql e t173_pessoa_documento_linha_tempo.py.

Co-Authored-By: Claude Opus 5.5 <noreply@anthropic.com>
</commit_message>
<xml_diff>
--- a/docs/Growths-o-sistema.docx
+++ b/docs/Growths-o-sistema.docx
@@ -30,7 +30,7 @@
         <w:t>Última atualização:</w:t>
       </w:r>
       <w:r>
-        <w:t xml:space="preserve"> 30/10/2026, versão 0.172.</w:t>
+        <w:t xml:space="preserve"> 30/10/2026, versão 0.173.</w:t>
       </w:r>
     </w:p>
     <w:p>
@@ -5128,6 +5128,24 @@
       </w:pPr>
       <w:r>
         <w:t>14. Histórico resumido</w:t>
+      </w:r>
+    </w:p>
+    <w:p>
+      <w:pPr>
+        <w:pStyle w:val="Compact"/>
+        <w:numPr>
+          <w:ilvl w:val="0"/>
+          <w:numId w:val="1001"/>
+        </w:numPr>
+      </w:pPr>
+      <w:r>
+        <w:rPr>
+          <w:b/>
+        </w:rPr>
+        <w:t>30/10 (v0.173):</w:t>
+      </w:r>
+      <w:r>
+        <w:t xml:space="preserve"> CPF/CNPJ no cadastro da pessoa e linha do tempo única do cliente na ficha.</w:t>
       </w:r>
     </w:p>
     <w:p>

</xml_diff>

<commit_message>
v0.174: E2 — o lead vira oportunidade e a oportunidade gera o contrato
contratos.oportunidade_id (vários por oportunidade), origem 'crm', contrato ativado ganha a
oportunidade e o negócio da pessoa acompanha as oportunidades de venda nova. Funil de leads
com a oportunidade; Proposta = contrato em rascunho ligado; Ganhou abre a proposta para
ativar; CPF/CNPJ pedido no contrato. Testes oportunidade_contrato_cenarios.sql e t174.

Co-Authored-By: Claude Opus 5.5 <noreply@anthropic.com>
</commit_message>
<xml_diff>
--- a/docs/Growths-o-sistema.docx
+++ b/docs/Growths-o-sistema.docx
@@ -30,7 +30,7 @@
         <w:t>Última atualização:</w:t>
       </w:r>
       <w:r>
-        <w:t xml:space="preserve"> 30/10/2026, versão 0.173.</w:t>
+        <w:t xml:space="preserve"> 30/10/2026, versão 0.174.</w:t>
       </w:r>
     </w:p>
     <w:p>
@@ -5128,6 +5128,24 @@
       </w:pPr>
       <w:r>
         <w:t>14. Histórico resumido</w:t>
+      </w:r>
+    </w:p>
+    <w:p>
+      <w:pPr>
+        <w:pStyle w:val="Compact"/>
+        <w:numPr>
+          <w:ilvl w:val="0"/>
+          <w:numId w:val="1001"/>
+        </w:numPr>
+      </w:pPr>
+      <w:r>
+        <w:rPr>
+          <w:b/>
+        </w:rPr>
+        <w:t>30/10 (v0.174):</w:t>
+      </w:r>
+      <w:r>
+        <w:t xml:space="preserve"> O lead vira oportunidade, e a oportunidade gera o contrato em rascunho (a proposta).</w:t>
       </w:r>
     </w:p>
     <w:p>

</xml_diff>

<commit_message>
v0.175: Diagnóstico 360° (G1) — formulário do cliente e catálogo de métricas
Formulário para lead ou cliente; tipos de pergunta novos (métricas do funil pirata com tenho/não
tenho e o bloco de cada métrica, mês a mês, valor com "não sei", lista, documentos); pergunta
condicional; link individual com validade de 30 dias; modelo pronto com as 8 seções (75 perguntas);
catálogo com etapa do funil pirata e 36 métricas novas; "Ver respostas" para a equipe.
Testes diagnostico_g1_cenarios.sql e t175_diagnostico_g1.py.

Co-Authored-By: Claude Opus 5.5 <noreply@anthropic.com>
</commit_message>
<xml_diff>
--- a/docs/Growths-o-sistema.docx
+++ b/docs/Growths-o-sistema.docx
@@ -30,7 +30,7 @@
         <w:t>Última atualização:</w:t>
       </w:r>
       <w:r>
-        <w:t xml:space="preserve"> 30/10/2026, versão 0.174.</w:t>
+        <w:t xml:space="preserve"> 30/10/2026, versão 0.175.</w:t>
       </w:r>
     </w:p>
     <w:p>
@@ -5128,6 +5128,24 @@
       </w:pPr>
       <w:r>
         <w:t>14. Histórico resumido</w:t>
+      </w:r>
+    </w:p>
+    <w:p>
+      <w:pPr>
+        <w:pStyle w:val="Compact"/>
+        <w:numPr>
+          <w:ilvl w:val="0"/>
+          <w:numId w:val="1001"/>
+        </w:numPr>
+      </w:pPr>
+      <w:r>
+        <w:rPr>
+          <w:b/>
+        </w:rPr>
+        <w:t>30/10 (v0.175):</w:t>
+      </w:r>
+      <w:r>
+        <w:t xml:space="preserve"> Diagnóstico 360° (G1): formulário do cliente com as métricas do funil pirata e o modelo pronto com as 8 seções.</w:t>
       </w:r>
     </w:p>
     <w:p>

</xml_diff>

<commit_message>
docs: Growths-o-sistema.docx com a v0.175 (atendimento) e a v0.176 (diagnóstico)
Co-Authored-By: Claude Opus 5.5 <noreply@anthropic.com>
</commit_message>
<xml_diff>
--- a/docs/Growths-o-sistema.docx
+++ b/docs/Growths-o-sistema.docx
@@ -30,7 +30,7 @@
         <w:t>Última atualização:</w:t>
       </w:r>
       <w:r>
-        <w:t xml:space="preserve"> 30/10/2026, versão 0.175.</w:t>
+        <w:t xml:space="preserve"> 30/10/2026, versão 0.176.</w:t>
       </w:r>
     </w:p>
     <w:p>
@@ -3171,6 +3171,38 @@
     </w:p>
     <w:p>
       <w:pPr>
+        <w:pStyle w:val="Heading3"/>
+      </w:pPr>
+      <w:r>
+        <w:t>Atendimento multicanal</w:t>
+      </w:r>
+    </w:p>
+    <w:p>
+      <w:pPr>
+        <w:pStyle w:val="FirstParagraph"/>
+      </w:pPr>
+      <w:r>
+        <w:t>A Central de Atendimento reúne conversas do WhatsApp oficial e do Instagram pela Zernio, além do WhatsApp e grupos pela Evolution. À esquerda ficam as conversas e os filtros; no centro, o histórico e as respostas; à direita, a pessoa do CRM, com responsável, oportunidades, compras e acesso à ficha completa. É possível registrar notas internas e indicar se a conversa está aberta, aguardando ou resolvida.</w:t>
+      </w:r>
+    </w:p>
+    <w:p>
+      <w:pPr>
+        <w:pStyle w:val="BodyText"/>
+      </w:pPr>
+      <w:r>
+        <w:t>As respostas levam o nome do atendente cadastrado no Growths. Nos grupos, cada mensagem identifica seu participante. O histórico capturado fica salvo no Growths e continua disponível mesmo se o número for desconectado; arquivos recebidos são copiados para armazenamento privado, com indicação quando a recuperação ainda está pendente. Conversas individuais podem ser vinculadas a pessoas existentes ou originar um novo lead.</w:t>
+      </w:r>
+    </w:p>
+    <w:p>
+      <w:pPr>
+        <w:pStyle w:val="BodyText"/>
+      </w:pPr>
+      <w:r>
+        <w:t>A primeira etapa está implementada e testada localmente na v0.175, aguardando publicação do banco e da função e configuração dos canais. Templates, disparos, automações e outros canais serão etapas seguintes.</w:t>
+      </w:r>
+    </w:p>
+    <w:p>
+      <w:pPr>
         <w:pStyle w:val="Heading2"/>
       </w:pPr>
       <w:r>
@@ -5142,10 +5174,28 @@
         <w:rPr>
           <w:b/>
         </w:rPr>
+        <w:t>30/10 (v0.176):</w:t>
+      </w:r>
+      <w:r>
+        <w:t xml:space="preserve"> Diagnóstico 360° (G1): formulário do cliente com as métricas do funil pirata e o modelo pronto com as 8 seções.</w:t>
+      </w:r>
+    </w:p>
+    <w:p>
+      <w:pPr>
+        <w:pStyle w:val="Compact"/>
+        <w:numPr>
+          <w:ilvl w:val="0"/>
+          <w:numId w:val="1001"/>
+        </w:numPr>
+      </w:pPr>
+      <w:r>
+        <w:rPr>
+          <w:b/>
+        </w:rPr>
         <w:t>30/10 (v0.175):</w:t>
       </w:r>
       <w:r>
-        <w:t xml:space="preserve"> Diagnóstico 360° (G1): formulário do cliente com as métricas do funil pirata e o modelo pronto com as 8 seções.</w:t>
+        <w:t xml:space="preserve"> Central de Atendimento, grupos WhatsApp, conexões, assinatura do atendente e histórico ligado ao CRM; publicação e configuração pendentes.</w:t>
       </w:r>
     </w:p>
     <w:p>

</xml_diff>

<commit_message>
Diagnóstico 360° v0.177: formulário curto, arquivos pelo link e reunião (G1b, G2, G3)
- G1b: modelo "Diagnóstico 360° (cliente, curto)" com 6 partes; métricas no modo
  simples (acompanho / não acompanho / não sei e onde vê); rascunho no link
  individual para salvar e continuar depois.
- G2: envio de arquivos pelo link para o local privado "diagnostico", via a
  função na nuvem diagnostico-arquivo (autorizar, confirmar, remover); página só
  de arquivos depois de responder.
- G3: reunião da equipe (números para decidir, perguntas por natureza da
  métrica, roteiro do modelo completo, documentos, validar) e leitura dos
  arquivos no Diagnóstico Growth guardada no diagnóstico do cliente, sem mexer
  no Growth Model da empresa.
- Migrações aplicadas em produção como v0177_diagnostico_g1b, _g2_arquivos e
  _g3_reuniao; função diagnostico-arquivo publicada.

Co-Authored-By: Claude Opus 5.5 <noreply@anthropic.com>
</commit_message>
<xml_diff>
--- a/docs/Growths-o-sistema.docx
+++ b/docs/Growths-o-sistema.docx
@@ -30,7 +30,7 @@
         <w:t>Última atualização:</w:t>
       </w:r>
       <w:r>
-        <w:t xml:space="preserve"> 30/10/2026, versão 0.176.</w:t>
+        <w:t xml:space="preserve"> 30/10/2026, versão 0.177.</w:t>
       </w:r>
     </w:p>
     <w:p>
@@ -5160,6 +5160,24 @@
       </w:pPr>
       <w:r>
         <w:t>14. Histórico resumido</w:t>
+      </w:r>
+    </w:p>
+    <w:p>
+      <w:pPr>
+        <w:pStyle w:val="Compact"/>
+        <w:numPr>
+          <w:ilvl w:val="0"/>
+          <w:numId w:val="1001"/>
+        </w:numPr>
+      </w:pPr>
+      <w:r>
+        <w:rPr>
+          <w:b/>
+        </w:rPr>
+        <w:t>30/10 (v0.177):</w:t>
+      </w:r>
+      <w:r>
+        <w:t xml:space="preserve"> Diagnóstico 360°: formulário curto do cliente (salva e continua depois), envio de arquivos pelo link e a reunião do diagnóstico, com a leitura dos arquivos no Diagnóstico Growth.</w:t>
       </w:r>
     </w:p>
     <w:p>

</xml_diff>